<commit_message>
Constitution session 260523-2: 7 provisions added from recommendations review
- §2.1.k.i: Coordination Failure Protocol (executive deadlock outside military domain)
- §3.7.e: Independent Officer Removal — Judicial Track (Inspectorate petition + SC + Senate/election)
- §4.1.f: Supreme Court Quorum (majority of seated; 5 minimum for constitutional questions)
- §8.3.d: IG Term Expiry and Incapacity (automatic termination; deputy authority)
- §8.12.a: Institutional Compromise Protocol (2-of-3 Inspectorate petition; acting IG from pool)
- §8.14: Registry Integrity Standards (objective criteria; appeal rights; exclusion rationale)
- §9.5.b: NRS Downtime Protocol revised (parallel system; acts effective regardless of NRS status)

Full document sweep: 537 sections defined, 0 broken cross-references
</commit_message>
<xml_diff>
--- a/constitution-current.docx
+++ b/constitution-current.docx
@@ -4439,6 +4439,55 @@
           <ns0:sz ns0:val="18"/>
           <ns0:szCs ns0:val="18"/>
         </ns0:rPr>
+        <ns0:t xml:space="preserve">§2.1.k.i  </ns0:t>
+      </ns0:r>
+      <ns0:r>
+        <ns0:rPr>
+          <ns0:rFonts ns0:ascii="Garamond" ns0:cs="Garamond" ns0:eastAsia="Garamond" ns0:hAnsi="Garamond"/>
+          <ns0:b/>
+          <ns0:bCs/>
+          <ns0:color ns0:val="1B2A4A"/>
+          <ns0:sz ns0:val="22"/>
+          <ns0:szCs ns0:val="22"/>
+        </ns0:rPr>
+        <ns0:t xml:space="preserve">Coordination Failure Protocol</ns0:t>
+      </ns0:r>
+    </ns0:p>
+    <ns0:p>
+      <ns0:pPr>
+        <ns0:spacing ns0:after="120" ns0:before="0"/>
+        <ns0:ind ns0:left="431"/>
+        <ns0:jc ns0:val="both"/>
+      </ns0:pPr>
+      <ns0:r>
+        <ns0:rPr>
+          <ns0:rFonts ns0:ascii="Garamond" ns0:cs="Garamond" ns0:eastAsia="Garamond" ns0:hAnsi="Garamond"/>
+          <ns0:b ns0:val="false"/>
+          <ns0:bCs ns0:val="false"/>
+          <ns0:i ns0:val="false"/>
+          <ns0:iCs ns0:val="false"/>
+          <ns0:color ns0:val="2a2520"/>
+          <ns0:sz ns0:val="22"/>
+          <ns0:szCs ns0:val="22"/>
+        </ns0:rPr>
+        <ns0:t xml:space="preserve">Where both executives are acting within their respective domains but their actions are materially incompatible — creating an operational deadlock not resolvable as a domain dispute under §2.1.k — either executive may declare a coordination failure by written NRS notice. The JEC has 14 days to produce a joint resolution. Where no joint resolution is published within 14 days, the matter is transmitted to the House Speaker and Senate Speaker jointly. The Legislature may resolve the deadlock by concurrent resolution of both chambers within 30 days — a concurrent resolution under this provision binds both executives to its terms for the duration of the impasse only and does not alter permanent domain boundaries. Where the Legislature does not act within 30 days, the PM's residual authority under §2.2 governs until either the executives reach agreement or the Legislature acts. A coordination failure declaration and all resolution steps are published to the NRS as permanent records.</ns0:t>
+      </ns0:r>
+    </ns0:p>
+    <ns0:p>
+      <ns0:pPr>
+        <ns0:spacing ns0:after="60" ns0:before="200"/>
+        <ns0:ind ns0:left="431"/>
+        <ns0:jc ns0:val="left"/>
+      </ns0:pPr>
+      <ns0:r>
+        <ns0:rPr>
+          <ns0:rFonts ns0:ascii="Courier New" ns0:cs="Courier New" ns0:eastAsia="Courier New" ns0:hAnsi="Courier New"/>
+          <ns0:b/>
+          <ns0:bCs/>
+          <ns0:color ns0:val="1B2A4A"/>
+          <ns0:sz ns0:val="18"/>
+          <ns0:szCs ns0:val="18"/>
+        </ns0:rPr>
         <ns0:t xml:space="preserve">§2.2  </ns0:t>
       </ns0:r>
       <ns0:r>
@@ -9005,6 +9054,55 @@
           <ns0:sz ns0:val="18"/>
           <ns0:szCs ns0:val="18"/>
         </ns0:rPr>
+        <ns0:t xml:space="preserve">§3.7.e  </ns0:t>
+      </ns0:r>
+      <ns0:r>
+        <ns0:rPr>
+          <ns0:rFonts ns0:ascii="Garamond" ns0:cs="Garamond" ns0:eastAsia="Garamond" ns0:hAnsi="Garamond"/>
+          <ns0:b/>
+          <ns0:bCs/>
+          <ns0:color ns0:val="1B2A4A"/>
+          <ns0:sz ns0:val="22"/>
+          <ns0:szCs ns0:val="22"/>
+        </ns0:rPr>
+        <ns0:t xml:space="preserve">Independent Officer Removal — Judicial Track</ns0:t>
+      </ns0:r>
+    </ns0:p>
+    <ns0:p>
+      <ns0:pPr>
+        <ns0:spacing ns0:after="120" ns0:before="0"/>
+        <ns0:ind ns0:left="431"/>
+        <ns0:jc ns0:val="both"/>
+      </ns0:pPr>
+      <ns0:r>
+        <ns0:rPr>
+          <ns0:rFonts ns0:ascii="Garamond" ns0:cs="Garamond" ns0:eastAsia="Garamond" ns0:hAnsi="Garamond"/>
+          <ns0:b ns0:val="false"/>
+          <ns0:bCs ns0:val="false"/>
+          <ns0:i ns0:val="false"/>
+          <ns0:iCs ns0:val="false"/>
+          <ns0:color ns0:val="2a2520"/>
+          <ns0:sz ns0:val="22"/>
+          <ns0:szCs ns0:val="22"/>
+        </ns0:rPr>
+        <ns0:t xml:space="preserve">Where two of the three Inspectorates jointly certify for-cause grounds and petition the SC, the SC determines within 30 days whether the certified grounds constitute sufficient cause for suspension. If cause is found, the officer is suspended and the most senior deputy acts in the interim. The Senate then has 60 days to hold a removal vote; a 3/5 majority removes the officer permanently. A vote that fails to reach 3/5 reinstates the officer and closes the process. Where the Senate fails to vote within 60 days: if the next National Election Day falls within 6 months, the matter is placed on that ballot; otherwise the Legislature may set a special election by concurrent resolution with a minimum 90-day notice period — failure to set a date within 30 days defaults the matter to the next National Election Day. Removal by election requires 60% of votes cast. All steps are published to the NRS as permanent records.</ns0:t>
+      </ns0:r>
+    </ns0:p>
+    <ns0:p>
+      <ns0:pPr>
+        <ns0:spacing ns0:after="60" ns0:before="200"/>
+        <ns0:ind ns0:left="431"/>
+        <ns0:jc ns0:val="left"/>
+      </ns0:pPr>
+      <ns0:r>
+        <ns0:rPr>
+          <ns0:rFonts ns0:ascii="Courier New" ns0:cs="Courier New" ns0:eastAsia="Courier New" ns0:hAnsi="Courier New"/>
+          <ns0:b/>
+          <ns0:bCs/>
+          <ns0:color ns0:val="1B2A4A"/>
+          <ns0:sz ns0:val="18"/>
+          <ns0:szCs ns0:val="18"/>
+        </ns0:rPr>
         <ns0:t xml:space="preserve">§3.8  </ns0:t>
       </ns0:r>
       <ns0:r>
@@ -9593,6 +9691,55 @@
           <ns0:sz ns0:val="18"/>
           <ns0:szCs ns0:val="18"/>
         </ns0:rPr>
+        <ns0:t xml:space="preserve">§4.1.f  </ns0:t>
+      </ns0:r>
+      <ns0:r>
+        <ns0:rPr>
+          <ns0:rFonts ns0:ascii="Garamond" ns0:cs="Garamond" ns0:eastAsia="Garamond" ns0:hAnsi="Garamond"/>
+          <ns0:b/>
+          <ns0:bCs/>
+          <ns0:color ns0:val="1B2A4A"/>
+          <ns0:sz ns0:val="22"/>
+          <ns0:szCs ns0:val="22"/>
+        </ns0:rPr>
+        <ns0:t xml:space="preserve">Supreme Court Quorum</ns0:t>
+      </ns0:r>
+    </ns0:p>
+    <ns0:p>
+      <ns0:pPr>
+        <ns0:spacing ns0:after="120" ns0:before="0"/>
+        <ns0:ind ns0:left="431"/>
+        <ns0:jc ns0:val="both"/>
+      </ns0:pPr>
+      <ns0:r>
+        <ns0:rPr>
+          <ns0:rFonts ns0:ascii="Garamond" ns0:cs="Garamond" ns0:eastAsia="Garamond" ns0:hAnsi="Garamond"/>
+          <ns0:b ns0:val="false"/>
+          <ns0:bCs ns0:val="false"/>
+          <ns0:i ns0:val="false"/>
+          <ns0:iCs ns0:val="false"/>
+          <ns0:color ns0:val="2a2520"/>
+          <ns0:sz ns0:val="22"/>
+          <ns0:szCs ns0:val="22"/>
+        </ns0:rPr>
+        <ns0:t xml:space="preserve">A majority of the SC's seated justices — including any temporary associate justices serving under §4.2.g — constitutes quorum for ordinary decisions. Constitutional questions require a minimum of five justices regardless of total seated membership. Where insufficient Appellate Court judges are available for designation under §4.2.g, the most senior federal District Court judges by continuous service fill remaining positions in order on the same temporary basis.</ns0:t>
+      </ns0:r>
+    </ns0:p>
+    <ns0:p>
+      <ns0:pPr>
+        <ns0:spacing ns0:after="60" ns0:before="200"/>
+        <ns0:ind ns0:left="431"/>
+        <ns0:jc ns0:val="left"/>
+      </ns0:pPr>
+      <ns0:r>
+        <ns0:rPr>
+          <ns0:rFonts ns0:ascii="Courier New" ns0:cs="Courier New" ns0:eastAsia="Courier New" ns0:hAnsi="Courier New"/>
+          <ns0:b/>
+          <ns0:bCs/>
+          <ns0:color ns0:val="1B2A4A"/>
+          <ns0:sz ns0:val="18"/>
+          <ns0:szCs ns0:val="18"/>
+        </ns0:rPr>
         <ns0:t xml:space="preserve">§4.2  </ns0:t>
       </ns0:r>
       <ns0:r>
@@ -13575,6 +13722,55 @@
           <ns0:sz ns0:val="18"/>
           <ns0:szCs ns0:val="18"/>
         </ns0:rPr>
+        <ns0:t xml:space="preserve">§8.3.d  </ns0:t>
+      </ns0:r>
+      <ns0:r>
+        <ns0:rPr>
+          <ns0:rFonts ns0:ascii="Garamond" ns0:cs="Garamond" ns0:eastAsia="Garamond" ns0:hAnsi="Garamond"/>
+          <ns0:b/>
+          <ns0:bCs/>
+          <ns0:color ns0:val="1B2A4A"/>
+          <ns0:sz ns0:val="22"/>
+          <ns0:szCs ns0:val="22"/>
+        </ns0:rPr>
+        <ns0:t xml:space="preserve">Term Expiry and Incapacity</ns0:t>
+      </ns0:r>
+    </ns0:p>
+    <ns0:p>
+      <ns0:pPr>
+        <ns0:spacing ns0:after="120" ns0:before="0"/>
+        <ns0:ind ns0:left="431"/>
+        <ns0:jc ns0:val="both"/>
+      </ns0:pPr>
+      <ns0:r>
+        <ns0:rPr>
+          <ns0:rFonts ns0:ascii="Garamond" ns0:cs="Garamond" ns0:eastAsia="Garamond" ns0:hAnsi="Garamond"/>
+          <ns0:b ns0:val="false"/>
+          <ns0:bCs ns0:val="false"/>
+          <ns0:i ns0:val="false"/>
+          <ns0:iCs ns0:val="false"/>
+          <ns0:color ns0:val="2a2520"/>
+          <ns0:sz ns0:val="22"/>
+          <ns0:szCs ns0:val="22"/>
+        </ns0:rPr>
+        <ns0:t xml:space="preserve">An IG's constitutional authority terminates automatically at the moment their term expires — no further act or proceeding is required. Any official act taken after term expiry is constitutionally void. Where a successor has not yet been confirmed at term expiry, the most senior deputy within the Inspectorate holds full IG authority on an acting basis until the successor is confirmed; acting authority under this provision may not exceed 90 days without LI certification of the delay as a constitutional compliance breach. Where an IG is certified incapacitated by the other two Inspectorates jointly, the most senior deputy assumes acting authority immediately pending either recovery or a new selection under §8.3; the incapacitated IG's authority is suspended from the moment of joint certification.</ns0:t>
+      </ns0:r>
+    </ns0:p>
+    <ns0:p>
+      <ns0:pPr>
+        <ns0:spacing ns0:after="60" ns0:before="200"/>
+        <ns0:ind ns0:left="431"/>
+        <ns0:jc ns0:val="left"/>
+      </ns0:pPr>
+      <ns0:r>
+        <ns0:rPr>
+          <ns0:rFonts ns0:ascii="Courier New" ns0:cs="Courier New" ns0:eastAsia="Courier New" ns0:hAnsi="Courier New"/>
+          <ns0:b/>
+          <ns0:bCs/>
+          <ns0:color ns0:val="1B2A4A"/>
+          <ns0:sz ns0:val="18"/>
+          <ns0:szCs ns0:val="18"/>
+        </ns0:rPr>
         <ns0:t xml:space="preserve">§8.4  </ns0:t>
       </ns0:r>
       <ns0:r>
@@ -15360,6 +15556,55 @@
           <ns0:sz ns0:val="18"/>
           <ns0:szCs ns0:val="18"/>
         </ns0:rPr>
+        <ns0:t xml:space="preserve">§8.12.a  </ns0:t>
+      </ns0:r>
+      <ns0:r>
+        <ns0:rPr>
+          <ns0:rFonts ns0:ascii="Garamond" ns0:cs="Garamond" ns0:eastAsia="Garamond" ns0:hAnsi="Garamond"/>
+          <ns0:b/>
+          <ns0:bCs/>
+          <ns0:color ns0:val="1B2A4A"/>
+          <ns0:sz ns0:val="22"/>
+          <ns0:szCs ns0:val="22"/>
+        </ns0:rPr>
+        <ns0:t xml:space="preserve">Institutional Compromise Protocol</ns0:t>
+      </ns0:r>
+    </ns0:p>
+    <ns0:p>
+      <ns0:pPr>
+        <ns0:spacing ns0:after="120" ns0:before="0"/>
+        <ns0:ind ns0:left="431"/>
+        <ns0:jc ns0:val="both"/>
+      </ns0:pPr>
+      <ns0:r>
+        <ns0:rPr>
+          <ns0:rFonts ns0:ascii="Garamond" ns0:cs="Garamond" ns0:eastAsia="Garamond" ns0:hAnsi="Garamond"/>
+          <ns0:b ns0:val="false"/>
+          <ns0:bCs ns0:val="false"/>
+          <ns0:i ns0:val="false"/>
+          <ns0:iCs ns0:val="false"/>
+          <ns0:color ns0:val="2a2520"/>
+          <ns0:sz ns0:val="22"/>
+          <ns0:szCs ns0:val="22"/>
+        </ns0:rPr>
+        <ns0:t xml:space="preserve">Where two of the three Inspectorates jointly certify that the third is operating in demonstrable bad faith, they petition the SC directly for confirmation of the finding; the SC rules within 14 days. Upon filing the petition, the two petitioning Inspectorates jointly designate an Acting Inspector General: the longest-tenured member of the affected Inspectorate's candidate pool who accepts the designation and is approved by both executives. The Acting IG assumes all constitutional functions of the compromised Inspectorate from the moment of designation. If the SC does not confirm the finding, the Acting IG stands down and all functions return immediately to the original IG. If confirmed, the Acting IG serves until either the original IG is restored to full function or a new permanent IG is confirmed under §8.3 — whichever occurs first. The Acting IG is not eligible for permanent appointment to the position in which they serve; upon conclusion of acting service they return to the candidate pool. All designations, approvals, findings, and SC rulings are published permanently to the NRS.</ns0:t>
+      </ns0:r>
+    </ns0:p>
+    <ns0:p>
+      <ns0:pPr>
+        <ns0:spacing ns0:after="60" ns0:before="200"/>
+        <ns0:ind ns0:left="431"/>
+        <ns0:jc ns0:val="left"/>
+      </ns0:pPr>
+      <ns0:r>
+        <ns0:rPr>
+          <ns0:rFonts ns0:ascii="Courier New" ns0:cs="Courier New" ns0:eastAsia="Courier New" ns0:hAnsi="Courier New"/>
+          <ns0:b/>
+          <ns0:bCs/>
+          <ns0:color ns0:val="1B2A4A"/>
+          <ns0:sz ns0:val="18"/>
+          <ns0:szCs ns0:val="18"/>
+        </ns0:rPr>
         <ns0:t xml:space="preserve">§8.13  </ns0:t>
       </ns0:r>
       <ns0:r>
@@ -15394,6 +15639,55 @@
           <ns0:szCs ns0:val="22"/>
         </ns0:rPr>
         <ns0:t xml:space="preserve">Every constitutional pool operates through four sequential stages: entry, certification, selection, and — where specified — confirmation. This section establishes the standard mechanics for each stage; individual pool provisions specify which variation applies and any pool-specific parameters. Entry: pool members are self-nominated (any qualifying citizen may apply), State-designated (each State nominates through its own process), or executive-nominated (each executive nominates to their respective pool). Senate confirmation is never required for pool entry — confirmation applies only to selected individuals, not to pool membership. A pool that required Senate confirmation at entry would require the democratic legitimacy of an elected office; if that level of accountability is needed, the office should be elected, not pooled. Certification: the JI reviews each entrant and publishes a qualification report to the NRS within 30 days, assessing whether the entrant meets the qualification requirements for that pool. Where the pool involves an office with significant financial authority, the EI reviews each entrant's financial disclosure within 21 days and publishes findings to the NRS alongside the JI report. Pool membership is established by JI certification; a rejected entrant may appeal to an Appellate Court within 14 days. Pool records are public NRS records at all times. Selection: where a pool provision specifies lottery selection, the Joint Inspectorate Council under §8.12 conducts the draw in a public session, certifies the result jointly, and publishes it to the NRS before the session closes. Drawn members must accept or decline within 48 hours; alternates fill declined seats in draw order; the JIC conducts supplemental draws if alternates are exhausted. Where a pool provision specifies deliberate nomination, the named officer nominates from certified pool members. Confirmation: where required, Senate confirmation applies to the selected individual only. Timeframes are specified in the establishing provision; failure to confirm within the specified period is a constitutional compliance breach certified by the LI unless deemed confirmation is specified. Pool health: the JI monitors all constitutional pools and publishes an annual status report to the NRS for each pool. Where a pool falls below its constitutional minimum, the JI publishes a deficiency notice; the relevant nominating bodies must respond within 30 days.</ns0:t>
+      </ns0:r>
+    </ns0:p>
+    <ns0:p>
+      <ns0:pPr>
+        <ns0:spacing ns0:after="60" ns0:before="200"/>
+        <ns0:ind ns0:left="431"/>
+        <ns0:jc ns0:val="left"/>
+      </ns0:pPr>
+      <ns0:r>
+        <ns0:rPr>
+          <ns0:rFonts ns0:ascii="Courier New" ns0:cs="Courier New" ns0:eastAsia="Courier New" ns0:hAnsi="Courier New"/>
+          <ns0:b/>
+          <ns0:bCs/>
+          <ns0:color ns0:val="1B2A4A"/>
+          <ns0:sz ns0:val="18"/>
+          <ns0:szCs ns0:val="18"/>
+        </ns0:rPr>
+        <ns0:t xml:space="preserve">§8.14  </ns0:t>
+      </ns0:r>
+      <ns0:r>
+        <ns0:rPr>
+          <ns0:rFonts ns0:ascii="Garamond" ns0:cs="Garamond" ns0:eastAsia="Garamond" ns0:hAnsi="Garamond"/>
+          <ns0:b/>
+          <ns0:bCs/>
+          <ns0:color ns0:val="1B2A4A"/>
+          <ns0:sz ns0:val="22"/>
+          <ns0:szCs ns0:val="22"/>
+        </ns0:rPr>
+        <ns0:t xml:space="preserve">Registry Integrity Standards</ns0:t>
+      </ns0:r>
+    </ns0:p>
+    <ns0:p>
+      <ns0:pPr>
+        <ns0:spacing ns0:after="120" ns0:before="0"/>
+        <ns0:ind ns0:left="431"/>
+        <ns0:jc ns0:val="both"/>
+      </ns0:pPr>
+      <ns0:r>
+        <ns0:rPr>
+          <ns0:rFonts ns0:ascii="Garamond" ns0:cs="Garamond" ns0:eastAsia="Garamond" ns0:hAnsi="Garamond"/>
+          <ns0:b ns0:val="false"/>
+          <ns0:bCs ns0:val="false"/>
+          <ns0:i ns0:val="false"/>
+          <ns0:iCs ns0:val="false"/>
+          <ns0:color ns0:val="2a2520"/>
+          <ns0:sz ns0:val="22"/>
+          <ns0:szCs ns0:val="22"/>
+        </ns0:rPr>
+        <ns0:t xml:space="preserve">These standards apply to all registries and candidate pools maintained under constitutional mandate. Eligibility criteria are strictly objective — years of practice or service, office status, and financial interests as defined by this Constitution or by statute. No registry administrator may apply criteria relating to legal philosophy, judicial temperament, ideological orientation, or political association; any exclusion on such grounds is constitutionally void. Where an applicant is excluded or removed, the administering body must publish the specific grounds to the NRS within 14 days. An excluded or removed applicant may petition the SC within 30 days of NRS publication; the SC reviews only whether the stated grounds correspond to an established eligibility criterion — it does not review the factual merits of the determination. The §8.11 eight-year assessment must evaluate each registry for pool depth, distribution, and patterns in exclusion decisions.</ns0:t>
       </ns0:r>
     </ns0:p>
     <ns0:p>
@@ -16589,7 +16883,7 @@
           <ns0:sz ns0:val="22"/>
           <ns0:szCs ns0:val="22"/>
         </ns0:rPr>
-        <ns0:t xml:space="preserve">In the event of a technical outage, government acts that would otherwise have required NRS publication to take effect are delayed until the outage is resolved. Emergency acts required for immediate public safety may be announced through alternative channels, but the NRS publication requirement applies from the moment the NRS is restored.</ns0:t>
+        <ns0:t xml:space="preserve">The NRS is the record of government, not a condition of it. Government acts take legal effect from the moment of issuance regardless of NRS status; the publication obligation applies from the moment the NRS is restored. The JI maintains a continuously operating parallel authentication system, physically and logistically independent of the NRS, capable of authenticating and preserving all constitutional acts without NRS connectivity. This system operates in parallel at all times — not merely as a contingency — and records all authenticated acts with full constitutional effect from the moment of their issuance. Upon NRS restoration, all parallel system records migrate to the NRS as permanent records with their original issuance timestamps. Where the NRS has not been restored within 180 days, the parallel system becomes the constitutional record of the Republic; the Legislature must by statute establish permanent restoration obligations and timelines within 90 days of that threshold. The Legislature defines the technical specifications, security standards, and operational parameters of the parallel system by statute; the constitutional obligation to maintain it is absolute and its funding floor follows §9.5.d.</ns0:t>
       </ns0:r>
     </ns0:p>
     <ns0:p>

</xml_diff>

<commit_message>
Constitution 260524b: Office continuity and IG acting mechanism
- §1.31 (new): Continuity of Constitutionally Mandated Offices — no gap between
  incumbent term end and successor term start; eligibility requirement for all
  acting officials; LI certifies failure as compliance breach
- §8.1.d: Rewritten — pool-sourced acting IG for unexpected vacancies only;
  longest eligible pool tenure; ineligible for permanent appointment; returns to
  pool; both executives approve within 5 days; deputy mechanism removed
- §8.3: Nomination deadlines added (24 months before term end); acting capacity
  on nomination removed; confirmed successor assumes office at precise term end;
  §8.1.d acting mechanism activates if confirmation fails
</commit_message>
<xml_diff>
--- a/constitution-current.docx
+++ b/constitution-current.docx
@@ -1544,6 +1544,55 @@
     <w:p>
       <w:pPr>
         <w:spacing w:after="60" w:before="200"/>
+        <w:ind w:left="431"/>
+        <w:jc w:val="left"/>
+      </w:pPr>
+      <w:r>
+        <w:rPr>
+          <w:rFonts w:ascii="Courier New" w:cs="Courier New" w:eastAsia="Courier New" w:hAnsi="Courier New"/>
+          <w:b/>
+          <w:bCs/>
+          <w:color w:val="1B2A4A"/>
+          <w:sz w:val="18"/>
+          <w:szCs w:val="18"/>
+        </w:rPr>
+        <w:t xml:space="preserve">§1.31  </w:t>
+      </w:r>
+      <w:r>
+        <w:rPr>
+          <w:rFonts w:ascii="Garamond" w:cs="Garamond" w:eastAsia="Garamond" w:hAnsi="Garamond"/>
+          <w:b/>
+          <w:bCs/>
+          <w:color w:val="1B2A4A"/>
+          <w:sz w:val="22"/>
+          <w:szCs w:val="22"/>
+        </w:rPr>
+        <w:t xml:space="preserve">Continuity of Constitutionally Mandated Offices</w:t>
+      </w:r>
+    </w:p>
+    <w:p>
+      <w:pPr>
+        <w:spacing w:after="120" w:before="0"/>
+        <w:ind w:left="431"/>
+        <w:jc w:val="both"/>
+      </w:pPr>
+      <w:r>
+        <w:rPr>
+          <w:rFonts w:ascii="Garamond" w:cs="Garamond" w:eastAsia="Garamond" w:hAnsi="Garamond"/>
+          <w:b w:val="false"/>
+          <w:bCs w:val="false"/>
+          <w:i w:val="false"/>
+          <w:iCs w:val="false"/>
+          <w:color w:val="2a2520"/>
+          <w:sz w:val="22"/>
+          <w:szCs w:val="22"/>
+        </w:rPr>
+        <w:t xml:space="preserve">For every office established by this Constitution with a fixed term, the confirmed or elected successor’s term begins at the precise moment the incumbent’s term concludes — no gap exists between the end of one term and the commencement of the next. The selection and confirmation processes for each such office must be initiated and completed with sufficient lead time to ensure seamless succession before the incumbent’s term ends; failure to do so is a constitutional compliance breach certified by the LI. Any person serving in an acting capacity for a constitutionally mandated office during an unexpected vacancy must be otherwise eligible for that office — possessing all substantive qualifications for the role — with the sole exception of not having completed the applicable confirmation or election process. The acting mechanism for each office is defined in the provisions governing that office.</w:t>
+      </w:r>
+    </w:p>
+    <w:p>
+      <w:pPr>
+        <w:spacing w:after="60" w:before="200"/>
         <w:jc w:val="left"/>
       </w:pPr>
       <w:r>
@@ -4573,7 +4622,7 @@
           <w:sz w:val="22"/>
           <w:szCs w:val="22"/>
         </w:rPr>
-        <w:t xml:space="preserve">An IG’s constitutional authority terminates automatically at the moment their term expires — no further act or proceeding is required. Any official act taken after term expiry is constitutionally void. Where a successor has not yet been confirmed at term expiry, the most senior deputy within the Inspectorate holds full IG authority on an acting basis until the successor is confirmed; acting authority under this provision may not exceed 90 days without LI certification of the delay as a constitutional compliance breach. Where an IG is certified incapacitated by the other two Inspectorates jointly, the most senior deputy assumes acting authority immediately pending either recovery or a new selection under §8.3; the incapacitated IG’s authority is suspended from the moment of joint certification.</w:t>
+        <w:t xml:space="preserve">An IG’s constitutional authority terminates automatically at the moment their term expires — no further act or proceeding is required. Any official act taken after term expiry is constitutionally void. Where an unexpected vacancy arises mid-term — through death, resignation, removal, or certified incapacity — the most senior eligible member of the affected Inspectorate’s candidate pool by continuous pool tenure who accepts designation serves as Acting Inspector General until a successor is confirmed under §8.3. The Acting IG holds full constitutional authority of the office. The Acting IG is not eligible for permanent appointment to the position in which they serve; upon conclusion of acting service they return to the candidate pool. Both executives must approve the designation within 5 days of the vacancy arising; the designation is published to the NRS immediately. Pool membership satisfies the eligibility requirement of §1.31. Where an IG is certified incapacitated by the other two Inspectorates jointly, the incapacitated IG’s authority is suspended from the moment of joint certification and the acting mechanism under this provision activates immediately.</w:t>
       </w:r>
     </w:p>
     <w:p>
@@ -4675,7 +4724,7 @@
           <w:sz w:val="22"/>
           <w:szCs w:val="22"/>
         </w:rPr>
-        <w:t xml:space="preserve">LI IG: nominated by the SC from a pool of qualified candidates maintained by the Elections Panel; confirmed by national popular vote at the next the federal electoral period following nomination, by simple majority of votes cast. The nominee takes office in an acting capacity immediately on nomination and exercises full IG authority pending confirmation. If the confirmation vote fails, the acting IG completes any open findings within 60 days and the SC initiates a new nomination from the pool. EI IG: nominated by the House from a pool of qualified candidates maintained by the Elections Panel; confirmed by national popular vote at the next the federal electoral period following nomination, by simple majority of votes cast, with JI vetting of the nominee's disclosure record published before the vote. The same acting-capacity and failed-vote provisions apply. JI IG: selected by public lottery under §8.13 from the JI Candidate Pool under §8.4.a maintained by the Elections Panel; no confirmation. All IGs serve 10-year non-renewable terms. No two IG terms may begin within 18 months of each other, ensuring continuous institutional knowledge across offices. All pool records and certifications are published to the NRS. The Elections Panel administers all IG confirmation votes as part of the regular the federal electoral period ballot.</w:t>
+        <w:t xml:space="preserve">LI IG: nominated by the SC from a pool of qualified candidates maintained by the Elections Panel no later than 24 months before the incumbent’s term expires, to ensure confirmation is complete before the transition; confirmed by national popular vote at the next federal electoral period following nomination, by simple majority of votes cast. The confirmed successor assumes full IG authority at the precise moment the incumbent’s term concludes under §1.31. If the confirmation vote fails, the §8.1.d acting mechanism activates and the SC initiates a new nomination from the pool within 60 days. EI IG: nominated by the House from a pool of qualified candidates maintained by the Elections Panel no later than 24 months before the incumbent’s term expires; confirmed by national popular vote at the next federal electoral period following nomination, by simple majority of votes cast, with JI vetting of the nominee’s disclosure record published before the vote. The same timing and failed-vote provisions apply. JI IG: selected by public lottery under §8.13 from the JI Candidate Pool under §8.4.a maintained by the Elections Panel, conducted no later than 24 months before the incumbent’s term expires; no separate confirmation required — the lottery result is the selection and the selected person assumes office at the precise moment the incumbent’s term concludes. All IGs serve 10-year non-renewable terms. No two IG terms may begin within 18 months of each other, ensuring continuous institutional knowledge across offices. All pool records and certifications are published to the NRS. The Elections Panel administers all IG confirmation votes as part of the regular federal electoral period ballot.</w:t>
       </w:r>
     </w:p>
     <w:p>

</xml_diff>

<commit_message>
Constitution 260524c: DIC Director removed, panel structure simplified
- §16.1: Removed joint Commission and Director; two independent panels with
  automatic Chair (most senior by continuous service within panel; JIC lot
  if tied); Legislature sets standards/budget by statute; panels implement
- §16.1.a: Within-panel staggering (max one seat expires per year within each
  panel); founding lot assigns three offset start points; cross-panel staggering
  removed; Director references removed
- §16.1.b: Removed entirely (Director no longer exists)
- §16.1.c: 'Commission as a whole' replaced with 'each panel'; Director removed
- §16.5: Emergency ratification changed from 'full Commission' to 'full panel
  by majority vote'
</commit_message>
<xml_diff>
--- a/constitution-current.docx
+++ b/constitution-current.docx
@@ -7638,7 +7638,7 @@
           <w:sz w:val="22"/>
           <w:szCs w:val="22"/>
         </w:rPr>
-        <w:t xml:space="preserve">The Digital Infrastructure Commission is a constitutionally independent body responsible for operating the National Record System, the National Voting System, and maintaining all constitutional candidate registries and pools as the administrative keeper of record. The Commission comprises two panels of three administrators each — the NRS Panel and the Elections Panel. Each panel governs its own system independently in day-to-day operations; neither panel may direct the other. Both panels sitting together constitute the full Commission for joint decisions on architecture standards, technical policy, budget, and any matter crossing both systems. Joint decisions require a majority of the full six-member Commission; where the Commission is equally divided, the Director casts a deciding vote. The Commission is independent of both executives and the Legislature in the exercise of its administrative and certification functions.</w:t>
+        <w:t xml:space="preserve">The Digital Infrastructure Commission comprises two constitutionally independent panels — the NRS Panel and the Elections Panel — each responsible for the day-to-day operation of its respective system and for maintaining all constitutional candidate registries and pools within its mandate. The NRS Panel operates the National Record System. The Elections Panel operates the National Voting System and administers all federal elections, referenda, and confirmation votes. Each panel is operationally independent; neither panel may direct the other. The Legislature defines by statute the technical standards, interface requirements, budget, and operational parameters for each system; the panels implement within those statutory parameters. The Chair of each panel is its most senior administrator by continuous service within that panel; where two or more administrators have equal continuous service, the Chair is determined by lot conducted by the JIC. Each panel is independent of both executives and the Legislature in the exercise of its operational functions.</w:t>
       </w:r>
     </w:p>
     <w:p>
@@ -7689,58 +7689,7 @@
           <w:sz w:val="22"/>
           <w:szCs w:val="22"/>
         </w:rPr>
-        <w:t xml:space="preserve">The PM nominates DIC administrators from the DIC Administrator Pool maintained by the Elections Panel. The Senate confirms by 2/3 supermajority. Administrators serve a primary 8-year non-renewable term. The PM may grant a single 2-year extension to any administrator before their term expires where a genuine ongoing operational matter requires continuity — the extension and stated reasons must be published to the NRS; the JIC assesses the stated justification and publishes its assessment within 30 days. Extensions are not the constitutional norm; no administrator may serve more than 10 years in total. Terms are staggered so that no more than two seats across both panels expire within any two-year window. NRS Panel administrators must hold at least 12 years of professional expertise in cryptography, distributed systems, or public records management. Elections Panel administrators must hold at least 12 years of professional expertise in elections administration or electoral technology. All administrators must hold no current or recent partisan affiliation and must pass the CLT.</w:t>
-      </w:r>
-    </w:p>
-    <w:p>
-      <w:pPr>
-        <w:spacing w:after="60" w:before="200"/>
-        <w:ind w:left="431"/>
-        <w:jc w:val="left"/>
-      </w:pPr>
-      <w:r>
-        <w:rPr>
-          <w:rFonts w:ascii="Courier New" w:cs="Courier New" w:eastAsia="Courier New" w:hAnsi="Courier New"/>
-          <w:b/>
-          <w:bCs/>
-          <w:color w:val="1B2A4A"/>
-          <w:sz w:val="18"/>
-          <w:szCs w:val="18"/>
-        </w:rPr>
-        <w:t xml:space="preserve">§16.1.b  </w:t>
-      </w:r>
-      <w:r>
-        <w:rPr>
-          <w:rFonts w:ascii="Garamond" w:cs="Garamond" w:eastAsia="Garamond" w:hAnsi="Garamond"/>
-          <w:b/>
-          <w:bCs/>
-          <w:i w:val="false"/>
-          <w:iCs w:val="false"/>
-          <w:color w:val="1B2A4A"/>
-          <w:sz w:val="22"/>
-          <w:szCs w:val="22"/>
-        </w:rPr>
-        <w:t xml:space="preserve">The Director</w:t>
-      </w:r>
-    </w:p>
-    <w:p>
-      <w:pPr>
-        <w:spacing w:after="120" w:before="0"/>
-        <w:ind w:left="431"/>
-        <w:jc w:val="both"/>
-      </w:pPr>
-      <w:r>
-        <w:rPr>
-          <w:rFonts w:ascii="Garamond" w:cs="Garamond" w:eastAsia="Garamond" w:hAnsi="Garamond"/>
-          <w:b w:val="false"/>
-          <w:bCs w:val="false"/>
-          <w:i w:val="false"/>
-          <w:iCs w:val="false"/>
-          <w:color w:val="2a2520"/>
-          <w:sz w:val="22"/>
-          <w:szCs w:val="22"/>
-        </w:rPr>
-        <w:t xml:space="preserve">The Commission elects its Director from among the six administrators by majority vote of the full Commission. The Director serves in that role for not more than 4 years and may not serve consecutive Director terms — after serving as Director a person must serve at least one full Director term as a panel member before standing again. The Director remains a full panel member throughout their Director service and retains their panel vote. As Director, they chair joint Commission sessions, cast deciding votes when the Commission is equally divided, and serve as the Commission's constitutional representative for external matters. The Director may not direct either panel in operational matters within that panel's independent domain. Where the Director role is vacant, the Commission elects an Acting Director from among its members within 7 days.</w:t>
+        <w:t xml:space="preserve">The PM nominates DIC administrators from the DIC Administrator Pool maintained by the Elections Panel. The Senate confirms by 2/3 supermajority. Administrators serve a primary 8-year non-renewable term. The PM may grant a single 2-year extension to any administrator before their term expires where a genuine ongoing operational matter requires continuity — the extension and stated reasons must be published to the NRS; the JIC assesses the stated justification and publishes its assessment within 30 days. Extensions are not the constitutional norm; no administrator may serve more than 10 years in total. Within each panel, terms are staggered so that no more than one seat expires in any calendar year, ensuring a continuous seniority hierarchy for the Chair function. At establishment, initial terms within each panel are assigned by lot across three offset starting points — one full 8-year term, one initial term of approximately 5 years, and one initial term of approximately 3 years — creating an immediate seniority hierarchy within each panel from day one. NRS Panel administrators must hold at least 12 years of professional expertise in cryptography, distributed systems, or public records management. Elections Panel administrators must hold at least 12 years of professional expertise in elections administration or electoral technology. All administrators must hold no current or recent partisan affiliation and must pass the CLT.</w:t>
       </w:r>
     </w:p>
     <w:p>
@@ -7791,7 +7740,7 @@
           <w:sz w:val="22"/>
           <w:szCs w:val="22"/>
         </w:rPr>
-        <w:t xml:space="preserve">For-cause removal of any DIC administrator requires: a substantiated finding from a State Designee Panel under §8.9; a 14-day SC appeal window from publication of the finding; and a 2/3 vote of both chambers simultaneously. Duty suspension triggers upon publication of a substantiated Panel finding. Any removal vote within 180 days of a major national election is automatically suspended pending SC review within 48 hours. The EI oversees the Commission as a whole for executive accountability purposes. The JIC audits NRS operation and integrity compliance annually under §8.12; the JI audits Elections Panel operations and electoral integrity annually. All findings are published to the NRS and transmitted to both chambers.</w:t>
+        <w:t xml:space="preserve">For-cause removal of any DIC administrator requires: a substantiated finding from a State Designee Panel under §8.9; a 14-day SC appeal window from publication of the finding; and a 2/3 vote of both chambers simultaneously. Duty suspension triggers upon publication of a substantiated Panel finding. Any removal vote within 180 days of a major national election is automatically suspended pending SC review within 48 hours. The EI oversees each panel for executive accountability purposes. The JIC audits NRS operation and integrity compliance annually under §8.12; the JI audits Elections Panel operations and electoral integrity annually. All findings are published to the NRS and transmitted to both chambers.</w:t>
       </w:r>
     </w:p>
     <w:p>
@@ -7893,7 +7842,7 @@
           <w:sz w:val="22"/>
           <w:szCs w:val="22"/>
         </w:rPr>
-        <w:t xml:space="preserve">Where a panel administrator seat becomes vacant mid-term, the PM nominates a replacement within 60 days and the Senate confirms within 90 days of the vacancy opening; failure to confirm within that period is a constitutional compliance breach. The replacement serves the remainder of the vacated term only. The Legislature must establish by statute a procedure for the Commission to adopt temporary technical measures in response to imminent security threats or system failures; emergency measures may not change electoral rules, timelines, or NRS record permanence; they expire within 72 hours unless ratified by the full Commission. The Legislature must by statute establish the transition from any predecessor voting infrastructure to the constitutionally required NVS, ensuring no gap in democratic participation.</w:t>
+        <w:t xml:space="preserve">Where a panel administrator seat becomes vacant mid-term, the PM nominates a replacement within 60 days and the Senate confirms within 90 days of the vacancy opening; failure to confirm within that period is a constitutional compliance breach. The replacement serves the remainder of the vacated term only. The Legislature must establish by statute a procedure for each panel to adopt temporary technical measures in response to imminent security threats or system failures within its domain; emergency measures may not change electoral rules, timelines, or NRS record permanence; they expire within 72 hours unless the full panel ratifies them by majority vote. The Legislature must by statute establish the transition from any predecessor voting infrastructure to the constitutionally required NVS, ensuring no gap in democratic participation.</w:t>
       </w:r>
     </w:p>
     <w:p>

</xml_diff>

<commit_message>
§11.4 Electoral Supermajority Threshold — 60% made explicit constitutional principle
New provision in Article XI stating that 60% of votes cast is the
constitutional threshold for all direct electoral supermajority
determinations. Covers §7.2 (presidential first-round), §4.4.a (SC
public confirmation), §8.15 (public election removal). Legislature
barred from altering without amendment. Distinguishes from simple
majority referendum/initiative provisions.
</commit_message>
<xml_diff>
--- a/constitution-current.docx
+++ b/constitution-current.docx
@@ -6226,6 +6226,55 @@
           <w:szCs w:val="22"/>
         </w:rPr>
         <w:t xml:space="preserve">Local governments — cities, counties, municipalities, and other subdivisions — receive constitutional recognition as primary points of contact between citizens and government. They are entitled to reasonable fiscal capacity to carry out their constitutional functions. States may not starve local governments to achieve de facto state centralization.</w:t>
+      </w:r>
+    </w:p>
+    <w:p>
+      <w:pPr>
+        <w:spacing w:after="60" w:before="200"/>
+        <w:ind w:left="431"/>
+        <w:jc w:val="left"/>
+      </w:pPr>
+      <w:r>
+        <w:rPr>
+          <w:rFonts w:ascii="Courier New" w:cs="Courier New" w:eastAsia="Courier New" w:hAnsi="Courier New"/>
+          <w:b/>
+          <w:bCs/>
+          <w:color w:val="1B2A4A"/>
+          <w:sz w:val="18"/>
+          <w:szCs w:val="18"/>
+        </w:rPr>
+        <w:t xml:space="preserve">§11.4  </w:t>
+      </w:r>
+      <w:r>
+        <w:rPr>
+          <w:rFonts w:ascii="Garamond" w:cs="Garamond" w:eastAsia="Garamond" w:hAnsi="Garamond"/>
+          <w:b/>
+          <w:bCs/>
+          <w:color w:val="1B2A4A"/>
+          <w:sz w:val="22"/>
+          <w:szCs w:val="22"/>
+        </w:rPr>
+        <w:t xml:space="preserve">Electoral Supermajority Threshold</w:t>
+      </w:r>
+    </w:p>
+    <w:p>
+      <w:pPr>
+        <w:spacing w:after="120" w:before="0"/>
+        <w:ind w:left="431"/>
+        <w:jc w:val="both"/>
+      </w:pPr>
+      <w:r>
+        <w:rPr>
+          <w:rFonts w:ascii="Garamond" w:cs="Garamond" w:eastAsia="Garamond" w:hAnsi="Garamond"/>
+          <w:b w:val="false"/>
+          <w:bCs w:val="false"/>
+          <w:i w:val="false"/>
+          <w:iCs w:val="false"/>
+          <w:color w:val="2a2520"/>
+          <w:sz w:val="22"/>
+          <w:szCs w:val="22"/>
+        </w:rPr>
+        <w:t xml:space="preserve">60% of votes cast is the constitutional threshold for all direct electoral supermajority determinations. This threshold applies wherever this Constitution requires a supermajority outcome in a citizen vote rather than a legislative vote: the presidential first-round threshold at which the State plurality requirement is waived (§7.2); public confirmation of a Supreme Court justice under the Senate bypass mechanism (§4.4.a); and public election removal of a constitutional officer under the Judicial Track (§8.15). The Legislature may not set a higher or lower threshold for any direct electoral supermajority determination without a constitutional amendment. This provision does not govern the optional referendum or citizen initiative under §11.1–§11.2, which require only a simple majority of votes cast; it governs determinations that require constitutional supermajority democratic consent.</w:t>
       </w:r>
     </w:p>
     <w:p>

</xml_diff>

<commit_message>
Constitutional simplification: 5 structural changes
1. §2.11 JEC — quarterly attendance mandate removed; JEC stands as
   institution, coordination frequency left to executives

2. §8.9 State Designee Panel — per-proceeding lottery replaced by
   standing body of 5; JIC constitutes by lottery at start of each
   2-year cycle; immediately available for any proceeding; review
   timeline moves to statute

3. §15.1 Amendment Paths — Path A and Path B collapsed into single
   Parliamentary Amendment path; proposing body specifies ratification
   mechanism (State or Popular) at time of proposal; Path C unchanged

4. §19.9 TAM — ~250 word constitutional machinery simplified to ~80
   word authorization principle; implementation delegated to statute

5. Governing principle applied: implementation timelines → statute;
   constitutional text states the principle and the protection
</commit_message>
<xml_diff>
--- a/constitution-current.docx
+++ b/constitution-current.docx
@@ -2328,7 +2328,7 @@
           <w:sz w:val="22"/>
           <w:szCs w:val="22"/>
         </w:rPr>
-        <w:t xml:space="preserve">The Joint Executive Council comprises the President's domain officers and the PM's Cabinet ministers meeting jointly as a standing cross-executive coordination body. The Council is the primary forum for matters that cross executive domains. Both executives must attend at least one session per quarter. The Council makes recommendations and coordinates positions; it does not exercise executive authority. A summary record of each session is published to the NRS within the period defined by statute. The existence and general subject of each session may not be classified. Operational procedures are defined by statute. In a cross-domain emergency — a crisis whose effective management requires unified operational authority across executive domains — either executive may propose a temporary operational lead designation to the JEC; the other executive must respond in writing within twelve hours; concurrence makes the designation effective and it is published to the NRS immediately with both executives' attributed positions; objection refers the dispute to the SC under §2.15 for expedited review. A temporary lead designation does not extinguish the other executive's domain authorities or certification functions — it assigns operational coordination, not constitutional supremacy. Judicial review of any lead designation is conducted after the emergency is stabilized, not during it; courts do not govern active crisis management.</w:t>
+        <w:t xml:space="preserve">The Joint Executive Council comprises the President's domain officers and the PM's Cabinet ministers meeting jointly as a standing cross-executive coordination body. The Council is the primary forum for matters that cross executive domains. The Council makes recommendations and coordinates positions; it does not exercise executive authority. A summary record of each session is published to the NRS within the period defined by statute. The existence and general subject of each session may not be classified. Operational procedures are defined by statute. In a cross-domain emergency — a crisis whose effective management requires unified operational authority across executive domains — either executive may propose a temporary operational lead designation to the JEC; the other executive must respond in writing within twelve hours; concurrence makes the designation effective and it is published to the NRS immediately with both executives' attributed positions; objection refers the dispute to the SC under §2.15 for expedited review. A temporary lead designation does not extinguish the other executive's domain authorities or certification functions — it assigns operational coordination, not constitutional supremacy. Judicial review of any lead designation is conducted after the emergency is stabilized, not during it; courts do not govern active crisis management.</w:t>
       </w:r>
     </w:p>
     <w:p>
@@ -5132,7 +5132,7 @@
           <w:sz w:val="22"/>
           <w:szCs w:val="22"/>
         </w:rPr>
-        <w:t xml:space="preserve">The State Designee Panel is constituted per proceeding to determine, before any qualifying for-cause removal vote, whether the stated grounds are substantiated within the enumerated constitutional categories for the relevant office. The Panel publishes a binary finding only — grounds substantiated or unsubstantiated. Each State maintains a standing State Designee Pool; eligibility requires at least five years of citizenship, no current or recent federal office, and no pending federal criminal proceedings. Pool membership is a public NRS record maintained by the LI. Upon activation, the JIC constitutes a Panel of five members by lottery within five days from the combined national pool. The Panel has 21 days from full constitution to review. The Panel determines only whether the stated grounds, as documented in the submitted record, constitute at least one enumerated constitutional category for the subject office — it does not independently investigate or assess credibility. A substantiated finding authorises the Legislature to proceed to a removal vote and triggers applicable duty suspension. The subject officer may petition the SC within 14 days; the Court reviews only whether constitutional categories were correctly applied and must rule within 21 days; a petition does not automatically stay duty suspension.</w:t>
+        <w:t xml:space="preserve">The State Designee Panel is a standing constitutional body of five members that determines, before any qualifying for-cause removal vote, whether the stated grounds are substantiated within the enumerated constitutional categories for the relevant office. The Panel publishes a binary finding only — grounds substantiated or unsubstantiated. Each State maintains a standing State Designee Pool; eligibility requires at least five years of citizenship, no current or recent federal office, and no pending federal criminal proceedings. Pool membership is a public NRS record maintained by the LI. The JIC constitutes the Panel by lottery from the combined national pool at the start of each two-year cycle; members serve two-year terms with staggered rotation so no more than three seats turn over in any single cycle. The Panel is available immediately upon any qualifying proceeding. The Panel determines only whether the stated grounds, as documented in the submitted record, constitute at least one enumerated constitutional category for the subject office — it does not independently investigate or assess credibility. The Panel must issue its finding within the period defined by statute. A substantiated finding authorises the Legislature to proceed to a removal vote and triggers applicable duty suspension. The subject officer may petition the SC; the Court reviews only whether constitutional categories were correctly applied; a petition does not automatically stay duty suspension.</w:t>
       </w:r>
     </w:p>
     <w:p>
@@ -7433,30 +7433,28 @@
           <w:sz w:val="22"/>
           <w:szCs w:val="22"/>
         </w:rPr>
-        <w:t xml:space="preserve">Two Amendment Paths</w:t>
-      </w:r>
-    </w:p>
-    <w:p>
-      <w:pPr>
-        <w:spacing w:after="120" w:before="0"/>
-        <w:ind w:left="431"/>
-        <w:jc w:val="both"/>
-      </w:pPr>
-      <w:r>
-        <w:rPr>
-          <w:rFonts w:ascii="Garamond" w:cs="Garamond" w:eastAsia="Garamond" w:hAnsi="Garamond"/>
-          <w:b w:val="false"/>
-          <w:bCs w:val="false"/>
-          <w:i w:val="false"/>
-          <w:iCs w:val="false"/>
-          <w:color w:val="2a2520"/>
-          <w:sz w:val="22"/>
-          <w:szCs w:val="22"/>
-        </w:rPr>
-        <w:t xml:space="preserve">This Constitution may be amended through two paths, both requiring a 2/3 supermajority of the full seated membership of both chambers as the legislative threshold. No executive signature is required; no executive veto applies. Every member's vote on any amendment is published to the NRS. 
-Path A — Legislative and State Ratification: A 2/3 supermajority of both chambers, followed by ratification by 2/3 of States. The Legislature defines the ratification period by statute. 
-Path B — Legislative and Popular Ratification: A 2/3 supermajority of both chambers, followed by a national popular referendum achieving 2/3 affirmative support with at least 55% citizen participation. The Legislature defines the referendum window by statute. 
-Both paths are available for any amendment. The proposing body specifies which path applies at the time of proposal. A proposed amendment may be withdrawn at any point before ratification is certified. Two amendments may be simultaneously in ratification; where they conflict, the one ratified later in time prevails.</w:t>
+        <w:t xml:space="preserve">Amendment Paths</w:t>
+      </w:r>
+    </w:p>
+    <w:p>
+      <w:pPr>
+        <w:spacing w:after="120" w:before="0"/>
+        <w:ind w:left="431"/>
+        <w:jc w:val="both"/>
+      </w:pPr>
+      <w:r>
+        <w:rPr>
+          <w:rFonts w:ascii="Garamond" w:cs="Garamond" w:eastAsia="Garamond" w:hAnsi="Garamond"/>
+          <w:b w:val="false"/>
+          <w:bCs w:val="false"/>
+          <w:i w:val="false"/>
+          <w:iCs w:val="false"/>
+          <w:color w:val="2a2520"/>
+          <w:sz w:val="22"/>
+          <w:szCs w:val="22"/>
+        </w:rPr>
+        <w:t xml:space="preserve">This Constitution may be amended through the parliamentary path or through citizen initiative. No executive signature is required; no executive veto applies. Every member’s vote on any amendment is published to the NRS.
+Parliamentary Amendment: A 2/3 supermajority of the full seated membership of both chambers proposes the amendment. The proposing body simultaneously specifies the ratification mechanism — either State Ratification (ratification by 2/3 of States within the period defined by statute) or Popular Ratification (a national popular referendum achieving 2/3 affirmative support with at least 55% citizen participation within 180 days). A proposed amendment may be withdrawn at any point before ratification is certified. Two amendments may be simultaneously in ratification; where they conflict, the one ratified later in time prevails.</w:t>
       </w:r>
     </w:p>
     <w:p>
@@ -8788,7 +8786,7 @@
           <w:sz w:val="22"/>
           <w:szCs w:val="22"/>
         </w:rPr>
-        <w:t xml:space="preserve">Where a ratifying polity's predecessor government has documented constitutional violations — systematic rights abuses, documented atrocities — the Republic may establish a Transitional Accountability Mechanism by statute passed by 2/3 of both chambers. The TAM is time-limited, non-criminal (it cannot impose criminal sentences or orders equivalent to criminal punishment), and subject to NRS publication. The TAM investigates, documents, and recommends remedies for serious violations committed by predecessor government entities; its jurisdiction is bounded to predecessor-era conduct. Findings may recommend criminal referrals, institutional restructuring, or reparative measures, but carry no binding force. The TAM may not publish preliminary or draft determinations — only finalized findings that have completed the evidentiary process. The establishing statute and any amendments require the same 2/3 majority; no amendment may expand the TAM's subject matter scope beyond the establishing statute. The TAM dissolves at its statutory sunset; its NRS record is permanent. Extension beyond the statutory sunset requires a fresh 2/3 supermajority in both chambers. No new Transitional Accountability Mechanism may be established within ten years of the sunset of a prior Mechanism.</w:t>
+        <w:t xml:space="preserve">Where a ratifying polity’s predecessor government has documented constitutional violations, the Legislature may by statute passed by 2/3 of both chambers establish a Transitional Accountability Mechanism. Such a mechanism must be time-limited, non-criminal, and consistent with Article I in all its operations. The establishing statute defines the scope, procedures, and duration; no amendment may expand the scope without the same 2/3 majority; the NRS record is permanent. No new Mechanism may be established within ten years of the sunset of a prior one.</w:t>
       </w:r>
     </w:p>
     <w:p>

</xml_diff>

<commit_message>
§8.9 State Designee Panel → SC Removal Grounds Review
Replace per-proceeding Panel with direct SC categorical determination.
Charging party (1/3 either chamber or 2 Inspectorates) files stated
grounds with SC. SC determines within 14 days whether grounds constitute
a statutory removal category. No standing body, no pool, no two-year
cycle, no per-proceeding logistics.

§8.15 Standard Track updated to reference SC categorical confirmation.
Article VIII heading: Inspectorates and Accountability.
Glossary: State Designee Panel removed, Removal Grounds Review added.
Legislature defines enumerated removal categories by statute.
</commit_message>
<xml_diff>
--- a/constitution-current.docx
+++ b/constitution-current.docx
@@ -4361,7 +4361,7 @@
           <w:sz w:val="34"/>
           <w:szCs w:val="34"/>
         </w:rPr>
-        <w:t xml:space="preserve">Article VIII — Inspectorates and the State Designee Panel</w:t>
+        <w:t xml:space="preserve">Article VIII — Inspectorates and Accountability</w:t>
       </w:r>
     </w:p>
     <w:p>
@@ -5112,27 +5112,27 @@
           <w:sz w:val="22"/>
           <w:szCs w:val="22"/>
         </w:rPr>
-        <w:t xml:space="preserve">State Designee Panel</w:t>
-      </w:r>
-    </w:p>
-    <w:p>
-      <w:pPr>
-        <w:spacing w:after="120" w:before="0"/>
-        <w:ind w:left="431"/>
-        <w:jc w:val="both"/>
-      </w:pPr>
-      <w:r>
-        <w:rPr>
-          <w:rFonts w:ascii="Garamond" w:cs="Garamond" w:eastAsia="Garamond" w:hAnsi="Garamond"/>
-          <w:b w:val="false"/>
-          <w:bCs w:val="false"/>
-          <w:i w:val="false"/>
-          <w:iCs w:val="false"/>
-          <w:color w:val="2a2520"/>
-          <w:sz w:val="22"/>
-          <w:szCs w:val="22"/>
-        </w:rPr>
-        <w:t xml:space="preserve">The State Designee Panel is a standing constitutional body of five members that determines, before any qualifying for-cause removal vote, whether the stated grounds are substantiated within the enumerated constitutional categories for the relevant office. The Panel publishes a binary finding only — grounds substantiated or unsubstantiated. Each State maintains a standing State Designee Pool; eligibility requires at least five years of citizenship, no current or recent federal office, and no pending federal criminal proceedings. Pool membership is a public NRS record maintained by the LI. The JIC constitutes the Panel by lottery from the combined national pool at the start of each two-year cycle; members serve two-year terms with staggered rotation so no more than three seats turn over in any single cycle. The Panel is available immediately upon any qualifying proceeding. The Panel determines only whether the stated grounds, as documented in the submitted record, constitute at least one enumerated constitutional category for the subject office — it does not independently investigate or assess credibility. The Panel must issue its finding within the period defined by statute. A substantiated finding authorises the Legislature to proceed to a removal vote and triggers applicable duty suspension. The subject officer may petition the SC; the Court reviews only whether constitutional categories were correctly applied; a petition does not automatically stay duty suspension.</w:t>
+        <w:t xml:space="preserve">Removal Grounds Review</w:t>
+      </w:r>
+    </w:p>
+    <w:p>
+      <w:pPr>
+        <w:spacing w:after="120" w:before="0"/>
+        <w:ind w:left="431"/>
+        <w:jc w:val="both"/>
+      </w:pPr>
+      <w:r>
+        <w:rPr>
+          <w:rFonts w:ascii="Garamond" w:cs="Garamond" w:eastAsia="Garamond" w:hAnsi="Garamond"/>
+          <w:b w:val="false"/>
+          <w:bCs w:val="false"/>
+          <w:i w:val="false"/>
+          <w:iCs w:val="false"/>
+          <w:color w:val="2a2520"/>
+          <w:sz w:val="22"/>
+          <w:szCs w:val="22"/>
+        </w:rPr>
+        <w:t xml:space="preserve">To initiate a standard track removal vote under §8.15, the charging party — a concurrent resolution of 1/3 of either chamber, or two of the three Inspectorates jointly — must file stated grounds with the SC. The SC determines within 14 days whether the stated grounds constitute at least one statutory removal category for the subject office as defined by the Legislature. If grounds are confirmed: duty suspension activates immediately and the Legislature may proceed to a removal vote. If grounds are not confirmed: the process closes and may not be reinitiated on the same grounds within six months. The SC reviews constitutional category only — it does not assess the factual merits or credibility of the underlying allegations. No per-proceeding panel is required; the SC performs this function directly. The Legislature defines the enumerated removal categories for each constitutionally confirmed office by statute; no removal vote may proceed without the SC’s categorical confirmation under this section.</w:t>
       </w:r>
     </w:p>
     <w:p>
@@ -9250,7 +9250,7 @@
           <w:sz w:val="22"/>
           <w:szCs w:val="22"/>
         </w:rPr>
-        <w:t xml:space="preserve">This section governs for-cause removal of all constitutionally confirmed independent officers except Supreme Court justices (§4.1.c) and elected executives. Two removal tracks are available. Standard Track: A substantiated finding from a State Designee Panel under §8.9 constitutes for-cause grounds; duty suspension is automatic on publication of the finding; removal requires a 2/3 vote of both chambers simultaneously; no removal vote may be held within 180 days of a major national election without prior SC review within 48 hours; either finding is a constitutional record. Judicial Track: Where two of the three Inspectorates jointly certify for-cause grounds and petition the SC, the SC determines within 30 days whether the certified grounds constitute sufficient cause for suspension; if cause is found, the officer is suspended and the most senior deputy acts in the interim; the Senate has 60 days to hold a removal vote, with 3/5 required for permanent removal; a vote failing 3/5 reinstates the officer and closes the process; where the Senate fails to vote within 60 days, the matter is placed before the next federal electoral period ballot or a Legislature-set special election with a minimum 90-day notice period; removal by election requires 60% of votes cast. The Judicial Track is available where the Standard Track’s legislative threshold appears unreachable due to demonstrated political gridlock. Officers subject to this framework include Inspector Generals, DIC administrators, MA board members, and all other constitutionally confirmed independent officers. Provisions governing specific offices may cross-reference this section without restating its terms.</w:t>
+        <w:t xml:space="preserve">This section governs for-cause removal of all constitutionally confirmed independent officers except Supreme Court justices (§4.1.c) and elected executives. Two removal tracks are available. Standard Track: The charging party files stated grounds with the SC under §8.9; the SC confirms grounds within 14 days; duty suspension activates immediately on confirmation; removal requires a 2/3 vote of both chambers simultaneously; no removal vote may be held within 180 days of a major national election without prior SC review within 48 hours. Judicial Track: Where two of the three Inspectorates jointly certify for-cause grounds and petition the SC, the SC determines within 30 days whether the certified grounds constitute sufficient cause for suspension; if cause is found, the officer is suspended and the most senior deputy acts in the interim; the Senate has 60 days to hold a removal vote, with 3/5 required for permanent removal; a vote failing 3/5 reinstates the officer and closes the process; where the Senate fails to vote within 60 days, the matter is placed before the next federal electoral period ballot or a Legislature-set special election with a minimum 90-day notice period; removal by election requires 60% of votes cast. The Judicial Track is available where the Standard Track’s legislative threshold appears unreachable due to demonstrated political gridlock. Officers subject to this framework include Inspector Generals, DIC administrators, MA board members, and all other constitutionally confirmed independent officers. Provisions governing specific offices may cross-reference this section without restating its terms.</w:t>
       </w:r>
     </w:p>
     <w:p>

</xml_diff>

<commit_message>
Seven-principle review: 8 constitutional changes
Applied all 7 constitutional design principles to the document:

§2.12: Premature clemency grant void by constitutional operation
§8.1.d/§8.12.a: Executive approval → notification (designation effective
  on acceptance; notice does not condition effectiveness)
§8.3: 24-month nomination deadlines → statutory timeline under §1.31
§8.6: Critical Failure remediation trigger added as standing requirement
§8.11: Removed entirely (annual reports + JIC + NRS cover all functions)
§9.3: Removed entirely (JIC annual audit + JI Elections Panel audit cover)
§9.5: 'prohibited' → 'prohibited and void' (void by constitutional
  operation from moment of creation; EI documents, does not void)
§16.1.a: CLT removed from appointment requirements (retained in §5.1.c
  naturalization where properly defined)
§8.14: cross-reference updated §8.11 → JIC annual audit
§8.12 JIC: Eight-Year Assessment reference removed
</commit_message>
<xml_diff>
--- a/constitution-current.docx
+++ b/constitution-current.docx
@@ -2226,7 +2226,7 @@
           <w:sz w:val="22"/>
           <w:szCs w:val="22"/>
         </w:rPr>
-        <w:t xml:space="preserve">Each executive holds clemency authority within their own domain only. Presidential clemency covers military law and national security offenses. PM clemency covers domestic offenses. Neither may pardon offenses within the other's domain. Self-clemency is absolutely prohibited for all constitutional officers; an attempted self-clemency is void and itself a constitutional violation. No clemency may be granted for offenses in which the granting executive was a participant or direct beneficiary. Before any grant, the EI publishes a factual background report to the NRS. Every petition, report, and grant or decline is published permanently to the NRS. Every grant is subject to cross-chamber transparency review. Group amnesty requires legislative action; no executive may grant group amnesty.</w:t>
+        <w:t xml:space="preserve">Each executive holds clemency authority within their own domain only. Presidential clemency covers military law and national security offenses. PM clemency covers domestic offenses. Neither may pardon offenses within the other's domain. Self-clemency is absolutely prohibited for all constitutional officers; an attempted self-clemency is void and itself a constitutional violation. No clemency may be granted for offenses in which the granting executive was a participant or direct beneficiary. Before any grant, the EI publishes a factual background report to the NRS. A clemency grant made before the EI report is published is void and of no legal effect. Every petition, report, and grant or decline is published permanently to the NRS. Every grant is subject to cross-chamber transparency review. Group amnesty requires legislative action; no executive may grant group amnesty.</w:t>
       </w:r>
     </w:p>
     <w:p>
@@ -4622,7 +4622,7 @@
           <w:sz w:val="22"/>
           <w:szCs w:val="22"/>
         </w:rPr>
-        <w:t xml:space="preserve">An IG’s constitutional authority terminates automatically at the moment their term expires — no further act or proceeding is required. Any official act taken after term expiry is constitutionally void. Where an unexpected vacancy arises mid-term — through death, resignation, removal, or certified incapacity — the most senior eligible member of the affected Inspectorate’s candidate pool by continuous pool tenure who accepts designation serves as Acting Inspector General until a successor is confirmed under §8.3. The Acting IG holds full constitutional authority of the office. The Acting IG is not eligible for permanent appointment to the position in which they serve; upon conclusion of acting service they return to the candidate pool. Both executives must approve the designation within 5 days of the vacancy arising; the designation is published to the NRS immediately. Pool membership satisfies the eligibility requirement of §1.31. Where an IG is certified incapacitated by the other two Inspectorates jointly, the incapacitated IG’s authority is suspended from the moment of joint certification and the acting mechanism under this provision activates immediately.</w:t>
+        <w:t xml:space="preserve">An IG’s constitutional authority terminates automatically at the moment their term expires — no further act or proceeding is required. Any official act taken after term expiry is constitutionally void. Where an unexpected vacancy arises mid-term — through death, resignation, removal, or certified incapacity — the most senior eligible member of the affected Inspectorate’s candidate pool by continuous pool tenure who accepts designation serves as Acting Inspector General until a successor is confirmed under §8.3. The Acting IG holds full constitutional authority of the office. The Acting IG is not eligible for permanent appointment to the position in which they serve; upon conclusion of acting service they return to the candidate pool. The JIC certifies the designation and both executives are notified immediately; notice does not condition the designation’s effectiveness. Pool membership satisfies the eligibility requirement of §1.31. Where an IG is certified incapacitated by the other two Inspectorates jointly, the incapacitated IG’s authority is suspended from the moment of joint certification and the acting mechanism under this provision activates immediately.</w:t>
       </w:r>
     </w:p>
     <w:p>
@@ -4724,7 +4724,7 @@
           <w:sz w:val="22"/>
           <w:szCs w:val="22"/>
         </w:rPr>
-        <w:t xml:space="preserve">LI IG: nominated by the SC from a pool of qualified candidates maintained by the Elections Panel no later than 24 months before the incumbent’s term expires, to ensure confirmation is complete before the transition; confirmed by national popular vote at the next federal electoral period following nomination, by simple majority of votes cast. The confirmed successor assumes full IG authority at the precise moment the incumbent’s term concludes under §1.31. If the confirmation vote fails, the §8.1.d acting mechanism activates and the SC initiates a new nomination from the pool within 60 days. EI IG: nominated by the House from a pool of qualified candidates maintained by the Elections Panel no later than 24 months before the incumbent’s term expires; confirmed by national popular vote at the next federal electoral period following nomination, by simple majority of votes cast, with JI vetting of the nominee’s disclosure record published before the vote. The same timing and failed-vote provisions apply. JI IG: selected by public lottery under §8.13 from the JI Candidate Pool under §8.4.a maintained by the Elections Panel, conducted no later than 24 months before the incumbent’s term expires; no separate confirmation required — the lottery result is the selection and the selected person assumes office at the precise moment the incumbent’s term concludes. All IGs serve 10-year non-renewable terms. No two IG terms may begin within 18 months of each other, ensuring continuous institutional knowledge across offices. The Elections Panel administers all IG confirmation votes as part of the regular federal electoral period ballot.</w:t>
+        <w:t xml:space="preserve">LI IG: nominated by the SC from a pool of qualified candidates maintained by the Elections Panel at the timeline defined by statute, sufficiently in advance to ensure confirmation is complete before the transition under §1.31; confirmed by national popular vote at the next federal electoral period following nomination, by simple majority of votes cast. The confirmed successor assumes full IG authority at the precise moment the incumbent’s term concludes under §1.31. If the confirmation vote fails, the §8.1.d acting mechanism activates and the SC initiates a new nomination from the pool within 60 days. EI IG: nominated by the House from a pool of qualified candidates maintained by the Elections Panel at the timeline defined by statute under §1.31; confirmed by national popular vote at the next federal electoral period following nomination, by simple majority of votes cast, with JI vetting of the nominee’s disclosure record published before the vote. The same timing and failed-vote provisions apply. JI IG: selected by public lottery under §8.13 from the JI Candidate Pool under §8.4.a maintained by the Elections Panel, conducted at the timeline defined by statute under §1.31; no separate confirmation required — the lottery result is the selection and the selected person assumes office at the precise moment the incumbent’s term concludes. All IGs serve 10-year non-renewable terms. No two IG terms may begin within 18 months of each other, ensuring continuous institutional knowledge across offices. The Elections Panel administers all IG confirmation votes as part of the regular federal electoral period ballot.</w:t>
       </w:r>
     </w:p>
     <w:p>
@@ -4979,7 +4979,7 @@
           <w:sz w:val="22"/>
           <w:szCs w:val="22"/>
         </w:rPr>
-        <w:t xml:space="preserve">The Inspectorates publish findings; they do not issue binding orders or legal determinations. Every finding, report, and discrepancy notice must be published to the NRS permanently and free of charge; no official may suppress, delay, classify, or alter an Inspectorate report before publication. Inspectorate reports are permanently exempt from classification. Any staff member may publish a minority report directly to the NRS if they believe a finding has been improperly omitted or suppressed — staff cannot be disciplined for doing so. All three Inspectorates jointly publish an annual State of the Republic report on a fixed date regardless of whether any political actor requests it. Where a compliance question spans multiple Inspectorate mandates, the Inspectorates may conduct a joint investigation; neither IG may veto the other's contribution. All three Inspectorates have unrestricted access to records, personnel, facilities, and systems within their audit mandate; obstruction is a constitutional breach.</w:t>
+        <w:t xml:space="preserve">The Inspectorates publish findings; they do not issue binding orders or legal determinations. Every finding, report, and discrepancy notice must be published to the NRS permanently and free of charge; no official may suppress, delay, classify, or alter an Inspectorate report before publication. Inspectorate reports are permanently exempt from classification. Where any Inspectorate publishes a Critical Failure finding, the Legislature must publish a remediation plan with actions and timelines within the period defined by statute; failure to publish a remediation plan is a constitutional compliance breach certified by the LI. Any staff member may publish a minority report directly to the NRS if they believe a finding has been improperly omitted or suppressed — staff cannot be disciplined for doing so. All three Inspectorates jointly publish an annual State of the Republic report on a fixed date regardless of whether any political actor requests it. Where a compliance question spans multiple Inspectorate mandates, the Inspectorates may conduct a joint investigation; neither IG may veto the other's contribution. All three Inspectorates have unrestricted access to records, personnel, facilities, and systems within their audit mandate; obstruction is a constitutional breach.</w:t>
       </w:r>
     </w:p>
     <w:p>
@@ -5201,57 +5201,6 @@
           <w:sz w:val="18"/>
           <w:szCs w:val="18"/>
         </w:rPr>
-        <w:t xml:space="preserve">§8.11  </w:t>
-      </w:r>
-      <w:r>
-        <w:rPr>
-          <w:rFonts w:ascii="Garamond" w:cs="Garamond" w:eastAsia="Garamond" w:hAnsi="Garamond"/>
-          <w:b/>
-          <w:bCs/>
-          <w:i w:val="false"/>
-          <w:iCs w:val="false"/>
-          <w:color w:val="1B2A4A"/>
-          <w:sz w:val="22"/>
-          <w:szCs w:val="22"/>
-        </w:rPr>
-        <w:t xml:space="preserve">Eight-Year Assessment</w:t>
-      </w:r>
-    </w:p>
-    <w:p>
-      <w:pPr>
-        <w:spacing w:after="120" w:before="0"/>
-        <w:ind w:left="431"/>
-        <w:jc w:val="both"/>
-      </w:pPr>
-      <w:r>
-        <w:rPr>
-          <w:rFonts w:ascii="Garamond" w:cs="Garamond" w:eastAsia="Garamond" w:hAnsi="Garamond"/>
-          <w:b w:val="false"/>
-          <w:bCs w:val="false"/>
-          <w:i w:val="false"/>
-          <w:iCs w:val="false"/>
-          <w:color w:val="2a2520"/>
-          <w:sz w:val="22"/>
-          <w:szCs w:val="22"/>
-        </w:rPr>
-        <w:t xml:space="preserve">Every eight years from the date of full constitutional operation, the three Inspectorates jointly assess constitutional framework performance across: Article I rights enforcement across all jurisdictions; Inspectorate functioning and mandate adequacy; social state obligation compliance including healthcare solvency and universal access; military subordination to constitutional authority; NRS coverage and integrity; and constitutional pool and lottery mechanism health. The assessment is published to the NRS and transmitted to both chambers. Findings are classified by severity: No Finding, Deficiency, or Critical Failure. For No Finding: acknowledgment is sufficient. For Deficiency: the Legislature must publish a remediation plan with actions and timelines; acknowledgment without a plan is a constitutional compliance breach certified by the LI. For Critical Failure: the Legislature must publish a remediation plan and any member may petition the SC to determine whether judicial remedy is required.</w:t>
-      </w:r>
-    </w:p>
-    <w:p>
-      <w:pPr>
-        <w:spacing w:after="60" w:before="200"/>
-        <w:ind w:left="431"/>
-        <w:jc w:val="left"/>
-      </w:pPr>
-      <w:r>
-        <w:rPr>
-          <w:rFonts w:ascii="Courier New" w:cs="Courier New" w:eastAsia="Courier New" w:hAnsi="Courier New"/>
-          <w:b/>
-          <w:bCs/>
-          <w:color w:val="1B2A4A"/>
-          <w:sz w:val="18"/>
-          <w:szCs w:val="18"/>
-        </w:rPr>
         <w:t xml:space="preserve">§8.12  </w:t>
       </w:r>
       <w:r>
@@ -5285,7 +5234,7 @@
           <w:sz w:val="22"/>
           <w:szCs w:val="22"/>
         </w:rPr>
-        <w:t xml:space="preserve">The three Inspector Generals jointly constitute the JIC as the standing coordination body for matters crossing Inspectorate jurisdictions. The JIC formally houses all jointly certified constitutional functions — including the Eight-Year Assessment, lottery draws, and selection processes throughout the constitution. The chair of any joint session is the IG whose domain covers the primary subject matter; where all domains are equally engaged, the chair rotates annually. Where the IGs cannot reach consensus on a joint matter, each publishes their individual assessment and the disagreement is noted in the permanent NRS record. The JIC conducts an annual NRS audit covering both operational compliance — whether the NRS is functioning as constitutionally required, accessible, and free of single points of failure — and content integrity — whether all constitutionally required publications across all domains have been made and no records have been altered or deleted. The joint annual NRS audit is published to both chambers. For the DIC Administrator Pool specifically, the JIC exercises enhanced oversight given the Elections Panel's administrative interest in its own membership pool: the JIC conducts quarterly review of pool health and certification accuracy; any JIC member may challenge the exclusion of any applicant and the Elections Panel must respond in writing within 14 days; and each pool entry requires joint certification published by the JIC alongside the relevant Inspectorate certification. The JIC has no authority to override the individual mandate of any Inspectorate.</w:t>
+        <w:t xml:space="preserve">The three Inspector Generals jointly constitute the JIC as the standing coordination body for matters crossing Inspectorate jurisdictions. The JIC formally houses all jointly certified constitutional functions — including lottery draws and selection processes throughout the constitution. The chair of any joint session is the IG whose domain covers the primary subject matter; where all domains are equally engaged, the chair rotates annually. Where the IGs cannot reach consensus on a joint matter, each publishes their individual assessment and the disagreement is noted in the permanent NRS record. The JIC conducts an annual NRS audit covering both operational compliance — whether the NRS is functioning as constitutionally required, accessible, and free of single points of failure — and content integrity — whether all constitutionally required publications across all domains have been made and no records have been altered or deleted. The joint annual NRS audit is published to both chambers. For the DIC Administrator Pool specifically, the JIC exercises enhanced oversight given the Elections Panel's administrative interest in its own membership pool: the JIC conducts quarterly review of pool health and certification accuracy; any JIC member may challenge the exclusion of any applicant and the Elections Panel must respond in writing within 14 days; and each pool entry requires joint certification published by the JIC alongside the relevant Inspectorate certification. The JIC has no authority to override the individual mandate of any Inspectorate.</w:t>
       </w:r>
     </w:p>
     <w:p>
@@ -5334,7 +5283,7 @@
           <w:sz w:val="22"/>
           <w:szCs w:val="22"/>
         </w:rPr>
-        <w:t xml:space="preserve">Where two of the three Inspectorates jointly certify that the third is operating in demonstrable bad faith, they petition the SC directly for confirmation of the finding; the SC rules within 14 days. Upon filing the petition, the two petitioning Inspectorates jointly designate an Acting Inspector General: the longest-tenured member of the affected Inspectorate’s candidate pool who accepts the designation and is approved by both executives. The Acting IG assumes all constitutional functions of the compromised Inspectorate from the moment of designation. If the SC does not confirm the finding, the Acting IG stands down and all functions return immediately to the original IG. If confirmed, the Acting IG serves until either the original IG is restored to full function or a new permanent IG is confirmed under §8.3 — whichever occurs first. The Acting IG is not eligible for permanent appointment to the position in which they serve; upon conclusion of acting service they return to the candidate pool.</w:t>
+        <w:t xml:space="preserve">Where two of the three Inspectorates jointly certify that the third is operating in demonstrable bad faith, they petition the SC directly for confirmation of the finding; the SC rules within 14 days. Upon filing the petition, the two petitioning Inspectorates jointly designate an Acting Inspector General: the longest-tenured member of the affected Inspectorate’s candidate pool who accepts the designation; both executives are notified immediately. The Acting IG assumes all constitutional functions of the compromised Inspectorate from the moment of designation. If the SC does not confirm the finding, the Acting IG stands down and all functions return immediately to the original IG. If confirmed, the Acting IG serves until either the original IG is restored to full function or a new permanent IG is confirmed under §8.3 — whichever occurs first. The Acting IG is not eligible for permanent appointment to the position in which they serve; upon conclusion of acting service they return to the candidate pool.</w:t>
       </w:r>
     </w:p>
     <w:p>
@@ -5461,7 +5410,7 @@
           <w:sz w:val="22"/>
           <w:szCs w:val="22"/>
         </w:rPr>
-        <w:t xml:space="preserve">These standards apply to all registries and candidate pools maintained under constitutional mandate. Eligibility criteria are strictly objective — years of practice or service, office status, and financial interests as defined by this Constitution or by statute. No registry administrator may apply criteria relating to legal philosophy, judicial temperament, ideological orientation, or political association; any exclusion on such grounds is constitutionally void. Where an applicant is excluded or removed, the administering body must publish the specific grounds to the NRS within 14 days. An excluded or removed applicant may petition the SC within 30 days of NRS publication; the SC reviews only whether the stated grounds correspond to an established eligibility criterion — it does not review the factual merits of the determination. The §8.11 eight-year assessment must evaluate each registry for pool depth, distribution, and patterns in exclusion decisions.</w:t>
+        <w:t xml:space="preserve">These standards apply to all registries and candidate pools maintained under constitutional mandate. Eligibility criteria are strictly objective — years of practice or service, office status, and financial interests as defined by this Constitution or by statute. No registry administrator may apply criteria relating to legal philosophy, judicial temperament, ideological orientation, or political association; any exclusion on such grounds is constitutionally void. Where an applicant is excluded or removed, the administering body must publish the specific grounds to the NRS within 14 days. An excluded or removed applicant may petition the SC within 30 days of NRS publication; the SC reviews only whether the stated grounds correspond to an established eligibility criterion — it does not review the factual merits of the determination. The JIC annual audit must evaluate each registry for pool depth, distribution, and patterns in exclusion decisions.</w:t>
       </w:r>
     </w:p>
     <w:p>
@@ -5530,57 +5479,6 @@
           <w:sz w:val="18"/>
           <w:szCs w:val="18"/>
         </w:rPr>
-        <w:t xml:space="preserve">§9.3  </w:t>
-      </w:r>
-      <w:r>
-        <w:rPr>
-          <w:rFonts w:ascii="Garamond" w:cs="Garamond" w:eastAsia="Garamond" w:hAnsi="Garamond"/>
-          <w:b/>
-          <w:bCs/>
-          <w:i w:val="false"/>
-          <w:iCs w:val="false"/>
-          <w:color w:val="1B2A4A"/>
-          <w:sz w:val="22"/>
-          <w:szCs w:val="22"/>
-        </w:rPr>
-        <w:t xml:space="preserve">Digital Infrastructure Advisory Council</w:t>
-      </w:r>
-    </w:p>
-    <w:p>
-      <w:pPr>
-        <w:spacing w:after="120" w:before="0"/>
-        <w:ind w:left="431"/>
-        <w:jc w:val="both"/>
-      </w:pPr>
-      <w:r>
-        <w:rPr>
-          <w:rFonts w:ascii="Garamond" w:cs="Garamond" w:eastAsia="Garamond" w:hAnsi="Garamond"/>
-          <w:b w:val="false"/>
-          <w:bCs w:val="false"/>
-          <w:i w:val="false"/>
-          <w:iCs w:val="false"/>
-          <w:color w:val="2a2520"/>
-          <w:sz w:val="22"/>
-          <w:szCs w:val="22"/>
-        </w:rPr>
-        <w:t xml:space="preserve">The NRS and NVS are reviewed decennially by the Digital Infrastructure Advisory Council — an independent expert body that publishes advisory findings and recommendations to the Digital Infrastructure Commission. The Council convenes every ten years from the date of the first Legislature convening; the Legislature may not adjust the decennial trigger by statute. Each State may nominate qualified persons to the Advisory Pool at any time; pool entry and certification follow §8.13. The JIC constitutes the Council by public lottery drawing five members from the eligible pool when a decennial review is triggered. Advisory Council findings are published jointly by all three Inspectorates to the NRS and transmitted to the Commission Director and both panel chairs simultaneously. The Commission must publish its response — accepting, modifying, or declining each recommendation with published reasons — within 90 days of findings publication. The Senate must hold a mandatory public session at which Advisory Council members present their findings and respond to questions within 90 days of publication; failure to schedule within 30 days is a constitutional compliance breach certified by the LI.</w:t>
-      </w:r>
-    </w:p>
-    <w:p>
-      <w:pPr>
-        <w:spacing w:after="60" w:before="200"/>
-        <w:ind w:left="431"/>
-        <w:jc w:val="left"/>
-      </w:pPr>
-      <w:r>
-        <w:rPr>
-          <w:rFonts w:ascii="Courier New" w:cs="Courier New" w:eastAsia="Courier New" w:hAnsi="Courier New"/>
-          <w:b/>
-          <w:bCs/>
-          <w:color w:val="1B2A4A"/>
-          <w:sz w:val="18"/>
-          <w:szCs w:val="18"/>
-        </w:rPr>
         <w:t xml:space="preserve">§9.4  </w:t>
       </w:r>
       <w:r>
@@ -5663,7 +5561,7 @@
           <w:sz w:val="22"/>
           <w:szCs w:val="22"/>
         </w:rPr>
-        <w:t xml:space="preserve">Government records may be classified only on grounds the Legislature defines by statute. Classification to conceal a constitutional violation, policy disagreement, or political embarrassment is prohibited. The classifying authority must state the statutory ground at the time of classification.</w:t>
+        <w:t xml:space="preserve">Government records may be classified only on grounds the Legislature defines by statute. Classification to conceal a constitutional violation, policy disagreement, or political embarrassment is prohibited and void. The classifying authority must state the statutory ground at the time of classification.</w:t>
       </w:r>
     </w:p>
     <w:p>
@@ -7736,7 +7634,7 @@
           <w:sz w:val="22"/>
           <w:szCs w:val="22"/>
         </w:rPr>
-        <w:t xml:space="preserve">The PM nominates DIC administrators from the DIC Administrator Pool maintained by the Elections Panel. The Senate confirms by 2/3 supermajority. Administrators serve a primary 8-year non-renewable term. The PM may grant a single 2-year extension to any administrator before their term expires where a genuine ongoing operational matter requires continuity — the extension and stated reasons must be published to the NRS; the JIC assesses the stated justification and publishes its assessment within 30 days. Extensions are not the constitutional norm; no administrator may serve more than 10 years in total. Within each panel, terms are staggered so that no more than one seat expires in any calendar year, ensuring a continuous seniority hierarchy for the Chair function. At establishment, initial terms within each panel are assigned by lot across three offset starting points — one full 8-year term, one initial term of approximately 5 years, and one initial term of approximately 3 years — creating an immediate seniority hierarchy within each panel from day one. NRS Panel administrators must hold at least 12 years of professional expertise in cryptography, distributed systems, or public records management. Elections Panel administrators must hold at least 12 years of professional expertise in elections administration or electoral technology. All administrators must hold no current or recent partisan affiliation and must pass the CLT.</w:t>
+        <w:t xml:space="preserve">The PM nominates DIC administrators from the DIC Administrator Pool maintained by the Elections Panel. The Senate confirms by 2/3 supermajority. Administrators serve a primary 8-year non-renewable term. The PM may grant a single 2-year extension to any administrator before their term expires where a genuine ongoing operational matter requires continuity — the extension and stated reasons must be published to the NRS; the JIC assesses the stated justification and publishes its assessment within 30 days. Extensions are not the constitutional norm; no administrator may serve more than 10 years in total. Within each panel, terms are staggered so that no more than one seat expires in any calendar year, ensuring a continuous seniority hierarchy for the Chair function. At establishment, initial terms within each panel are assigned by lot across three offset starting points — one full 8-year term, one initial term of approximately 5 years, and one initial term of approximately 3 years — creating an immediate seniority hierarchy within each panel from day one. NRS Panel administrators must hold at least 12 years of professional expertise in cryptography, distributed systems, or public records management. Elections Panel administrators must hold at least 12 years of professional expertise in elections administration or electoral technology. All administrators must hold no current or recent partisan affiliation.</w:t>
       </w:r>
     </w:p>
     <w:p>

</xml_diff>

<commit_message>
Fine detail review: spelling, grammar, ordering, stale references
Structural:
- §4.3.a and §4.3.b reordered to immediately follow §4.3 (before §4.4)
- §15.1: redundant two-amendments sentence removed; §15.5 handles fully

Stale references:
- §15.2: 'Path A'/'Path B' → 'State Ratification'/'Popular Ratification'

Grammar:
- 'Inspector Generals' (×2) → 'Inspectors General' (§8.12, §8.15)
- §19.10: 'shall establish' → 'must establish' (only 'shall' in document)
- §19.7: 'a state fails' → 'a State fails'

Phrasing:
- §8.3: 'at the timeline defined by statute, sufficiently in advance'
  → cleaner construction across all three IG selection provisions

Spelling standardized to American English throughout:
- authoris* → authoriz* (6 authorisation, 2 authorise, 1 authorising)
- recognis* → recogniz* (6 recognised, 1 recognising incl. preamble)
- organised → organized (1)
- self-defence/defence → self-defense/defense (4)
</commit_message>
<xml_diff>
--- a/constitution-current.docx
+++ b/constitution-current.docx
@@ -185,7 +185,7 @@
           <w:sz w:val="24"/>
           <w:szCs w:val="24"/>
         </w:rPr>
-        <w:t xml:space="preserve">We, the people of the Federated Republic, recognising that legitimate government derives its authority solely from the consent of the governed; that individual rights precede and constrain all governmental authority; that transparency and accountability are prerequisites for democratic legitimacy; and that the diversity of our communities and the integrity of our federation are both worth protecting — do ordain and establish this Constitution.</w:t>
+        <w:t xml:space="preserve">We, the people of the Federated Republic, recognizing that legitimate government derives its authority solely from the consent of the governed; that individual rights precede and constrain all governmental authority; that transparency and accountability are prerequisites for democratic legitimacy; and that the diversity of our communities and the integrity of our federation are both worth protecting — do ordain and establish this Constitution.</w:t>
       </w:r>
     </w:p>
     <w:p>
@@ -569,7 +569,7 @@
           <w:sz w:val="22"/>
           <w:szCs w:val="22"/>
         </w:rPr>
-        <w:t xml:space="preserve">Every person holds sovereign authority over their own body. Medical decisions are the province of the individual and their chosen provider. The state may promote public health through information, licensing, and access; it may not compel medical decisions or penalise their exercise. Every person holds the right to privacy in their person, home, communications, and data. Searches, surveillance, and data collection by government require prior independent judicial authorisation based on specific, articulable grounds. The Legislature establishes by statute the warrant framework, subject to the requirement of independent judicial oversight. Communications and stored data receive equivalent protection to physical premises. Encryption is a lawful means of protecting private information and may not be prohibited. No government may impose civil or criminal liability on any person solely for receiving, assisting access to, or providing accurate information about medical care that was lawful where received.</w:t>
+        <w:t xml:space="preserve">Every person holds sovereign authority over their own body. Medical decisions are the province of the individual and their chosen provider. The state may promote public health through information, licensing, and access; it may not compel medical decisions or penalise their exercise. Every person holds the right to privacy in their person, home, communications, and data. Searches, surveillance, and data collection by government require prior independent judicial authorization based on specific, articulable grounds. The Legislature establishes by statute the warrant framework, subject to the requirement of independent judicial oversight. Communications and stored data receive equivalent protection to physical premises. Encryption is a lawful means of protecting private information and may not be prohibited. No government may impose civil or criminal liability on any person solely for receiving, assisting access to, or providing accurate information about medical care that was lawful where received.</w:t>
       </w:r>
     </w:p>
     <w:p>
@@ -620,7 +620,7 @@
           <w:sz w:val="22"/>
           <w:szCs w:val="22"/>
         </w:rPr>
-        <w:t xml:space="preserve">Every person holds the right to own property and to security in their home. The state may take private property for public use only upon payment of just compensation determined by independent process, not by the taking authority. The home may not be entered without the occupant's consent or prior independent judicial authorisation.</w:t>
+        <w:t xml:space="preserve">Every person holds the right to own property and to security in their home. The state may take private property for public use only upon payment of just compensation determined by independent process, not by the taking authority. The home may not be entered without the occupant's consent or prior independent judicial authorization.</w:t>
       </w:r>
     </w:p>
     <w:p>
@@ -722,7 +722,7 @@
           <w:sz w:val="22"/>
           <w:szCs w:val="22"/>
         </w:rPr>
-        <w:t xml:space="preserve">The right to keep and bear arms for lawful purposes including self-defence is recognised. States may establish licensing and safety frameworks. No government may enact a categorical prohibition on the civilian ownership of arms. The Legislature and States may regulate the type, transfer, and carry of arms subject to the requirement that lawful ownership for self-defence remain available.</w:t>
+        <w:t xml:space="preserve">The right to keep and bear arms for lawful purposes including self-defense is recognized. States may establish licensing and safety frameworks. No government may enact a categorical prohibition on the civilian ownership of arms. The Legislature and States may regulate the type, transfer, and carry of arms subject to the requirement that lawful ownership for self-defense remain available.</w:t>
       </w:r>
     </w:p>
     <w:p>
@@ -824,7 +824,7 @@
           <w:sz w:val="22"/>
           <w:szCs w:val="22"/>
         </w:rPr>
-        <w:t xml:space="preserve">Every person accused of a criminal offence holds: the right to be informed promptly of the charges; the right to counsel of their choosing, or to competent, adequately resourced counsel appointed at public expense where they cannot afford representation; the right to adequate time and means to prepare a defence; the right to examine witnesses; the right to silence without adverse inference; and the right to a speedy trial. No person may be penalised — by sentence enhancement or otherwise — solely for exercising the right to trial. Bail may not be used as punishment; its purpose is ensuring appearance and public safety, calibrated to individual circumstances. The Legislature establishes by statute the procedural framework for criminal proceedings, subject to the requirements of this provision. Where algorithmic systems are used as evidence, the accused has the right to examine the system's methodology.</w:t>
+        <w:t xml:space="preserve">Every person accused of a criminal offence holds: the right to be informed promptly of the charges; the right to counsel of their choosing, or to competent, adequately resourced counsel appointed at public expense where they cannot afford representation; the right to adequate time and means to prepare a defense; the right to examine witnesses; the right to silence without adverse inference; and the right to a speedy trial. No person may be penalised — by sentence enhancement or otherwise — solely for exercising the right to trial. Bail may not be used as punishment; its purpose is ensuring appearance and public safety, calibrated to individual circumstances. The Legislature establishes by statute the procedural framework for criminal proceedings, subject to the requirements of this provision. Where algorithmic systems are used as evidence, the accused has the right to examine the system's methodology.</w:t>
       </w:r>
     </w:p>
     <w:p>
@@ -1767,7 +1767,7 @@
           <w:sz w:val="22"/>
           <w:szCs w:val="22"/>
         </w:rPr>
-        <w:t xml:space="preserve">The President directs foreign intelligence. No intelligence operation may be conducted against Republic citizens within Republic territory on the President's authority; such operations require independent judicial authorisation. The EI reports any order authorising domestic intelligence operations without judicial authorisation to the NRS. The President may veto legislation that raises a genuine constitutional concern within the President's security domain — military operations, intelligence, treaty obligations, or border security. A general or speculative security connection is insufficient. Either Speaker may request an EI assessment of whether the veto falls within the President's defined domain; the EI publishes its finding to the NRS within 48 hours.</w:t>
+        <w:t xml:space="preserve">The President directs foreign intelligence. No intelligence operation may be conducted against Republic citizens within Republic territory on the President's authority; such operations require independent judicial authorization. The EI reports any order authorizing domestic intelligence operations without judicial authorization to the NRS. The President may veto legislation that raises a genuine constitutional concern within the President's security domain — military operations, intelligence, treaty obligations, or border security. A general or speculative security connection is insufficient. Either Speaker may request an EI assessment of whether the veto falls within the President's defined domain; the EI publishes its finding to the NRS within 48 hours.</w:t>
       </w:r>
     </w:p>
     <w:p>
@@ -3194,7 +3194,105 @@
           <w:sz w:val="22"/>
           <w:szCs w:val="22"/>
         </w:rPr>
-        <w:t xml:space="preserve">The Supreme Court consists initially of nine justices organised into three staggered classes, each serving a single non-renewable 12-year term. The Legislature may increase the number of justices by statute requiring 2/3 of both chambers; any seat added must be filled within 18 months or expires by operation of law. The Legislature may decrease the number only by 2/3 of both chambers, effective through natural attrition only, never by removing a sitting justice. The Court may not fall below three justices. Where the Court is equally divided, the challenged ruling of the lower court or government body stands.</w:t>
+        <w:t xml:space="preserve">The Supreme Court consists initially of nine justices organized into three staggered classes, each serving a single non-renewable 12-year term. The Legislature may increase the number of justices by statute requiring 2/3 of both chambers; any seat added must be filled within 18 months or expires by operation of law. The Legislature may decrease the number only by 2/3 of both chambers, effective through natural attrition only, never by removing a sitting justice. The Court may not fall below three justices. Where the Court is equally divided, the challenged ruling of the lower court or government body stands.</w:t>
+      </w:r>
+    </w:p>
+    <w:p>
+      <w:pPr>
+        <w:spacing w:after="60" w:before="200"/>
+        <w:ind w:left="431"/>
+        <w:jc w:val="left"/>
+      </w:pPr>
+      <w:r>
+        <w:rPr>
+          <w:rFonts w:ascii="Courier New" w:cs="Courier New" w:eastAsia="Courier New" w:hAnsi="Courier New"/>
+          <w:b/>
+          <w:bCs/>
+          <w:color w:val="1B2A4A"/>
+          <w:sz w:val="18"/>
+          <w:szCs w:val="18"/>
+        </w:rPr>
+        <w:t xml:space="preserve">§4.3.a  </w:t>
+      </w:r>
+      <w:r>
+        <w:rPr>
+          <w:rFonts w:ascii="Garamond" w:cs="Garamond" w:eastAsia="Garamond" w:hAnsi="Garamond"/>
+          <w:b/>
+          <w:bCs/>
+          <w:color w:val="1B2A4A"/>
+          <w:sz w:val="22"/>
+          <w:szCs w:val="22"/>
+        </w:rPr>
+        <w:t xml:space="preserve">Supreme Court Quorum</w:t>
+      </w:r>
+    </w:p>
+    <w:p>
+      <w:pPr>
+        <w:spacing w:after="120" w:before="0"/>
+        <w:ind w:left="431"/>
+        <w:jc w:val="both"/>
+      </w:pPr>
+      <w:r>
+        <w:rPr>
+          <w:rFonts w:ascii="Garamond" w:cs="Garamond" w:eastAsia="Garamond" w:hAnsi="Garamond"/>
+          <w:b w:val="false"/>
+          <w:bCs w:val="false"/>
+          <w:i w:val="false"/>
+          <w:iCs w:val="false"/>
+          <w:color w:val="2a2520"/>
+          <w:sz w:val="22"/>
+          <w:szCs w:val="22"/>
+        </w:rPr>
+        <w:t xml:space="preserve">A majority of the SC’s seated justices — including any Temporary Associate Justices — constitutes quorum for ordinary decisions. Constitutional questions require a minimum of five justices regardless of total seated membership. Where insufficient Appellate Court judges are available for Temporary Associate Justice designation, the most senior federal District Court judges by continuous service fill remaining positions in order on the same temporary basis.</w:t>
+      </w:r>
+    </w:p>
+    <w:p>
+      <w:pPr>
+        <w:spacing w:after="60" w:before="200"/>
+        <w:ind w:left="431"/>
+        <w:jc w:val="left"/>
+      </w:pPr>
+      <w:r>
+        <w:rPr>
+          <w:rFonts w:ascii="Courier New" w:cs="Courier New" w:eastAsia="Courier New" w:hAnsi="Courier New"/>
+          <w:b/>
+          <w:bCs/>
+          <w:color w:val="1B2A4A"/>
+          <w:sz w:val="18"/>
+          <w:szCs w:val="18"/>
+        </w:rPr>
+        <w:t xml:space="preserve">§4.3.b  </w:t>
+      </w:r>
+      <w:r>
+        <w:rPr>
+          <w:rFonts w:ascii="Garamond" w:cs="Garamond" w:eastAsia="Garamond" w:hAnsi="Garamond"/>
+          <w:b/>
+          <w:bCs/>
+          <w:color w:val="1B2A4A"/>
+          <w:sz w:val="22"/>
+          <w:szCs w:val="22"/>
+        </w:rPr>
+        <w:t xml:space="preserve">Supreme Court Justice Removal</w:t>
+      </w:r>
+    </w:p>
+    <w:p>
+      <w:pPr>
+        <w:spacing w:after="120" w:before="0"/>
+        <w:ind w:left="431"/>
+        <w:jc w:val="both"/>
+      </w:pPr>
+      <w:r>
+        <w:rPr>
+          <w:rFonts w:ascii="Garamond" w:cs="Garamond" w:eastAsia="Garamond" w:hAnsi="Garamond"/>
+          <w:b w:val="false"/>
+          <w:bCs w:val="false"/>
+          <w:i w:val="false"/>
+          <w:iCs w:val="false"/>
+          <w:color w:val="2a2520"/>
+          <w:sz w:val="22"/>
+          <w:szCs w:val="22"/>
+        </w:rPr>
+        <w:t xml:space="preserve">A Supreme Court justice may be removed only for cause. Three grounds constitute sufficient cause: a published EI finding of constitutional breach in the exercise of judicial authority; certified permanent incapacity jointly certified by the EI and LI; or conviction for a disqualifying offense. Removal requires a 2/3 vote of both chambers simultaneously following publication of the relevant ground. No removal vote may be held within 180 days of a major national election without prior SC review within 48 hours. Judicial disagreement — however profound — does not constitute grounds for removal; the independence of SC judicial judgment is absolute within the scope of Article I. Upon removal, the most senior Appellate Court judge auto-designates as Temporary Associate Justice under §4.4 until the vacancy is filled.</w:t>
       </w:r>
     </w:p>
     <w:p>
@@ -3263,104 +3361,6 @@
           <w:sz w:val="18"/>
           <w:szCs w:val="18"/>
         </w:rPr>
-        <w:t xml:space="preserve">§4.3.a  </w:t>
-      </w:r>
-      <w:r>
-        <w:rPr>
-          <w:rFonts w:ascii="Garamond" w:cs="Garamond" w:eastAsia="Garamond" w:hAnsi="Garamond"/>
-          <w:b/>
-          <w:bCs/>
-          <w:color w:val="1B2A4A"/>
-          <w:sz w:val="22"/>
-          <w:szCs w:val="22"/>
-        </w:rPr>
-        <w:t xml:space="preserve">Supreme Court Quorum</w:t>
-      </w:r>
-    </w:p>
-    <w:p>
-      <w:pPr>
-        <w:spacing w:after="120" w:before="0"/>
-        <w:ind w:left="431"/>
-        <w:jc w:val="both"/>
-      </w:pPr>
-      <w:r>
-        <w:rPr>
-          <w:rFonts w:ascii="Garamond" w:cs="Garamond" w:eastAsia="Garamond" w:hAnsi="Garamond"/>
-          <w:b w:val="false"/>
-          <w:bCs w:val="false"/>
-          <w:i w:val="false"/>
-          <w:iCs w:val="false"/>
-          <w:color w:val="2a2520"/>
-          <w:sz w:val="22"/>
-          <w:szCs w:val="22"/>
-        </w:rPr>
-        <w:t xml:space="preserve">A majority of the SC’s seated justices — including any Temporary Associate Justices — constitutes quorum for ordinary decisions. Constitutional questions require a minimum of five justices regardless of total seated membership. Where insufficient Appellate Court judges are available for Temporary Associate Justice designation, the most senior federal District Court judges by continuous service fill remaining positions in order on the same temporary basis.</w:t>
-      </w:r>
-    </w:p>
-    <w:p>
-      <w:pPr>
-        <w:spacing w:after="60" w:before="200"/>
-        <w:ind w:left="431"/>
-        <w:jc w:val="left"/>
-      </w:pPr>
-      <w:r>
-        <w:rPr>
-          <w:rFonts w:ascii="Courier New" w:cs="Courier New" w:eastAsia="Courier New" w:hAnsi="Courier New"/>
-          <w:b/>
-          <w:bCs/>
-          <w:color w:val="1B2A4A"/>
-          <w:sz w:val="18"/>
-          <w:szCs w:val="18"/>
-        </w:rPr>
-        <w:t xml:space="preserve">§4.3.b  </w:t>
-      </w:r>
-      <w:r>
-        <w:rPr>
-          <w:rFonts w:ascii="Garamond" w:cs="Garamond" w:eastAsia="Garamond" w:hAnsi="Garamond"/>
-          <w:b/>
-          <w:bCs/>
-          <w:color w:val="1B2A4A"/>
-          <w:sz w:val="22"/>
-          <w:szCs w:val="22"/>
-        </w:rPr>
-        <w:t xml:space="preserve">Supreme Court Justice Removal</w:t>
-      </w:r>
-    </w:p>
-    <w:p>
-      <w:pPr>
-        <w:spacing w:after="120" w:before="0"/>
-        <w:ind w:left="431"/>
-        <w:jc w:val="both"/>
-      </w:pPr>
-      <w:r>
-        <w:rPr>
-          <w:rFonts w:ascii="Garamond" w:cs="Garamond" w:eastAsia="Garamond" w:hAnsi="Garamond"/>
-          <w:b w:val="false"/>
-          <w:bCs w:val="false"/>
-          <w:i w:val="false"/>
-          <w:iCs w:val="false"/>
-          <w:color w:val="2a2520"/>
-          <w:sz w:val="22"/>
-          <w:szCs w:val="22"/>
-        </w:rPr>
-        <w:t xml:space="preserve">A Supreme Court justice may be removed only for cause. Three grounds constitute sufficient cause: a published EI finding of constitutional breach in the exercise of judicial authority; certified permanent incapacity jointly certified by the EI and LI; or conviction for a disqualifying offense. Removal requires a 2/3 vote of both chambers simultaneously following publication of the relevant ground. No removal vote may be held within 180 days of a major national election without prior SC review within 48 hours. Judicial disagreement — however profound — does not constitute grounds for removal; the independence of SC judicial judgment is absolute within the scope of Article I. Upon removal, the most senior Appellate Court judge auto-designates as Temporary Associate Justice under §4.4 until the vacancy is filled.</w:t>
-      </w:r>
-    </w:p>
-    <w:p>
-      <w:pPr>
-        <w:spacing w:after="60" w:before="200"/>
-        <w:ind w:left="431"/>
-        <w:jc w:val="left"/>
-      </w:pPr>
-      <w:r>
-        <w:rPr>
-          <w:rFonts w:ascii="Courier New" w:cs="Courier New" w:eastAsia="Courier New" w:hAnsi="Courier New"/>
-          <w:b/>
-          <w:bCs/>
-          <w:color w:val="1B2A4A"/>
-          <w:sz w:val="18"/>
-          <w:szCs w:val="18"/>
-        </w:rPr>
         <w:t xml:space="preserve">§4.4.a  </w:t>
       </w:r>
       <w:r>
@@ -3494,7 +3494,7 @@
           <w:sz w:val="22"/>
           <w:szCs w:val="22"/>
         </w:rPr>
-        <w:t xml:space="preserve">Judicial judgments, official records, and authenticated documents are recognised across all jurisdictions within the Republic. A judgment valid in one jurisdiction must be recognised in all others. Non-recognition grounds are exhaustive: the issuing court lacked jurisdiction; the judgment was obtained by fraud; or enforcement would require an act defined by the Legislature as categorically unenforceable. Judgments contrary to Article I are void by operation of §15.6. A judgment or status order published to the NRS is self-authenticating in any Republic court and takes immediate effect without re-registration. No State or Territory may discriminate in recognition based on the nature of the parties or the subject matter recognised by the issuing jurisdiction.</w:t>
+        <w:t xml:space="preserve">Judicial judgments, official records, and authenticated documents are recognized across all jurisdictions within the Republic. A judgment valid in one jurisdiction must be recognized in all others. Non-recognition grounds are exhaustive: the issuing court lacked jurisdiction; the judgment was obtained by fraud; or enforcement would require an act defined by the Legislature as categorically unenforceable. Judgments contrary to Article I are void by operation of §15.6. A judgment or status order published to the NRS is self-authenticating in any Republic court and takes immediate effect without re-registration. No State or Territory may discriminate in recognition based on the nature of the parties or the subject matter recognized by the issuing jurisdiction.</w:t>
       </w:r>
     </w:p>
     <w:p>
@@ -4571,7 +4571,7 @@
           <w:sz w:val="22"/>
           <w:szCs w:val="22"/>
         </w:rPr>
-        <w:t xml:space="preserve">The EI audits both executives and the Monetary Authority. Annual responsibilities include: military compliance assessment covering whether tier authorisations were followed, whether the §2.3 intelligence warrant requirement was maintained, and whether fund certifications were observed; publishing clemency background reports before any executive act; reviewing disclosure records for constitutional appointments; and auditing electoral finance within the period defined by statute following any election.</w:t>
+        <w:t xml:space="preserve">The EI audits both executives and the Monetary Authority. Annual responsibilities include: military compliance assessment covering whether tier authorizations were followed, whether the §2.3 intelligence warrant requirement was maintained, and whether fund certifications were observed; publishing clemency background reports before any executive act; reviewing disclosure records for constitutional appointments; and auditing electoral finance within the period defined by statute following any election.</w:t>
       </w:r>
     </w:p>
     <w:p>
@@ -4773,7 +4773,7 @@
           <w:sz w:val="22"/>
           <w:szCs w:val="22"/>
         </w:rPr>
-        <w:t xml:space="preserve">The LI IG is nominated by the SC from a pool of qualified candidates maintained by the Elections Panel at the timeline defined by statute, sufficiently in advance to ensure confirmation is complete before the transition under §1.31; confirmed by national popular vote at the next federal electoral period following nomination, by simple majority of votes cast. The confirmed successor assumes full IG authority at the precise moment the incumbent’s term concludes under §1.31. If the confirmation vote fails, the §8.1.d acting mechanism activates and the SC initiates a new nomination from the pool within 60 days. The EI IG is nominated by the House from a pool of qualified candidates maintained by the Elections Panel at the timeline defined by statute under §1.31; confirmed by national popular vote at the next federal electoral period following nomination, by simple majority of votes cast, with JI vetting of the nominee’s disclosure record published before the vote. The same timing and failed-vote provisions apply. The JI IG is selected by public lottery under §8.13 from the JI Candidate Pool under §8.4.a maintained by the Elections Panel, conducted at the timeline defined by statute under §1.31; no separate confirmation required — the lottery result is the selection and the selected person assumes office at the precise moment the incumbent’s term concludes. All IGs serve 10-year non-renewable terms. No two IG terms may begin within 18 months of each other, ensuring continuous institutional knowledge across offices. The Elections Panel administers all IG confirmation votes as part of the regular federal electoral period ballot.</w:t>
+        <w:t xml:space="preserve">The LI IG is nominated by the SC from a pool of qualified candidates maintained by the Elections Panel, sufficiently in advance under the timeline defined by statute to ensure confirmation is complete before the transition under §1.31; confirmed by national popular vote at the next federal electoral period following nomination, by simple majority of votes cast. The confirmed successor assumes full IG authority at the precise moment the incumbent’s term concludes under §1.31. If the confirmation vote fails, the §8.1.d acting mechanism activates and the SC initiates a new nomination from the pool within 60 days. The EI IG is nominated by the House from a pool of qualified candidates maintained by the Elections Panel, sufficiently in advance under the timeline defined by statute under §1.31; confirmed by national popular vote at the next federal electoral period following nomination, by simple majority of votes cast, with JI vetting of the nominee’s disclosure record published before the vote. The same timing and failed-vote provisions apply. The JI IG is selected by public lottery under §8.13 from the JI Candidate Pool under §8.4.a maintained by the Elections Panel, conducted at the statutory timeline under §1.31, sufficiently in advance to ensure seamless succession; no separate confirmation required — the lottery result is the selection and the selected person assumes office at the precise moment the incumbent’s term concludes. All IGs serve 10-year non-renewable terms. No two IG terms may begin within 18 months of each other, ensuring continuous institutional knowledge across offices. The Elections Panel administers all IG confirmation votes as part of the regular federal electoral period ballot.</w:t>
       </w:r>
     </w:p>
     <w:p>
@@ -5130,7 +5130,7 @@
           <w:sz w:val="22"/>
           <w:szCs w:val="22"/>
         </w:rPr>
-        <w:t xml:space="preserve">A dedicated section within the EI's annual report covers: whether military operations in the prior year were authorised through the correct tier; whether the §2.3 intelligence warrant requirement was maintained throughout all operations; whether PM fund certifications were obtained and observed; and whether all military orders were published to the NRS within the required period.</w:t>
+        <w:t xml:space="preserve">A dedicated section within the EI's annual report covers: whether military operations in the prior year were authorized through the correct tier; whether the §2.3 intelligence warrant requirement was maintained throughout all operations; whether PM fund certifications were obtained and observed; and whether all military orders were published to the NRS within the required period.</w:t>
       </w:r>
     </w:p>
     <w:p>
@@ -5283,7 +5283,7 @@
           <w:sz w:val="22"/>
           <w:szCs w:val="22"/>
         </w:rPr>
-        <w:t xml:space="preserve">The three Inspector Generals jointly constitute the JIC as the standing coordination body for matters crossing Inspectorate jurisdictions. The JIC formally houses all jointly certified constitutional functions — including lottery draws and selection processes throughout the constitution. The chair of any joint session is the IG whose domain covers the primary subject matter; where all domains are equally engaged, the chair rotates annually. Where the IGs cannot reach consensus on a joint matter, each publishes their individual assessment and the disagreement is noted in the permanent NRS record. The JIC conducts an annual NRS audit covering both operational compliance — whether the NRS is functioning as constitutionally required, accessible, and free of single points of failure — and content integrity — whether all constitutionally required publications across all domains have been made and no records have been altered or deleted. The joint annual NRS audit is published to both chambers. For the DIC Administrator Pool specifically, the JIC exercises enhanced oversight given the Elections Panel's administrative interest in its own membership pool: the JIC conducts quarterly review of pool health and certification accuracy; any JIC member may challenge the exclusion of any applicant and the Elections Panel must respond in writing within 14 days; and each pool entry requires joint certification published by the JIC alongside the relevant Inspectorate certification. The JIC has no authority to override the individual mandate of any Inspectorate.</w:t>
+        <w:t xml:space="preserve">The three Inspectors General jointly constitute the JIC as the standing coordination body for matters crossing Inspectorate jurisdictions. The JIC formally houses all jointly certified constitutional functions — including lottery draws and selection processes throughout the constitution. The chair of any joint session is the IG whose domain covers the primary subject matter; where all domains are equally engaged, the chair rotates annually. Where the IGs cannot reach consensus on a joint matter, each publishes their individual assessment and the disagreement is noted in the permanent NRS record. The JIC conducts an annual NRS audit covering both operational compliance — whether the NRS is functioning as constitutionally required, accessible, and free of single points of failure — and content integrity — whether all constitutionally required publications across all domains have been made and no records have been altered or deleted. The joint annual NRS audit is published to both chambers. For the DIC Administrator Pool specifically, the JIC exercises enhanced oversight given the Elections Panel's administrative interest in its own membership pool: the JIC conducts quarterly review of pool health and certification accuracy; any JIC member may challenge the exclusion of any applicant and the Elections Panel must respond in writing within 14 days; and each pool entry requires joint certification published by the JIC alongside the relevant Inspectorate certification. The JIC has no authority to override the individual mandate of any Inspectorate.</w:t>
       </w:r>
     </w:p>
     <w:p>
@@ -5489,7 +5489,7 @@
           <w:sz w:val="22"/>
           <w:szCs w:val="22"/>
         </w:rPr>
-        <w:t xml:space="preserve">This section governs for-cause removal of all constitutionally confirmed independent officers except Supreme Court justices (§4.3.b) and elected executives. Two removal tracks are available. Under the Standard Track, the charging party files stated grounds with the SC under §8.9; the SC confirms grounds within 14 days; duty suspension activates immediately on confirmation; removal requires a 2/3 vote of both chambers simultaneously; no removal vote may be held within 180 days of a major national election without prior SC review within 48 hours. Under the Judicial Track, where two of the three Inspectorates jointly certify for-cause grounds and petition the SC, the SC determines within 30 days whether the certified grounds constitute sufficient cause for suspension; if cause is found, the officer is suspended and the most senior deputy acts in the interim; the Senate has 60 days to hold a removal vote, with 3/5 required for permanent removal; a vote failing 3/5 reinstates the officer and closes the process; where the Senate fails to vote within 60 days, the matter is placed before the next federal electoral period ballot or a Legislature-set special election with a minimum 90-day notice period; removal by election requires 60% of votes cast. The Judicial Track is available where the Standard Track’s legislative threshold appears unreachable due to demonstrated political gridlock. Officers subject to this framework include Inspector Generals, DIC administrators, MA board members, and all other constitutionally confirmed independent officers. Provisions governing specific offices may cross-reference this section without restating its terms.</w:t>
+        <w:t xml:space="preserve">This section governs for-cause removal of all constitutionally confirmed independent officers except Supreme Court justices (§4.3.b) and elected executives. Two removal tracks are available. Under the Standard Track, the charging party files stated grounds with the SC under §8.9; the SC confirms grounds within 14 days; duty suspension activates immediately on confirmation; removal requires a 2/3 vote of both chambers simultaneously; no removal vote may be held within 180 days of a major national election without prior SC review within 48 hours. Under the Judicial Track, where two of the three Inspectorates jointly certify for-cause grounds and petition the SC, the SC determines within 30 days whether the certified grounds constitute sufficient cause for suspension; if cause is found, the officer is suspended and the most senior deputy acts in the interim; the Senate has 60 days to hold a removal vote, with 3/5 required for permanent removal; a vote failing 3/5 reinstates the officer and closes the process; where the Senate fails to vote within 60 days, the matter is placed before the next federal electoral period ballot or a Legislature-set special election with a minimum 90-day notice period; removal by election requires 60% of votes cast. The Judicial Track is available where the Standard Track’s legislative threshold appears unreachable due to demonstrated political gridlock. Officers subject to this framework include Inspectors General, DIC administrators, MA board members, and all other constitutionally confirmed independent officers. Provisions governing specific offices may cross-reference this section without restating its terms.</w:t>
       </w:r>
     </w:p>
     <w:p>
@@ -6450,7 +6450,7 @@
           <w:sz w:val="22"/>
           <w:szCs w:val="22"/>
         </w:rPr>
-        <w:t xml:space="preserve">Intelligence capabilities used in support of authorized military operations are subject to the §2.3 warrant requirement at all times — no military operation authorizes domestic intelligence collection against citizens without independent judicial authorisation. Intelligence activities must be published to the NRS in classified summary form within the period defined by statute following military operations being fully concluded.</w:t>
+        <w:t xml:space="preserve">Intelligence capabilities used in support of authorized military operations are subject to the §2.3 warrant requirement at all times — no military operation authorizes domestic intelligence collection against citizens without independent judicial authorization. Intelligence activities must be published to the NRS in classified summary form within the period defined by statute following military operations being fully concluded.</w:t>
       </w:r>
     </w:p>
     <w:p>
@@ -6885,7 +6885,7 @@
           <w:sz w:val="22"/>
           <w:szCs w:val="22"/>
         </w:rPr>
-        <w:t xml:space="preserve">A sovereign entity may petition to join the Republic's constitutional framework as a Territory. The process requires a petition resolution adopted by the entity's own legislature by 2/3 majority, confirmed by a citizen referendum achieving simple majority on at least 50% participation; the JI's published assessment of whether the entity systematically violates any non-derogable right listed in §1.26.b; and acceptance by the Legislature by 2/3 of both chambers. An accepted petition produces an incorporation agreement specifying a transition period not exceeding 48 months. The Republic may not pressure any entity to initiate this process. An indigenous nation recognised under Article XIV must make a status election under §14.7 before this provision applies.</w:t>
+        <w:t xml:space="preserve">A sovereign entity may petition to join the Republic's constitutional framework as a Territory. The process requires a petition resolution adopted by the entity's own legislature by 2/3 majority, confirmed by a citizen referendum achieving simple majority on at least 50% participation; the JI's published assessment of whether the entity systematically violates any non-derogable right listed in §1.26.b; and acceptance by the Legislature by 2/3 of both chambers. An accepted petition produces an incorporation agreement specifying a transition period not exceeding 48 months. The Republic may not pressure any entity to initiate this process. An indigenous nation recognized under Article XIV must make a status election under §14.7 before this provision applies.</w:t>
       </w:r>
     </w:p>
     <w:p>
@@ -7320,7 +7320,7 @@
           <w:sz w:val="22"/>
           <w:szCs w:val="22"/>
         </w:rPr>
-        <w:t xml:space="preserve">An indigenous nation with an established compact under Article XIV holds the constitutional right to initiate a status transition through its own democratic or traditional governance process. Three status options are available: (a) Compact Status — continued Article XIV compact relationship (default; no election required to remain); (b) Territorial Integration — election to pursue territorial incorporation through §13.6, entering as a Territory with the standard §13.2 Statehood pathway available; (c) Full Sovereign Independence — the nation exists outside the Republic's constitutional framework as a fully independent sovereign nation, with the Republic obligated to negotiate a treaty within 24 months governing borders, trade, citizenship, and infrastructure — negotiations are conducted jointly by both executives through the JEC under §2.14, with the President holding primary authority on border and defence terms under §2.1 and the PM holding primary authority on domestic implementation terms under §2.5; as an independent sovereign the Nation may subsequently seek an Associated Community compact with the Republic under Article XX. The Republic may not prefer, discourage, or offer inducements toward any option. The Republic must provide factual information about each status upon request.</w:t>
+        <w:t xml:space="preserve">An indigenous nation with an established compact under Article XIV holds the constitutional right to initiate a status transition through its own democratic or traditional governance process. Three status options are available: (a) Compact Status — continued Article XIV compact relationship (default; no election required to remain); (b) Territorial Integration — election to pursue territorial incorporation through §13.6, entering as a Territory with the standard §13.2 Statehood pathway available; (c) Full Sovereign Independence — the nation exists outside the Republic's constitutional framework as a fully independent sovereign nation, with the Republic obligated to negotiate a treaty within 24 months governing borders, trade, citizenship, and infrastructure — negotiations are conducted jointly by both executives through the JEC under §2.14, with the President holding primary authority on border and defense terms under §2.1 and the PM holding primary authority on domestic implementation terms under §2.5; as an independent sovereign the Nation may subsequently seek an Associated Community compact with the Republic under Article XX. The Republic may not prefer, discourage, or offer inducements toward any option. The Republic must provide factual information about each status upon request.</w:t>
       </w:r>
     </w:p>
     <w:p>
@@ -7450,7 +7450,7 @@
           <w:szCs w:val="22"/>
         </w:rPr>
         <w:t xml:space="preserve">This Constitution may be amended through the parliamentary path or through citizen initiative. No executive signature is required; no executive veto applies. Every member’s vote on any amendment is published to the NRS.
-A parliamentary amendment requires a 2/3 supermajority of the full seated membership of both chambers. The proposing body simultaneously specifies the ratification mechanism. The proposing body simultaneously specifies the ratification mechanism — either State Ratification (ratification by 2/3 of States within the period defined by statute) or Popular Ratification (a national popular referendum achieving 2/3 affirmative support with at least 55% citizen participation within 180 days). A proposed amendment may be withdrawn at any point before ratification is certified. Two amendments may be simultaneously in ratification; where they conflict, the one ratified later in time prevails. Citizen Initiative Amendment (Path C): Any proposed constitutional amendment supported by a petition of at least 15% of eligible voters, as verified by the LI, proceeds directly to a national referendum. Passage requires 70% of votes cast with a minimum 65% citizen participation; where the participation floor is not met the initiative fails and may not be resubmitted on the same or substantially similar grounds for five years. No legislative or executive action is required to place the initiative on the ballot; the Elections Panel administers the referendum within 180 days of LI petition verification. Path C amendments are subject to §15.5 consistency analysis by the LI, advisory only.</w:t>
+A parliamentary amendment requires a 2/3 supermajority of the full seated membership of both chambers. The proposing body simultaneously specifies the ratification mechanism. The proposing body simultaneously specifies the ratification mechanism — either State Ratification (ratification by 2/3 of States within the period defined by statute) or Popular Ratification (a national popular referendum achieving 2/3 affirmative support with at least 55% citizen participation within 180 days). A proposed amendment may be withdrawn at any point before ratification is certified. Citizen Initiative Amendment (Path C): Any proposed constitutional amendment supported by a petition of at least 15% of eligible voters, as verified by the LI, proceeds directly to a national referendum. Passage requires 70% of votes cast with a minimum 65% citizen participation; where the participation floor is not met the initiative fails and may not be resubmitted on the same or substantially similar grounds for five years. No legislative or executive action is required to place the initiative on the ballot; the Elections Panel administers the referendum within 180 days of LI petition verification. Path C amendments are subject to §15.5 consistency analysis by the LI, advisory only.</w:t>
       </w:r>
     </w:p>
     <w:p>
@@ -7501,7 +7501,7 @@
           <w:sz w:val="22"/>
           <w:szCs w:val="22"/>
         </w:rPr>
-        <w:t xml:space="preserve">Neither the President nor the PM has any role in the constitutional amendment process. No signature required. No veto available. An amendment takes effect immediately upon LI certification (Path A) or Elections Panel certification (Path B) and NRS publication — no implementation delay, no executive discretion over timing.</w:t>
+        <w:t xml:space="preserve">Neither the President nor the PM has any role in the constitutional amendment process. No signature required. No veto available. An amendment takes effect immediately upon LI certification (State Ratification) or Elections Panel certification (Popular Ratification) and NRS publication — no implementation delay, no executive discretion over timing.</w:t>
       </w:r>
     </w:p>
     <w:p>
@@ -8680,7 +8680,7 @@
           <w:sz w:val="22"/>
           <w:szCs w:val="22"/>
         </w:rPr>
-        <w:t xml:space="preserve">Territories or subdivisions meeting the Statehood Audit Competency Baseline by Phase 2 end may petition to enter as State or Territory. Those failing the Baseline enter as Territory and may begin the Statehood Audit immediately. Any territory may choose Territory status by simple legislative vote regardless of whether it meets the Statehood Baseline. Prior government states or territories may voluntarily subdivide during the Transition Window by vote of their existing legislative body; new subdivisions are treated as separate petitioning entities. Where a state fails the Phase 2 Statehood Audit, it enters as a Territory; its population retains all Article I rights and participates in first House elections proportionally. All prior government territories that had not achieved statehood by Day Zero enter as Territories from Phase 4 activation without undergoing Phase 2 Statehood Audits; any capital district or special administrative region is assigned Territory status and follows the §13.2 path.</w:t>
+        <w:t xml:space="preserve">Territories or subdivisions meeting the Statehood Audit Competency Baseline by Phase 2 end may petition to enter as State or Territory. Those failing the Baseline enter as Territory and may begin the Statehood Audit immediately. Any territory may choose Territory status by simple legislative vote regardless of whether it meets the Statehood Baseline. Prior government states or territories may voluntarily subdivide during the Transition Window by vote of their existing legislative body; new subdivisions are treated as separate petitioning entities. Where a State fails the Phase 2 Statehood Audit, it enters as a Territory; its population retains all Article I rights and participates in first House elections proportionally. All prior government territories that had not achieved statehood by Day Zero enter as Territories from Phase 4 activation without undergoing Phase 2 Statehood Audits; any capital district or special administrative region is assigned Territory status and follows the §13.2 path.</w:t>
       </w:r>
     </w:p>
     <w:p>
@@ -8833,7 +8833,7 @@
           <w:sz w:val="22"/>
           <w:szCs w:val="22"/>
         </w:rPr>
-        <w:t xml:space="preserve">Where this Constitution assigns a specific function to a statutory independent agency under §3.9, the Legislature shall establish that agency within the following timeframes from Phase 4 activation: the CLT Administrator under §5.1.c, within 180 days; the Census Bureau under §3.2, within 18 months. Where the Legislature fails to meet a deadline, §3.9 applies: the function is administered on an interim basis by the responsible Inspectorate until the agency is established. The LI publishes a compliance notice when any establishment deadline is missed and again when the agency becomes operational. The Legislature may not permanently delegate a constitutionally required statutory function to an Inspectorate in lieu of establishing the required agency.</w:t>
+        <w:t xml:space="preserve">Where this Constitution assigns a specific function to a statutory independent agency under §3.9, the Legislature must establish that agency within the following timeframes from Phase 4 activation: the CLT Administrator under §5.1.c, within 180 days; the Census Bureau under §3.2, within 18 months. Where the Legislature fails to meet a deadline, §3.9 applies: the function is administered on an interim basis by the responsible Inspectorate until the agency is established. The LI publishes a compliance notice when any establishment deadline is missed and again when the agency becomes operational. The Legislature may not permanently delegate a constitutionally required statutory function to an Inspectorate in lieu of establishing the required agency.</w:t>
       </w:r>
     </w:p>
     <w:p>
@@ -8911,7 +8911,7 @@
           <w:sz w:val="22"/>
           <w:szCs w:val="22"/>
         </w:rPr>
-        <w:t xml:space="preserve">Exclusively for sovereign entities — not a form of State or Territory status, not transitional, not incorporation. Available to nations that have completed the independence process under §13.7, to independent nations outside the Republic seeking a defined relationship, or to nations recognised as pre-existing sovereigns under Article XIV. Indigenous nations holding rights under Article XIV may not substitute an Article XX compact for their Article XIV compact relationship without first completing a status election under §14.7.a.</w:t>
+        <w:t xml:space="preserve">Exclusively for sovereign entities — not a form of State or Territory status, not transitional, not incorporation. Available to nations that have completed the independence process under §13.7, to independent nations outside the Republic seeking a defined relationship, or to nations recognized as pre-existing sovereigns under Article XIV. Indigenous nations holding rights under Article XIV may not substitute an Article XX compact for their Article XIV compact relationship without first completing a status election under §14.7.a.</w:t>
       </w:r>
     </w:p>
     <w:p>
@@ -9013,7 +9013,7 @@
           <w:sz w:val="22"/>
           <w:szCs w:val="22"/>
         </w:rPr>
-        <w:t xml:space="preserve">No compact may be entered or ratified with any entity whose governance practices include, authorise, or systematically permit violations of any of the non-derogable rights established in §1.26.b, committed against any person within its jurisdiction. The Judicial Inspectorate certifies compliance with this condition before parliamentary ratification of any compact; a compact negotiated with a non-compliant entity is void regardless of parliamentary ratification. The JI conducts annual compliance reviews and publishes findings to the NRS. Where the JI finds systematic violations of the non-derogable rights under §1.26.b, the compact is suspended pending Supreme Court review. The Court may terminate the compact on confirmed systematic violations without remediation within a period the Legislature defines by statute. Economic value of the compact relationship is not a factor in JI certification or Supreme Court review. Where an Associated Community's territory includes indigenous nations with pre-existing governance relationships, the compact must address those relationships and may not require the Associated Community to eliminate or diminish pre-existing indigenous governance arrangements within its territory. The Legislature may not schedule a compact ratification vote until the JI publishes its certification finding. During suspension, both parties' obligations under the compact continue in effect pending the SC's determination; the Associated Community's observer delegate rights are suspended for the duration of the review.</w:t>
+        <w:t xml:space="preserve">No compact may be entered or ratified with any entity whose governance practices include, authorize, or systematically permit violations of any of the non-derogable rights established in §1.26.b, committed against any person within its jurisdiction. The Judicial Inspectorate certifies compliance with this condition before parliamentary ratification of any compact; a compact negotiated with a non-compliant entity is void regardless of parliamentary ratification. The JI conducts annual compliance reviews and publishes findings to the NRS. Where the JI finds systematic violations of the non-derogable rights under §1.26.b, the compact is suspended pending Supreme Court review. The Court may terminate the compact on confirmed systematic violations without remediation within a period the Legislature defines by statute. Economic value of the compact relationship is not a factor in JI certification or Supreme Court review. Where an Associated Community's territory includes indigenous nations with pre-existing governance relationships, the compact must address those relationships and may not require the Associated Community to eliminate or diminish pre-existing indigenous governance arrangements within its territory. The Legislature may not schedule a compact ratification vote until the JI publishes its certification finding. During suspension, both parties' obligations under the compact continue in effect pending the SC's determination; the Associated Community's observer delegate rights are suspended for the duration of the review.</w:t>
       </w:r>
     </w:p>
     <w:p>

</xml_diff>

<commit_message>
Remove all political party references from constitution
The constitution should be party-agnostic. Parties are voluntary
private organizations operating under free association rights and
statute — not constitutional actors.

§3.3: 'partisan registration data' → 'voter political affiliation data'
§8.2: 'cross-party Senate support' → 'broad Senate consensus'
§18.3: 'incumbents or established parties' → 'incumbents or established
  political organizations'

Legal uses of 'party' (charging party, parties to a compact, equal
parties, private parties, affected parties) are unchanged — different
meaning entirely.
</commit_message>
<xml_diff>
--- a/constitution-current.docx
+++ b/constitution-current.docx
@@ -2657,7 +2657,7 @@
           <w:sz w:val="22"/>
           <w:szCs w:val="22"/>
         </w:rPr>
-        <w:t xml:space="preserve">States draw their own House district maps subject to five criteria: population equality within reasonable tolerance; geographic contiguity; compliance with §1.6 non-discrimination; no intentional dilution of minority voting power; and reasonable compactness. Maps may not be drawn using partisan registration data, voting history data, incumbent residence, or racial composition as a primary criterion. The LI reviews all maps for compliance and publishes findings to the NRS. Where a map fails, the Elections Panel draws an interim compliant map that takes effect at the next election and is retired when the State submits a compliant map. Territorial districts are drawn by the Elections Panel under the same criteria. Any citizen, State government, or parliamentary minority may challenge a map before the SC.</w:t>
+        <w:t xml:space="preserve">States draw their own House district maps subject to five criteria: population equality within reasonable tolerance; geographic contiguity; compliance with §1.6 non-discrimination; no intentional dilution of minority voting power; and reasonable compactness. Maps may not be drawn using voter political affiliation data, voting history data, incumbent residence, or racial composition as a primary criterion. The LI reviews all maps for compliance and publishes findings to the NRS. Where a map fails, the Elections Panel draws an interim compliant map that takes effect at the next election and is retired when the State submits a compliant map. Territorial districts are drawn by the Elections Panel under the same criteria. Any citizen, State government, or parliamentary minority may challenge a map before the SC.</w:t>
       </w:r>
     </w:p>
     <w:p>
@@ -4722,7 +4722,7 @@
           <w:sz w:val="22"/>
           <w:szCs w:val="22"/>
         </w:rPr>
-        <w:t xml:space="preserve">Each Inspectorate is constituted through a process that structurally excludes the body being watched from selecting its watchers. The SC nominates the LI Inspector General, confirmed by Senate 2/3 supermajority — the Legislature is entirely excluded. The House Speaker and Senate Speaker jointly nominate the EI Inspector General, confirmed by Senate 2/3 supermajority with JI vetting — the executives are excluded, neither Speaker can act alone, and the 2/3 confirmation threshold prevents confirmation without cross-party Senate support. The JI Inspector General is selected by public lottery from a pool of former judges certified by the LI and EI — the JI has no role in constituting or certifying its own candidate pool.</w:t>
+        <w:t xml:space="preserve">Each Inspectorate is constituted through a process that structurally excludes the body being watched from selecting its watchers. The SC nominates the LI Inspector General, confirmed by Senate 2/3 supermajority — the Legislature is entirely excluded. The House Speaker and Senate Speaker jointly nominate the EI Inspector General, confirmed by Senate 2/3 supermajority with JI vetting — the executives are excluded, neither Speaker can act alone, and the 2/3 confirmation threshold requires broad Senate consensus for confirmation. The JI Inspector General is selected by public lottery from a pool of former judges certified by the LI and EI — the JI has no role in constituting or certifying its own candidate pool.</w:t>
       </w:r>
     </w:p>
     <w:p>
@@ -8245,7 +8245,7 @@
           <w:sz w:val="22"/>
           <w:szCs w:val="22"/>
         </w:rPr>
-        <w:t xml:space="preserve">The Republic maintains a publicly funded campaign financing system as an alternative to private fundraising. The system provides all registered candidates with equal baseline funding; no allocation may advantage incumbents or established parties. Candidates who accept public financing are subject to spending limits defined by statute. The Legislature may create a matching funds component amplifying small donations; matching thresholds, caps, and ratios must apply equally to all participating candidates. The Elections Panel administers disbursement and audits all campaign finance records within the period defined by statute following any election. Candidates who receive impermissible contributions must report them within 10 days and either return them or have them treated as undisclosed.</w:t>
+        <w:t xml:space="preserve">The Republic maintains a publicly funded campaign financing system as an alternative to private fundraising. The system provides all registered candidates with equal baseline funding; no allocation may advantage incumbents or established political organizations. Candidates who accept public financing are subject to spending limits defined by statute. The Legislature may create a matching funds component amplifying small donations; matching thresholds, caps, and ratios must apply equally to all participating candidates. The Elections Panel administers disbursement and audits all campaign finance records within the period defined by statute following any election. Candidates who receive impermissible contributions must report them within 10 days and either return them or have them treated as undisclosed.</w:t>
       </w:r>
     </w:p>
     <w:p>

</xml_diff>

<commit_message>
Language and consistency fixes
British spellings:
- §1.2: 'favour' → 'favor'
- §1.4: 'Forced Labour' → 'Forced Labor'
- §10.1: 'fulfils' → 'fulfills'

Grammar:
- §2.6: sentence fragment fixed ('the House' → 'The House')

Capitalization — 'Government' standardized to lowercase except
where starting a sentence or part of a proper name:
- §1.2, §1.5, §1.6, §1.23, §1.9, §9.1, §9.5: lowercase
- §1.2 sentence-opening instance kept capitalized
</commit_message>
<xml_diff>
--- a/constitution-current.docx
+++ b/constitution-current.docx
@@ -314,7 +314,7 @@
           <w:sz w:val="22"/>
           <w:szCs w:val="22"/>
         </w:rPr>
-        <w:t xml:space="preserve">Every person possesses an inviolable sphere of personal sovereignty over their own life, body, and choices. Government authority operates outside this sphere. Where the boundary is disputed, the presumption runs in favour of individual liberty; government bears the burden of demonstrating constitutional authority for any limitation.</w:t>
+        <w:t xml:space="preserve">Every person possesses an inviolable sphere of personal sovereignty over their own life, body, and choices. Government authority operates outside this sphere. Where the boundary is disputed, the presumption runs in favor of individual liberty; government bears the burden of demonstrating constitutional authority for any limitation.</w:t>
       </w:r>
     </w:p>
     <w:p>
@@ -396,7 +396,7 @@
           <w:sz w:val="22"/>
           <w:szCs w:val="22"/>
         </w:rPr>
-        <w:t xml:space="preserve">Prohibition of Slavery and Forced Labour</w:t>
+        <w:t xml:space="preserve">Prohibition of Slavery and Forced Labor</w:t>
       </w:r>
     </w:p>
     <w:p>
@@ -467,7 +467,7 @@
           <w:sz w:val="22"/>
           <w:szCs w:val="22"/>
         </w:rPr>
-        <w:t xml:space="preserve">Every person holds the rights of expression, thought, conscience, religion, association, assembly, petition, and movement. Government may regulate the time, place, and manner of expression and assembly for compelling public-order purposes, subject to strict scrutiny and without discriminating on the basis of viewpoint. No government may compel expression or penalise expression through intermediaries it controls or pressures. Freedom of religion protects belief absolutely; it protects practice against limitation except where practice causes direct harm to others. The Legislature establishes by statute any framework for exercising these rights, provided that framework does not burden the right itself.</w:t>
+        <w:t xml:space="preserve">Every person holds the rights of expression, thought, conscience, religion, association, assembly, petition, and movement. government may regulate the time, place, and manner of expression and assembly for compelling public-order purposes, subject to strict scrutiny and without discriminating on the basis of viewpoint. No government may compel expression or penalise expression through intermediaries it controls or pressures. Freedom of religion protects belief absolutely; it protects practice against limitation except where practice causes direct harm to others. The Legislature establishes by statute any framework for exercising these rights, provided that framework does not burden the right itself.</w:t>
       </w:r>
     </w:p>
     <w:p>
@@ -518,7 +518,7 @@
           <w:sz w:val="22"/>
           <w:szCs w:val="22"/>
         </w:rPr>
-        <w:t xml:space="preserve">Every person is equal before the law. Government may not discriminate on the basis of race, ethnicity, sex, sexual orientation, gender identity, religion, national origin, disability, age, or economic status in the provision of any governmental benefit, the imposition of any burden, or the application of any law. Distinctions rationally related to a legitimate governmental purpose that do not turn on these characteristics are permissible. Distinctions that do turn on these characteristics require compelling justification and are subject to strict scrutiny.</w:t>
+        <w:t xml:space="preserve">Every person is equal before the law. government may not discriminate on the basis of race, ethnicity, sex, sexual orientation, gender identity, religion, national origin, disability, age, or economic status in the provision of any governmental benefit, the imposition of any burden, or the application of any law. Distinctions rationally related to a legitimate governmental purpose that do not turn on these characteristics are permissible. Distinctions that do turn on these characteristics require compelling justification and are subject to strict scrutiny.</w:t>
       </w:r>
     </w:p>
     <w:p>
@@ -1130,7 +1130,7 @@
           <w:sz w:val="22"/>
           <w:szCs w:val="22"/>
         </w:rPr>
-        <w:t xml:space="preserve">Government holds an obligation not to cause environmental harm to persons within its jurisdiction through its own actions or through the actions of those it licences. The Legislature establishes by statute the framework for environmental protection, and may not enact statutes that systematically permit environmental harm to defined communities. This provision does not require the achievement of any particular environmental outcome; it requires genuine governmental action toward environmental protection proportionate to identified harms.</w:t>
+        <w:t xml:space="preserve">government holds an obligation not to cause environmental harm to persons within its jurisdiction through its own actions or through the actions of those it licences. The Legislature establishes by statute the framework for environmental protection, and may not enact statutes that systematically permit environmental harm to defined communities. This provision does not require the achievement of any particular environmental outcome; it requires genuine governmental action toward environmental protection proportionate to identified harms.</w:t>
       </w:r>
     </w:p>
     <w:p>
@@ -1969,7 +1969,7 @@
           <w:sz w:val="22"/>
           <w:szCs w:val="22"/>
         </w:rPr>
-        <w:t xml:space="preserve">The PM is accountable to the House. The House may remove the PM only through a constructive vote of no confidence: a single vote that simultaneously removes the sitting PM and installs a named replacement, by absolute majority of full seated House membership. A confidence vote that does not name and elect a successor has no constitutional effect. No person may serve more than 8 consecutive years as PM, and no more than 12 years in total across all periods of service. Both limits operate simultaneously; the stricter governs at any given moment. the House elects the PM by absolute majority within the period defined by statute following any general election or vacancy. If the House does not elect a PM within that period, the most senior confirmed Cabinet Minister continues as Caretaker PM. If no PM has been elected by absolute majority within 120 days of any general election or vacancy, the Elections Panel automatically administers a new House general election; the Caretaker mechanism continues until the newly elected House elects a PM. The Senate may, by 2/3 supermajority, designate a serving House member as PM if the House has failed to elect one within the statutory period; House election of a PM by absolute majority terminates any Senate designation. Where the PM is temporarily unable to exercise authority, the most senior confirmed Cabinet Minister by continuous length of service — as certified by the JI — serves as Caretaker PM with authority limited to maintaining existing policy and emergency functions; Caretaker status ends when the PM resumes their duties or a new PM is confirmed by the House.</w:t>
+        <w:t xml:space="preserve">The PM is accountable to the House. The House may remove the PM only through a constructive vote of no confidence: a single vote that simultaneously removes the sitting PM and installs a named replacement, by absolute majority of full seated House membership. A confidence vote that does not name and elect a successor has no constitutional effect. No person may serve more than 8 consecutive years as PM, and no more than 12 years in total across all periods of service. Both limits operate simultaneously; the stricter governs at any given moment. The House elects the PM by absolute majority within the period defined by statute following any general election or vacancy. If the House does not elect a PM within that period, the most senior confirmed Cabinet Minister continues as Caretaker PM. If no PM has been elected by absolute majority within 120 days of any general election or vacancy, the Elections Panel automatically administers a new House general election; the Caretaker mechanism continues until the newly elected House elects a PM. The Senate may, by 2/3 supermajority, designate a serving House member as PM if the House has failed to elect one within the statutory period; House election of a PM by absolute majority terminates any Senate designation. Where the PM is temporarily unable to exercise authority, the most senior confirmed Cabinet Minister by continuous length of service — as certified by the JI — serves as Caretaker PM with authority limited to maintaining existing policy and emergency functions; Caretaker status ends when the PM resumes their duties or a new PM is confirmed by the House.</w:t>
       </w:r>
     </w:p>
     <w:p>
@@ -4238,7 +4238,7 @@
           <w:sz w:val="22"/>
           <w:szCs w:val="22"/>
         </w:rPr>
-        <w:t xml:space="preserve">Every eligible citizen holds the right to vote in federal elections and the right to have that vote counted. Government at every level is prohibited from taking any action that makes voting more difficult, less accessible, or less secure. No law, rule, administrative decision, or practice that reduces access to the franchise is constitutionally valid. The state holds an affirmative obligation to make voting as accessible as possible consistent with security — it may not compel citizens to vote, but it must provide conditions in which doing so is genuinely possible. Federal election periods are public holidays.</w:t>
+        <w:t xml:space="preserve">Every eligible citizen holds the right to vote in federal elections and the right to have that vote counted. government at every level is prohibited from taking any action that makes voting more difficult, less accessible, or less secure. No law, rule, administrative decision, or practice that reduces access to the franchise is constitutionally valid. The state holds an affirmative obligation to make voting as accessible as possible consistent with security — it may not compel citizens to vote, but it must provide conditions in which doing so is genuinely possible. Federal election periods are public holidays.</w:t>
       </w:r>
     </w:p>
     <w:p>
@@ -5559,7 +5559,7 @@
           <w:sz w:val="22"/>
           <w:szCs w:val="22"/>
         </w:rPr>
-        <w:t xml:space="preserve">The National Record System is the permanent, tamper-evident public record of the Republic — freely accessible to every Inhabitant at no cost. Every constitutional act, order, finding, certification, designation, declaration, and determination made under authority of this Constitution is published to the NRS as a permanent record. No provision of this Constitution need state this obligation individually; it applies universally by operation of this section. Where this Constitution specifies a publication timeline, that timeline governs; in all other cases, publication occurs at or before the effective moment of the act. Every government act required to be published must appear on the NRS before it takes legal effect. Records may not be deleted, altered, or reclassified after publication; corrections are published as new entries alongside the original. The NRS must remain fully functional in the event of localized technical failure — no single point of failure is constitutionally acceptable. The Legislature defines technical standards by statute. The NRS includes a permanent historical archive of all prior legislative acts, executive orders, judicial decisions, and government documents dating to the Republic's founding. Records published to the NRS by any jurisdiction within the Republic are recognized as authentic by all other jurisdictions without re-certification. Inspectorate reports are permanently exempt from classification. Citizens may submit corrections or context to any NRS record through a public mechanism maintained by the LI; submissions are published alongside the original after accuracy review. The NRS is the record of government, not a condition of it. Government acts take legal effect from the moment of issuance regardless of NRS status; the publication obligation applies from the moment the NRS is restored. The JI maintains a continuously operating parallel authentication system, physically and logistically independent of the NRS, capable of authenticating and preserving all constitutional acts without NRS connectivity. This system operates in parallel at all times — not merely as a contingency — and records all authenticated acts with full constitutional effect from the moment of their issuance. Upon NRS restoration, all parallel system records migrate to the NRS as permanent records with their original issuance timestamps. Where the NRS has not been restored within 180 days, the parallel system becomes the constitutional record of the Republic; the Legislature must by statute establish permanent restoration obligations and timelines within 90 days of that threshold. The Legislature defines the technical specifications, security standards, and operational parameters of the parallel system by statute; the constitutional obligation to maintain it is absolute and its funding floor follows the NRS funding floor in this section. Funding for the NRS may not be reduced below the prior year’s level without a 2/3 vote of both chambers. Classification used to conceal a constitutional violation or illegal order is itself a constitutional offense.</w:t>
+        <w:t xml:space="preserve">The National Record System is the permanent, tamper-evident public record of the Republic — freely accessible to every Inhabitant at no cost. Every constitutional act, order, finding, certification, designation, declaration, and determination made under authority of this Constitution is published to the NRS as a permanent record. No provision of this Constitution need state this obligation individually; it applies universally by operation of this section. Where this Constitution specifies a publication timeline, that timeline governs; in all other cases, publication occurs at or before the effective moment of the act. Every government act required to be published must appear on the NRS before it takes legal effect. Records may not be deleted, altered, or reclassified after publication; corrections are published as new entries alongside the original. The NRS must remain fully functional in the event of localized technical failure — no single point of failure is constitutionally acceptable. The Legislature defines technical standards by statute. The NRS includes a permanent historical archive of all prior legislative acts, executive orders, judicial decisions, and government documents dating to the Republic's founding. Records published to the NRS by any jurisdiction within the Republic are recognized as authentic by all other jurisdictions without re-certification. Inspectorate reports are permanently exempt from classification. Citizens may submit corrections or context to any NRS record through a public mechanism maintained by the LI; submissions are published alongside the original after accuracy review. The NRS is the record of government, not a condition of it. government acts take legal effect from the moment of issuance regardless of NRS status; the publication obligation applies from the moment the NRS is restored. The JI maintains a continuously operating parallel authentication system, physically and logistically independent of the NRS, capable of authenticating and preserving all constitutional acts without NRS connectivity. This system operates in parallel at all times — not merely as a contingency — and records all authenticated acts with full constitutional effect from the moment of their issuance. Upon NRS restoration, all parallel system records migrate to the NRS as permanent records with their original issuance timestamps. Where the NRS has not been restored within 180 days, the parallel system becomes the constitutional record of the Republic; the Legislature must by statute establish permanent restoration obligations and timelines within 90 days of that threshold. The Legislature defines the technical specifications, security standards, and operational parameters of the parallel system by statute; the constitutional obligation to maintain it is absolute and its funding floor follows the NRS funding floor in this section. Funding for the NRS may not be reduced below the prior year’s level without a 2/3 vote of both chambers. Classification used to conceal a constitutional violation or illegal order is itself a constitutional offense.</w:t>
       </w:r>
     </w:p>
     <w:p>
@@ -5659,7 +5659,7 @@
           <w:sz w:val="22"/>
           <w:szCs w:val="22"/>
         </w:rPr>
-        <w:t xml:space="preserve">Government records may be classified only on grounds the Legislature defines by statute. Classification to conceal a constitutional violation, policy disagreement, or political embarrassment is prohibited and void. The classifying authority must state the statutory ground at the time of classification.</w:t>
+        <w:t xml:space="preserve">government records may be classified only on grounds the Legislature defines by statute. Classification to conceal a constitutional violation, policy disagreement, or political embarrassment is prohibited and void. The classifying authority must state the statutory ground at the time of classification.</w:t>
       </w:r>
     </w:p>
     <w:p>
@@ -5786,7 +5786,7 @@
           <w:sz w:val="22"/>
           <w:szCs w:val="22"/>
         </w:rPr>
-        <w:t xml:space="preserve">The Republic is a social state. Every Inhabitant is entitled to conditions of life consistent with human dignity, which the Republic fulfils through three mandatory systems: universally accessible healthcare insurance; social assistance sufficient to maintain basic material conditions; and free compulsory education for every child. The Legislature establishes the framework for each by statute. The Legislature must establish by statute an independent Monetary Authority responsible for monetary policy and fiscal integrity certification; the EI audits its operations annually and publishes findings to the NRS. The Legislature may not define MA independence standards in a manner that compromises the credibility of its certification functions; the EI assesses MA independence through its annual operational audit and publishes findings to the NRS.</w:t>
+        <w:t xml:space="preserve">The Republic is a social state. Every Inhabitant is entitled to conditions of life consistent with human dignity, which the Republic fulfills through three mandatory systems: universally accessible healthcare insurance; social assistance sufficient to maintain basic material conditions; and free compulsory education for every child. The Legislature establishes the framework for each by statute. The Legislature must establish by statute an independent Monetary Authority responsible for monetary policy and fiscal integrity certification; the EI audits its operations annually and publishes findings to the NRS. The Legislature may not define MA independence standards in a manner that compromises the credibility of its certification functions; the EI assesses MA independence through its annual operational audit and publishes findings to the NRS.</w:t>
       </w:r>
     </w:p>
     <w:p>

</xml_diff>

<commit_message>
Final cleanup: stale provision counts, remaining labour→labor
- diagrams.html and annotated.html: 156/157 provision counts → 165
- §1.4 body text: 'forced labour', 'prison labour' → 'labor'
  (heading was fixed earlier; body text instances missed)
- Advisor vault: 17 questions (4 new, 1 updated)
- Glossary: SC Default Rule and Independent Statutory Agencies added
</commit_message>
<xml_diff>
--- a/constitution-current.docx
+++ b/constitution-current.docx
@@ -416,7 +416,7 @@
           <w:sz w:val="22"/>
           <w:szCs w:val="22"/>
         </w:rPr>
-        <w:t xml:space="preserve">Slavery, involuntary servitude, and forced labour are absolutely prohibited. Lawfully imposed prison labour and compulsory military service under the terms established by statute do not constitute forced labour under this provision. This right is non-derogable under §1.26.b.</w:t>
+        <w:t xml:space="preserve">Slavery, involuntary servitude, and forced labor are absolutely prohibited. Lawfully imposed prison labor and compulsory military service under the terms established by statute do not constitute forced labor under this provision. This right is non-derogable under §1.26.b.</w:t>
       </w:r>
     </w:p>
     <w:p>
@@ -3545,7 +3545,7 @@
           <w:sz w:val="22"/>
           <w:szCs w:val="22"/>
         </w:rPr>
-        <w:t xml:space="preserve">Citizens are required to serve on juries when called. Jury service is compensated at a rate the Legislature defines by statute. Unexcused refusal is subject to civil consequences the Legislature defines. Jury service does not constitute forced labour under §1.4.</w:t>
+        <w:t xml:space="preserve">Citizens are required to serve on juries when called. Jury service is compensated at a rate the Legislature defines by statute. Unexcused refusal is subject to civil consequences the Legislature defines. Jury service does not constitute forced labor under §1.4.</w:t>
       </w:r>
     </w:p>
     <w:p>

</xml_diff>

<commit_message>
Article I review: three fixes
§1.5 — Civil and Political Liberties:
- 'penalise' → 'penalize' (British spelling)
- 'controls or pressures' → 'controls or has directed to act'
  (pressures was functionally undefined; new language is precise
  about what constitutes impermissible government action through
  intermediaries)

§1.23 — Environmental Obligations:
- 'licences' → 'licenses' (British spelling)

§1.26.e — No Permanent Emergency:
- Ambiguous single sentence restructured into two clear rules:
  1. Legislature may not re-declare within 60 days of expiry
  2. After 60 days, re-declaration requires 2/3 of both chambers
  Previous sentence admitted two incompatible readings; both
  conditions now stated separately
</commit_message>
<xml_diff>
--- a/constitution-current.docx
+++ b/constitution-current.docx
@@ -467,7 +467,7 @@
           <w:sz w:val="22"/>
           <w:szCs w:val="22"/>
         </w:rPr>
-        <w:t xml:space="preserve">Every person holds the rights of expression, thought, conscience, religion, association, assembly, petition, and movement. government may regulate the time, place, and manner of expression and assembly for compelling public-order purposes, subject to strict scrutiny and without discriminating on the basis of viewpoint. No government may compel expression or penalise expression through intermediaries it controls or pressures. Freedom of religion protects belief absolutely; it protects practice against limitation except where practice causes direct harm to others. The Legislature establishes by statute any framework for exercising these rights, provided that framework does not burden the right itself.</w:t>
+        <w:t xml:space="preserve">Every person holds the rights of expression, thought, conscience, religion, association, assembly, petition, and movement. government may regulate the time, place, and manner of expression and assembly for compelling public-order purposes, subject to strict scrutiny and without discriminating on the basis of viewpoint. No government may compel expression or penalize expression through intermediaries it controls or has directed to act. Freedom of religion protects belief absolutely; it protects practice against limitation except where practice causes direct harm to others. The Legislature establishes by statute any framework for exercising these rights, provided that framework does not burden the right itself.</w:t>
       </w:r>
     </w:p>
     <w:p>
@@ -1130,7 +1130,7 @@
           <w:sz w:val="22"/>
           <w:szCs w:val="22"/>
         </w:rPr>
-        <w:t xml:space="preserve">government holds an obligation not to cause environmental harm to persons within its jurisdiction through its own actions or through the actions of those it licences. The Legislature establishes by statute the framework for environmental protection, and may not enact statutes that systematically permit environmental harm to defined communities. This provision does not require the achievement of any particular environmental outcome; it requires genuine governmental action toward environmental protection proportionate to identified harms.</w:t>
+        <w:t xml:space="preserve">government holds an obligation not to cause environmental harm to persons within its jurisdiction through its own actions or through the actions of those it licenses. The Legislature establishes by statute the framework for environmental protection, and may not enact statutes that systematically permit environmental harm to defined communities. This provision does not require the achievement of any particular environmental outcome; it requires genuine governmental action toward environmental protection proportionate to identified harms.</w:t>
       </w:r>
     </w:p>
     <w:p>
@@ -1436,7 +1436,7 @@
           <w:sz w:val="22"/>
           <w:szCs w:val="22"/>
         </w:rPr>
-        <w:t xml:space="preserve">No emergency measure may be made permanent by legislative act. Every emergency measure lapses automatically at the expiry of the Declaration unless re-enacted through the ordinary legislative process. The Legislature may not extend an emergency measure by re-declaration within 60 days of its expiry, or at all unless a 2/3 majority certifies continued necessity.</w:t>
+        <w:t xml:space="preserve">No emergency measure may be made permanent by legislative act. Every emergency measure lapses automatically at the expiry of the Declaration unless re-enacted through the ordinary legislative process. The Legislature may not re-declare an emergency measure within 60 days of its expiry. After 60 days, re-declaration requires a 2/3 majority of both chambers certifying continued necessity.</w:t>
       </w:r>
     </w:p>
     <w:p>

</xml_diff>

<commit_message>
Article III review: five fixes
§3.4 — Legislative Standards:
- 'may establish' → 'must establish' a joint ethics committee
  (Principle 6: integrity oversight is pre-political, not optional)
- 'following a published EI finding' → 'following and on the basis
  of a published EI finding' (basis explicit, not just sequential)

§3.5 — The Senate:
- 'three consecutive sessions as Speaker' → 'three consecutive
  electoral cycles' (session was undefined, invitable to game)
- Double space removed before 'The Senate holds exclusive authority'

§3.7 — Legislative Process and Passage:
- 'presiding officer of each chamber' → 'Speaker of each chamber'
  (named actor, consistent with Principle 4)
- 'mandates tied to constitutional rights' → 'mandates whose
  non-fulfilment directly impairs the exercise of a right guaranteed
  in Article I' (tighter standard; previous language was circular)
</commit_message>
<xml_diff>
--- a/constitution-current.docx
+++ b/constitution-current.docx
@@ -2708,7 +2708,7 @@
           <w:sz w:val="22"/>
           <w:szCs w:val="22"/>
         </w:rPr>
-        <w:t xml:space="preserve">Every bill must address a single, clearly defined subject. A court finding that a bill addresses multiple unrelated subjects voids the act. The full text of every bill must be published to the NRS for a minimum period defined by statute before any final passage vote; a substantially amended bill resets the clock. The Legislature must sit for a minimum number of days per year defined by statute; emergency sessions may be called by the PM or by petition of 1/3 of either chamber. Members must disclose all financial interests to the EI. The Legislature may establish a joint ethics committee with authority to sanction and refer members; removal requires 2/3 of the relevant chamber following a published EI finding.</w:t>
+        <w:t xml:space="preserve">Every bill must address a single, clearly defined subject. A court finding that a bill addresses multiple unrelated subjects voids the act. The full text of every bill must be published to the NRS for a minimum period defined by statute before any final passage vote; a substantially amended bill resets the clock. The Legislature must sit for a minimum number of days per year defined by statute; emergency sessions may be called by the PM or by petition of 1/3 of either chamber. Members must disclose all financial interests to the EI. The Legislature must establish a joint ethics committee with authority to sanction and refer members; removal requires 2/3 of the relevant chamber following and on the basis of a published EI finding.</w:t>
       </w:r>
     </w:p>
     <w:p>
@@ -2759,7 +2759,7 @@
           <w:sz w:val="22"/>
           <w:szCs w:val="22"/>
         </w:rPr>
-        <w:t xml:space="preserve">The Senate comprises two senators per State regardless of population, elected for six-year staggered terms. No senator may serve more than two consecutive terms without sitting out one full term; no cumulative lifetime restriction applies after the cooling-off period. The Senate Speaker is elected by senators and may not serve more than three consecutive sessions as Speaker without sitting out one session. The Senate defines its own internal procedures. The Senate may expel a member by 2/3 vote of full seated membership; expulsion is published to the NRS and is effective immediately. A State may establish by its own law a recall mechanism for its senators; where a senator is recalled under State law the seat is treated as vacant under this Constitution.  The Senate holds exclusive authority over: judicial confirmation; treaty ratification by 2/3 of full seated membership; and, in the absence of a functioning Elections Panel, administration of the presidential election. The Senate may not initiate legislation; all bills originate in the House.</w:t>
+        <w:t xml:space="preserve">The Senate comprises two senators per State regardless of population, elected for six-year staggered terms. No senator may serve more than two consecutive terms without sitting out one full term; no cumulative lifetime restriction applies after the cooling-off period. The Senate Speaker is elected by senators and may not serve more than three consecutive electoral cycles as Speaker without sitting out one electoral cycle. The Senate defines its own internal procedures. The Senate may expel a member by 2/3 vote of full seated membership; expulsion is published to the NRS and is effective immediately. A State may establish by its own law a recall mechanism for its senators; where a senator is recalled under State law the seat is treated as vacant under this Constitution. The Senate holds exclusive authority over: judicial confirmation; treaty ratification by 2/3 of full seated membership; and, in the absence of a functioning Elections Panel, administration of the presidential election. The Senate may not initiate legislation; all bills originate in the House.</w:t>
       </w:r>
     </w:p>
     <w:p>
@@ -2861,7 +2861,7 @@
           <w:sz w:val="22"/>
           <w:szCs w:val="22"/>
         </w:rPr>
-        <w:t xml:space="preserve">Bills pass by absolute majority of the full seated membership of both chambers. Higher thresholds apply to constitutional amendments, veto overrides, removal proceedings, and other matters specified in this constitution. The presiding officer of each chamber must publish the final text of every enacted law to the NRS within the period defined by statute. All prior versions, committee reports, Inspectorate findings, and veto records are indexed alongside the enacted text. Where the constitution requires the Legislature to enact specific legislation and the Legislature fails to do so, the LI publishes a non-compliance finding; the mandate becomes justiciable in the SC; and, for mandates tied to constitutional rights, affected parties may bring direct constitutional claims.</w:t>
+        <w:t xml:space="preserve">Bills pass by absolute majority of the full seated membership of both chambers. Higher thresholds apply to constitutional amendments, veto overrides, removal proceedings, and other matters specified in this constitution. The Speaker of each chamber must publish the final text of every enacted law to the NRS within the period defined by statute. All prior versions, committee reports, Inspectorate findings, and veto records are indexed alongside the enacted text. Where the constitution requires the Legislature to enact specific legislation and the Legislature fails to do so, the LI publishes a non-compliance finding; the mandate becomes justiciable in the SC; and, for mandates whose non-fulfilment directly impairs the exercise of a right guaranteed in Article I, affected parties may bring direct constitutional claims.</w:t>
       </w:r>
     </w:p>
     <w:p>

</xml_diff>

<commit_message>
Article VII review: five fixes
§7.1: 'government at every level' → 'Government' (sentence-starting);
'The state holds' → 'The Republic holds' — 'state' lowercase is
ambiguous given this document's use of 'State' for member States

§7.2: runoff tiebreaker added — where two candidates are tied for
the second national first-preference position, the Elections Panel
determines which advances by lot

§7.2.b: certification challenge actor named — 'either candidate or
the Elections Panel itself where it identifies a material error in
its own certification' (Principle 4: name the holder)

§7.3: RCV sentence clarified — 'except the presidential election
which follows §7.2' implied presidential elections don't use RCV;
corrected to 'presidential elections use RCV within the framework
of §7.2, which adds the State plurality requirement'
</commit_message>
<xml_diff>
--- a/constitution-current.docx
+++ b/constitution-current.docx
@@ -4238,7 +4238,7 @@
           <w:sz w:val="22"/>
           <w:szCs w:val="22"/>
         </w:rPr>
-        <w:t xml:space="preserve">Every eligible citizen holds the right to vote in federal elections and the right to have that vote counted. government at every level is prohibited from taking any action that makes voting more difficult, less accessible, or less secure. No law, rule, administrative decision, or practice that reduces access to the franchise is constitutionally valid. The state holds an affirmative obligation to make voting as accessible as possible consistent with security — it may not compel citizens to vote, but it must provide conditions in which doing so is genuinely possible. Federal election periods are public holidays.</w:t>
+        <w:t xml:space="preserve">Every eligible citizen holds the right to vote in federal elections and the right to have that vote counted. Government at every level is prohibited from taking any action that makes voting more difficult, less accessible, or less secure. No law, rule, administrative decision, or practice that reduces access to the franchise is constitutionally valid. The Republic holds an affirmative obligation to make voting as accessible as possible consistent with security — it may not compel citizens to vote, but it must provide conditions in which doing so is genuinely possible. Federal election periods are public holidays.</w:t>
       </w:r>
     </w:p>
     <w:p>
@@ -4289,7 +4289,7 @@
           <w:sz w:val="22"/>
           <w:szCs w:val="22"/>
         </w:rPr>
-        <w:t xml:space="preserve">The President is elected through two concurrent requirements: a national RCV majority and a State plurality qualification. A candidate wins outright by satisfying both. Where a candidate's national RCV majority reaches or exceeds 60% of active ballots, the State plurality requirement is waived. Where no candidate wins outright, a runoff is conducted between the two candidates with the highest national first-preference totals, determined by national RCV only with no State plurality requirement. The Elections Panel administers and certifies all presidential elections. Territory citizens vote in presidential elections and their votes count in the national RCV total; Territories are not included in the State plurality calculation.</w:t>
+        <w:t xml:space="preserve">The President is elected through two concurrent requirements: a national RCV majority and a State plurality qualification. A candidate wins outright by satisfying both. Where a candidate's national RCV majority reaches or exceeds 60% of active ballots, the State plurality requirement is waived. Where no candidate wins outright, a runoff is conducted between the two candidates with the highest national first-preference totals, determined by national RCV only with no State plurality requirement; where two candidates are tied for the second position, the Elections Panel determines which advances by lot. The Elections Panel administers and certifies all presidential elections. Territory citizens vote in presidential elections and their votes count in the national RCV total; Territories are not included in the State plurality calculation.</w:t>
       </w:r>
     </w:p>
     <w:p>
@@ -4340,7 +4340,7 @@
           <w:sz w:val="22"/>
           <w:szCs w:val="22"/>
         </w:rPr>
-        <w:t xml:space="preserve">A candidate satisfies the State plurality requirement by receiving more first-preference votes than any other candidate in a majority of the Republic's States. The Elections Panel certifies State-by-State first-preference results as part of overall election certification. Certification is final and may be challenged only before the SC within 14 days of certification. No transfer of presidential authority may be delayed beyond the constitutional transition provisions.</w:t>
+        <w:t xml:space="preserve">A candidate satisfies the State plurality requirement by receiving more first-preference votes than any other candidate in a majority of the Republic's States. The Elections Panel certifies State-by-State first-preference results as part of overall election certification. Certification is final and may be challenged only before the SC within 14 days of certification by either candidate or the Elections Panel itself where it identifies a material error in its own certification. No transfer of presidential authority may be delayed beyond the constitutional transition provisions.</w:t>
       </w:r>
     </w:p>
     <w:p>
@@ -4391,7 +4391,7 @@
           <w:sz w:val="22"/>
           <w:szCs w:val="22"/>
         </w:rPr>
-        <w:t xml:space="preserve">Federal elections are held at regular intervals: House elections every two years; Senate elections on the staggered six-year cycle; presidential elections every four years. All federal elections use Ranked Choice Voting — majority required, not plurality — except the presidential election which follows §7.2. The Legislature defines by statute the specific timing, duration, and structure of the federal electoral period within these constitutional floors. All federal elections, referenda, and confirmation votes are administered by the Elections Panel using the National Voting System, free from executive interference. The President may not declare, postpone, or influence the scheduling of elections — including declaring emergencies that have the effect of delaying them. No State may take any action that reduces NVS access, functionality, or availability within its territory. States may offer early voting, mail-in ballots, and alternative participation methods provided all methods connect to the NVS and meet its constitutional standards. Special elections for vacancies are administered by the Elections Panel under procedures established by statute.</w:t>
+        <w:t xml:space="preserve">Federal elections are held at regular intervals: House elections every two years; Senate elections on the staggered six-year cycle; presidential elections every four years. All federal elections use Ranked Choice Voting — majority required, not plurality; presidential elections use RCV within the framework of §7.2, which adds the State plurality requirement. The Legislature defines by statute the specific timing, duration, and structure of the federal electoral period within these constitutional floors. All federal elections, referenda, and confirmation votes are administered by the Elections Panel using the National Voting System, free from executive interference. The President may not declare, postpone, or influence the scheduling of elections — including declaring emergencies that have the effect of delaying them. No State may take any action that reduces NVS access, functionality, or availability within its territory. States may offer early voting, mail-in ballots, and alternative participation methods provided all methods connect to the NVS and meet its constitutional standards. Special elections for vacancies are administered by the Elections Panel under procedures established by statute.</w:t>
       </w:r>
     </w:p>
     <w:p>

</xml_diff>

<commit_message>
Article X (NRS) review: four fixes
§9.1 — Contradictory sentence removed:
'Every government act required to be published must appear on the
NRS before it takes legal effect' directly contradicts the correct
design principle four sentences later: 'The NRS is the record of
government, not a condition of it. Government acts take legal
effect from the moment of issuance regardless of NRS status.'
The early-draft sentence was never removed. Removed now.

§9.1: 'government acts take legal effect' →
'Government acts take legal effect' (sentence-starting)

§9.5: 'government records may be classified' →
'Government records may be classified' (sentence-starting)

§9.5.a: Automatic declassification actor named —
'On expiry, the NRS Panel publishes the declassified record within
30 days of the classification ceiling date; this obligation is
automatic and requires no further government act.'
Previously: 'automatic declassification applies within 30 days'
with no actor — Principle 4.
</commit_message>
<xml_diff>
--- a/constitution-current.docx
+++ b/constitution-current.docx
@@ -5559,7 +5559,7 @@
           <w:sz w:val="22"/>
           <w:szCs w:val="22"/>
         </w:rPr>
-        <w:t xml:space="preserve">The National Record System is the permanent, tamper-evident public record of the Republic — freely accessible to every Inhabitant at no cost. Every constitutional act, order, finding, certification, designation, declaration, and determination made under authority of this Constitution is published to the NRS as a permanent record. No provision of this Constitution need state this obligation individually; it applies universally by operation of this section. Where this Constitution specifies a publication timeline, that timeline governs; in all other cases, publication occurs at or before the effective moment of the act. Every government act required to be published must appear on the NRS before it takes legal effect. Records may not be deleted, altered, or reclassified after publication; corrections are published as new entries alongside the original. The NRS must remain fully functional in the event of localized technical failure — no single point of failure is constitutionally acceptable. The Legislature defines technical standards by statute. The NRS includes a permanent historical archive of all prior legislative acts, executive orders, judicial decisions, and government documents dating to the Republic's founding. Records published to the NRS by any jurisdiction within the Republic are recognized as authentic by all other jurisdictions without re-certification. Inspectorate reports are permanently exempt from classification. Citizens may submit corrections or context to any NRS record through a public mechanism maintained by the LI; submissions are published alongside the original after accuracy review. The NRS is the record of government, not a condition of it. government acts take legal effect from the moment of issuance regardless of NRS status; the publication obligation applies from the moment the NRS is restored. The JI maintains a continuously operating parallel authentication system, physically and logistically independent of the NRS, capable of authenticating and preserving all constitutional acts without NRS connectivity. This system operates in parallel at all times — not merely as a contingency — and records all authenticated acts with full constitutional effect from the moment of their issuance. Upon NRS restoration, all parallel system records migrate to the NRS as permanent records with their original issuance timestamps. Where the NRS has not been restored within 180 days, the parallel system becomes the constitutional record of the Republic; the Legislature must by statute establish permanent restoration obligations and timelines within 90 days of that threshold. The Legislature defines the technical specifications, security standards, and operational parameters of the parallel system by statute; the constitutional obligation to maintain it is absolute and its funding floor follows the NRS funding floor in this section. Funding for the NRS may not be reduced below the prior year’s level without a 2/3 vote of both chambers. Classification used to conceal a constitutional violation or illegal order is itself a constitutional offense.</w:t>
+        <w:t xml:space="preserve">The National Record System is the permanent, tamper-evident public record of the Republic — freely accessible to every Inhabitant at no cost. Every constitutional act, order, finding, certification, designation, declaration, and determination made under authority of this Constitution is published to the NRS as a permanent record. No provision of this Constitution need state this obligation individually; it applies universally by operation of this section. Where this Constitution specifies a publication timeline, that timeline governs; in all other cases, publication occurs at or before the effective moment of the act. Records may not be deleted, altered, or reclassified after publication; corrections are published as new entries alongside the original. The NRS must remain fully functional in the event of localized technical failure — no single point of failure is constitutionally acceptable. The Legislature defines technical standards by statute. The NRS includes a permanent historical archive of all prior legislative acts, executive orders, judicial decisions, and government documents dating to the Republic's founding. Records published to the NRS by any jurisdiction within the Republic are recognized as authentic by all other jurisdictions without re-certification. Inspectorate reports are permanently exempt from classification. Citizens may submit corrections or context to any NRS record through a public mechanism maintained by the LI; submissions are published alongside the original after accuracy review. The NRS is the record of government, not a condition of it. Government acts take legal effect from the moment of issuance regardless of NRS status; the publication obligation applies from the moment the NRS is restored. The JI maintains a continuously operating parallel authentication system, physically and logistically independent of the NRS, capable of authenticating and preserving all constitutional acts without NRS connectivity. This system operates in parallel at all times — not merely as a contingency — and records all authenticated acts with full constitutional effect from the moment of their issuance. Upon NRS restoration, all parallel system records migrate to the NRS as permanent records with their original issuance timestamps. Where the NRS has not been restored within 180 days, the parallel system becomes the constitutional record of the Republic; the Legislature must by statute establish permanent restoration obligations and timelines within 90 days of that threshold. The Legislature defines the technical specifications, security standards, and operational parameters of the parallel system by statute; the constitutional obligation to maintain it is absolute and its funding floor follows the NRS funding floor in this section. Funding for the NRS may not be reduced below the prior year’s level without a 2/3 vote of both chambers. Classification used to conceal a constitutional violation or illegal order is itself a constitutional offense.</w:t>
       </w:r>
     </w:p>
     <w:p>
@@ -5659,7 +5659,7 @@
           <w:sz w:val="22"/>
           <w:szCs w:val="22"/>
         </w:rPr>
-        <w:t xml:space="preserve">government records may be classified only on grounds the Legislature defines by statute. Classification to conceal a constitutional violation, policy disagreement, or political embarrassment is prohibited and void. The classifying authority must state the statutory ground at the time of classification.</w:t>
+        <w:t xml:space="preserve">Government records may be classified only on grounds the Legislature defines by statute. Classification to conceal a constitutional violation, policy disagreement, or political embarrassment is prohibited and void. The classifying authority must state the statutory ground at the time of classification.</w:t>
       </w:r>
     </w:p>
     <w:p>
@@ -5708,7 +5708,7 @@
           <w:sz w:val="22"/>
           <w:szCs w:val="22"/>
         </w:rPr>
-        <w:t xml:space="preserve">No record may remain classified beyond 25 years from the date of original classification. A single 5-year extension may be granted where the responsible executive publishes a justification to the EI; the EI certifies whether the justification meets the statutory standard and publishes its finding to the NRS. No material may remain classified beyond 30 years under any circumstances. On expiry, automatic declassification and NRS publication applies within 30 days. All other classification periods, procedures, and review mechanisms are defined by statute within this ceiling.</w:t>
+        <w:t xml:space="preserve">No record may remain classified beyond 25 years from the date of original classification. A single 5-year extension may be granted where the responsible executive publishes a justification to the EI; the EI certifies whether the justification meets the statutory standard and publishes its finding to the NRS. No material may remain classified beyond 30 years under any circumstances. On expiry, the NRS Panel publishes the declassified record within 30 days of the classification ceiling date; this obligation is automatic and requires no further government act. All other classification periods, procedures, and review mechanisms are defined by statute within this ceiling.</w:t>
       </w:r>
     </w:p>
     <w:p>

</xml_diff>

<commit_message>
Article XIV (Military) review: five fixes
§12.1 — genocide definition:
Added 'as recognized under international law' — prevents domestic
redefinition of genocide to authorize operations that would not
meet the international legal standard

§12.1 — nation-building prohibition:
'nation-building' → 'the installation, support, or maintenance of
a specific governmental structure in another sovereign state'
Informal term replaced with precise constitutional language

§12.2 — EI accountability report:
180-day constitutional floor added where statute absent — military
accountability is time-sensitive; open-ended statutory window
creates too much flexibility for delay

§12.4 — Reconstruction Plan binding effect:
'binding on the executive' → 'binding on both executives within
their respective domains' — withdrawal timeline binds President
(military domain); domestic implementation binds PM

§12.5 — 'legislature' → 'Legislature'
</commit_message>
<xml_diff>
--- a/constitution-current.docx
+++ b/constitution-current.docx
@@ -6348,7 +6348,7 @@
           <w:sz w:val="22"/>
           <w:szCs w:val="22"/>
         </w:rPr>
-        <w:t xml:space="preserve">Military force serves two authorized purposes: protection of the Republic's territory, citizens, and treaty allies; and, with legislative authorization stating the specific grounds, response to genocide. Three purposes are explicitly prohibited regardless of legislative authorization: nation-building, resource extraction, and ideological imposition. Legislative authorization must state which authorized purpose it serves; authorization that cannot be linked to an authorized purpose is constitutionally void.</w:t>
+        <w:t xml:space="preserve">Military force serves two authorized purposes: protection of the Republic's territory, citizens, and treaty allies; and, with legislative authorization stating the specific grounds, response to genocide as recognized under international law. Three purposes are explicitly prohibited regardless of legislative authorization: the installation, support, or maintenance of a specific governmental structure in another sovereign state; resource extraction; and ideological imposition. Legislative authorization must state which authorized purpose it serves; authorization that cannot be linked to an authorized purpose is constitutionally void.</w:t>
       </w:r>
     </w:p>
     <w:p>
@@ -6399,7 +6399,7 @@
           <w:sz w:val="22"/>
           <w:szCs w:val="22"/>
         </w:rPr>
-        <w:t xml:space="preserve">Military expenditure is authorized through PM certification concurrent with legislative authorization. No military operation may be funded without PM certification; the PM may certify, condition, or decline certification on any operation. Expenditure in categories not covered by the certification requires supplementary PM certification. When legislative authorization expires or is not renewed, all military expenditure ceases; ongoing contracts may continue to wind down for the period the Legislature defines by statute; no new commitments may be entered after authorization expires. The EI audits all military expenditure during active operations and publishes findings to the NRS. Within the period the Legislature defines by statute following the conclusion of any military operation, the EI publishes a comprehensive expenditure accountability report. Where the PM declines certification for ongoing military operations that have been legislatively authorized, previously certified operational expenditure continues at maintenance-only levels for the period the Legislature defines by statute — covering only operations explicitly within the prior authorization, with no escalations, expansions, or new commitments permitted; the President must publish notice of the certification refusal to the NRS within 24 hours with stated grounds; both chambers must be notified simultaneously; if the Legislature does not act within the maintenance period, all expenditure ceases. A PM who declines certification bears the same constitutional attribution for the consequences of that decision as a President who orders an operation.</w:t>
+        <w:t xml:space="preserve">Military expenditure is authorized through PM certification concurrent with legislative authorization. No military operation may be funded without PM certification; the PM may certify, condition, or decline certification on any operation. Expenditure in categories not covered by the certification requires supplementary PM certification. When legislative authorization expires or is not renewed, all military expenditure ceases; ongoing contracts may continue to wind down for the period the Legislature defines by statute; no new commitments may be entered after authorization expires. The EI audits all military expenditure during active operations and publishes findings to the NRS. Within the period the Legislature defines by statute following the conclusion of any military operation, not to exceed 180 days, the EI publishes a comprehensive expenditure accountability report. Where the PM declines certification for ongoing military operations that have been legislatively authorized, previously certified operational expenditure continues at maintenance-only levels for the period the Legislature defines by statute — covering only operations explicitly within the prior authorization, with no escalations, expansions, or new commitments permitted; the President must publish notice of the certification refusal to the NRS within 24 hours with stated grounds; both chambers must be notified simultaneously; if the Legislature does not act within the maintenance period, all expenditure ceases. A PM who declines certification bears the same constitutional attribution for the consequences of that decision as a President who orders an operation.</w:t>
       </w:r>
     </w:p>
     <w:p>
@@ -6501,7 +6501,7 @@
           <w:sz w:val="22"/>
           <w:szCs w:val="22"/>
         </w:rPr>
-        <w:t xml:space="preserve">Within the period defined by statute following legislative military authorization being renewed for a second time, the Senate must approve a Transition and Reconstruction Plan specifying the Republic's post-conflict obligations: status of alliance obligations, civilian reconstruction support, transitional justice support, and withdrawal timeline. The Plan is published to the NRS and is binding on the executive. If the Senate fails to approve a Plan within the required period, the LI certifies a constitutional compliance breach; the PM may provisionally authorize continued operations for up to 60 days total in two 30-day extensions, each requiring PM notification to the Senate Armed Services Committee and certification that operations remain within the Declaration's scope. Once the two extensions are exhausted, no further authorization renewals are permitted until the Senate approves a Plan.</w:t>
+        <w:t xml:space="preserve">Within the period defined by statute following legislative military authorization being renewed for a second time, the Senate must approve a Transition and Reconstruction Plan specifying the Republic's post-conflict obligations: status of alliance obligations, civilian reconstruction support, transitional justice support, and withdrawal timeline. The Plan is published to the NRS and is binding on both executives within their respective domains. If the Senate fails to approve a Plan within the required period, the LI certifies a constitutional compliance breach; the PM may provisionally authorize continued operations for up to 60 days total in two 30-day extensions, each requiring PM notification to the Senate Armed Services Committee and certification that operations remain within the Declaration's scope. Once the two extensions are exhausted, no further authorization renewals are permitted until the Senate approves a Plan.</w:t>
       </w:r>
     </w:p>
     <w:p>
@@ -6552,7 +6552,7 @@
           <w:sz w:val="22"/>
           <w:szCs w:val="22"/>
         </w:rPr>
-        <w:t xml:space="preserve">Where an existing treaty requires emergency military action, the President may act immediately and must notify both chambers and the PM within 12 hours, citing the specific treaty obligation triggered. The legislature must then authorize continuation within the period defined by statute; absent authorization, operations cease. Treaties cannot substitute for legislative authorization of sustained engagement — each continued operation requires authorization regardless of what the treaty requires. PM certification of expenditure applies from the moment of action under §12.2.</w:t>
+        <w:t xml:space="preserve">Where an existing treaty requires emergency military action, the President may act immediately and must notify both chambers and the PM within 12 hours, citing the specific treaty obligation triggered. The Legislature must then authorize continuation within the period defined by statute; absent authorization, operations cease. Treaties cannot substitute for legislative authorization of sustained engagement — each continued operation requires authorization regardless of what the treaty requires. PM certification of expenditure applies from the moment of action under §12.2.</w:t>
       </w:r>
     </w:p>
     <w:p>

</xml_diff>

<commit_message>
Article XVII (Amendment) review: three fixes
§15.1 — Two cleanups:
1. 'Citizen Initiative Amendment (Path C)' → 'Citizen Initiative
   Amendment' — the Path A/B labels were removed; 'Path C' is an
   inconsistent holdover; all amendment paths now named descriptively
2. Duplicate withdrawal sentence removed — 'A proposed amendment may
   be withdrawn at any point before ratification is certified' appeared
   in both §15.1 and §15.5; §15.5 handles all procedural consequences
   of the ratification process; removed from §15.1

§15.5 — LI consistency analysis timing specified:
'within 30 days of its official proposal' — 'official proposal'
was undefined. Now: 'within 30 days of passage by both chambers
for a parliamentary amendment, or within 30 days of LI petition
verification for a citizen initiative amendment'
</commit_message>
<xml_diff>
--- a/constitution-current.docx
+++ b/constitution-current.docx
@@ -7450,7 +7450,7 @@
           <w:szCs w:val="22"/>
         </w:rPr>
         <w:t xml:space="preserve">This Constitution may be amended through the parliamentary path or through citizen initiative. No executive signature is required; no executive veto applies. Every member’s vote on any amendment is published to the NRS.
-A parliamentary amendment requires a 2/3 supermajority of the full seated membership of both chambers. The proposing body simultaneously specifies the ratification mechanism — either State Ratification (ratification by 2/3 of States within the period defined by statute) or Popular Ratification (a national popular referendum achieving 2/3 affirmative support with at least 55% citizen participation within 180 days). A proposed amendment may be withdrawn at any point before ratification is certified. Citizen Initiative Amendment (Path C): Any proposed constitutional amendment supported by a petition of at least 15% of eligible voters, as verified by the LI, proceeds directly to a national referendum. Passage requires 70% of votes cast with a minimum 65% citizen participation; where the participation floor is not met the initiative fails and may not be resubmitted on the same or substantially similar grounds for five years. No legislative or executive action is required to place the initiative on the ballot; the Elections Panel administers the referendum within 180 days of LI petition verification. Path C amendments are subject to §15.5 consistency analysis by the LI, advisory only.</w:t>
+A parliamentary amendment requires a 2/3 supermajority of the full seated membership of both chambers. The proposing body simultaneously specifies the ratification mechanism — either State Ratification (ratification by 2/3 of States within the period defined by statute) or Popular Ratification (a national popular referendum achieving 2/3 affirmative support with at least 55% citizen participation within 180 days). Citizen Initiative Amendment: Any proposed constitutional amendment supported by a petition of at least 15% of eligible voters, as verified by the LI, proceeds directly to a national referendum. Passage requires 70% of votes cast with a minimum 65% citizen participation; where the participation floor is not met the initiative fails and may not be resubmitted on the same or substantially similar grounds for five years. No legislative or executive action is required to place the initiative on the ballot; the Elections Panel administers the referendum within 180 days of LI petition verification. Citizen initiative amendments are subject to §15.5 consistency analysis by the LI, advisory only.</w:t>
       </w:r>
     </w:p>
     <w:p>
@@ -7552,7 +7552,7 @@
           <w:sz w:val="22"/>
           <w:szCs w:val="22"/>
         </w:rPr>
-        <w:t xml:space="preserve">An amendment that is logically inconsistent with an existing provision must either explicitly repeal the inconsistent provision or the inconsistency is treated as void. The LI publishes a consistency analysis of any proposed amendment within 30 days of its official proposal — advisory, but a permanent public record of what the amendment changes. If a ratified amendment's consistency with existing provisions is disputed, the SC resolves the dispute on expedited review; the SC may not refuse to apply an amendment that has met its procedural thresholds. Amendments take prospective effect from the date of ratification — they do not retroactively alter the constitutionality of acts that were constitutional when performed. Two amendments may be simultaneously in the ratification process; if both pass, both are law; where they conflict, the one ratified later prevails; where margins and timing are equal, the LI determines precedence from NRS records. A proposed amendment may be withdrawn at any point before ratification is certified.</w:t>
+        <w:t xml:space="preserve">An amendment that is logically inconsistent with an existing provision must either explicitly repeal the inconsistent provision or the inconsistency is treated as void. The LI publishes a consistency analysis of any proposed amendment within 30 days of passage by both chambers for a parliamentary amendment, or within 30 days of LI petition verification for a citizen initiative amendment — advisory, but a permanent public record of what the amendment changes. If a ratified amendment's consistency with existing provisions is disputed, the SC resolves the dispute on expedited review; the SC may not refuse to apply an amendment that has met its procedural thresholds. Amendments take prospective effect from the date of ratification — they do not retroactively alter the constitutionality of acts that were constitutional when performed. Two amendments may be simultaneously in the ratification process; if both pass, both are law; where they conflict, the one ratified later prevails; where margins and timing are equal, the LI determines precedence from NRS records. A proposed amendment may be withdrawn at any point before ratification is certified.</w:t>
       </w:r>
     </w:p>
     <w:p>

</xml_diff>

<commit_message>
Article XX (Associated Communities) review: two fixes
§20.3 — Compact suspension meaning clarified:
'During suspension, both parties obligations continue in effect;
the Associated Community's observer delegate rights are suspended'
created a contradiction — if all obligations continue, what does
suspension mean? Now explicit: compact suspension means observer
delegate participation rights are suspended; all other compact
obligations of both parties continue pending SC determination.

§20.4 — Termination notice:
'The Republic receives written notice of termination' → 'the
Associated Community publishes written notice of termination to
the NRS' — consistent with the NRS-first publication principle
throughout the document; the 12-month transition period runs
from the NRS publication date, not from private notice.
</commit_message>
<xml_diff>
--- a/constitution-current.docx
+++ b/constitution-current.docx
@@ -8911,7 +8911,7 @@
           <w:sz w:val="22"/>
           <w:szCs w:val="22"/>
         </w:rPr>
-        <w:t xml:space="preserve">No compact may be entered or ratified with any entity whose governance practices include, authorize, or systematically permit violations of any of the non-derogable rights established in §1.26.b, committed against any person within its jurisdiction. The Judicial Inspectorate certifies compliance with this condition before parliamentary ratification of any compact; a compact negotiated with a non-compliant entity is void regardless of parliamentary ratification. The JI conducts annual compliance reviews and publishes findings to the NRS. Where the JI finds systematic violations of the non-derogable rights under §1.26.b, the compact is suspended pending Supreme Court review. The Court may terminate the compact on confirmed systematic violations without remediation within a period the Legislature defines by statute. Economic value of the compact relationship is not a factor in JI certification or Supreme Court review. Where an Associated Community's territory includes indigenous nations with pre-existing governance relationships, the compact must address those relationships and may not require the Associated Community to eliminate or diminish pre-existing indigenous governance arrangements within its territory. The Legislature may not schedule a compact ratification vote until the JI publishes its certification finding. During suspension, both parties' obligations under the compact continue in effect pending the SC's determination; the Associated Community's observer delegate rights are suspended for the duration of the review.</w:t>
+        <w:t xml:space="preserve">No compact may be entered or ratified with any entity whose governance practices include, authorize, or systematically permit violations of any of the non-derogable rights established in §1.26.b, committed against any person within its jurisdiction. The Judicial Inspectorate certifies compliance with this condition before parliamentary ratification of any compact; a compact negotiated with a non-compliant entity is void regardless of parliamentary ratification. The JI conducts annual compliance reviews and publishes findings to the NRS. Where the JI finds systematic violations of the non-derogable rights under §1.26.b, the compact is suspended pending Supreme Court review. The Court may terminate the compact on confirmed systematic violations without remediation within a period the Legislature defines by statute. Economic value of the compact relationship is not a factor in JI certification or Supreme Court review. Where an Associated Community's territory includes indigenous nations with pre-existing governance relationships, the compact must address those relationships and may not require the Associated Community to eliminate or diminish pre-existing indigenous governance arrangements within its territory. The Legislature may not schedule a compact ratification vote until the JI publishes its certification finding. Compact suspension means the Associated Community's observer delegate participation rights are suspended for the duration of the review; all other compact obligations of both parties continue in effect pending the SC's determination.</w:t>
       </w:r>
     </w:p>
     <w:p>
@@ -8962,7 +8962,7 @@
           <w:sz w:val="22"/>
           <w:szCs w:val="22"/>
         </w:rPr>
-        <w:t xml:space="preserve">The Associated Community may at any time, by its own democratic or traditional governance process, elect to terminate the compact and proceed as a fully independent sovereign nation. No Republic consent is required for compact termination, and the Republic may not impose conditions on or penalties for the decision to terminate. Compact termination takes effect on a date not less than 12 months from the date the Republic receives written notice of termination, to allow orderly transition of any services the compact provides. Where the Associated Community's highest governance authority issues a formal ruling within the 12-month period that the termination decision was invalid under the community's own governance law, the community may withdraw the termination notice; the Republic acknowledges the withdrawal and the compact continues.</w:t>
+        <w:t xml:space="preserve">The Associated Community may at any time, by its own democratic or traditional governance process, elect to terminate the compact and proceed as a fully independent sovereign nation. No Republic consent is required for compact termination, and the Republic may not impose conditions on or penalties for the decision to terminate. Compact termination takes effect on a date not less than 12 months from the date the Associated Community publishes written notice of termination to the NRS, to allow orderly transition of any services the compact provides. Where the Associated Community's highest governance authority issues a formal ruling within the 12-month period that the termination decision was invalid under the community's own governance law, the community may withdraw the termination notice; the Republic acknowledges the withdrawal and the compact continues.</w:t>
       </w:r>
     </w:p>
     <w:p>

</xml_diff>

<commit_message>
Gap renumbering: sequential provision numbers throughout
44 provision renaming operations across 9 articles + 38 HTML files.

Article I (9 sequential gaps closed):
  §1.12→§1.11, §1.13→§1.12, §1.16→§1.13, §1.19→§1.14, §1.20→§1.15,
  §1.21→§1.16, §1.22→§1.17, §1.23→§1.18,
  §1.26→§1.19 (+ §1.26.a-e → §1.19.a-e), §1.27→§1.20,
  §1.28→§1.21, §1.31→§1.22, §1.32→§1.23

Article V (sub-provision gaps):
  §5.1.c→§5.1.a, §5.1.f→§5.1.b

Article VI (§6.4 block → §6.3):
  §6.4→§6.3, §6.4.c→§6.3.a, §6.4.e→§6.3.b, §6.4.h→§6.3.c

Article IX (Inspectorates):
  §9.4.e→§9.4.b, §9.12→§9.11, §9.12.a→§9.11.a

Article X (NRS):
  §10.4→§10.2, §10.5→§10.3, §10.5.a→§10.3.a

Article XI (NRS Panel):
  §11.3→§11.2, §11.5→§11.3

Article XII (Social State):
  §12.5→§12.4, §12.6→§12.5, §12.7→§12.6

Article XVII (Amendment):
  §17.5→§17.3, §17.6→§17.4

Article XIX (Transition):
  §19.4→§19.3 through §19.10→§19.9
</commit_message>
<xml_diff>
--- a/constitution-current.docx
+++ b/constitution-current.docx
@@ -365,7 +365,7 @@
           <w:sz w:val="22"/>
           <w:szCs w:val="22"/>
         </w:rPr>
-        <w:t xml:space="preserve">Torture and cruel, inhuman, or degrading treatment are absolutely prohibited. No person within the Republic's jurisdiction may be subjected to any such treatment under any circumstances. This right is non-derogable under §1.26.b.</w:t>
+        <w:t xml:space="preserve">Torture and cruel, inhuman, or degrading treatment are absolutely prohibited. No person within the Republic's jurisdiction may be subjected to any such treatment under any circumstances. This right is non-derogable under §1.19.b.</w:t>
       </w:r>
     </w:p>
     <w:p>
@@ -416,7 +416,7 @@
           <w:sz w:val="22"/>
           <w:szCs w:val="22"/>
         </w:rPr>
-        <w:t xml:space="preserve">Slavery, involuntary servitude, and forced labor are absolutely prohibited. Lawfully imposed prison labor and compulsory military service under the terms established by statute do not constitute forced labor under this provision. This right is non-derogable under §1.26.b.</w:t>
+        <w:t xml:space="preserve">Slavery, involuntary servitude, and forced labor are absolutely prohibited. Lawfully imposed prison labor and compulsory military service under the terms established by statute do not constitute forced labor under this provision. This right is non-derogable under §1.19.b.</w:t>
       </w:r>
     </w:p>
     <w:p>
@@ -740,6 +740,57 @@
           <w:sz w:val="18"/>
           <w:szCs w:val="18"/>
         </w:rPr>
+        <w:t xml:space="preserve">§1.11  </w:t>
+      </w:r>
+      <w:r>
+        <w:rPr>
+          <w:rFonts w:ascii="Garamond" w:cs="Garamond" w:eastAsia="Garamond" w:hAnsi="Garamond"/>
+          <w:b/>
+          <w:bCs/>
+          <w:i w:val="false"/>
+          <w:iCs w:val="false"/>
+          <w:color w:val="1B2A4A"/>
+          <w:sz w:val="22"/>
+          <w:szCs w:val="22"/>
+        </w:rPr>
+        <w:t xml:space="preserve">Habeas Corpus</w:t>
+      </w:r>
+    </w:p>
+    <w:p>
+      <w:pPr>
+        <w:spacing w:after="120" w:before="0"/>
+        <w:ind w:left="431"/>
+        <w:jc w:val="both"/>
+      </w:pPr>
+      <w:r>
+        <w:rPr>
+          <w:rFonts w:ascii="Garamond" w:cs="Garamond" w:eastAsia="Garamond" w:hAnsi="Garamond"/>
+          <w:b w:val="false"/>
+          <w:bCs w:val="false"/>
+          <w:i w:val="false"/>
+          <w:iCs w:val="false"/>
+          <w:color w:val="2a2520"/>
+          <w:sz w:val="22"/>
+          <w:szCs w:val="22"/>
+        </w:rPr>
+        <w:t xml:space="preserve">Every person detained by public authority has the right to challenge that detention before an independent court. The detaining authority must produce the person and justify the detention within the period established by statute. No court may decline to hear a habeas corpus application. This right is non-derogable under §1.19.b.</w:t>
+      </w:r>
+    </w:p>
+    <w:p>
+      <w:pPr>
+        <w:spacing w:after="60" w:before="200"/>
+        <w:ind w:left="431"/>
+        <w:jc w:val="left"/>
+      </w:pPr>
+      <w:r>
+        <w:rPr>
+          <w:rFonts w:ascii="Courier New" w:cs="Courier New" w:eastAsia="Courier New" w:hAnsi="Courier New"/>
+          <w:b/>
+          <w:bCs/>
+          <w:color w:val="1B2A4A"/>
+          <w:sz w:val="18"/>
+          <w:szCs w:val="18"/>
+        </w:rPr>
         <w:t xml:space="preserve">§1.12  </w:t>
       </w:r>
       <w:r>
@@ -753,27 +804,27 @@
           <w:sz w:val="22"/>
           <w:szCs w:val="22"/>
         </w:rPr>
-        <w:t xml:space="preserve">Habeas Corpus</w:t>
-      </w:r>
-    </w:p>
-    <w:p>
-      <w:pPr>
-        <w:spacing w:after="120" w:before="0"/>
-        <w:ind w:left="431"/>
-        <w:jc w:val="both"/>
-      </w:pPr>
-      <w:r>
-        <w:rPr>
-          <w:rFonts w:ascii="Garamond" w:cs="Garamond" w:eastAsia="Garamond" w:hAnsi="Garamond"/>
-          <w:b w:val="false"/>
-          <w:bCs w:val="false"/>
-          <w:i w:val="false"/>
-          <w:iCs w:val="false"/>
-          <w:color w:val="2a2520"/>
-          <w:sz w:val="22"/>
-          <w:szCs w:val="22"/>
-        </w:rPr>
-        <w:t xml:space="preserve">Every person detained by public authority has the right to challenge that detention before an independent court. The detaining authority must produce the person and justify the detention within the period established by statute. No court may decline to hear a habeas corpus application. This right is non-derogable under §1.26.b.</w:t>
+        <w:t xml:space="preserve">Rights of the Accused and Fair Trial</w:t>
+      </w:r>
+    </w:p>
+    <w:p>
+      <w:pPr>
+        <w:spacing w:after="120" w:before="0"/>
+        <w:ind w:left="431"/>
+        <w:jc w:val="both"/>
+      </w:pPr>
+      <w:r>
+        <w:rPr>
+          <w:rFonts w:ascii="Garamond" w:cs="Garamond" w:eastAsia="Garamond" w:hAnsi="Garamond"/>
+          <w:b w:val="false"/>
+          <w:bCs w:val="false"/>
+          <w:i w:val="false"/>
+          <w:iCs w:val="false"/>
+          <w:color w:val="2a2520"/>
+          <w:sz w:val="22"/>
+          <w:szCs w:val="22"/>
+        </w:rPr>
+        <w:t xml:space="preserve">Every person accused of a criminal offence holds: the right to be informed promptly of the charges; the right to counsel of their choosing, or to competent, adequately resourced counsel appointed at public expense where they cannot afford representation; the right to adequate time and means to prepare a defense; the right to examine witnesses; the right to silence without adverse inference; and the right to a speedy trial. No person may be penalised — by sentence enhancement or otherwise — solely for exercising the right to trial. Bail may not be used as punishment; its purpose is ensuring appearance and public safety, calibrated to individual circumstances. The Legislature establishes by statute the procedural framework for criminal proceedings, subject to the requirements of this provision. Where algorithmic systems are used as evidence, the accused has the right to examine the system's methodology.</w:t>
       </w:r>
     </w:p>
     <w:p>
@@ -804,27 +855,129 @@
           <w:sz w:val="22"/>
           <w:szCs w:val="22"/>
         </w:rPr>
-        <w:t xml:space="preserve">Rights of the Accused and Fair Trial</w:t>
-      </w:r>
-    </w:p>
-    <w:p>
-      <w:pPr>
-        <w:spacing w:after="120" w:before="0"/>
-        <w:ind w:left="431"/>
-        <w:jc w:val="both"/>
-      </w:pPr>
-      <w:r>
-        <w:rPr>
-          <w:rFonts w:ascii="Garamond" w:cs="Garamond" w:eastAsia="Garamond" w:hAnsi="Garamond"/>
-          <w:b w:val="false"/>
-          <w:bCs w:val="false"/>
-          <w:i w:val="false"/>
-          <w:iCs w:val="false"/>
-          <w:color w:val="2a2520"/>
-          <w:sz w:val="22"/>
-          <w:szCs w:val="22"/>
-        </w:rPr>
-        <w:t xml:space="preserve">Every person accused of a criminal offence holds: the right to be informed promptly of the charges; the right to counsel of their choosing, or to competent, adequately resourced counsel appointed at public expense where they cannot afford representation; the right to adequate time and means to prepare a defense; the right to examine witnesses; the right to silence without adverse inference; and the right to a speedy trial. No person may be penalised — by sentence enhancement or otherwise — solely for exercising the right to trial. Bail may not be used as punishment; its purpose is ensuring appearance and public safety, calibrated to individual circumstances. The Legislature establishes by statute the procedural framework for criminal proceedings, subject to the requirements of this provision. Where algorithmic systems are used as evidence, the accused has the right to examine the system's methodology.</w:t>
+        <w:t xml:space="preserve">Right to a Public Trial</w:t>
+      </w:r>
+    </w:p>
+    <w:p>
+      <w:pPr>
+        <w:spacing w:after="120" w:before="0"/>
+        <w:ind w:left="431"/>
+        <w:jc w:val="both"/>
+      </w:pPr>
+      <w:r>
+        <w:rPr>
+          <w:rFonts w:ascii="Garamond" w:cs="Garamond" w:eastAsia="Garamond" w:hAnsi="Garamond"/>
+          <w:b w:val="false"/>
+          <w:bCs w:val="false"/>
+          <w:i w:val="false"/>
+          <w:iCs w:val="false"/>
+          <w:color w:val="2a2520"/>
+          <w:sz w:val="22"/>
+          <w:szCs w:val="22"/>
+        </w:rPr>
+        <w:t xml:space="preserve">Every person accused of a criminal offence has the right to a public trial before an independent court. Proceedings may be held in camera only to the minimum extent necessary to protect a compelling interest identified in advance by the court; the existence of any proceeding may not be concealed. This right is non-derogable under §1.19.b.</w:t>
+      </w:r>
+    </w:p>
+    <w:p>
+      <w:pPr>
+        <w:spacing w:after="60" w:before="200"/>
+        <w:ind w:left="431"/>
+        <w:jc w:val="left"/>
+      </w:pPr>
+      <w:r>
+        <w:rPr>
+          <w:rFonts w:ascii="Courier New" w:cs="Courier New" w:eastAsia="Courier New" w:hAnsi="Courier New"/>
+          <w:b/>
+          <w:bCs/>
+          <w:color w:val="1B2A4A"/>
+          <w:sz w:val="18"/>
+          <w:szCs w:val="18"/>
+        </w:rPr>
+        <w:t xml:space="preserve">§1.14  </w:t>
+      </w:r>
+      <w:r>
+        <w:rPr>
+          <w:rFonts w:ascii="Garamond" w:cs="Garamond" w:eastAsia="Garamond" w:hAnsi="Garamond"/>
+          <w:b/>
+          <w:bCs/>
+          <w:i w:val="false"/>
+          <w:iCs w:val="false"/>
+          <w:color w:val="1B2A4A"/>
+          <w:sz w:val="22"/>
+          <w:szCs w:val="22"/>
+        </w:rPr>
+        <w:t xml:space="preserve">Freedom from Retroactive Criminal Law</w:t>
+      </w:r>
+    </w:p>
+    <w:p>
+      <w:pPr>
+        <w:spacing w:after="120" w:before="0"/>
+        <w:ind w:left="431"/>
+        <w:jc w:val="both"/>
+      </w:pPr>
+      <w:r>
+        <w:rPr>
+          <w:rFonts w:ascii="Garamond" w:cs="Garamond" w:eastAsia="Garamond" w:hAnsi="Garamond"/>
+          <w:b w:val="false"/>
+          <w:bCs w:val="false"/>
+          <w:i w:val="false"/>
+          <w:iCs w:val="false"/>
+          <w:color w:val="2a2520"/>
+          <w:sz w:val="22"/>
+          <w:szCs w:val="22"/>
+        </w:rPr>
+        <w:t xml:space="preserve">No person may be convicted of an act that was not a criminal offence when committed, or subjected to a penalty greater than that applicable at the time of the offence. No criminal law may be applied retroactively to the disadvantage of the accused. This right is non-derogable under §1.19.b.</w:t>
+      </w:r>
+    </w:p>
+    <w:p>
+      <w:pPr>
+        <w:spacing w:after="60" w:before="200"/>
+        <w:ind w:left="431"/>
+        <w:jc w:val="left"/>
+      </w:pPr>
+      <w:r>
+        <w:rPr>
+          <w:rFonts w:ascii="Courier New" w:cs="Courier New" w:eastAsia="Courier New" w:hAnsi="Courier New"/>
+          <w:b/>
+          <w:bCs/>
+          <w:color w:val="1B2A4A"/>
+          <w:sz w:val="18"/>
+          <w:szCs w:val="18"/>
+        </w:rPr>
+        <w:t xml:space="preserve">§1.15  </w:t>
+      </w:r>
+      <w:r>
+        <w:rPr>
+          <w:rFonts w:ascii="Garamond" w:cs="Garamond" w:eastAsia="Garamond" w:hAnsi="Garamond"/>
+          <w:b/>
+          <w:bCs/>
+          <w:i w:val="false"/>
+          <w:iCs w:val="false"/>
+          <w:color w:val="1B2A4A"/>
+          <w:sz w:val="22"/>
+          <w:szCs w:val="22"/>
+        </w:rPr>
+        <w:t xml:space="preserve">Double Jeopardy</w:t>
+      </w:r>
+    </w:p>
+    <w:p>
+      <w:pPr>
+        <w:spacing w:after="120" w:before="0"/>
+        <w:ind w:left="431"/>
+        <w:jc w:val="both"/>
+      </w:pPr>
+      <w:r>
+        <w:rPr>
+          <w:rFonts w:ascii="Garamond" w:cs="Garamond" w:eastAsia="Garamond" w:hAnsi="Garamond"/>
+          <w:b w:val="false"/>
+          <w:bCs w:val="false"/>
+          <w:i w:val="false"/>
+          <w:iCs w:val="false"/>
+          <w:color w:val="2a2520"/>
+          <w:sz w:val="22"/>
+          <w:szCs w:val="22"/>
+        </w:rPr>
+        <w:t xml:space="preserve">No person may be tried or punished twice for the same offence following a final acquittal or conviction. The Legislature defines by statute the scope of this protection, including its application across jurisdictions.</w:t>
       </w:r>
     </w:p>
     <w:p>
@@ -855,27 +1008,129 @@
           <w:sz w:val="22"/>
           <w:szCs w:val="22"/>
         </w:rPr>
-        <w:t xml:space="preserve">Right to a Public Trial</w:t>
-      </w:r>
-    </w:p>
-    <w:p>
-      <w:pPr>
-        <w:spacing w:after="120" w:before="0"/>
-        <w:ind w:left="431"/>
-        <w:jc w:val="both"/>
-      </w:pPr>
-      <w:r>
-        <w:rPr>
-          <w:rFonts w:ascii="Garamond" w:cs="Garamond" w:eastAsia="Garamond" w:hAnsi="Garamond"/>
-          <w:b w:val="false"/>
-          <w:bCs w:val="false"/>
-          <w:i w:val="false"/>
-          <w:iCs w:val="false"/>
-          <w:color w:val="2a2520"/>
-          <w:sz w:val="22"/>
-          <w:szCs w:val="22"/>
-        </w:rPr>
-        <w:t xml:space="preserve">Every person accused of a criminal offence has the right to a public trial before an independent court. Proceedings may be held in camera only to the minimum extent necessary to protect a compelling interest identified in advance by the court; the existence of any proceeding may not be concealed. This right is non-derogable under §1.26.b.</w:t>
+        <w:t xml:space="preserve">Social Assistance Floor</w:t>
+      </w:r>
+    </w:p>
+    <w:p>
+      <w:pPr>
+        <w:spacing w:after="120" w:before="0"/>
+        <w:ind w:left="431"/>
+        <w:jc w:val="both"/>
+      </w:pPr>
+      <w:r>
+        <w:rPr>
+          <w:rFonts w:ascii="Garamond" w:cs="Garamond" w:eastAsia="Garamond" w:hAnsi="Garamond"/>
+          <w:b w:val="false"/>
+          <w:bCs w:val="false"/>
+          <w:i w:val="false"/>
+          <w:iCs w:val="false"/>
+          <w:color w:val="2a2520"/>
+          <w:sz w:val="22"/>
+          <w:szCs w:val="22"/>
+        </w:rPr>
+        <w:t xml:space="preserve">Every Inhabitant is entitled to access the Republic's social state systems under Article X. No government may exclude any person from social assistance on the basis of the characteristics listed in §1.6. The Legislature establishes by statute the content and administration of social assistance, subject to the adequacy standards certified under §12.1.</w:t>
+      </w:r>
+    </w:p>
+    <w:p>
+      <w:pPr>
+        <w:spacing w:after="60" w:before="200"/>
+        <w:ind w:left="431"/>
+        <w:jc w:val="left"/>
+      </w:pPr>
+      <w:r>
+        <w:rPr>
+          <w:rFonts w:ascii="Courier New" w:cs="Courier New" w:eastAsia="Courier New" w:hAnsi="Courier New"/>
+          <w:b/>
+          <w:bCs/>
+          <w:color w:val="1B2A4A"/>
+          <w:sz w:val="18"/>
+          <w:szCs w:val="18"/>
+        </w:rPr>
+        <w:t xml:space="preserve">§1.17  </w:t>
+      </w:r>
+      <w:r>
+        <w:rPr>
+          <w:rFonts w:ascii="Garamond" w:cs="Garamond" w:eastAsia="Garamond" w:hAnsi="Garamond"/>
+          <w:b/>
+          <w:bCs/>
+          <w:i w:val="false"/>
+          <w:iCs w:val="false"/>
+          <w:color w:val="1B2A4A"/>
+          <w:sz w:val="22"/>
+          <w:szCs w:val="22"/>
+        </w:rPr>
+        <w:t xml:space="preserve">Education</w:t>
+      </w:r>
+    </w:p>
+    <w:p>
+      <w:pPr>
+        <w:spacing w:after="120" w:before="0"/>
+        <w:ind w:left="431"/>
+        <w:jc w:val="both"/>
+      </w:pPr>
+      <w:r>
+        <w:rPr>
+          <w:rFonts w:ascii="Garamond" w:cs="Garamond" w:eastAsia="Garamond" w:hAnsi="Garamond"/>
+          <w:b w:val="false"/>
+          <w:bCs w:val="false"/>
+          <w:i w:val="false"/>
+          <w:iCs w:val="false"/>
+          <w:color w:val="2a2520"/>
+          <w:sz w:val="22"/>
+          <w:szCs w:val="22"/>
+        </w:rPr>
+        <w:t xml:space="preserve">Every child has the right to education adequate to enable full civic participation. The state must ensure this education is available and accessible. Parents hold the right to direct the education of their children within the framework of public educational standards. The Legislature establishes by statute the content and funding of public education, subject to the adequacy standard of genuine civic preparation.</w:t>
+      </w:r>
+    </w:p>
+    <w:p>
+      <w:pPr>
+        <w:spacing w:after="60" w:before="200"/>
+        <w:ind w:left="431"/>
+        <w:jc w:val="left"/>
+      </w:pPr>
+      <w:r>
+        <w:rPr>
+          <w:rFonts w:ascii="Courier New" w:cs="Courier New" w:eastAsia="Courier New" w:hAnsi="Courier New"/>
+          <w:b/>
+          <w:bCs/>
+          <w:color w:val="1B2A4A"/>
+          <w:sz w:val="18"/>
+          <w:szCs w:val="18"/>
+        </w:rPr>
+        <w:t xml:space="preserve">§1.18  </w:t>
+      </w:r>
+      <w:r>
+        <w:rPr>
+          <w:rFonts w:ascii="Garamond" w:cs="Garamond" w:eastAsia="Garamond" w:hAnsi="Garamond"/>
+          <w:b/>
+          <w:bCs/>
+          <w:i w:val="false"/>
+          <w:iCs w:val="false"/>
+          <w:color w:val="1B2A4A"/>
+          <w:sz w:val="22"/>
+          <w:szCs w:val="22"/>
+        </w:rPr>
+        <w:t xml:space="preserve">Environmental Obligations</w:t>
+      </w:r>
+    </w:p>
+    <w:p>
+      <w:pPr>
+        <w:spacing w:after="120" w:before="0"/>
+        <w:ind w:left="431"/>
+        <w:jc w:val="both"/>
+      </w:pPr>
+      <w:r>
+        <w:rPr>
+          <w:rFonts w:ascii="Garamond" w:cs="Garamond" w:eastAsia="Garamond" w:hAnsi="Garamond"/>
+          <w:b w:val="false"/>
+          <w:bCs w:val="false"/>
+          <w:i w:val="false"/>
+          <w:iCs w:val="false"/>
+          <w:color w:val="2a2520"/>
+          <w:sz w:val="22"/>
+          <w:szCs w:val="22"/>
+        </w:rPr>
+        <w:t xml:space="preserve">government holds an obligation not to cause environmental harm to persons within its jurisdiction through its own actions or through the actions of those it licenses. The Legislature establishes by statute the framework for environmental protection, and may not enact statutes that systematically permit environmental harm to defined communities. This provision does not require the achievement of any particular environmental outcome; it requires genuine governmental action toward environmental protection proportionate to identified harms.</w:t>
       </w:r>
     </w:p>
     <w:p>
@@ -906,27 +1161,282 @@
           <w:sz w:val="22"/>
           <w:szCs w:val="22"/>
         </w:rPr>
-        <w:t xml:space="preserve">Freedom from Retroactive Criminal Law</w:t>
-      </w:r>
-    </w:p>
-    <w:p>
-      <w:pPr>
-        <w:spacing w:after="120" w:before="0"/>
-        <w:ind w:left="431"/>
-        <w:jc w:val="both"/>
-      </w:pPr>
-      <w:r>
-        <w:rPr>
-          <w:rFonts w:ascii="Garamond" w:cs="Garamond" w:eastAsia="Garamond" w:hAnsi="Garamond"/>
-          <w:b w:val="false"/>
-          <w:bCs w:val="false"/>
-          <w:i w:val="false"/>
-          <w:iCs w:val="false"/>
-          <w:color w:val="2a2520"/>
-          <w:sz w:val="22"/>
-          <w:szCs w:val="22"/>
-        </w:rPr>
-        <w:t xml:space="preserve">No person may be convicted of an act that was not a criminal offence when committed, or subjected to a penalty greater than that applicable at the time of the offence. No criminal law may be applied retroactively to the disadvantage of the accused. This right is non-derogable under §1.26.b.</w:t>
+        <w:t xml:space="preserve">Emergency Derogation</w:t>
+      </w:r>
+    </w:p>
+    <w:p>
+      <w:pPr>
+        <w:spacing w:after="120" w:before="0"/>
+        <w:ind w:left="431"/>
+        <w:jc w:val="both"/>
+      </w:pPr>
+      <w:r>
+        <w:rPr>
+          <w:rFonts w:ascii="Garamond" w:cs="Garamond" w:eastAsia="Garamond" w:hAnsi="Garamond"/>
+          <w:b w:val="false"/>
+          <w:bCs w:val="false"/>
+          <w:i w:val="false"/>
+          <w:iCs w:val="false"/>
+          <w:color w:val="2a2520"/>
+          <w:sz w:val="22"/>
+          <w:szCs w:val="22"/>
+        </w:rPr>
+        <w:t xml:space="preserve">No emergency — however severe — suspends the Individual Sovereignty Floor in full. Temporary derogation of certain rights is permitted only under the strict conditions of this section; the rights enumerated in §1.19.b may not be derogated under any circumstances.</w:t>
+      </w:r>
+    </w:p>
+    <w:p>
+      <w:pPr>
+        <w:spacing w:after="60" w:before="200"/>
+        <w:ind w:left="431"/>
+        <w:jc w:val="left"/>
+      </w:pPr>
+      <w:r>
+        <w:rPr>
+          <w:rFonts w:ascii="Courier New" w:cs="Courier New" w:eastAsia="Courier New" w:hAnsi="Courier New"/>
+          <w:b/>
+          <w:bCs/>
+          <w:color w:val="1B2A4A"/>
+          <w:sz w:val="18"/>
+          <w:szCs w:val="18"/>
+        </w:rPr>
+        <w:t xml:space="preserve">§1.19.a  </w:t>
+      </w:r>
+      <w:r>
+        <w:rPr>
+          <w:rFonts w:ascii="Garamond" w:cs="Garamond" w:eastAsia="Garamond" w:hAnsi="Garamond"/>
+          <w:b/>
+          <w:bCs/>
+          <w:i w:val="false"/>
+          <w:iCs w:val="false"/>
+          <w:color w:val="1B2A4A"/>
+          <w:sz w:val="22"/>
+          <w:szCs w:val="22"/>
+        </w:rPr>
+        <w:t xml:space="preserve">Emergency Derogation — Declaration Requirements</w:t>
+      </w:r>
+    </w:p>
+    <w:p>
+      <w:pPr>
+        <w:spacing w:after="120" w:before="0"/>
+        <w:ind w:left="431"/>
+        <w:jc w:val="both"/>
+      </w:pPr>
+      <w:r>
+        <w:rPr>
+          <w:rFonts w:ascii="Garamond" w:cs="Garamond" w:eastAsia="Garamond" w:hAnsi="Garamond"/>
+          <w:b w:val="false"/>
+          <w:bCs w:val="false"/>
+          <w:i w:val="false"/>
+          <w:iCs w:val="false"/>
+          <w:color w:val="2a2520"/>
+          <w:sz w:val="22"/>
+          <w:szCs w:val="22"/>
+        </w:rPr>
+        <w:t xml:space="preserve">Emergency derogation of Article I rights requires a precisely structured declaration specifying: the nature of the emergency, which rights are limited, the geographic scope, the duration, and the review mechanism. The specificity requirement prevents open-ended emergency licenses — the government must commit in advance to exactly what it is doing, for how long, and where. Blanket declarations are constitutionally invalid. The declaration is published to the NRS immediately. An undisclosed emergency is not a constitutionally recognized emergency. Automatic expiry (§1.19.d) without renewal.</w:t>
+      </w:r>
+    </w:p>
+    <w:p>
+      <w:pPr>
+        <w:spacing w:after="60" w:before="200"/>
+        <w:ind w:left="431"/>
+        <w:jc w:val="left"/>
+      </w:pPr>
+      <w:r>
+        <w:rPr>
+          <w:rFonts w:ascii="Courier New" w:cs="Courier New" w:eastAsia="Courier New" w:hAnsi="Courier New"/>
+          <w:b/>
+          <w:bCs/>
+          <w:color w:val="1B2A4A"/>
+          <w:sz w:val="18"/>
+          <w:szCs w:val="18"/>
+        </w:rPr>
+        <w:t xml:space="preserve">§1.19.b  </w:t>
+      </w:r>
+      <w:r>
+        <w:rPr>
+          <w:rFonts w:ascii="Garamond" w:cs="Garamond" w:eastAsia="Garamond" w:hAnsi="Garamond"/>
+          <w:b/>
+          <w:bCs/>
+          <w:i w:val="false"/>
+          <w:iCs w:val="false"/>
+          <w:color w:val="1B2A4A"/>
+          <w:sz w:val="22"/>
+          <w:szCs w:val="22"/>
+        </w:rPr>
+        <w:t xml:space="preserve">Non-Derogable Rights</w:t>
+      </w:r>
+    </w:p>
+    <w:p>
+      <w:pPr>
+        <w:spacing w:after="120" w:before="0"/>
+        <w:ind w:left="431"/>
+        <w:jc w:val="both"/>
+      </w:pPr>
+      <w:r>
+        <w:rPr>
+          <w:rFonts w:ascii="Garamond" w:cs="Garamond" w:eastAsia="Garamond" w:hAnsi="Garamond"/>
+          <w:b w:val="false"/>
+          <w:bCs w:val="false"/>
+          <w:i w:val="false"/>
+          <w:iCs w:val="false"/>
+          <w:color w:val="2a2520"/>
+          <w:sz w:val="22"/>
+          <w:szCs w:val="22"/>
+        </w:rPr>
+        <w:t xml:space="preserve">These six rights are absolute under any circumstances: the prohibition on torture (§1.3); slavery (§1.4); habeas corpus (§1.11); the right to a public trial (§1.13); no retroactive punishment (§1.14); and non-refoulement (§1.21). No emergency declaration, executive order, or legislative act may derogate any of these rights. They are non-derogable by their nature — their value derives precisely from the fact that they hold under the worst circumstances, not only the ordinary ones.</w:t>
+      </w:r>
+    </w:p>
+    <w:p>
+      <w:pPr>
+        <w:spacing w:after="60" w:before="200"/>
+        <w:ind w:left="431"/>
+        <w:jc w:val="left"/>
+      </w:pPr>
+      <w:r>
+        <w:rPr>
+          <w:rFonts w:ascii="Courier New" w:cs="Courier New" w:eastAsia="Courier New" w:hAnsi="Courier New"/>
+          <w:b/>
+          <w:bCs/>
+          <w:color w:val="1B2A4A"/>
+          <w:sz w:val="18"/>
+          <w:szCs w:val="18"/>
+        </w:rPr>
+        <w:t xml:space="preserve">§1.19.c  </w:t>
+      </w:r>
+      <w:r>
+        <w:rPr>
+          <w:rFonts w:ascii="Garamond" w:cs="Garamond" w:eastAsia="Garamond" w:hAnsi="Garamond"/>
+          <w:b/>
+          <w:bCs/>
+          <w:i w:val="false"/>
+          <w:iCs w:val="false"/>
+          <w:color w:val="1B2A4A"/>
+          <w:sz w:val="22"/>
+          <w:szCs w:val="22"/>
+        </w:rPr>
+        <w:t xml:space="preserve">Inspectorate Continuity</w:t>
+      </w:r>
+    </w:p>
+    <w:p>
+      <w:pPr>
+        <w:spacing w:after="120" w:before="0"/>
+        <w:ind w:left="431"/>
+        <w:jc w:val="both"/>
+      </w:pPr>
+      <w:r>
+        <w:rPr>
+          <w:rFonts w:ascii="Garamond" w:cs="Garamond" w:eastAsia="Garamond" w:hAnsi="Garamond"/>
+          <w:b w:val="false"/>
+          <w:bCs w:val="false"/>
+          <w:i w:val="false"/>
+          <w:iCs w:val="false"/>
+          <w:color w:val="2a2520"/>
+          <w:sz w:val="22"/>
+          <w:szCs w:val="22"/>
+        </w:rPr>
+        <w:t xml:space="preserve">The three Inspectorates continue to operate with full constitutional authority throughout any emergency — they cannot be suspended or have their mandate reduced by emergency declaration. Accountability infrastructure is precisely most important when emergency powers are active.</w:t>
+      </w:r>
+    </w:p>
+    <w:p>
+      <w:pPr>
+        <w:spacing w:after="60" w:before="200"/>
+        <w:ind w:left="431"/>
+        <w:jc w:val="left"/>
+      </w:pPr>
+      <w:r>
+        <w:rPr>
+          <w:rFonts w:ascii="Courier New" w:cs="Courier New" w:eastAsia="Courier New" w:hAnsi="Courier New"/>
+          <w:b/>
+          <w:bCs/>
+          <w:color w:val="1B2A4A"/>
+          <w:sz w:val="18"/>
+          <w:szCs w:val="18"/>
+        </w:rPr>
+        <w:t xml:space="preserve">§1.19.d  </w:t>
+      </w:r>
+      <w:r>
+        <w:rPr>
+          <w:rFonts w:ascii="Garamond" w:cs="Garamond" w:eastAsia="Garamond" w:hAnsi="Garamond"/>
+          <w:b/>
+          <w:bCs/>
+          <w:i w:val="false"/>
+          <w:iCs w:val="false"/>
+          <w:color w:val="1B2A4A"/>
+          <w:sz w:val="22"/>
+          <w:szCs w:val="22"/>
+        </w:rPr>
+        <w:t xml:space="preserve">Automatic Expiry and Judicial Review</w:t>
+      </w:r>
+    </w:p>
+    <w:p>
+      <w:pPr>
+        <w:spacing w:after="120" w:before="0"/>
+        <w:ind w:left="431"/>
+        <w:jc w:val="both"/>
+      </w:pPr>
+      <w:r>
+        <w:rPr>
+          <w:rFonts w:ascii="Garamond" w:cs="Garamond" w:eastAsia="Garamond" w:hAnsi="Garamond"/>
+          <w:b w:val="false"/>
+          <w:bCs w:val="false"/>
+          <w:i w:val="false"/>
+          <w:iCs w:val="false"/>
+          <w:color w:val="2a2520"/>
+          <w:sz w:val="22"/>
+          <w:szCs w:val="22"/>
+        </w:rPr>
+        <w:t xml:space="preserve">Emergency measures lapse automatically at the expiry of the Declaration. Judicial review of any emergency measure is available to any citizen at any time, and courts may rule during the emergency that a specific measure is unconstitutional.</w:t>
+      </w:r>
+    </w:p>
+    <w:p>
+      <w:pPr>
+        <w:spacing w:after="60" w:before="200"/>
+        <w:ind w:left="431"/>
+        <w:jc w:val="left"/>
+      </w:pPr>
+      <w:r>
+        <w:rPr>
+          <w:rFonts w:ascii="Courier New" w:cs="Courier New" w:eastAsia="Courier New" w:hAnsi="Courier New"/>
+          <w:b/>
+          <w:bCs/>
+          <w:color w:val="1B2A4A"/>
+          <w:sz w:val="18"/>
+          <w:szCs w:val="18"/>
+        </w:rPr>
+        <w:t xml:space="preserve">§1.19.e  </w:t>
+      </w:r>
+      <w:r>
+        <w:rPr>
+          <w:rFonts w:ascii="Garamond" w:cs="Garamond" w:eastAsia="Garamond" w:hAnsi="Garamond"/>
+          <w:b/>
+          <w:bCs/>
+          <w:i w:val="false"/>
+          <w:iCs w:val="false"/>
+          <w:color w:val="1B2A4A"/>
+          <w:sz w:val="22"/>
+          <w:szCs w:val="22"/>
+        </w:rPr>
+        <w:t xml:space="preserve">No Permanent Emergency</w:t>
+      </w:r>
+    </w:p>
+    <w:p>
+      <w:pPr>
+        <w:spacing w:after="120" w:before="0"/>
+        <w:ind w:left="431"/>
+        <w:jc w:val="both"/>
+      </w:pPr>
+      <w:r>
+        <w:rPr>
+          <w:rFonts w:ascii="Garamond" w:cs="Garamond" w:eastAsia="Garamond" w:hAnsi="Garamond"/>
+          <w:b w:val="false"/>
+          <w:bCs w:val="false"/>
+          <w:i w:val="false"/>
+          <w:iCs w:val="false"/>
+          <w:color w:val="2a2520"/>
+          <w:sz w:val="22"/>
+          <w:szCs w:val="22"/>
+        </w:rPr>
+        <w:t xml:space="preserve">No emergency measure may be made permanent by legislative act. Every emergency measure lapses automatically at the expiry of the Declaration unless re-enacted through the ordinary legislative process. The Legislature may not re-declare an emergency measure within 60 days of its expiry. After 60 days, re-declaration requires a 2/3 majority of both chambers certifying continued necessity.</w:t>
       </w:r>
     </w:p>
     <w:p>
@@ -957,27 +1467,27 @@
           <w:sz w:val="22"/>
           <w:szCs w:val="22"/>
         </w:rPr>
-        <w:t xml:space="preserve">Double Jeopardy</w:t>
-      </w:r>
-    </w:p>
-    <w:p>
-      <w:pPr>
-        <w:spacing w:after="120" w:before="0"/>
-        <w:ind w:left="431"/>
-        <w:jc w:val="both"/>
-      </w:pPr>
-      <w:r>
-        <w:rPr>
-          <w:rFonts w:ascii="Garamond" w:cs="Garamond" w:eastAsia="Garamond" w:hAnsi="Garamond"/>
-          <w:b w:val="false"/>
-          <w:bCs w:val="false"/>
-          <w:i w:val="false"/>
-          <w:iCs w:val="false"/>
-          <w:color w:val="2a2520"/>
-          <w:sz w:val="22"/>
-          <w:szCs w:val="22"/>
-        </w:rPr>
-        <w:t xml:space="preserve">No person may be tried or punished twice for the same offence following a final acquittal or conviction. The Legislature defines by statute the scope of this protection, including its application across jurisdictions.</w:t>
+        <w:t xml:space="preserve">Right to Seek Asylum</w:t>
+      </w:r>
+    </w:p>
+    <w:p>
+      <w:pPr>
+        <w:spacing w:after="120" w:before="0"/>
+        <w:ind w:left="431"/>
+        <w:jc w:val="both"/>
+      </w:pPr>
+      <w:r>
+        <w:rPr>
+          <w:rFonts w:ascii="Garamond" w:cs="Garamond" w:eastAsia="Garamond" w:hAnsi="Garamond"/>
+          <w:b w:val="false"/>
+          <w:bCs w:val="false"/>
+          <w:i w:val="false"/>
+          <w:iCs w:val="false"/>
+          <w:color w:val="2a2520"/>
+          <w:sz w:val="22"/>
+          <w:szCs w:val="22"/>
+        </w:rPr>
+        <w:t xml:space="preserve">Every person who reaches the Republic's jurisdiction has the right to claim asylum and have that claim determined by an independent process under §6.3. The manner of entry does not affect this right. An asylum seeker is an Inhabitant of the Republic from the date of claim and holds all rights in this Article.</w:t>
       </w:r>
     </w:p>
     <w:p>
@@ -1008,27 +1518,27 @@
           <w:sz w:val="22"/>
           <w:szCs w:val="22"/>
         </w:rPr>
-        <w:t xml:space="preserve">Social Assistance Floor</w:t>
-      </w:r>
-    </w:p>
-    <w:p>
-      <w:pPr>
-        <w:spacing w:after="120" w:before="0"/>
-        <w:ind w:left="431"/>
-        <w:jc w:val="both"/>
-      </w:pPr>
-      <w:r>
-        <w:rPr>
-          <w:rFonts w:ascii="Garamond" w:cs="Garamond" w:eastAsia="Garamond" w:hAnsi="Garamond"/>
-          <w:b w:val="false"/>
-          <w:bCs w:val="false"/>
-          <w:i w:val="false"/>
-          <w:iCs w:val="false"/>
-          <w:color w:val="2a2520"/>
-          <w:sz w:val="22"/>
-          <w:szCs w:val="22"/>
-        </w:rPr>
-        <w:t xml:space="preserve">Every Inhabitant is entitled to access the Republic's social state systems under Article X. No government may exclude any person from social assistance on the basis of the characteristics listed in §1.6. The Legislature establishes by statute the content and administration of social assistance, subject to the adequacy standards certified under §12.1.</w:t>
+        <w:t xml:space="preserve">Non-Refoulement</w:t>
+      </w:r>
+    </w:p>
+    <w:p>
+      <w:pPr>
+        <w:spacing w:after="120" w:before="0"/>
+        <w:ind w:left="431"/>
+        <w:jc w:val="both"/>
+      </w:pPr>
+      <w:r>
+        <w:rPr>
+          <w:rFonts w:ascii="Garamond" w:cs="Garamond" w:eastAsia="Garamond" w:hAnsi="Garamond"/>
+          <w:b w:val="false"/>
+          <w:bCs w:val="false"/>
+          <w:i w:val="false"/>
+          <w:iCs w:val="false"/>
+          <w:color w:val="2a2520"/>
+          <w:sz w:val="22"/>
+          <w:szCs w:val="22"/>
+        </w:rPr>
+        <w:t xml:space="preserve">No person within the Republic's jurisdiction may be returned, expelled, or extradited to any territory where they face genuine risk of persecution, torture, or deprivation of life. This protection applies regardless of the person's status, conduct, or the nature of the receiving territory's government. This right is non-derogable under §1.19.b.</w:t>
       </w:r>
     </w:p>
     <w:p>
@@ -1053,33 +1563,31 @@
           <w:rFonts w:ascii="Garamond" w:cs="Garamond" w:eastAsia="Garamond" w:hAnsi="Garamond"/>
           <w:b/>
           <w:bCs/>
-          <w:i w:val="false"/>
-          <w:iCs w:val="false"/>
-          <w:color w:val="1B2A4A"/>
-          <w:sz w:val="22"/>
-          <w:szCs w:val="22"/>
-        </w:rPr>
-        <w:t xml:space="preserve">Education</w:t>
-      </w:r>
-    </w:p>
-    <w:p>
-      <w:pPr>
-        <w:spacing w:after="120" w:before="0"/>
-        <w:ind w:left="431"/>
-        <w:jc w:val="both"/>
-      </w:pPr>
-      <w:r>
-        <w:rPr>
-          <w:rFonts w:ascii="Garamond" w:cs="Garamond" w:eastAsia="Garamond" w:hAnsi="Garamond"/>
-          <w:b w:val="false"/>
-          <w:bCs w:val="false"/>
-          <w:i w:val="false"/>
-          <w:iCs w:val="false"/>
-          <w:color w:val="2a2520"/>
-          <w:sz w:val="22"/>
-          <w:szCs w:val="22"/>
-        </w:rPr>
-        <w:t xml:space="preserve">Every child has the right to education adequate to enable full civic participation. The state must ensure this education is available and accessible. Parents hold the right to direct the education of their children within the framework of public educational standards. The Legislature establishes by statute the content and funding of public education, subject to the adequacy standard of genuine civic preparation.</w:t>
+          <w:color w:val="1B2A4A"/>
+          <w:sz w:val="22"/>
+          <w:szCs w:val="22"/>
+        </w:rPr>
+        <w:t xml:space="preserve">Continuity of Constitutionally Mandated Offices</w:t>
+      </w:r>
+    </w:p>
+    <w:p>
+      <w:pPr>
+        <w:spacing w:after="120" w:before="0"/>
+        <w:ind w:left="431"/>
+        <w:jc w:val="both"/>
+      </w:pPr>
+      <w:r>
+        <w:rPr>
+          <w:rFonts w:ascii="Garamond" w:cs="Garamond" w:eastAsia="Garamond" w:hAnsi="Garamond"/>
+          <w:b w:val="false"/>
+          <w:bCs w:val="false"/>
+          <w:i w:val="false"/>
+          <w:iCs w:val="false"/>
+          <w:color w:val="2a2520"/>
+          <w:sz w:val="22"/>
+          <w:szCs w:val="22"/>
+        </w:rPr>
+        <w:t xml:space="preserve">For every office established by this Constitution with a fixed term, the confirmed or elected successor’s term begins at the precise moment the incumbent’s term concludes — no gap exists between the end of one term and the commencement of the next. The selection and confirmation processes for each such office must be initiated and completed with sufficient lead time to ensure seamless succession before the incumbent’s term ends; failure to do so is a constitutional compliance breach certified by the LI. Any person serving in an acting capacity for a constitutionally mandated office during an unexpected vacancy must be otherwise eligible for that office — possessing all substantive qualifications for the role — with the sole exception of not having completed the applicable confirmation or election process. The acting mechanism for each office is defined in the provisions governing that office.</w:t>
       </w:r>
     </w:p>
     <w:p>
@@ -1098,514 +1606,6 @@
           <w:szCs w:val="18"/>
         </w:rPr>
         <w:t xml:space="preserve">§1.23  </w:t>
-      </w:r>
-      <w:r>
-        <w:rPr>
-          <w:rFonts w:ascii="Garamond" w:cs="Garamond" w:eastAsia="Garamond" w:hAnsi="Garamond"/>
-          <w:b/>
-          <w:bCs/>
-          <w:i w:val="false"/>
-          <w:iCs w:val="false"/>
-          <w:color w:val="1B2A4A"/>
-          <w:sz w:val="22"/>
-          <w:szCs w:val="22"/>
-        </w:rPr>
-        <w:t xml:space="preserve">Environmental Obligations</w:t>
-      </w:r>
-    </w:p>
-    <w:p>
-      <w:pPr>
-        <w:spacing w:after="120" w:before="0"/>
-        <w:ind w:left="431"/>
-        <w:jc w:val="both"/>
-      </w:pPr>
-      <w:r>
-        <w:rPr>
-          <w:rFonts w:ascii="Garamond" w:cs="Garamond" w:eastAsia="Garamond" w:hAnsi="Garamond"/>
-          <w:b w:val="false"/>
-          <w:bCs w:val="false"/>
-          <w:i w:val="false"/>
-          <w:iCs w:val="false"/>
-          <w:color w:val="2a2520"/>
-          <w:sz w:val="22"/>
-          <w:szCs w:val="22"/>
-        </w:rPr>
-        <w:t xml:space="preserve">government holds an obligation not to cause environmental harm to persons within its jurisdiction through its own actions or through the actions of those it licenses. The Legislature establishes by statute the framework for environmental protection, and may not enact statutes that systematically permit environmental harm to defined communities. This provision does not require the achievement of any particular environmental outcome; it requires genuine governmental action toward environmental protection proportionate to identified harms.</w:t>
-      </w:r>
-    </w:p>
-    <w:p>
-      <w:pPr>
-        <w:spacing w:after="60" w:before="200"/>
-        <w:ind w:left="431"/>
-        <w:jc w:val="left"/>
-      </w:pPr>
-      <w:r>
-        <w:rPr>
-          <w:rFonts w:ascii="Courier New" w:cs="Courier New" w:eastAsia="Courier New" w:hAnsi="Courier New"/>
-          <w:b/>
-          <w:bCs/>
-          <w:color w:val="1B2A4A"/>
-          <w:sz w:val="18"/>
-          <w:szCs w:val="18"/>
-        </w:rPr>
-        <w:t xml:space="preserve">§1.26  </w:t>
-      </w:r>
-      <w:r>
-        <w:rPr>
-          <w:rFonts w:ascii="Garamond" w:cs="Garamond" w:eastAsia="Garamond" w:hAnsi="Garamond"/>
-          <w:b/>
-          <w:bCs/>
-          <w:i w:val="false"/>
-          <w:iCs w:val="false"/>
-          <w:color w:val="1B2A4A"/>
-          <w:sz w:val="22"/>
-          <w:szCs w:val="22"/>
-        </w:rPr>
-        <w:t xml:space="preserve">Emergency Derogation</w:t>
-      </w:r>
-    </w:p>
-    <w:p>
-      <w:pPr>
-        <w:spacing w:after="120" w:before="0"/>
-        <w:ind w:left="431"/>
-        <w:jc w:val="both"/>
-      </w:pPr>
-      <w:r>
-        <w:rPr>
-          <w:rFonts w:ascii="Garamond" w:cs="Garamond" w:eastAsia="Garamond" w:hAnsi="Garamond"/>
-          <w:b w:val="false"/>
-          <w:bCs w:val="false"/>
-          <w:i w:val="false"/>
-          <w:iCs w:val="false"/>
-          <w:color w:val="2a2520"/>
-          <w:sz w:val="22"/>
-          <w:szCs w:val="22"/>
-        </w:rPr>
-        <w:t xml:space="preserve">No emergency — however severe — suspends the Individual Sovereignty Floor in full. Temporary derogation of certain rights is permitted only under the strict conditions of this section; the rights enumerated in §1.26.b may not be derogated under any circumstances.</w:t>
-      </w:r>
-    </w:p>
-    <w:p>
-      <w:pPr>
-        <w:spacing w:after="60" w:before="200"/>
-        <w:ind w:left="431"/>
-        <w:jc w:val="left"/>
-      </w:pPr>
-      <w:r>
-        <w:rPr>
-          <w:rFonts w:ascii="Courier New" w:cs="Courier New" w:eastAsia="Courier New" w:hAnsi="Courier New"/>
-          <w:b/>
-          <w:bCs/>
-          <w:color w:val="1B2A4A"/>
-          <w:sz w:val="18"/>
-          <w:szCs w:val="18"/>
-        </w:rPr>
-        <w:t xml:space="preserve">§1.26.a  </w:t>
-      </w:r>
-      <w:r>
-        <w:rPr>
-          <w:rFonts w:ascii="Garamond" w:cs="Garamond" w:eastAsia="Garamond" w:hAnsi="Garamond"/>
-          <w:b/>
-          <w:bCs/>
-          <w:i w:val="false"/>
-          <w:iCs w:val="false"/>
-          <w:color w:val="1B2A4A"/>
-          <w:sz w:val="22"/>
-          <w:szCs w:val="22"/>
-        </w:rPr>
-        <w:t xml:space="preserve">Emergency Derogation — Declaration Requirements</w:t>
-      </w:r>
-    </w:p>
-    <w:p>
-      <w:pPr>
-        <w:spacing w:after="120" w:before="0"/>
-        <w:ind w:left="431"/>
-        <w:jc w:val="both"/>
-      </w:pPr>
-      <w:r>
-        <w:rPr>
-          <w:rFonts w:ascii="Garamond" w:cs="Garamond" w:eastAsia="Garamond" w:hAnsi="Garamond"/>
-          <w:b w:val="false"/>
-          <w:bCs w:val="false"/>
-          <w:i w:val="false"/>
-          <w:iCs w:val="false"/>
-          <w:color w:val="2a2520"/>
-          <w:sz w:val="22"/>
-          <w:szCs w:val="22"/>
-        </w:rPr>
-        <w:t xml:space="preserve">Emergency derogation of Article I rights requires a precisely structured declaration specifying: the nature of the emergency, which rights are limited, the geographic scope, the duration, and the review mechanism. The specificity requirement prevents open-ended emergency licenses — the government must commit in advance to exactly what it is doing, for how long, and where. Blanket declarations are constitutionally invalid. The declaration is published to the NRS immediately. An undisclosed emergency is not a constitutionally recognized emergency. Automatic expiry (§1.26.d) without renewal.</w:t>
-      </w:r>
-    </w:p>
-    <w:p>
-      <w:pPr>
-        <w:spacing w:after="60" w:before="200"/>
-        <w:ind w:left="431"/>
-        <w:jc w:val="left"/>
-      </w:pPr>
-      <w:r>
-        <w:rPr>
-          <w:rFonts w:ascii="Courier New" w:cs="Courier New" w:eastAsia="Courier New" w:hAnsi="Courier New"/>
-          <w:b/>
-          <w:bCs/>
-          <w:color w:val="1B2A4A"/>
-          <w:sz w:val="18"/>
-          <w:szCs w:val="18"/>
-        </w:rPr>
-        <w:t xml:space="preserve">§1.26.b  </w:t>
-      </w:r>
-      <w:r>
-        <w:rPr>
-          <w:rFonts w:ascii="Garamond" w:cs="Garamond" w:eastAsia="Garamond" w:hAnsi="Garamond"/>
-          <w:b/>
-          <w:bCs/>
-          <w:i w:val="false"/>
-          <w:iCs w:val="false"/>
-          <w:color w:val="1B2A4A"/>
-          <w:sz w:val="22"/>
-          <w:szCs w:val="22"/>
-        </w:rPr>
-        <w:t xml:space="preserve">Non-Derogable Rights</w:t>
-      </w:r>
-    </w:p>
-    <w:p>
-      <w:pPr>
-        <w:spacing w:after="120" w:before="0"/>
-        <w:ind w:left="431"/>
-        <w:jc w:val="both"/>
-      </w:pPr>
-      <w:r>
-        <w:rPr>
-          <w:rFonts w:ascii="Garamond" w:cs="Garamond" w:eastAsia="Garamond" w:hAnsi="Garamond"/>
-          <w:b w:val="false"/>
-          <w:bCs w:val="false"/>
-          <w:i w:val="false"/>
-          <w:iCs w:val="false"/>
-          <w:color w:val="2a2520"/>
-          <w:sz w:val="22"/>
-          <w:szCs w:val="22"/>
-        </w:rPr>
-        <w:t xml:space="preserve">These six rights are absolute under any circumstances: the prohibition on torture (§1.3); slavery (§1.4); habeas corpus (§1.12); the right to a public trial (§1.16); no retroactive punishment (§1.19); and non-refoulement (§1.28). No emergency declaration, executive order, or legislative act may derogate any of these rights. They are non-derogable by their nature — their value derives precisely from the fact that they hold under the worst circumstances, not only the ordinary ones.</w:t>
-      </w:r>
-    </w:p>
-    <w:p>
-      <w:pPr>
-        <w:spacing w:after="60" w:before="200"/>
-        <w:ind w:left="431"/>
-        <w:jc w:val="left"/>
-      </w:pPr>
-      <w:r>
-        <w:rPr>
-          <w:rFonts w:ascii="Courier New" w:cs="Courier New" w:eastAsia="Courier New" w:hAnsi="Courier New"/>
-          <w:b/>
-          <w:bCs/>
-          <w:color w:val="1B2A4A"/>
-          <w:sz w:val="18"/>
-          <w:szCs w:val="18"/>
-        </w:rPr>
-        <w:t xml:space="preserve">§1.26.c  </w:t>
-      </w:r>
-      <w:r>
-        <w:rPr>
-          <w:rFonts w:ascii="Garamond" w:cs="Garamond" w:eastAsia="Garamond" w:hAnsi="Garamond"/>
-          <w:b/>
-          <w:bCs/>
-          <w:i w:val="false"/>
-          <w:iCs w:val="false"/>
-          <w:color w:val="1B2A4A"/>
-          <w:sz w:val="22"/>
-          <w:szCs w:val="22"/>
-        </w:rPr>
-        <w:t xml:space="preserve">Inspectorate Continuity</w:t>
-      </w:r>
-    </w:p>
-    <w:p>
-      <w:pPr>
-        <w:spacing w:after="120" w:before="0"/>
-        <w:ind w:left="431"/>
-        <w:jc w:val="both"/>
-      </w:pPr>
-      <w:r>
-        <w:rPr>
-          <w:rFonts w:ascii="Garamond" w:cs="Garamond" w:eastAsia="Garamond" w:hAnsi="Garamond"/>
-          <w:b w:val="false"/>
-          <w:bCs w:val="false"/>
-          <w:i w:val="false"/>
-          <w:iCs w:val="false"/>
-          <w:color w:val="2a2520"/>
-          <w:sz w:val="22"/>
-          <w:szCs w:val="22"/>
-        </w:rPr>
-        <w:t xml:space="preserve">The three Inspectorates continue to operate with full constitutional authority throughout any emergency — they cannot be suspended or have their mandate reduced by emergency declaration. Accountability infrastructure is precisely most important when emergency powers are active.</w:t>
-      </w:r>
-    </w:p>
-    <w:p>
-      <w:pPr>
-        <w:spacing w:after="60" w:before="200"/>
-        <w:ind w:left="431"/>
-        <w:jc w:val="left"/>
-      </w:pPr>
-      <w:r>
-        <w:rPr>
-          <w:rFonts w:ascii="Courier New" w:cs="Courier New" w:eastAsia="Courier New" w:hAnsi="Courier New"/>
-          <w:b/>
-          <w:bCs/>
-          <w:color w:val="1B2A4A"/>
-          <w:sz w:val="18"/>
-          <w:szCs w:val="18"/>
-        </w:rPr>
-        <w:t xml:space="preserve">§1.26.d  </w:t>
-      </w:r>
-      <w:r>
-        <w:rPr>
-          <w:rFonts w:ascii="Garamond" w:cs="Garamond" w:eastAsia="Garamond" w:hAnsi="Garamond"/>
-          <w:b/>
-          <w:bCs/>
-          <w:i w:val="false"/>
-          <w:iCs w:val="false"/>
-          <w:color w:val="1B2A4A"/>
-          <w:sz w:val="22"/>
-          <w:szCs w:val="22"/>
-        </w:rPr>
-        <w:t xml:space="preserve">Automatic Expiry and Judicial Review</w:t>
-      </w:r>
-    </w:p>
-    <w:p>
-      <w:pPr>
-        <w:spacing w:after="120" w:before="0"/>
-        <w:ind w:left="431"/>
-        <w:jc w:val="both"/>
-      </w:pPr>
-      <w:r>
-        <w:rPr>
-          <w:rFonts w:ascii="Garamond" w:cs="Garamond" w:eastAsia="Garamond" w:hAnsi="Garamond"/>
-          <w:b w:val="false"/>
-          <w:bCs w:val="false"/>
-          <w:i w:val="false"/>
-          <w:iCs w:val="false"/>
-          <w:color w:val="2a2520"/>
-          <w:sz w:val="22"/>
-          <w:szCs w:val="22"/>
-        </w:rPr>
-        <w:t xml:space="preserve">Emergency measures lapse automatically at the expiry of the Declaration. Judicial review of any emergency measure is available to any citizen at any time, and courts may rule during the emergency that a specific measure is unconstitutional.</w:t>
-      </w:r>
-    </w:p>
-    <w:p>
-      <w:pPr>
-        <w:spacing w:after="60" w:before="200"/>
-        <w:ind w:left="431"/>
-        <w:jc w:val="left"/>
-      </w:pPr>
-      <w:r>
-        <w:rPr>
-          <w:rFonts w:ascii="Courier New" w:cs="Courier New" w:eastAsia="Courier New" w:hAnsi="Courier New"/>
-          <w:b/>
-          <w:bCs/>
-          <w:color w:val="1B2A4A"/>
-          <w:sz w:val="18"/>
-          <w:szCs w:val="18"/>
-        </w:rPr>
-        <w:t xml:space="preserve">§1.26.e  </w:t>
-      </w:r>
-      <w:r>
-        <w:rPr>
-          <w:rFonts w:ascii="Garamond" w:cs="Garamond" w:eastAsia="Garamond" w:hAnsi="Garamond"/>
-          <w:b/>
-          <w:bCs/>
-          <w:i w:val="false"/>
-          <w:iCs w:val="false"/>
-          <w:color w:val="1B2A4A"/>
-          <w:sz w:val="22"/>
-          <w:szCs w:val="22"/>
-        </w:rPr>
-        <w:t xml:space="preserve">No Permanent Emergency</w:t>
-      </w:r>
-    </w:p>
-    <w:p>
-      <w:pPr>
-        <w:spacing w:after="120" w:before="0"/>
-        <w:ind w:left="431"/>
-        <w:jc w:val="both"/>
-      </w:pPr>
-      <w:r>
-        <w:rPr>
-          <w:rFonts w:ascii="Garamond" w:cs="Garamond" w:eastAsia="Garamond" w:hAnsi="Garamond"/>
-          <w:b w:val="false"/>
-          <w:bCs w:val="false"/>
-          <w:i w:val="false"/>
-          <w:iCs w:val="false"/>
-          <w:color w:val="2a2520"/>
-          <w:sz w:val="22"/>
-          <w:szCs w:val="22"/>
-        </w:rPr>
-        <w:t xml:space="preserve">No emergency measure may be made permanent by legislative act. Every emergency measure lapses automatically at the expiry of the Declaration unless re-enacted through the ordinary legislative process. The Legislature may not re-declare an emergency measure within 60 days of its expiry. After 60 days, re-declaration requires a 2/3 majority of both chambers certifying continued necessity.</w:t>
-      </w:r>
-    </w:p>
-    <w:p>
-      <w:pPr>
-        <w:spacing w:after="60" w:before="200"/>
-        <w:ind w:left="431"/>
-        <w:jc w:val="left"/>
-      </w:pPr>
-      <w:r>
-        <w:rPr>
-          <w:rFonts w:ascii="Courier New" w:cs="Courier New" w:eastAsia="Courier New" w:hAnsi="Courier New"/>
-          <w:b/>
-          <w:bCs/>
-          <w:color w:val="1B2A4A"/>
-          <w:sz w:val="18"/>
-          <w:szCs w:val="18"/>
-        </w:rPr>
-        <w:t xml:space="preserve">§1.27  </w:t>
-      </w:r>
-      <w:r>
-        <w:rPr>
-          <w:rFonts w:ascii="Garamond" w:cs="Garamond" w:eastAsia="Garamond" w:hAnsi="Garamond"/>
-          <w:b/>
-          <w:bCs/>
-          <w:i w:val="false"/>
-          <w:iCs w:val="false"/>
-          <w:color w:val="1B2A4A"/>
-          <w:sz w:val="22"/>
-          <w:szCs w:val="22"/>
-        </w:rPr>
-        <w:t xml:space="preserve">Right to Seek Asylum</w:t>
-      </w:r>
-    </w:p>
-    <w:p>
-      <w:pPr>
-        <w:spacing w:after="120" w:before="0"/>
-        <w:ind w:left="431"/>
-        <w:jc w:val="both"/>
-      </w:pPr>
-      <w:r>
-        <w:rPr>
-          <w:rFonts w:ascii="Garamond" w:cs="Garamond" w:eastAsia="Garamond" w:hAnsi="Garamond"/>
-          <w:b w:val="false"/>
-          <w:bCs w:val="false"/>
-          <w:i w:val="false"/>
-          <w:iCs w:val="false"/>
-          <w:color w:val="2a2520"/>
-          <w:sz w:val="22"/>
-          <w:szCs w:val="22"/>
-        </w:rPr>
-        <w:t xml:space="preserve">Every person who reaches the Republic's jurisdiction has the right to claim asylum and have that claim determined by an independent process under §6.4. The manner of entry does not affect this right. An asylum seeker is an Inhabitant of the Republic from the date of claim and holds all rights in this Article.</w:t>
-      </w:r>
-    </w:p>
-    <w:p>
-      <w:pPr>
-        <w:spacing w:after="60" w:before="200"/>
-        <w:ind w:left="431"/>
-        <w:jc w:val="left"/>
-      </w:pPr>
-      <w:r>
-        <w:rPr>
-          <w:rFonts w:ascii="Courier New" w:cs="Courier New" w:eastAsia="Courier New" w:hAnsi="Courier New"/>
-          <w:b/>
-          <w:bCs/>
-          <w:color w:val="1B2A4A"/>
-          <w:sz w:val="18"/>
-          <w:szCs w:val="18"/>
-        </w:rPr>
-        <w:t xml:space="preserve">§1.28  </w:t>
-      </w:r>
-      <w:r>
-        <w:rPr>
-          <w:rFonts w:ascii="Garamond" w:cs="Garamond" w:eastAsia="Garamond" w:hAnsi="Garamond"/>
-          <w:b/>
-          <w:bCs/>
-          <w:i w:val="false"/>
-          <w:iCs w:val="false"/>
-          <w:color w:val="1B2A4A"/>
-          <w:sz w:val="22"/>
-          <w:szCs w:val="22"/>
-        </w:rPr>
-        <w:t xml:space="preserve">Non-Refoulement</w:t>
-      </w:r>
-    </w:p>
-    <w:p>
-      <w:pPr>
-        <w:spacing w:after="120" w:before="0"/>
-        <w:ind w:left="431"/>
-        <w:jc w:val="both"/>
-      </w:pPr>
-      <w:r>
-        <w:rPr>
-          <w:rFonts w:ascii="Garamond" w:cs="Garamond" w:eastAsia="Garamond" w:hAnsi="Garamond"/>
-          <w:b w:val="false"/>
-          <w:bCs w:val="false"/>
-          <w:i w:val="false"/>
-          <w:iCs w:val="false"/>
-          <w:color w:val="2a2520"/>
-          <w:sz w:val="22"/>
-          <w:szCs w:val="22"/>
-        </w:rPr>
-        <w:t xml:space="preserve">No person within the Republic's jurisdiction may be returned, expelled, or extradited to any territory where they face genuine risk of persecution, torture, or deprivation of life. This protection applies regardless of the person's status, conduct, or the nature of the receiving territory's government. This right is non-derogable under §1.26.b.</w:t>
-      </w:r>
-    </w:p>
-    <w:p>
-      <w:pPr>
-        <w:spacing w:after="60" w:before="200"/>
-        <w:ind w:left="431"/>
-        <w:jc w:val="left"/>
-      </w:pPr>
-      <w:r>
-        <w:rPr>
-          <w:rFonts w:ascii="Courier New" w:cs="Courier New" w:eastAsia="Courier New" w:hAnsi="Courier New"/>
-          <w:b/>
-          <w:bCs/>
-          <w:color w:val="1B2A4A"/>
-          <w:sz w:val="18"/>
-          <w:szCs w:val="18"/>
-        </w:rPr>
-        <w:t xml:space="preserve">§1.31  </w:t>
-      </w:r>
-      <w:r>
-        <w:rPr>
-          <w:rFonts w:ascii="Garamond" w:cs="Garamond" w:eastAsia="Garamond" w:hAnsi="Garamond"/>
-          <w:b/>
-          <w:bCs/>
-          <w:color w:val="1B2A4A"/>
-          <w:sz w:val="22"/>
-          <w:szCs w:val="22"/>
-        </w:rPr>
-        <w:t xml:space="preserve">Continuity of Constitutionally Mandated Offices</w:t>
-      </w:r>
-    </w:p>
-    <w:p>
-      <w:pPr>
-        <w:spacing w:after="120" w:before="0"/>
-        <w:ind w:left="431"/>
-        <w:jc w:val="both"/>
-      </w:pPr>
-      <w:r>
-        <w:rPr>
-          <w:rFonts w:ascii="Garamond" w:cs="Garamond" w:eastAsia="Garamond" w:hAnsi="Garamond"/>
-          <w:b w:val="false"/>
-          <w:bCs w:val="false"/>
-          <w:i w:val="false"/>
-          <w:iCs w:val="false"/>
-          <w:color w:val="2a2520"/>
-          <w:sz w:val="22"/>
-          <w:szCs w:val="22"/>
-        </w:rPr>
-        <w:t xml:space="preserve">For every office established by this Constitution with a fixed term, the confirmed or elected successor’s term begins at the precise moment the incumbent’s term concludes — no gap exists between the end of one term and the commencement of the next. The selection and confirmation processes for each such office must be initiated and completed with sufficient lead time to ensure seamless succession before the incumbent’s term ends; failure to do so is a constitutional compliance breach certified by the LI. Any person serving in an acting capacity for a constitutionally mandated office during an unexpected vacancy must be otherwise eligible for that office — possessing all substantive qualifications for the role — with the sole exception of not having completed the applicable confirmation or election process. The acting mechanism for each office is defined in the provisions governing that office.</w:t>
-      </w:r>
-    </w:p>
-    <w:p>
-      <w:pPr>
-        <w:spacing w:after="60" w:before="200"/>
-        <w:ind w:left="431"/>
-        <w:jc w:val="left"/>
-      </w:pPr>
-      <w:r>
-        <w:rPr>
-          <w:rFonts w:ascii="Courier New" w:cs="Courier New" w:eastAsia="Courier New" w:hAnsi="Courier New"/>
-          <w:b/>
-          <w:bCs/>
-          <w:color w:val="1B2A4A"/>
-          <w:sz w:val="18"/>
-          <w:szCs w:val="18"/>
-        </w:rPr>
-        <w:t xml:space="preserve">§1.32  </w:t>
       </w:r>
       <w:r>
         <w:rPr>
@@ -2963,7 +2963,7 @@
           <w:sz w:val="22"/>
           <w:szCs w:val="22"/>
         </w:rPr>
-        <w:t xml:space="preserve">The Legislature may establish independent agencies operating outside the authority of both executives. Where this Constitution assigns a function to an independent agency, the Legislature must establish it; until it does, the relevant Inspectorate certifies the constitutional breach annually and reports on compliance, but does not substitute for the agency. The Legislature defines qualification standards for each agency’s officer pool by statute. The JI certifies candidates meeting those standards and maintains the pool as a public NRS record. The PM nominates the agency director from the certified pool only; a nomination outside the certified pool is constitutionally void. The Senate confirms by 2/3 supermajority. Agency officers serve fixed terms defined by statute and are removable for cause only; no executive may unilaterally remove an independent agency officer. Cause must relate to conduct, competence, or a disqualifying offense under §1.32; policy disagreement with the Legislature or either executive does not constitute cause. The oversight mechanism and removal procedure are defined by the statute establishing the agency, consistent with this principle.</w:t>
+        <w:t xml:space="preserve">The Legislature may establish independent agencies operating outside the authority of both executives. Where this Constitution assigns a function to an independent agency, the Legislature must establish it; until it does, the relevant Inspectorate certifies the constitutional breach annually and reports on compliance, but does not substitute for the agency. The Legislature defines qualification standards for each agency’s officer pool by statute. The JI certifies candidates meeting those standards and maintains the pool as a public NRS record. The PM nominates the agency director from the certified pool only; a nomination outside the certified pool is constitutionally void. The Senate confirms by 2/3 supermajority. Agency officers serve fixed terms defined by statute and are removable for cause only; no executive may unilaterally remove an independent agency officer. Cause must relate to conduct, competence, or a disqualifying offense under §1.23; policy disagreement with the Legislature or either executive does not constitute cause. The oversight mechanism and removal procedure are defined by the statute establishing the agency, consistent with this principle.</w:t>
       </w:r>
     </w:p>
     <w:p>
@@ -3343,7 +3343,7 @@
           <w:sz w:val="22"/>
           <w:szCs w:val="22"/>
         </w:rPr>
-        <w:t xml:space="preserve">SC justices are nominated by the PM from the open SC Candidate Registry maintained by the Elections Panel with eligibility certified by the JI under §9.4.e — any eligible citizen who applies and meets the qualification criteria is entered. The PM nominates within the period defined by statute following a vacancy (not to exceed 90 days for anticipated vacancies, 60 days for unanticipated vacancies). The JI confirms registry status and publishes the nominee's full record. The Senate must vote within the period defined by statute following JI publication of the nominee's record (not to exceed 120 days); no deemed confirmation applies, but failure to vote within that period is certified by the LI as a constitutional compliance breach. If the Senate declines, the PM nominates again within the period defined by statute. Where the PM fails to nominate within 30 days of an LI certification of constitutional breach under this section, the Senate may select a nominee directly from the SC Candidate Registry by 2/3 vote of full seated membership; a Senate selection under this provision requires no further PM nomination and proceeds directly to confirmation. The confirmed justice serves a single non-renewable 12-year term from the date of confirmation. A mid-term replacement serves only the remainder of the original term. At founding, the nine initial justices are confirmed simultaneously and assigned to their three classes by public lot. The Legislature must by statute establish a recusal framework; in the absence of statute, a justice must recuse where impartiality could reasonably be questioned. Upon any SC vacancy, the most senior Appellate Court judge by continuous service is automatically designated Temporary Associate Justice within 5 days — without nomination or confirmation — holding full voting rights until the vacancy is filled. A Temporary Associate Justice may not stand as a candidate for the seat they are temporarily filling.</w:t>
+        <w:t xml:space="preserve">SC justices are nominated by the PM from the open SC Candidate Registry maintained by the Elections Panel with eligibility certified by the JI under §9.4.b — any eligible citizen who applies and meets the qualification criteria is entered. The PM nominates within the period defined by statute following a vacancy (not to exceed 90 days for anticipated vacancies, 60 days for unanticipated vacancies). The JI confirms registry status and publishes the nominee's full record. The Senate must vote within the period defined by statute following JI publication of the nominee's record (not to exceed 120 days); no deemed confirmation applies, but failure to vote within that period is certified by the LI as a constitutional compliance breach. If the Senate declines, the PM nominates again within the period defined by statute. Where the PM fails to nominate within 30 days of an LI certification of constitutional breach under this section, the Senate may select a nominee directly from the SC Candidate Registry by 2/3 vote of full seated membership; a Senate selection under this provision requires no further PM nomination and proceeds directly to confirmation. The confirmed justice serves a single non-renewable 12-year term from the date of confirmation. A mid-term replacement serves only the remainder of the original term. At founding, the nine initial justices are confirmed simultaneously and assigned to their three classes by public lot. The Legislature must by statute establish a recusal framework; in the absence of statute, a justice must recuse where impartiality could reasonably be questioned. Upon any SC vacancy, the most senior Appellate Court judge by continuous service is automatically designated Temporary Associate Justice within 5 days — without nomination or confirmation — holding full voting rights until the vacancy is filled. A Temporary Associate Justice may not stand as a candidate for the seat they are temporarily filling.</w:t>
       </w:r>
     </w:p>
     <w:p>
@@ -3494,7 +3494,7 @@
           <w:sz w:val="22"/>
           <w:szCs w:val="22"/>
         </w:rPr>
-        <w:t xml:space="preserve">Judicial judgments, official records, and authenticated documents are recognized across all jurisdictions within the Republic. A judgment valid in one jurisdiction must be recognized in all others. Non-recognition grounds are exhaustive: the issuing court lacked jurisdiction; the judgment was obtained by fraud; or enforcement would require an act defined by the Legislature as categorically unenforceable. Judgments contrary to Article I are void by operation of §17.6. A judgment or status order published to the NRS is self-authenticating in any Republic court and takes immediate effect without re-registration. No State or Territory may discriminate in recognition based on the nature of the parties or the subject matter recognized by the issuing jurisdiction.</w:t>
+        <w:t xml:space="preserve">Judicial judgments, official records, and authenticated documents are recognized across all jurisdictions within the Republic. A judgment valid in one jurisdiction must be recognized in all others. Non-recognition grounds are exhaustive: the issuing court lacked jurisdiction; the judgment was obtained by fraud; or enforcement would require an act defined by the Legislature as categorically unenforceable. Judgments contrary to Article I are void by operation of §17.4. A judgment or status order published to the NRS is self-authenticating in any Republic court and takes immediate effect without re-registration. No State or Territory may discriminate in recognition based on the nature of the parties or the subject matter recognized by the issuing jurisdiction.</w:t>
       </w:r>
     </w:p>
     <w:p>
@@ -3641,7 +3641,7 @@
           <w:sz w:val="18"/>
           <w:szCs w:val="18"/>
         </w:rPr>
-        <w:t xml:space="preserve">§5.1.c  </w:t>
+        <w:t xml:space="preserve">§5.1.a  </w:t>
       </w:r>
       <w:r>
         <w:rPr>
@@ -3692,7 +3692,7 @@
           <w:sz w:val="18"/>
           <w:szCs w:val="18"/>
         </w:rPr>
-        <w:t xml:space="preserve">§5.1.f  </w:t>
+        <w:t xml:space="preserve">§5.1.b  </w:t>
       </w:r>
       <w:r>
         <w:rPr>
@@ -3905,7 +3905,7 @@
           <w:sz w:val="22"/>
           <w:szCs w:val="22"/>
         </w:rPr>
-        <w:t xml:space="preserve">Every immigration application must clear two sequential gates: Gate 1 (State sponsorship) and Gate 2 (federal certification). Legal residency requires passing both gates. States retain discretion over whom they sponsor but may not apply sponsorship criteria that violate §1.6. Federal certification covers four statutory categories only: identity verification, criminal history, national security assessment, and absence of documented welfare dependency on a foreign state — no ideological screening or nationality-based quotas. Any denial must specify the precise ground in writing. Once an applicant clears both gates, the President must ministerially issue residency credentials; Presidential interference with credential issuance is constitutionally prohibited. The Legislature may establish a Federal Sponsorship Category where federal agencies serve as Gate 1 sponsors for applicants serving a defined federal interest; this does not bypass Gate 2. The Legislature may set aggregate limits on total applications received and processed in any period, provided limits are applied without §1.6 discrimination. Asylum proceedings under §6.4 are exempt from Gate 1 — no State's refusal to sponsor can extinguish a §1.28 asylum claim.</w:t>
+        <w:t xml:space="preserve">Every immigration application must clear two sequential gates: Gate 1 (State sponsorship) and Gate 2 (federal certification). Legal residency requires passing both gates. States retain discretion over whom they sponsor but may not apply sponsorship criteria that violate §1.6. Federal certification covers four statutory categories only: identity verification, criminal history, national security assessment, and absence of documented welfare dependency on a foreign state — no ideological screening or nationality-based quotas. Any denial must specify the precise ground in writing. Once an applicant clears both gates, the President must ministerially issue residency credentials; Presidential interference with credential issuance is constitutionally prohibited. The Legislature may establish a Federal Sponsorship Category where federal agencies serve as Gate 1 sponsors for applicants serving a defined federal interest; this does not bypass Gate 2. The Legislature may set aggregate limits on total applications received and processed in any period, provided limits are applied without §1.6 discrimination. Asylum proceedings under §6.3 are exempt from Gate 1 — no State's refusal to sponsor can extinguish a §1.21 asylum claim.</w:t>
       </w:r>
     </w:p>
     <w:p>
@@ -3974,7 +3974,7 @@
           <w:sz w:val="18"/>
           <w:szCs w:val="18"/>
         </w:rPr>
-        <w:t xml:space="preserve">§6.4  </w:t>
+        <w:t xml:space="preserve">§6.3  </w:t>
       </w:r>
       <w:r>
         <w:rPr>
@@ -4007,25 +4007,25 @@
           <w:sz w:val="22"/>
           <w:szCs w:val="22"/>
         </w:rPr>
-        <w:t xml:space="preserve">Asylum proceedings operate on a separate constitutional track from the dual-gate system. Any person who files an asylum claim under §1.28 is an Inhabitant from the date of filing — entitled to Article I protections and social state access. Claims must be determined before any removal order takes effect. A claim filed solely to delay a final removal order may be expedited under procedures the Legislature defines, consistent with the right to a fair hearing. Where the Asylum Court grants protection, the person receives federal residency credentials by operation of that grant; Gate 1 and Gate 2 are not required conditions. The manner of entry does not affect the right to claim asylum or have that claim determined. No penalty arising solely from irregular entry may be imposed on a person whose claim is pending or has been granted. Asylum proceedings must provide: a qualified adjudicator, interpreter access, the right to present evidence and witnesses, a written decision with grounds, and a right of appeal — regardless of point of entry. The asylum proceedings statute must ensure accessibility to persons in Territories and geographically remote areas.</w:t>
-      </w:r>
-    </w:p>
-    <w:p>
-      <w:pPr>
-        <w:spacing w:after="60" w:before="200"/>
-        <w:ind w:left="431"/>
-        <w:jc w:val="left"/>
-      </w:pPr>
-      <w:r>
-        <w:rPr>
-          <w:rFonts w:ascii="Courier New" w:cs="Courier New" w:eastAsia="Courier New" w:hAnsi="Courier New"/>
-          <w:b/>
-          <w:bCs/>
-          <w:color w:val="1B2A4A"/>
-          <w:sz w:val="18"/>
-          <w:szCs w:val="18"/>
-        </w:rPr>
-        <w:t xml:space="preserve">§6.4.c  </w:t>
+        <w:t xml:space="preserve">Asylum proceedings operate on a separate constitutional track from the dual-gate system. Any person who files an asylum claim under §1.21 is an Inhabitant from the date of filing — entitled to Article I protections and social state access. Claims must be determined before any removal order takes effect. A claim filed solely to delay a final removal order may be expedited under procedures the Legislature defines, consistent with the right to a fair hearing. Where the Asylum Court grants protection, the person receives federal residency credentials by operation of that grant; Gate 1 and Gate 2 are not required conditions. The manner of entry does not affect the right to claim asylum or have that claim determined. No penalty arising solely from irregular entry may be imposed on a person whose claim is pending or has been granted. Asylum proceedings must provide: a qualified adjudicator, interpreter access, the right to present evidence and witnesses, a written decision with grounds, and a right of appeal — regardless of point of entry. The asylum proceedings statute must ensure accessibility to persons in Territories and geographically remote areas.</w:t>
+      </w:r>
+    </w:p>
+    <w:p>
+      <w:pPr>
+        <w:spacing w:after="60" w:before="200"/>
+        <w:ind w:left="431"/>
+        <w:jc w:val="left"/>
+      </w:pPr>
+      <w:r>
+        <w:rPr>
+          <w:rFonts w:ascii="Courier New" w:cs="Courier New" w:eastAsia="Courier New" w:hAnsi="Courier New"/>
+          <w:b/>
+          <w:bCs/>
+          <w:color w:val="1B2A4A"/>
+          <w:sz w:val="18"/>
+          <w:szCs w:val="18"/>
+        </w:rPr>
+        <w:t xml:space="preserve">§6.3.a  </w:t>
       </w:r>
       <w:r>
         <w:rPr>
@@ -4076,7 +4076,7 @@
           <w:sz w:val="18"/>
           <w:szCs w:val="18"/>
         </w:rPr>
-        <w:t xml:space="preserve">§6.4.e  </w:t>
+        <w:t xml:space="preserve">§6.3.b  </w:t>
       </w:r>
       <w:r>
         <w:rPr>
@@ -4109,25 +4109,25 @@
           <w:sz w:val="22"/>
           <w:szCs w:val="22"/>
         </w:rPr>
-        <w:t xml:space="preserve">The Legislature must define a minimum status, material conditions, and periodic judicial review for persons subject to final removal orders that cannot be executed — because the destination country will not accept them or execution would violate §1.28. Indefinite stateless detention is constitutionally prohibited. Where the Asylum Court grants §1.28 protection to a person who poses a documented security threat, removal remains constitutionally barred and indefinite unreviewed detention is not available. Detention is permitted subject to: mandatory judicial review by an independent federal court within 90 days of initial detention; mandatory review every 180 days thereafter; statutory minimum conditions of humane treatment; and no detention beyond 5 years without annual SC review.</w:t>
-      </w:r>
-    </w:p>
-    <w:p>
-      <w:pPr>
-        <w:spacing w:after="60" w:before="200"/>
-        <w:ind w:left="431"/>
-        <w:jc w:val="left"/>
-      </w:pPr>
-      <w:r>
-        <w:rPr>
-          <w:rFonts w:ascii="Courier New" w:cs="Courier New" w:eastAsia="Courier New" w:hAnsi="Courier New"/>
-          <w:b/>
-          <w:bCs/>
-          <w:color w:val="1B2A4A"/>
-          <w:sz w:val="18"/>
-          <w:szCs w:val="18"/>
-        </w:rPr>
-        <w:t xml:space="preserve">§6.4.h  </w:t>
+        <w:t xml:space="preserve">The Legislature must define a minimum status, material conditions, and periodic judicial review for persons subject to final removal orders that cannot be executed — because the destination country will not accept them or execution would violate §1.21. Indefinite stateless detention is constitutionally prohibited. Where the Asylum Court grants §1.21 protection to a person who poses a documented security threat, removal remains constitutionally barred and indefinite unreviewed detention is not available. Detention is permitted subject to: mandatory judicial review by an independent federal court within 90 days of initial detention; mandatory review every 180 days thereafter; statutory minimum conditions of humane treatment; and no detention beyond 5 years without annual SC review.</w:t>
+      </w:r>
+    </w:p>
+    <w:p>
+      <w:pPr>
+        <w:spacing w:after="60" w:before="200"/>
+        <w:ind w:left="431"/>
+        <w:jc w:val="left"/>
+      </w:pPr>
+      <w:r>
+        <w:rPr>
+          <w:rFonts w:ascii="Courier New" w:cs="Courier New" w:eastAsia="Courier New" w:hAnsi="Courier New"/>
+          <w:b/>
+          <w:bCs/>
+          <w:color w:val="1B2A4A"/>
+          <w:sz w:val="18"/>
+          <w:szCs w:val="18"/>
+        </w:rPr>
+        <w:t xml:space="preserve">§6.3.c  </w:t>
       </w:r>
       <w:r>
         <w:rPr>
@@ -4160,7 +4160,7 @@
           <w:sz w:val="22"/>
           <w:szCs w:val="22"/>
         </w:rPr>
-        <w:t xml:space="preserve">An unaccompanied minor arriving in the Republic is an Inhabitant from the moment of contact and holds full §1.28 protection. A federal legal guardian must be appointed by the federal court with jurisdiction over the point of contact within 24 hours. No unaccompanied minor may be detained in a facility not specifically designated and resourced for children.</w:t>
+        <w:t xml:space="preserve">An unaccompanied minor arriving in the Republic is an Inhabitant from the moment of contact and holds full §1.21 protection. A federal legal guardian must be appointed by the federal court with jurisdiction over the point of contact within 24 hours. No unaccompanied minor may be detained in a facility not specifically designated and resourced for children.</w:t>
       </w:r>
     </w:p>
     <w:p>
@@ -4802,7 +4802,7 @@
           <w:sz w:val="22"/>
           <w:szCs w:val="22"/>
         </w:rPr>
-        <w:t xml:space="preserve">The JI audits the courts for judicial scope and independence. The JI certifies eligibility for the SC Candidate Registry under §9.4.e and confirms registry status for SC nominees, and conducts annual audits of the Elections Panel for electoral integrity compliance. The JI reviews accommodation compact compliance, Associated Community compact compliance under Article XX, and Article XVI indigenous compact obligations. The JI's lottery-based selection makes it the appropriate body to administer all constitutional lottery draws and candidate certification functions throughout the Republic.</w:t>
+        <w:t xml:space="preserve">The JI audits the courts for judicial scope and independence. The JI certifies eligibility for the SC Candidate Registry under §9.4.b and confirms registry status for SC nominees, and conducts annual audits of the Elections Panel for electoral integrity compliance. The JI reviews accommodation compact compliance, Associated Community compact compliance under Article XX, and Article XVI indigenous compact obligations. The JI's lottery-based selection makes it the appropriate body to administer all constitutional lottery draws and candidate certification functions throughout the Republic.</w:t>
       </w:r>
     </w:p>
     <w:p>
@@ -4851,7 +4851,7 @@
           <w:sz w:val="22"/>
           <w:szCs w:val="22"/>
         </w:rPr>
-        <w:t xml:space="preserve">An IG’s constitutional authority terminates automatically at the moment their term expires — no further act or proceeding is required. Any official act taken after term expiry is constitutionally void. Where an unexpected vacancy arises mid-term — through death, resignation, removal, or certified incapacity — the most senior eligible member of the affected Inspectorate’s candidate pool by continuous pool tenure who accepts designation serves as Acting Inspector General until a successor is confirmed under §9.3. The Acting IG holds full constitutional authority of the office. The Acting IG is not eligible for permanent appointment to the position in which they serve; upon conclusion of acting service they return to the candidate pool. The JIC certifies the designation and both executives are notified immediately; notice does not condition the designation’s effectiveness. Pool membership satisfies the eligibility requirement of §1.31. Where an IG is certified incapacitated by the other two Inspectorates jointly, the incapacitated IG’s authority is suspended from the moment of joint certification and the acting mechanism under this provision activates immediately.</w:t>
+        <w:t xml:space="preserve">An IG’s constitutional authority terminates automatically at the moment their term expires — no further act or proceeding is required. Any official act taken after term expiry is constitutionally void. Where an unexpected vacancy arises mid-term — through death, resignation, removal, or certified incapacity — the most senior eligible member of the affected Inspectorate’s candidate pool by continuous pool tenure who accepts designation serves as Acting Inspector General until a successor is confirmed under §9.3. The Acting IG holds full constitutional authority of the office. The Acting IG is not eligible for permanent appointment to the position in which they serve; upon conclusion of acting service they return to the candidate pool. The JIC certifies the designation and both executives are notified immediately; notice does not condition the designation’s effectiveness. Pool membership satisfies the eligibility requirement of §1.22. Where an IG is certified incapacitated by the other two Inspectorates jointly, the incapacitated IG’s authority is suspended from the moment of joint certification and the acting mechanism under this provision activates immediately.</w:t>
       </w:r>
     </w:p>
     <w:p>
@@ -4953,7 +4953,7 @@
           <w:sz w:val="22"/>
           <w:szCs w:val="22"/>
         </w:rPr>
-        <w:t xml:space="preserve">The LI IG is nominated by the SC from a pool of qualified candidates maintained by the Elections Panel and certified jointly by the EI and JI, sufficiently in advance under the timeline defined by statute to ensure confirmation is complete before the transition under §1.31; confirmed by national popular vote at the next federal electoral period following nomination, by simple majority of votes cast. The confirmed successor assumes full IG authority at the precise moment the incumbent’s term concludes under §1.31. If the confirmation vote fails, the §9.1.d acting mechanism activates and the SC initiates a new nomination from the pool within 60 days. The EI IG is nominated jointly by the House Speaker and Senate Speaker from a pool of qualified candidates maintained by the Elections Panel and certified jointly by the LI and JI, sufficiently in advance under the timeline defined by statute under §1.31; confirmed by national popular vote at the next federal electoral period following nomination, by simple majority of votes cast, with JI vetting of the nominee’s disclosure record published before the vote. The same timing and failed-vote provisions apply. The JI IG is selected by public lottery under §9.13 from the JI Candidate Pool under §9.4.a maintained by the Elections Panel, conducted at the statutory timeline under §1.31, sufficiently in advance to ensure seamless succession; no separate confirmation required — the lottery result is the selection and the selected person assumes office at the precise moment the incumbent’s term concludes. All IGs serve 10-year non-renewable terms. No two IG terms may begin within 18 months of each other, ensuring continuous institutional knowledge across offices. The Elections Panel administers all IG confirmation votes as part of the regular federal electoral period ballot.</w:t>
+        <w:t xml:space="preserve">The LI IG is nominated by the SC from a pool of qualified candidates maintained by the Elections Panel and certified jointly by the EI and JI, sufficiently in advance under the timeline defined by statute to ensure confirmation is complete before the transition under §1.22; confirmed by national popular vote at the next federal electoral period following nomination, by simple majority of votes cast. The confirmed successor assumes full IG authority at the precise moment the incumbent’s term concludes under §1.22. If the confirmation vote fails, the §9.1.d acting mechanism activates and the SC initiates a new nomination from the pool within 60 days. The EI IG is nominated jointly by the House Speaker and Senate Speaker from a pool of qualified candidates maintained by the Elections Panel and certified jointly by the LI and JI, sufficiently in advance under the timeline defined by statute under §1.22; confirmed by national popular vote at the next federal electoral period following nomination, by simple majority of votes cast, with JI vetting of the nominee’s disclosure record published before the vote. The same timing and failed-vote provisions apply. The JI IG is selected by public lottery under §9.13 from the JI Candidate Pool under §9.4.a maintained by the Elections Panel, conducted at the statutory timeline under §1.22, sufficiently in advance to ensure seamless succession; no separate confirmation required — the lottery result is the selection and the selected person assumes office at the precise moment the incumbent’s term concludes. All IGs serve 10-year non-renewable terms. No two IG terms may begin within 18 months of each other, ensuring continuous institutional knowledge across offices. The Elections Panel administers all IG confirmation votes as part of the regular federal electoral period ballot.</w:t>
       </w:r>
     </w:p>
     <w:p>
@@ -5073,7 +5073,7 @@
           <w:sz w:val="18"/>
           <w:szCs w:val="18"/>
         </w:rPr>
-        <w:t xml:space="preserve">§9.4.e  </w:t>
+        <w:t xml:space="preserve">§9.4.b  </w:t>
       </w:r>
       <w:r>
         <w:rPr>
@@ -5430,7 +5430,7 @@
           <w:sz w:val="18"/>
           <w:szCs w:val="18"/>
         </w:rPr>
-        <w:t xml:space="preserve">§9.12  </w:t>
+        <w:t xml:space="preserve">§9.11  </w:t>
       </w:r>
       <w:r>
         <w:rPr>
@@ -5481,7 +5481,7 @@
           <w:sz w:val="18"/>
           <w:szCs w:val="18"/>
         </w:rPr>
-        <w:t xml:space="preserve">§9.12.a  </w:t>
+        <w:t xml:space="preserve">§9.11.a  </w:t>
       </w:r>
       <w:r>
         <w:rPr>
@@ -5757,7 +5757,7 @@
           <w:sz w:val="18"/>
           <w:szCs w:val="18"/>
         </w:rPr>
-        <w:t xml:space="preserve">§10.4  </w:t>
+        <w:t xml:space="preserve">§10.2  </w:t>
       </w:r>
       <w:r>
         <w:rPr>
@@ -5808,7 +5808,7 @@
           <w:sz w:val="18"/>
           <w:szCs w:val="18"/>
         </w:rPr>
-        <w:t xml:space="preserve">§10.5  </w:t>
+        <w:t xml:space="preserve">§10.3  </w:t>
       </w:r>
       <w:r>
         <w:rPr>
@@ -5857,7 +5857,7 @@
           <w:sz w:val="18"/>
           <w:szCs w:val="18"/>
         </w:rPr>
-        <w:t xml:space="preserve">§10.5.a  </w:t>
+        <w:t xml:space="preserve">§10.3.a  </w:t>
       </w:r>
       <w:r>
         <w:rPr>
@@ -5984,58 +5984,58 @@
           <w:sz w:val="18"/>
           <w:szCs w:val="18"/>
         </w:rPr>
+        <w:t xml:space="preserve">§11.2  </w:t>
+      </w:r>
+      <w:r>
+        <w:rPr>
+          <w:rFonts w:ascii="Garamond" w:cs="Garamond" w:eastAsia="Garamond" w:hAnsi="Garamond"/>
+          <w:b/>
+          <w:bCs/>
+          <w:i w:val="false"/>
+          <w:iCs w:val="false"/>
+          <w:color w:val="1B2A4A"/>
+          <w:sz w:val="22"/>
+          <w:szCs w:val="22"/>
+        </w:rPr>
+        <w:t xml:space="preserve">NVS Properties and Voting Rights</w:t>
+      </w:r>
+    </w:p>
+    <w:p>
+      <w:pPr>
+        <w:spacing w:after="120" w:before="0"/>
+        <w:ind w:left="431"/>
+        <w:jc w:val="both"/>
+      </w:pPr>
+      <w:r>
+        <w:rPr>
+          <w:rFonts w:ascii="Garamond" w:cs="Garamond" w:eastAsia="Garamond" w:hAnsi="Garamond"/>
+          <w:b w:val="false"/>
+          <w:bCs w:val="false"/>
+          <w:i w:val="false"/>
+          <w:iCs w:val="false"/>
+          <w:color w:val="2a2520"/>
+          <w:sz w:val="22"/>
+          <w:szCs w:val="22"/>
+        </w:rPr>
+        <w:t xml:space="preserve">The National Voting System must maintain three constitutionally required properties simultaneously: ballot secrecy (technically impossible to link any vote to any voter, including in post-election audits), public auditability (aggregate results mathematically verifiable by anyone with NRS access; every vote individually verifiable by the voter without revealing identity to any other party), and resilience (capable of operating in degraded conditions without compromising either secrecy or auditability). No information generated by the NVS — including voter participation records — may be shared with any government body or foreign entity for any purpose other than administering the relevant election. Every citizen holds the right to vote in federal elections. The Elections Panel issues and manages the Citizen Voting Credential, storing only cryptographic identifiers — not names or biometric data. Voter eligibility is verified through cryptographic matching against citizenship and residency records maintained separately from the NVS and accessible only for that purpose. States may offer early voting, mail-in ballots, and alternative participation methods provided all methods connect to the NVS and meet its constitutional standards. No State may reduce NVS access, functionality, or availability within its territory. No State may impose requirements or intermediaries that effectively reduce NVS access or impose burdens not present in direct NVS participation. Before each federal election window, the Elections Panel delivers to every eligible citizen the list of federal races on their ballot, NVS access procedures, and the certification timeline through at least two distinct channels.</w:t>
+      </w:r>
+    </w:p>
+    <w:p>
+      <w:pPr>
+        <w:spacing w:after="60" w:before="200"/>
+        <w:ind w:left="431"/>
+        <w:jc w:val="left"/>
+      </w:pPr>
+      <w:r>
+        <w:rPr>
+          <w:rFonts w:ascii="Courier New" w:cs="Courier New" w:eastAsia="Courier New" w:hAnsi="Courier New"/>
+          <w:b/>
+          <w:bCs/>
+          <w:color w:val="1B2A4A"/>
+          <w:sz w:val="18"/>
+          <w:szCs w:val="18"/>
+        </w:rPr>
         <w:t xml:space="preserve">§11.3  </w:t>
-      </w:r>
-      <w:r>
-        <w:rPr>
-          <w:rFonts w:ascii="Garamond" w:cs="Garamond" w:eastAsia="Garamond" w:hAnsi="Garamond"/>
-          <w:b/>
-          <w:bCs/>
-          <w:i w:val="false"/>
-          <w:iCs w:val="false"/>
-          <w:color w:val="1B2A4A"/>
-          <w:sz w:val="22"/>
-          <w:szCs w:val="22"/>
-        </w:rPr>
-        <w:t xml:space="preserve">NVS Properties and Voting Rights</w:t>
-      </w:r>
-    </w:p>
-    <w:p>
-      <w:pPr>
-        <w:spacing w:after="120" w:before="0"/>
-        <w:ind w:left="431"/>
-        <w:jc w:val="both"/>
-      </w:pPr>
-      <w:r>
-        <w:rPr>
-          <w:rFonts w:ascii="Garamond" w:cs="Garamond" w:eastAsia="Garamond" w:hAnsi="Garamond"/>
-          <w:b w:val="false"/>
-          <w:bCs w:val="false"/>
-          <w:i w:val="false"/>
-          <w:iCs w:val="false"/>
-          <w:color w:val="2a2520"/>
-          <w:sz w:val="22"/>
-          <w:szCs w:val="22"/>
-        </w:rPr>
-        <w:t xml:space="preserve">The National Voting System must maintain three constitutionally required properties simultaneously: ballot secrecy (technically impossible to link any vote to any voter, including in post-election audits), public auditability (aggregate results mathematically verifiable by anyone with NRS access; every vote individually verifiable by the voter without revealing identity to any other party), and resilience (capable of operating in degraded conditions without compromising either secrecy or auditability). No information generated by the NVS — including voter participation records — may be shared with any government body or foreign entity for any purpose other than administering the relevant election. Every citizen holds the right to vote in federal elections. The Elections Panel issues and manages the Citizen Voting Credential, storing only cryptographic identifiers — not names or biometric data. Voter eligibility is verified through cryptographic matching against citizenship and residency records maintained separately from the NVS and accessible only for that purpose. States may offer early voting, mail-in ballots, and alternative participation methods provided all methods connect to the NVS and meet its constitutional standards. No State may reduce NVS access, functionality, or availability within its territory. No State may impose requirements or intermediaries that effectively reduce NVS access or impose burdens not present in direct NVS participation. Before each federal election window, the Elections Panel delivers to every eligible citizen the list of federal races on their ballot, NVS access procedures, and the certification timeline through at least two distinct channels.</w:t>
-      </w:r>
-    </w:p>
-    <w:p>
-      <w:pPr>
-        <w:spacing w:after="60" w:before="200"/>
-        <w:ind w:left="431"/>
-        <w:jc w:val="left"/>
-      </w:pPr>
-      <w:r>
-        <w:rPr>
-          <w:rFonts w:ascii="Courier New" w:cs="Courier New" w:eastAsia="Courier New" w:hAnsi="Courier New"/>
-          <w:b/>
-          <w:bCs/>
-          <w:color w:val="1B2A4A"/>
-          <w:sz w:val="18"/>
-          <w:szCs w:val="18"/>
-        </w:rPr>
-        <w:t xml:space="preserve">§11.5  </w:t>
       </w:r>
       <w:r>
         <w:rPr>
@@ -6266,6 +6266,57 @@
           <w:sz w:val="18"/>
           <w:szCs w:val="18"/>
         </w:rPr>
+        <w:t xml:space="preserve">§12.4  </w:t>
+      </w:r>
+      <w:r>
+        <w:rPr>
+          <w:rFonts w:ascii="Garamond" w:cs="Garamond" w:eastAsia="Garamond" w:hAnsi="Garamond"/>
+          <w:b/>
+          <w:bCs/>
+          <w:i w:val="false"/>
+          <w:iCs w:val="false"/>
+          <w:color w:val="1B2A4A"/>
+          <w:sz w:val="22"/>
+          <w:szCs w:val="22"/>
+        </w:rPr>
+        <w:t xml:space="preserve">Ethics and Conflict of Interest</w:t>
+      </w:r>
+    </w:p>
+    <w:p>
+      <w:pPr>
+        <w:spacing w:after="120" w:before="0"/>
+        <w:ind w:left="431"/>
+        <w:jc w:val="both"/>
+      </w:pPr>
+      <w:r>
+        <w:rPr>
+          <w:rFonts w:ascii="Garamond" w:cs="Garamond" w:eastAsia="Garamond" w:hAnsi="Garamond"/>
+          <w:b w:val="false"/>
+          <w:bCs w:val="false"/>
+          <w:i w:val="false"/>
+          <w:iCs w:val="false"/>
+          <w:color w:val="2a2520"/>
+          <w:sz w:val="22"/>
+          <w:szCs w:val="22"/>
+        </w:rPr>
+        <w:t xml:space="preserve">All constitutional officers must disclose all financial interests, holdings, income sources, and liabilities to the EI within the period defined by statute after taking office and annually thereafter; disclosure records are published to the NRS. Any officer with a direct financial interest in a decision within their authority must recuse themselves; recusal is self-executing. Any decision made without required recusal is voidable; the EI certifies the conflict to the NRS and the relevant chamber may void the decision by simple majority within 90 days of that certification. Constitutional officers may not, for a period defined by statute after leaving office — which may not be less than two years — engage in any activity that monetizes or draws on non-public information, relationships, or access accumulated during service; the EI determines whether a post-service engagement falls within this restriction and the officer bears the burden of demonstrating it does not. Officers may not accept gifts above a de minimis threshold; all gifts above the threshold must be disclosed to the EI and deposited with the relevant treasury. All records created in the exercise of official functions are public records and may not be retained, destroyed, or removed by departing officers. The EI investigates alleged violations and publishes findings to the NRS; where findings warrant further action, the EI refers to the appropriate authority.</w:t>
+      </w:r>
+    </w:p>
+    <w:p>
+      <w:pPr>
+        <w:spacing w:after="60" w:before="200"/>
+        <w:ind w:left="431"/>
+        <w:jc w:val="left"/>
+      </w:pPr>
+      <w:r>
+        <w:rPr>
+          <w:rFonts w:ascii="Courier New" w:cs="Courier New" w:eastAsia="Courier New" w:hAnsi="Courier New"/>
+          <w:b/>
+          <w:bCs/>
+          <w:color w:val="1B2A4A"/>
+          <w:sz w:val="18"/>
+          <w:szCs w:val="18"/>
+        </w:rPr>
         <w:t xml:space="preserve">§12.5  </w:t>
       </w:r>
       <w:r>
@@ -6279,27 +6330,27 @@
           <w:sz w:val="22"/>
           <w:szCs w:val="22"/>
         </w:rPr>
-        <w:t xml:space="preserve">Ethics and Conflict of Interest</w:t>
-      </w:r>
-    </w:p>
-    <w:p>
-      <w:pPr>
-        <w:spacing w:after="120" w:before="0"/>
-        <w:ind w:left="431"/>
-        <w:jc w:val="both"/>
-      </w:pPr>
-      <w:r>
-        <w:rPr>
-          <w:rFonts w:ascii="Garamond" w:cs="Garamond" w:eastAsia="Garamond" w:hAnsi="Garamond"/>
-          <w:b w:val="false"/>
-          <w:bCs w:val="false"/>
-          <w:i w:val="false"/>
-          <w:iCs w:val="false"/>
-          <w:color w:val="2a2520"/>
-          <w:sz w:val="22"/>
-          <w:szCs w:val="22"/>
-        </w:rPr>
-        <w:t xml:space="preserve">All constitutional officers must disclose all financial interests, holdings, income sources, and liabilities to the EI within the period defined by statute after taking office and annually thereafter; disclosure records are published to the NRS. Any officer with a direct financial interest in a decision within their authority must recuse themselves; recusal is self-executing. Any decision made without required recusal is voidable; the EI certifies the conflict to the NRS and the relevant chamber may void the decision by simple majority within 90 days of that certification. Constitutional officers may not, for a period defined by statute after leaving office — which may not be less than two years — engage in any activity that monetizes or draws on non-public information, relationships, or access accumulated during service; the EI determines whether a post-service engagement falls within this restriction and the officer bears the burden of demonstrating it does not. Officers may not accept gifts above a de minimis threshold; all gifts above the threshold must be disclosed to the EI and deposited with the relevant treasury. All records created in the exercise of official functions are public records and may not be retained, destroyed, or removed by departing officers. The EI investigates alleged violations and publishes findings to the NRS; where findings warrant further action, the EI refers to the appropriate authority.</w:t>
+        <w:t xml:space="preserve">National Endowment</w:t>
+      </w:r>
+    </w:p>
+    <w:p>
+      <w:pPr>
+        <w:spacing w:after="120" w:before="0"/>
+        <w:ind w:left="431"/>
+        <w:jc w:val="both"/>
+      </w:pPr>
+      <w:r>
+        <w:rPr>
+          <w:rFonts w:ascii="Garamond" w:cs="Garamond" w:eastAsia="Garamond" w:hAnsi="Garamond"/>
+          <w:b w:val="false"/>
+          <w:bCs w:val="false"/>
+          <w:i w:val="false"/>
+          <w:iCs w:val="false"/>
+          <w:color w:val="2a2520"/>
+          <w:sz w:val="22"/>
+          <w:szCs w:val="22"/>
+        </w:rPr>
+        <w:t xml:space="preserve">The National Endowment is a constitutionally established reserve fund that backstops the Republic's social state obligations under §12.1 during periods of Severe Revenue Contraction, as certified by the independent Monetary Authority established under §12.1. It operates independently of the annual budget process. The Endowment is governed by a board of five trustees selected by public lottery from the National Endowment Trustee Pool. Each executive nominates qualified persons to the pool annually; pool entry follows §9.13 and eligibility is certified jointly by the EI and LI; the JIC conducts the trustee lottery under §9.13. Disbursements are activated on Monetary Authority certification of Severe Revenue Contraction and continue until the Monetary Authority certifies the contraction has ended. Trustees serve staggered 6-year non-renewable terms and may be removed only for cause under the framework established in §9.15. The board's sole mandate is to preserve and grow the Endowment for social state backstop purposes; it may not be directed to any other goal. All board decisions and performance reports are published to the NRS; the EI audits the board annually.</w:t>
       </w:r>
     </w:p>
     <w:p>
@@ -6318,57 +6369,6 @@
           <w:szCs w:val="18"/>
         </w:rPr>
         <w:t xml:space="preserve">§12.6  </w:t>
-      </w:r>
-      <w:r>
-        <w:rPr>
-          <w:rFonts w:ascii="Garamond" w:cs="Garamond" w:eastAsia="Garamond" w:hAnsi="Garamond"/>
-          <w:b/>
-          <w:bCs/>
-          <w:i w:val="false"/>
-          <w:iCs w:val="false"/>
-          <w:color w:val="1B2A4A"/>
-          <w:sz w:val="22"/>
-          <w:szCs w:val="22"/>
-        </w:rPr>
-        <w:t xml:space="preserve">National Endowment</w:t>
-      </w:r>
-    </w:p>
-    <w:p>
-      <w:pPr>
-        <w:spacing w:after="120" w:before="0"/>
-        <w:ind w:left="431"/>
-        <w:jc w:val="both"/>
-      </w:pPr>
-      <w:r>
-        <w:rPr>
-          <w:rFonts w:ascii="Garamond" w:cs="Garamond" w:eastAsia="Garamond" w:hAnsi="Garamond"/>
-          <w:b w:val="false"/>
-          <w:bCs w:val="false"/>
-          <w:i w:val="false"/>
-          <w:iCs w:val="false"/>
-          <w:color w:val="2a2520"/>
-          <w:sz w:val="22"/>
-          <w:szCs w:val="22"/>
-        </w:rPr>
-        <w:t xml:space="preserve">The National Endowment is a constitutionally established reserve fund that backstops the Republic's social state obligations under §12.1 during periods of Severe Revenue Contraction, as certified by the independent Monetary Authority established under §12.1. It operates independently of the annual budget process. The Endowment is governed by a board of five trustees selected by public lottery from the National Endowment Trustee Pool. Each executive nominates qualified persons to the pool annually; pool entry follows §9.13 and eligibility is certified jointly by the EI and LI; the JIC conducts the trustee lottery under §9.13. Disbursements are activated on Monetary Authority certification of Severe Revenue Contraction and continue until the Monetary Authority certifies the contraction has ended. Trustees serve staggered 6-year non-renewable terms and may be removed only for cause under the framework established in §9.15. The board's sole mandate is to preserve and grow the Endowment for social state backstop purposes; it may not be directed to any other goal. All board decisions and performance reports are published to the NRS; the EI audits the board annually.</w:t>
-      </w:r>
-    </w:p>
-    <w:p>
-      <w:pPr>
-        <w:spacing w:after="60" w:before="200"/>
-        <w:ind w:left="431"/>
-        <w:jc w:val="left"/>
-      </w:pPr>
-      <w:r>
-        <w:rPr>
-          <w:rFonts w:ascii="Courier New" w:cs="Courier New" w:eastAsia="Courier New" w:hAnsi="Courier New"/>
-          <w:b/>
-          <w:bCs/>
-          <w:color w:val="1B2A4A"/>
-          <w:sz w:val="18"/>
-          <w:szCs w:val="18"/>
-        </w:rPr>
-        <w:t xml:space="preserve">§12.7  </w:t>
       </w:r>
       <w:r>
         <w:rPr>
@@ -7245,7 +7245,7 @@
           <w:sz w:val="22"/>
           <w:szCs w:val="22"/>
         </w:rPr>
-        <w:t xml:space="preserve">A sovereign entity may petition to join the Republic's constitutional framework as a Territory. The process requires a petition resolution adopted by the entity's own legislature by 2/3 majority, confirmed by a citizen referendum achieving simple majority on at least 50% participation; the JI's published assessment of whether the entity systematically violates any non-derogable right listed in §1.26.b; and acceptance by the Legislature by 2/3 of both chambers. An accepted petition produces an incorporation agreement specifying a transition period not exceeding 48 months. No constitutional officer may condition treaty obligations, trade relations, military cooperation, or foreign aid on any entity's decision to initiate or advance this process. An indigenous nation recognized under Article XVI must make a status election under §16.7 before this provision applies.</w:t>
+        <w:t xml:space="preserve">A sovereign entity may petition to join the Republic's constitutional framework as a Territory. The process requires a petition resolution adopted by the entity's own legislature by 2/3 majority, confirmed by a citizen referendum achieving simple majority on at least 50% participation; the JI's published assessment of whether the entity systematically violates any non-derogable right listed in §1.19.b; and acceptance by the Legislature by 2/3 of both chambers. An accepted petition produces an incorporation agreement specifying a transition period not exceeding 48 months. No constitutional officer may condition treaty obligations, trade relations, military cooperation, or foreign aid on any entity's decision to initiate or advance this process. An indigenous nation recognized under Article XVI must make a status election under §16.7 before this provision applies.</w:t>
       </w:r>
     </w:p>
     <w:p>
@@ -7810,7 +7810,7 @@
           <w:szCs w:val="22"/>
         </w:rPr>
         <w:t xml:space="preserve">This Constitution may be amended through the parliamentary path or through citizen initiative. No executive signature is required; no executive veto applies. Every member’s vote on any amendment is published to the NRS.
-A parliamentary amendment requires a 2/3 supermajority of the full seated membership of both chambers. The proposing body simultaneously specifies the ratification mechanism — either State Ratification (ratification by 2/3 of States within the period defined by statute) or Popular Ratification (a national popular referendum achieving 2/3 affirmative support with at least 55% citizen participation within 180 days). Citizen Initiative Amendment: Any proposed constitutional amendment supported by a petition of at least 15% of eligible voters, as verified by the LI, proceeds directly to a national referendum. Passage requires 70% of votes cast with a minimum 65% citizen participation; where the participation floor is not met the initiative fails and may not be resubmitted on the same or substantially similar grounds for five years. No legislative or executive action is required to place the initiative on the ballot; the Elections Panel administers the referendum within 180 days of LI petition verification. Citizen initiative amendments are subject to §17.5 consistency analysis by the LI, advisory only.</w:t>
+A parliamentary amendment requires a 2/3 supermajority of the full seated membership of both chambers. The proposing body simultaneously specifies the ratification mechanism — either State Ratification (ratification by 2/3 of States within the period defined by statute) or Popular Ratification (a national popular referendum achieving 2/3 affirmative support with at least 55% citizen participation within 180 days). Citizen Initiative Amendment: Any proposed constitutional amendment supported by a petition of at least 15% of eligible voters, as verified by the LI, proceeds directly to a national referendum. Passage requires 70% of votes cast with a minimum 65% citizen participation; where the participation floor is not met the initiative fails and may not be resubmitted on the same or substantially similar grounds for five years. No legislative or executive action is required to place the initiative on the ballot; the Elections Panel administers the referendum within 180 days of LI petition verification. Citizen initiative amendments are subject to §17.3 consistency analysis by the LI, advisory only.</w:t>
       </w:r>
     </w:p>
     <w:p>
@@ -7879,7 +7879,7 @@
           <w:sz w:val="18"/>
           <w:szCs w:val="18"/>
         </w:rPr>
-        <w:t xml:space="preserve">§17.5  </w:t>
+        <w:t xml:space="preserve">§17.3  </w:t>
       </w:r>
       <w:r>
         <w:rPr>
@@ -7930,7 +7930,7 @@
           <w:sz w:val="18"/>
           <w:szCs w:val="18"/>
         </w:rPr>
-        <w:t xml:space="preserve">§17.6  </w:t>
+        <w:t xml:space="preserve">§17.4  </w:t>
       </w:r>
       <w:r>
         <w:rPr>
@@ -8194,7 +8194,7 @@
           <w:sz w:val="22"/>
           <w:szCs w:val="22"/>
         </w:rPr>
-        <w:t xml:space="preserve">The National Trust holds all federal land not conveyed by statute to States, indigenous compact territories, or private parties. Land disposal requires statute — the executive cannot convey or encumber public land unilaterally. National Trust designation requires a 2/3 vote of both chambers with host State consent; removal from Trust designation requires the same threshold plus SC review within 60 days confirming compliance with any applicable international obligations. International conservation agreements require a 2/3 Senate vote to withdraw before the national removal process begins. Land designated National Trust carries an active stewardship obligation: the federal government must maintain ecological integrity and public accessibility; the EI monitors compliance annually cross-referenced with §1.23. States and indigenous nations may enter co-management agreements with the Domestic Affairs Council for National Trust lands within their borders or ancestral territories without transferring Trust ownership. The National Trust Administrator is a statutory independent officer whose independence is protected by statute; the enabling statute may not reduce the stewardship obligations or diminish the EI's annual monitoring authority.</w:t>
+        <w:t xml:space="preserve">The National Trust holds all federal land not conveyed by statute to States, indigenous compact territories, or private parties. Land disposal requires statute — the executive cannot convey or encumber public land unilaterally. National Trust designation requires a 2/3 vote of both chambers with host State consent; removal from Trust designation requires the same threshold plus SC review within 60 days confirming compliance with any applicable international obligations. International conservation agreements require a 2/3 Senate vote to withdraw before the national removal process begins. Land designated National Trust carries an active stewardship obligation: the federal government must maintain ecological integrity and public accessibility; the EI monitors compliance annually cross-referenced with §1.18. States and indigenous nations may enter co-management agreements with the Domestic Affairs Council for National Trust lands within their borders or ancestral territories without transferring Trust ownership. The National Trust Administrator is a statutory independent officer whose independence is protected by statute; the enabling statute may not reduce the stewardship obligations or diminish the EI's annual monitoring authority.</w:t>
       </w:r>
     </w:p>
     <w:p>
@@ -8323,7 +8323,7 @@
           <w:sz w:val="22"/>
           <w:szCs w:val="22"/>
         </w:rPr>
-        <w:t xml:space="preserve">This constitution takes effect upon: (1) interim Elections Panel certification that the NVS is operational and meets §11.3; and (2) a national ratification vote achieving 60% affirmative support with at least 50% participation. Ratification creates binding constitutional obligations on all governmental actors from Day Zero. Where multiple sovereign nations simultaneously pool sovereignty through a treaty of union, transition provisions adapt as specified in the treaty of union, subject to the constitutional principles of this Article. Where the ratifying polity maintains existing institutions overlapping with constitutional mechanisms, the Legislature must by statute within two years of Phase 4 define their relationship; accommodation statutes may not reduce the legal standing of pre-existing governance structures below their pre-Phase 4 status.</w:t>
+        <w:t xml:space="preserve">This constitution takes effect upon: (1) interim Elections Panel certification that the NVS is operational and meets §11.2; and (2) a national ratification vote achieving 60% affirmative support with at least 50% participation. Ratification creates binding constitutional obligations on all governmental actors from Day Zero. Where multiple sovereign nations simultaneously pool sovereignty through a treaty of union, transition provisions adapt as specified in the treaty of union, subject to the constitutional principles of this Article. Where the ratifying polity maintains existing institutions overlapping with constitutional mechanisms, the Legislature must by statute within two years of Phase 4 define their relationship; accommodation statutes may not reduce the legal standing of pre-existing governance structures below their pre-Phase 4 status.</w:t>
       </w:r>
     </w:p>
     <w:p>
@@ -8392,6 +8392,57 @@
           <w:sz w:val="18"/>
           <w:szCs w:val="18"/>
         </w:rPr>
+        <w:t xml:space="preserve">§19.3  </w:t>
+      </w:r>
+      <w:r>
+        <w:rPr>
+          <w:rFonts w:ascii="Garamond" w:cs="Garamond" w:eastAsia="Garamond" w:hAnsi="Garamond"/>
+          <w:b/>
+          <w:bCs/>
+          <w:i w:val="false"/>
+          <w:iCs w:val="false"/>
+          <w:color w:val="1B2A4A"/>
+          <w:sz w:val="22"/>
+          <w:szCs w:val="22"/>
+        </w:rPr>
+        <w:t xml:space="preserve">Caretaker Status</w:t>
+      </w:r>
+    </w:p>
+    <w:p>
+      <w:pPr>
+        <w:spacing w:after="120" w:before="0"/>
+        <w:ind w:left="431"/>
+        <w:jc w:val="both"/>
+      </w:pPr>
+      <w:r>
+        <w:rPr>
+          <w:rFonts w:ascii="Garamond" w:cs="Garamond" w:eastAsia="Garamond" w:hAnsi="Garamond"/>
+          <w:b w:val="false"/>
+          <w:bCs w:val="false"/>
+          <w:i w:val="false"/>
+          <w:iCs w:val="false"/>
+          <w:color w:val="2a2520"/>
+          <w:sz w:val="22"/>
+          <w:szCs w:val="22"/>
+        </w:rPr>
+        <w:t xml:space="preserve">All existing government officials serve as caretakers during the Transition Window — restricted to maintaining existing services only; no new permanent legislation. Transition is supervised by a joint Inspectorate panel of one representative per Inspectorate appointed by their respective IGs; the panel dissolves automatically at the Transition Window's conclusion.</w:t>
+      </w:r>
+    </w:p>
+    <w:p>
+      <w:pPr>
+        <w:spacing w:after="60" w:before="200"/>
+        <w:ind w:left="431"/>
+        <w:jc w:val="left"/>
+      </w:pPr>
+      <w:r>
+        <w:rPr>
+          <w:rFonts w:ascii="Courier New" w:cs="Courier New" w:eastAsia="Courier New" w:hAnsi="Courier New"/>
+          <w:b/>
+          <w:bCs/>
+          <w:color w:val="1B2A4A"/>
+          <w:sz w:val="18"/>
+          <w:szCs w:val="18"/>
+        </w:rPr>
         <w:t xml:space="preserve">§19.4  </w:t>
       </w:r>
       <w:r>
@@ -8405,27 +8456,27 @@
           <w:sz w:val="22"/>
           <w:szCs w:val="22"/>
         </w:rPr>
-        <w:t xml:space="preserve">Caretaker Status</w:t>
-      </w:r>
-    </w:p>
-    <w:p>
-      <w:pPr>
-        <w:spacing w:after="120" w:before="0"/>
-        <w:ind w:left="431"/>
-        <w:jc w:val="both"/>
-      </w:pPr>
-      <w:r>
-        <w:rPr>
-          <w:rFonts w:ascii="Garamond" w:cs="Garamond" w:eastAsia="Garamond" w:hAnsi="Garamond"/>
-          <w:b w:val="false"/>
-          <w:bCs w:val="false"/>
-          <w:i w:val="false"/>
-          <w:iCs w:val="false"/>
-          <w:color w:val="2a2520"/>
-          <w:sz w:val="22"/>
-          <w:szCs w:val="22"/>
-        </w:rPr>
-        <w:t xml:space="preserve">All existing government officials serve as caretakers during the Transition Window — restricted to maintaining existing services only; no new permanent legislation. Transition is supervised by a joint Inspectorate panel of one representative per Inspectorate appointed by their respective IGs; the panel dissolves automatically at the Transition Window's conclusion.</w:t>
+        <w:t xml:space="preserve">Pre-Constitutional Classified Documents</w:t>
+      </w:r>
+    </w:p>
+    <w:p>
+      <w:pPr>
+        <w:spacing w:after="120" w:before="0"/>
+        <w:ind w:left="431"/>
+        <w:jc w:val="both"/>
+      </w:pPr>
+      <w:r>
+        <w:rPr>
+          <w:rFonts w:ascii="Garamond" w:cs="Garamond" w:eastAsia="Garamond" w:hAnsi="Garamond"/>
+          <w:b w:val="false"/>
+          <w:bCs w:val="false"/>
+          <w:i w:val="false"/>
+          <w:iCs w:val="false"/>
+          <w:color w:val="2a2520"/>
+          <w:sz w:val="22"/>
+          <w:szCs w:val="22"/>
+        </w:rPr>
+        <w:t xml:space="preserve">The Legislature must establish a Classification Review Commission within 90 days of Phase 4 activation. The Commission applies constitutional classification criteria to predecessor classified material: legitimately classified material enters the standard classification framework from Day Zero; improperly classified material is immediately declassified and published to the NRS. Any Inhabitant may challenge a Commission determination before the SC.</w:t>
       </w:r>
     </w:p>
     <w:p>
@@ -8456,27 +8507,27 @@
           <w:sz w:val="22"/>
           <w:szCs w:val="22"/>
         </w:rPr>
-        <w:t xml:space="preserve">Pre-Constitutional Classified Documents</w:t>
-      </w:r>
-    </w:p>
-    <w:p>
-      <w:pPr>
-        <w:spacing w:after="120" w:before="0"/>
-        <w:ind w:left="431"/>
-        <w:jc w:val="both"/>
-      </w:pPr>
-      <w:r>
-        <w:rPr>
-          <w:rFonts w:ascii="Garamond" w:cs="Garamond" w:eastAsia="Garamond" w:hAnsi="Garamond"/>
-          <w:b w:val="false"/>
-          <w:bCs w:val="false"/>
-          <w:i w:val="false"/>
-          <w:iCs w:val="false"/>
-          <w:color w:val="2a2520"/>
-          <w:sz w:val="22"/>
-          <w:szCs w:val="22"/>
-        </w:rPr>
-        <w:t xml:space="preserve">The Legislature must establish a Classification Review Commission within 90 days of Phase 4 activation. The Commission applies constitutional classification criteria to predecessor classified material: legitimately classified material enters the standard classification framework from Day Zero; improperly classified material is immediately declassified and published to the NRS. Any Inhabitant may challenge a Commission determination before the SC.</w:t>
+        <w:t xml:space="preserve">Pre-Existing Obligations</w:t>
+      </w:r>
+    </w:p>
+    <w:p>
+      <w:pPr>
+        <w:spacing w:after="120" w:before="0"/>
+        <w:ind w:left="431"/>
+        <w:jc w:val="both"/>
+      </w:pPr>
+      <w:r>
+        <w:rPr>
+          <w:rFonts w:ascii="Garamond" w:cs="Garamond" w:eastAsia="Garamond" w:hAnsi="Garamond"/>
+          <w:b w:val="false"/>
+          <w:bCs w:val="false"/>
+          <w:i w:val="false"/>
+          <w:iCs w:val="false"/>
+          <w:color w:val="2a2520"/>
+          <w:sz w:val="22"/>
+          <w:szCs w:val="22"/>
+        </w:rPr>
+        <w:t xml:space="preserve">The Republic assumes the public debt obligations of its predecessor government as a constitutional matter — it does not inherit a clean slate. Active military operations of the prior government continue under existing authorization until the §2.2 tier framework can apply; the President, once inaugurated, must certify each active operation under the appropriate tier within 14 days or begin orderly cessation; operations not certified within 60 days cease unless the Legislature grants a one-time extension. Social insurance programs — retirement pensions, disability benefits, health coverage — continue uninterrupted during the Transition Window. All benefit obligations to persons who served in military or national service under the prior government are inherited and honored; the Legislature must pass a Veterans and National Service Benefits Act within the first budget cycle following Phase 4. The Republic is the legal continuation of the prior government as a matter of international law; all international obligations, financial commitments, treaty relationships, and contractual obligations of the prior government are assumed as successor sovereign. The immediate nullification of laws conflicting with the Individual Sovereignty Floor creates constitutional disputes; the Legislature must establish an interim Constitutional Claims Court within Phase 2, with jurisdiction over all Article I claims arising from Day Zero nullification.</w:t>
       </w:r>
     </w:p>
     <w:p>
@@ -8507,27 +8558,27 @@
           <w:sz w:val="22"/>
           <w:szCs w:val="22"/>
         </w:rPr>
-        <w:t xml:space="preserve">Pre-Existing Obligations</w:t>
-      </w:r>
-    </w:p>
-    <w:p>
-      <w:pPr>
-        <w:spacing w:after="120" w:before="0"/>
-        <w:ind w:left="431"/>
-        <w:jc w:val="both"/>
-      </w:pPr>
-      <w:r>
-        <w:rPr>
-          <w:rFonts w:ascii="Garamond" w:cs="Garamond" w:eastAsia="Garamond" w:hAnsi="Garamond"/>
-          <w:b w:val="false"/>
-          <w:bCs w:val="false"/>
-          <w:i w:val="false"/>
-          <w:iCs w:val="false"/>
-          <w:color w:val="2a2520"/>
-          <w:sz w:val="22"/>
-          <w:szCs w:val="22"/>
-        </w:rPr>
-        <w:t xml:space="preserve">The Republic assumes the public debt obligations of its predecessor government as a constitutional matter — it does not inherit a clean slate. Active military operations of the prior government continue under existing authorization until the §2.2 tier framework can apply; the President, once inaugurated, must certify each active operation under the appropriate tier within 14 days or begin orderly cessation; operations not certified within 60 days cease unless the Legislature grants a one-time extension. Social insurance programs — retirement pensions, disability benefits, health coverage — continue uninterrupted during the Transition Window. All benefit obligations to persons who served in military or national service under the prior government are inherited and honored; the Legislature must pass a Veterans and National Service Benefits Act within the first budget cycle following Phase 4. The Republic is the legal continuation of the prior government as a matter of international law; all international obligations, financial commitments, treaty relationships, and contractual obligations of the prior government are assumed as successor sovereign. The immediate nullification of laws conflicting with the Individual Sovereignty Floor creates constitutional disputes; the Legislature must establish an interim Constitutional Claims Court within Phase 2, with jurisdiction over all Article I claims arising from Day Zero nullification.</w:t>
+        <w:t xml:space="preserve">Transition Territories</w:t>
+      </w:r>
+    </w:p>
+    <w:p>
+      <w:pPr>
+        <w:spacing w:after="120" w:before="0"/>
+        <w:ind w:left="431"/>
+        <w:jc w:val="both"/>
+      </w:pPr>
+      <w:r>
+        <w:rPr>
+          <w:rFonts w:ascii="Garamond" w:cs="Garamond" w:eastAsia="Garamond" w:hAnsi="Garamond"/>
+          <w:b w:val="false"/>
+          <w:bCs w:val="false"/>
+          <w:i w:val="false"/>
+          <w:iCs w:val="false"/>
+          <w:color w:val="2a2520"/>
+          <w:sz w:val="22"/>
+          <w:szCs w:val="22"/>
+        </w:rPr>
+        <w:t xml:space="preserve">Territories or subdivisions meeting the Statehood Audit Competency Baseline by Phase 2 end may petition to enter as State or Territory. Those failing the Baseline enter as Territory and may begin the Statehood Audit immediately. Any territory may choose Territory status by simple legislative vote regardless of whether it meets the Statehood Baseline. Prior government states or territories may voluntarily subdivide during the Transition Window by vote of their existing legislative body; new subdivisions are treated as separate petitioning entities. Where a State fails the Phase 2 Statehood Audit, it enters as a Territory; its population retains all Article I rights and participates in first House elections proportionally. All prior government territories that had not achieved statehood by Day Zero enter as Territories from Phase 4 activation without undergoing Phase 2 Statehood Audits; any capital district or special administrative region is assigned Territory status and follows the §15.2 path.</w:t>
       </w:r>
     </w:p>
     <w:p>
@@ -8558,27 +8609,27 @@
           <w:sz w:val="22"/>
           <w:szCs w:val="22"/>
         </w:rPr>
-        <w:t xml:space="preserve">Transition Territories</w:t>
-      </w:r>
-    </w:p>
-    <w:p>
-      <w:pPr>
-        <w:spacing w:after="120" w:before="0"/>
-        <w:ind w:left="431"/>
-        <w:jc w:val="both"/>
-      </w:pPr>
-      <w:r>
-        <w:rPr>
-          <w:rFonts w:ascii="Garamond" w:cs="Garamond" w:eastAsia="Garamond" w:hAnsi="Garamond"/>
-          <w:b w:val="false"/>
-          <w:bCs w:val="false"/>
-          <w:i w:val="false"/>
-          <w:iCs w:val="false"/>
-          <w:color w:val="2a2520"/>
-          <w:sz w:val="22"/>
-          <w:szCs w:val="22"/>
-        </w:rPr>
-        <w:t xml:space="preserve">Territories or subdivisions meeting the Statehood Audit Competency Baseline by Phase 2 end may petition to enter as State or Territory. Those failing the Baseline enter as Territory and may begin the Statehood Audit immediately. Any territory may choose Territory status by simple legislative vote regardless of whether it meets the Statehood Baseline. Prior government states or territories may voluntarily subdivide during the Transition Window by vote of their existing legislative body; new subdivisions are treated as separate petitioning entities. Where a State fails the Phase 2 Statehood Audit, it enters as a Territory; its population retains all Article I rights and participates in first House elections proportionally. All prior government territories that had not achieved statehood by Day Zero enter as Territories from Phase 4 activation without undergoing Phase 2 Statehood Audits; any capital district or special administrative region is assigned Territory status and follows the §15.2 path.</w:t>
+        <w:t xml:space="preserve">Transition Candidate Registers</w:t>
+      </w:r>
+    </w:p>
+    <w:p>
+      <w:pPr>
+        <w:spacing w:after="120" w:before="0"/>
+        <w:ind w:left="431"/>
+        <w:jc w:val="both"/>
+      </w:pPr>
+      <w:r>
+        <w:rPr>
+          <w:rFonts w:ascii="Garamond" w:cs="Garamond" w:eastAsia="Garamond" w:hAnsi="Garamond"/>
+          <w:b w:val="false"/>
+          <w:bCs w:val="false"/>
+          <w:i w:val="false"/>
+          <w:iCs w:val="false"/>
+          <w:color w:val="2a2520"/>
+          <w:sz w:val="22"/>
+          <w:szCs w:val="22"/>
+        </w:rPr>
+        <w:t xml:space="preserve">The joint Inspectorate panel assembles the initial Candidate Registers for all constitutionally established positions before Phase 3 elections can occur. The panel performs the register-assembly and vetting function that permanent Inspectorates will assume after Phase 4; registers assembled by the panel carry full constitutional validity and the Legislature ratifies and continues them through the first budget cycle after Phase 4. The panel performs interim MA fiscal certification functions from Phase 4 activation until the first MA Director takes office; the first PM must nominate MA board members within 90 days of Phase 4 activation.</w:t>
       </w:r>
     </w:p>
     <w:p>
@@ -8609,27 +8660,27 @@
           <w:sz w:val="22"/>
           <w:szCs w:val="22"/>
         </w:rPr>
-        <w:t xml:space="preserve">Transition Candidate Registers</w:t>
-      </w:r>
-    </w:p>
-    <w:p>
-      <w:pPr>
-        <w:spacing w:after="120" w:before="0"/>
-        <w:ind w:left="431"/>
-        <w:jc w:val="both"/>
-      </w:pPr>
-      <w:r>
-        <w:rPr>
-          <w:rFonts w:ascii="Garamond" w:cs="Garamond" w:eastAsia="Garamond" w:hAnsi="Garamond"/>
-          <w:b w:val="false"/>
-          <w:bCs w:val="false"/>
-          <w:i w:val="false"/>
-          <w:iCs w:val="false"/>
-          <w:color w:val="2a2520"/>
-          <w:sz w:val="22"/>
-          <w:szCs w:val="22"/>
-        </w:rPr>
-        <w:t xml:space="preserve">The joint Inspectorate panel assembles the initial Candidate Registers for all constitutionally established positions before Phase 3 elections can occur. The panel performs the register-assembly and vetting function that permanent Inspectorates will assume after Phase 4; registers assembled by the panel carry full constitutional validity and the Legislature ratifies and continues them through the first budget cycle after Phase 4. The panel performs interim MA fiscal certification functions from Phase 4 activation until the first MA Director takes office; the first PM must nominate MA board members within 90 days of Phase 4 activation.</w:t>
+        <w:t xml:space="preserve">Transitional Accountability Mechanism</w:t>
+      </w:r>
+    </w:p>
+    <w:p>
+      <w:pPr>
+        <w:spacing w:after="120" w:before="0"/>
+        <w:ind w:left="431"/>
+        <w:jc w:val="both"/>
+      </w:pPr>
+      <w:r>
+        <w:rPr>
+          <w:rFonts w:ascii="Garamond" w:cs="Garamond" w:eastAsia="Garamond" w:hAnsi="Garamond"/>
+          <w:b w:val="false"/>
+          <w:bCs w:val="false"/>
+          <w:i w:val="false"/>
+          <w:iCs w:val="false"/>
+          <w:color w:val="2a2520"/>
+          <w:sz w:val="22"/>
+          <w:szCs w:val="22"/>
+        </w:rPr>
+        <w:t xml:space="preserve">Where a ratifying polity’s predecessor government has documented constitutional violations, the Legislature may by statute passed by 2/3 of both chambers establish a Transitional Accountability Mechanism. Such a mechanism must be time-limited, non-criminal, and consistent with Article I in all its operations. The establishing statute defines the scope, procedures, and duration; no amendment may expand the scope without the same 2/3 majority; the NRS record is permanent. No new Mechanism may be established within ten years of the sunset of a prior one.</w:t>
       </w:r>
     </w:p>
     <w:p>
@@ -8660,57 +8711,6 @@
           <w:sz w:val="22"/>
           <w:szCs w:val="22"/>
         </w:rPr>
-        <w:t xml:space="preserve">Transitional Accountability Mechanism</w:t>
-      </w:r>
-    </w:p>
-    <w:p>
-      <w:pPr>
-        <w:spacing w:after="120" w:before="0"/>
-        <w:ind w:left="431"/>
-        <w:jc w:val="both"/>
-      </w:pPr>
-      <w:r>
-        <w:rPr>
-          <w:rFonts w:ascii="Garamond" w:cs="Garamond" w:eastAsia="Garamond" w:hAnsi="Garamond"/>
-          <w:b w:val="false"/>
-          <w:bCs w:val="false"/>
-          <w:i w:val="false"/>
-          <w:iCs w:val="false"/>
-          <w:color w:val="2a2520"/>
-          <w:sz w:val="22"/>
-          <w:szCs w:val="22"/>
-        </w:rPr>
-        <w:t xml:space="preserve">Where a ratifying polity’s predecessor government has documented constitutional violations, the Legislature may by statute passed by 2/3 of both chambers establish a Transitional Accountability Mechanism. Such a mechanism must be time-limited, non-criminal, and consistent with Article I in all its operations. The establishing statute defines the scope, procedures, and duration; no amendment may expand the scope without the same 2/3 majority; the NRS record is permanent. No new Mechanism may be established within ten years of the sunset of a prior one.</w:t>
-      </w:r>
-    </w:p>
-    <w:p>
-      <w:pPr>
-        <w:spacing w:after="60" w:before="200"/>
-        <w:ind w:left="431"/>
-        <w:jc w:val="left"/>
-      </w:pPr>
-      <w:r>
-        <w:rPr>
-          <w:rFonts w:ascii="Courier New" w:cs="Courier New" w:eastAsia="Courier New" w:hAnsi="Courier New"/>
-          <w:b/>
-          <w:bCs/>
-          <w:color w:val="1B2A4A"/>
-          <w:sz w:val="18"/>
-          <w:szCs w:val="18"/>
-        </w:rPr>
-        <w:t xml:space="preserve">§19.10  </w:t>
-      </w:r>
-      <w:r>
-        <w:rPr>
-          <w:rFonts w:ascii="Garamond" w:cs="Garamond" w:eastAsia="Garamond" w:hAnsi="Garamond"/>
-          <w:b/>
-          <w:bCs/>
-          <w:i w:val="false"/>
-          <w:iCs w:val="false"/>
-          <w:color w:val="1B2A4A"/>
-          <w:sz w:val="22"/>
-          <w:szCs w:val="22"/>
-        </w:rPr>
         <w:t xml:space="preserve">Required Statutory Agency Establishment</w:t>
       </w:r>
     </w:p>
@@ -8731,7 +8731,7 @@
           <w:sz w:val="22"/>
           <w:szCs w:val="22"/>
         </w:rPr>
-        <w:t xml:space="preserve">Where this Constitution assigns a specific function to a statutory independent agency under §3.9, the Legislature must establish that agency within the following timeframes from Phase 4 activation: the CLT Administrator under §5.1.c, within 180 days; the Census Bureau under §3.2, within 18 months. Where the Legislature fails to meet a deadline, §3.9 applies: the LI publishes a compliance notice certifying the breach, and the responsible Inspectorate reports on the unfilled mandate until the agency is established. The LI publishes a compliance notice when any establishment deadline is missed and again when the agency becomes operational. The Legislature may not permanently delegate a constitutionally required statutory function to an Inspectorate in lieu of establishing the required agency.</w:t>
+        <w:t xml:space="preserve">Where this Constitution assigns a specific function to a statutory independent agency under §3.9, the Legislature must establish that agency within the following timeframes from Phase 4 activation: the CLT Administrator under §5.1.a, within 180 days; the Census Bureau under §3.2, within 18 months. Where the Legislature fails to meet a deadline, §3.9 applies: the LI publishes a compliance notice certifying the breach, and the responsible Inspectorate reports on the unfilled mandate until the agency is established. The LI publishes a compliance notice when any establishment deadline is missed and again when the agency becomes operational. The Legislature may not permanently delegate a constitutionally required statutory function to an Inspectorate in lieu of establishing the required agency.</w:t>
       </w:r>
     </w:p>
     <w:p>
@@ -8911,7 +8911,7 @@
           <w:sz w:val="22"/>
           <w:szCs w:val="22"/>
         </w:rPr>
-        <w:t xml:space="preserve">No compact may be entered or ratified with any entity whose governance practices include, authorize, or systematically permit violations of any of the non-derogable rights established in §1.26.b, committed against any person within its jurisdiction. The Judicial Inspectorate certifies compliance with this condition before parliamentary ratification of any compact; a compact negotiated with a non-compliant entity is void regardless of parliamentary ratification. The JI conducts annual compliance reviews and publishes findings to the NRS. Where the JI finds systematic violations of the non-derogable rights under §1.26.b, the compact is suspended pending Supreme Court review. The Court may terminate the compact on confirmed systematic violations without remediation within a period the Legislature defines by statute. Economic value of the compact relationship is not a factor in JI certification or Supreme Court review. Where an Associated Community's territory includes indigenous nations with pre-existing governance relationships, the compact must address those relationships and may not require the Associated Community to eliminate or diminish pre-existing indigenous governance arrangements within its territory. The Legislature may not schedule a compact ratification vote until the JI publishes its certification finding. Compact suspension means the Associated Community's observer delegate participation rights are suspended for the duration of the review; all other compact obligations of both parties continue in effect pending the SC's determination.</w:t>
+        <w:t xml:space="preserve">No compact may be entered or ratified with any entity whose governance practices include, authorize, or systematically permit violations of any of the non-derogable rights established in §1.19.b, committed against any person within its jurisdiction. The Judicial Inspectorate certifies compliance with this condition before parliamentary ratification of any compact; a compact negotiated with a non-compliant entity is void regardless of parliamentary ratification. The JI conducts annual compliance reviews and publishes findings to the NRS. Where the JI finds systematic violations of the non-derogable rights under §1.19.b, the compact is suspended pending Supreme Court review. The Court may terminate the compact on confirmed systematic violations without remediation within a period the Legislature defines by statute. Economic value of the compact relationship is not a factor in JI certification or Supreme Court review. Where an Associated Community's territory includes indigenous nations with pre-existing governance relationships, the compact must address those relationships and may not require the Associated Community to eliminate or diminish pre-existing indigenous governance arrangements within its territory. The Legislature may not schedule a compact ratification vote until the JI publishes its certification finding. Compact suspension means the Associated Community's observer delegate participation rights are suspended for the duration of the review; all other compact obligations of both parties continue in effect pending the SC's determination.</w:t>
       </w:r>
     </w:p>
     <w:p>

</xml_diff>

<commit_message>
JI IG public confirmation + document cleanup
§9.3 — JI IG public confirmation added:
All three IGs now follow identical democratic legitimacy mechanism.
Lottery-selected JI IG candidate confirmed by national popular vote
at next federal electoral period, simple majority. Failed
confirmation → §9.1.d acting mechanism + new lottery within 60 days.
The three selection methods differ (SC nominates LI; Speakers
nominate EI; lottery selects JI) but all confirmed by the public.

§1.5, §1.6 — 'government' → 'Government' (sentence-starting,
two remaining instances missed in earlier pass)

Site descriptions updated:
- §9.2 annotated.html description updated to reflect JI IG
  now also publicly confirmed
- scenario-the-default.html: Armed Services Committee → Senate
  military oversight committee
- scenario.html: same fix
</commit_message>
<xml_diff>
--- a/constitution-current.docx
+++ b/constitution-current.docx
@@ -467,7 +467,7 @@
           <w:sz w:val="22"/>
           <w:szCs w:val="22"/>
         </w:rPr>
-        <w:t xml:space="preserve">Every person holds the rights of expression, thought, conscience, religion, association, assembly, petition, and movement. government may regulate the time, place, and manner of expression and assembly for compelling public-order purposes, subject to strict scrutiny and without discriminating on the basis of viewpoint. No government may compel expression or penalize expression through intermediaries it controls or has directed to act. Freedom of religion protects belief absolutely; it protects practice against limitation except where practice causes direct harm to others. The Legislature establishes by statute any framework for exercising these rights, provided that framework does not burden the right itself.</w:t>
+        <w:t xml:space="preserve">Every person holds the rights of expression, thought, conscience, religion, association, assembly, petition, and movement. Government may regulate the time, place, and manner of expression and assembly for compelling public-order purposes, subject to strict scrutiny and without discriminating on the basis of viewpoint. No government may compel expression or penalize expression through intermediaries it controls or has directed to act. Freedom of religion protects belief absolutely; it protects practice against limitation except where practice causes direct harm to others. The Legislature establishes by statute any framework for exercising these rights, provided that framework does not burden the right itself.</w:t>
       </w:r>
     </w:p>
     <w:p>
@@ -518,7 +518,7 @@
           <w:sz w:val="22"/>
           <w:szCs w:val="22"/>
         </w:rPr>
-        <w:t xml:space="preserve">Every person is equal before the law. government may not discriminate on the basis of race, ethnicity, sex, sexual orientation, gender identity, religion, national origin, disability, age, or economic status in the provision of any governmental benefit, the imposition of any burden, or the application of any law. Distinctions rationally related to a legitimate governmental purpose that do not turn on these characteristics are permissible. Distinctions that do turn on these characteristics require compelling justification and are subject to strict scrutiny.</w:t>
+        <w:t xml:space="preserve">Every person is equal before the law. Government may not discriminate on the basis of race, ethnicity, sex, sexual orientation, gender identity, religion, national origin, disability, age, or economic status in the provision of any governmental benefit, the imposition of any burden, or the application of any law. Distinctions rationally related to a legitimate governmental purpose that do not turn on these characteristics are permissible. Distinctions that do turn on these characteristics require compelling justification and are subject to strict scrutiny.</w:t>
       </w:r>
     </w:p>
     <w:p>
@@ -4953,7 +4953,7 @@
           <w:sz w:val="22"/>
           <w:szCs w:val="22"/>
         </w:rPr>
-        <w:t xml:space="preserve">The LI IG is nominated by the SC from a pool of qualified candidates maintained by the Elections Panel and certified jointly by the EI and JI, sufficiently in advance under the timeline defined by statute to ensure confirmation is complete before the transition under §1.22; confirmed by national popular vote at the next federal electoral period following nomination, by simple majority of votes cast. The confirmed successor assumes full IG authority at the precise moment the incumbent’s term concludes under §1.22. If the confirmation vote fails, the §9.1.d acting mechanism activates and the SC initiates a new nomination from the pool within 60 days. The EI IG is nominated jointly by the House Speaker and Senate Speaker from a pool of qualified candidates maintained by the Elections Panel and certified jointly by the LI and JI, sufficiently in advance under the timeline defined by statute under §1.22; confirmed by national popular vote at the next federal electoral period following nomination, by simple majority of votes cast, with JI vetting of the nominee’s disclosure record published before the vote. The same timing and failed-vote provisions apply. The JI IG is selected by public lottery under §9.13 from the JI Candidate Pool under §9.4.a maintained by the Elections Panel, conducted at the statutory timeline under §1.22, sufficiently in advance to ensure seamless succession; no separate confirmation required — the lottery result is the selection and the selected person assumes office at the precise moment the incumbent’s term concludes. All IGs serve 10-year non-renewable terms. No two IG terms may begin within 18 months of each other, ensuring continuous institutional knowledge across offices. The Elections Panel administers all IG confirmation votes as part of the regular federal electoral period ballot.</w:t>
+        <w:t xml:space="preserve">The LI IG is nominated by the SC from a pool of qualified candidates maintained by the Elections Panel and certified jointly by the EI and JI, sufficiently in advance under the timeline defined by statute to ensure confirmation is complete before the transition under §1.22; confirmed by national popular vote at the next federal electoral period following nomination, by simple majority of votes cast. The confirmed successor assumes full IG authority at the precise moment the incumbent’s term concludes under §1.22. If the confirmation vote fails, the §9.1.d acting mechanism activates and the SC initiates a new nomination from the pool within 60 days. The EI IG is nominated jointly by the House Speaker and Senate Speaker from a pool of qualified candidates maintained by the Elections Panel and certified jointly by the LI and JI, sufficiently in advance under the timeline defined by statute under §1.22; confirmed by national popular vote at the next federal electoral period following nomination, by simple majority of votes cast, with JI vetting of the nominee’s disclosure record published before the vote. The same timing and failed-vote provisions apply. The JI IG is selected by public lottery under §9.13 from the JI Candidate Pool under §9.4.a maintained by the Elections Panel, conducted at the statutory timeline under §1.22, sufficiently in advance to ensure seamless succession. The lottery-selected candidate is confirmed by national popular vote at the next federal electoral period following the draw, by simple majority of votes cast; the confirmed candidate assumes office at the precise moment the incumbent’s term concludes under §1.22. If the confirmation vote fails, the §9.1.d acting mechanism activates and the JIC conducts a new lottery from the pool within 60 days; the same confirmation process applies to the new selection. All IGs serve 10-year non-renewable terms. No two IG terms may begin within 18 months of each other, ensuring continuous institutional knowledge across offices. The Elections Panel administers all IG confirmation votes as part of the regular federal electoral period ballot.</w:t>
       </w:r>
     </w:p>
     <w:p>

</xml_diff>

<commit_message>
EI IG deadlock fix + final gap renumbering
§9.3 — EI IG nomination deadlock:
Where House Speaker and Senate Speaker fail to jointly nominate
within 60 days of a vacancy published to NRS, the Senate selects
from the certified EI IG pool directly by 2/3 vote. Selected
nominee proceeds to national popular vote on same terms. Executives
remain excluded from nomination under both paths. Closes the gap
where two-person Speaker deadlock could keep an Acting EI IG
indefinitely with no constitutional resolution.

Final gap renumbering:
- §7.2.b → §7.2.a (no §7.2.a existed; sub-provision gap closed)
- §9.13 → §9.12 (JIC — gap at §9.12 from earlier DIC removal)
- §9.14 → §9.13 (Constitutional Pool Administration)
- §9.15 → §9.14 (Officer Protection)

All provision sequences now fully sequential throughout the
document. No remaining numbering gaps.
</commit_message>
<xml_diff>
--- a/constitution-current.docx
+++ b/constitution-current.docx
@@ -1867,7 +1867,7 @@
           <w:sz w:val="22"/>
           <w:szCs w:val="22"/>
         </w:rPr>
-        <w:t xml:space="preserve">The President negotiates and concludes trade agreements. PM written concurrence is required only for provisions imposing national treatment obligations within Republic territory, provisions requiring new domestic legislation, or provisions creating direct obligations on domestic persons. All other trade terms are within the President's sole authority. Where PM concurrence is withheld on a specific provision, that provision may be transmitted to the House as ordinary legislation while the remaining agreement proceeds to Senate ratification independently. The President nominates senior domain officers — Director of Intelligence, Secretary for Foreign Affairs, Secretary for Defense — from a pool of qualified candidates maintained by the Elections Panel and certified by the JI under §9.13. The Legislature defines qualifications and confirmation procedures for each office by statute; Acting appointments may be made pending confirmation for the period and under the conditions the Legislature defines. Indefinite circumvention of Senate confirmation through Acting appointments is constitutionally prohibited. All nominations and appointments are published to the NRS.</w:t>
+        <w:t xml:space="preserve">The President negotiates and concludes trade agreements. PM written concurrence is required only for provisions imposing national treatment obligations within Republic territory, provisions requiring new domestic legislation, or provisions creating direct obligations on domestic persons. All other trade terms are within the President's sole authority. Where PM concurrence is withheld on a specific provision, that provision may be transmitted to the House as ordinary legislation while the remaining agreement proceeds to Senate ratification independently. The President nominates senior domain officers — Director of Intelligence, Secretary for Foreign Affairs, Secretary for Defense — from a pool of qualified candidates maintained by the Elections Panel and certified by the JI under §9.12. The Legislature defines qualifications and confirmation procedures for each office by statute; Acting appointments may be made pending confirmation for the period and under the conditions the Legislature defines. Indefinite circumvention of Senate confirmation through Acting appointments is constitutionally prohibited. All nominations and appointments are published to the NRS.</w:t>
       </w:r>
     </w:p>
     <w:p>
@@ -3143,7 +3143,7 @@
           <w:sz w:val="22"/>
           <w:szCs w:val="22"/>
         </w:rPr>
-        <w:t xml:space="preserve">Any person meeting the qualifications for inferior court judges defined by statute may apply directly to the Elections Panel; the JI certifies eligibility against those qualifications and the Elections Panel enters certified applicants into the pool. Exceptions to pool eligibility — including persons currently holding government positions, those with disqualifying financial interests, and those removed from a court within a recent period — are defined by statute. The PM nominates inferior court judges from the pool maintained by the Elections Panel under §9.13. The PM must nominate within the period defined by statute following a vacancy, not to exceed 90 days where no statutory period has been defined. The Senate confirms by a 2/3 supermajority. Inferior court judges serve a single non-renewable term of 15 years and may be removed only for cause. The Legislature may establish a mandatory retirement age by statute, not below 70. Judicial removal occurs through three tracks: legislative removal by 2/3 of both chambers following an EI assessment of constitutional breach or demonstrated incapacity, which either chamber may request; judicial discipline through a process established by statute under SC oversight; or criminal conviction for a disqualifying offense. No public official may direct, threaten, or seek to influence a judge's decision in any pending matter. Judicial compensation may not be reduced during a judge's term.</w:t>
+        <w:t xml:space="preserve">Any person meeting the qualifications for inferior court judges defined by statute may apply directly to the Elections Panel; the JI certifies eligibility against those qualifications and the Elections Panel enters certified applicants into the pool. Exceptions to pool eligibility — including persons currently holding government positions, those with disqualifying financial interests, and those removed from a court within a recent period — are defined by statute. The PM nominates inferior court judges from the pool maintained by the Elections Panel under §9.12. The PM must nominate within the period defined by statute following a vacancy, not to exceed 90 days where no statutory period has been defined. The Senate confirms by a 2/3 supermajority. Inferior court judges serve a single non-renewable term of 15 years and may be removed only for cause. The Legislature may establish a mandatory retirement age by statute, not below 70. Judicial removal occurs through three tracks: legislative removal by 2/3 of both chambers following an EI assessment of constitutional breach or demonstrated incapacity, which either chamber may request; judicial discipline through a process established by statute under SC oversight; or criminal conviction for a disqualifying offense. No public official may direct, threaten, or seek to influence a judge's decision in any pending matter. Judicial compensation may not be reduced during a judge's term.</w:t>
       </w:r>
     </w:p>
     <w:p>
@@ -4307,7 +4307,7 @@
           <w:sz w:val="18"/>
           <w:szCs w:val="18"/>
         </w:rPr>
-        <w:t xml:space="preserve">§7.2.b  </w:t>
+        <w:t xml:space="preserve">§7.2.a  </w:t>
       </w:r>
       <w:r>
         <w:rPr>
@@ -4953,7 +4953,7 @@
           <w:sz w:val="22"/>
           <w:szCs w:val="22"/>
         </w:rPr>
-        <w:t xml:space="preserve">The LI IG is nominated by the SC from a pool of qualified candidates maintained by the Elections Panel and certified jointly by the EI and JI, sufficiently in advance under the timeline defined by statute to ensure confirmation is complete before the transition under §1.22; confirmed by national popular vote at the next federal electoral period following nomination, by simple majority of votes cast. The confirmed successor assumes full IG authority at the precise moment the incumbent’s term concludes under §1.22. If the confirmation vote fails, the §9.1.d acting mechanism activates and the SC initiates a new nomination from the pool within 60 days. The EI IG is nominated jointly by the House Speaker and Senate Speaker from a pool of qualified candidates maintained by the Elections Panel and certified jointly by the LI and JI, sufficiently in advance under the timeline defined by statute under §1.22; confirmed by national popular vote at the next federal electoral period following nomination, by simple majority of votes cast, with JI vetting of the nominee’s disclosure record published before the vote. The same timing and failed-vote provisions apply. The JI IG is selected by public lottery under §9.13 from the JI Candidate Pool under §9.4.a maintained by the Elections Panel, conducted at the statutory timeline under §1.22, sufficiently in advance to ensure seamless succession. The lottery-selected candidate is confirmed by national popular vote at the next federal electoral period following the draw, by simple majority of votes cast; the confirmed candidate assumes office at the precise moment the incumbent’s term concludes under §1.22. If the confirmation vote fails, the §9.1.d acting mechanism activates and the JIC conducts a new lottery from the pool within 60 days; the same confirmation process applies to the new selection. All IGs serve 10-year non-renewable terms. No two IG terms may begin within 18 months of each other, ensuring continuous institutional knowledge across offices. The Elections Panel administers all IG confirmation votes as part of the regular federal electoral period ballot.</w:t>
+        <w:t xml:space="preserve">The LI IG is nominated by the SC from a pool of qualified candidates maintained by the Elections Panel and certified jointly by the EI and JI, sufficiently in advance under the timeline defined by statute to ensure confirmation is complete before the transition under §1.22; confirmed by national popular vote at the next federal electoral period following nomination, by simple majority of votes cast. The confirmed successor assumes full IG authority at the precise moment the incumbent’s term concludes under §1.22. If the confirmation vote fails, the §9.1.d acting mechanism activates and the SC initiates a new nomination from the pool within 60 days. The EI IG is nominated jointly by the House Speaker and Senate Speaker from a pool of qualified candidates maintained by the Elections Panel and certified jointly by the LI and JI, sufficiently in advance under the timeline defined by statute under §1.22; confirmed by national popular vote at the next federal electoral period following nomination, by simple majority of votes cast, with JI vetting of the nominee’s disclosure record published before the vote. The same timing and failed-vote provisions apply. Where the House Speaker and Senate Speaker fail to jointly nominate within 60 days of a vacancy being published to the NRS, the Senate selects a nominee from the certified pool directly by 2/3 vote of full seated membership; the selected nominee proceeds to national popular vote confirmation on the same terms; the executives remain excluded from nomination under both paths. The JI IG is selected by public lottery under §9.12 from the JI Candidate Pool under §9.4.a maintained by the Elections Panel, conducted at the statutory timeline under §1.22, sufficiently in advance to ensure seamless succession. The lottery-selected candidate is confirmed by national popular vote at the next federal electoral period following the draw, by simple majority of votes cast; the confirmed candidate assumes office at the precise moment the incumbent’s term concludes under §1.22. If the confirmation vote fails, the §9.1.d acting mechanism activates and the JIC conducts a new lottery from the pool within 60 days; the same confirmation process applies to the new selection. All IGs serve 10-year non-renewable terms. No two IG terms may begin within 18 months of each other, ensuring continuous institutional knowledge across offices. The Elections Panel administers all IG confirmation votes as part of the regular federal electoral period ballot.</w:t>
       </w:r>
     </w:p>
     <w:p>
@@ -5157,7 +5157,7 @@
           <w:sz w:val="22"/>
           <w:szCs w:val="22"/>
         </w:rPr>
-        <w:t xml:space="preserve">For-cause removal of any IG follows §9.15 Standard Track. The Judicial Track under §9.15 is additionally available where two of the three Inspectorates jointly assess and report for-cause grounds.</w:t>
+        <w:t xml:space="preserve">For-cause removal of any IG follows §9.14 Standard Track. The Judicial Track under §9.14 is additionally available where two of the three Inspectorates jointly assess and report for-cause grounds.</w:t>
       </w:r>
     </w:p>
     <w:p>
@@ -5361,7 +5361,7 @@
           <w:sz w:val="22"/>
           <w:szCs w:val="22"/>
         </w:rPr>
-        <w:t xml:space="preserve">To initiate a standard track removal vote under §9.15, the charging party — a concurrent resolution of 1/3 of either chamber, or two of the three Inspectorates jointly — must file stated grounds with the SC. The SC determines within 14 days whether the stated grounds constitute at least one statutory removal category for the subject office as defined by the Legislature. If grounds are confirmed, duty suspension activates immediately and the Legislature may proceed to a removal vote. If grounds are not confirmed: the process closes and may not be reinitiated on the same or substantially similar grounds within six months. The SC reviews constitutional category only — it does not assess the factual merits or credibility of the underlying allegations. No per-proceeding panel is required; the SC performs this function directly. The Legislature defines the enumerated removal categories for each constitutionally confirmed office by statute; no removal vote may proceed without the SC’s categorical confirmation under this section. Where the SC fails to publish its determination within 14 days, the stated grounds are deemed confirmed by constitutional operation and duty suspension activates immediately; the Legislature may proceed to a removal vote as if grounds had been confirmed.</w:t>
+        <w:t xml:space="preserve">To initiate a standard track removal vote under §9.14, the charging party — a concurrent resolution of 1/3 of either chamber, or two of the three Inspectorates jointly — must file stated grounds with the SC. The SC determines within 14 days whether the stated grounds constitute at least one statutory removal category for the subject office as defined by the Legislature. If grounds are confirmed, duty suspension activates immediately and the Legislature may proceed to a removal vote. If grounds are not confirmed: the process closes and may not be reinitiated on the same or substantially similar grounds within six months. The SC reviews constitutional category only — it does not assess the factual merits or credibility of the underlying allegations. No per-proceeding panel is required; the SC performs this function directly. The Legislature defines the enumerated removal categories for each constitutionally confirmed office by statute; no removal vote may proceed without the SC’s categorical confirmation under this section. Where the SC fails to publish its determination within 14 days, the stated grounds are deemed confirmed by constitutional operation and duty suspension activates immediately; the Legislature may proceed to a removal vote as if grounds had been confirmed.</w:t>
       </w:r>
     </w:p>
     <w:p>
@@ -5530,6 +5530,65 @@
           <w:sz w:val="18"/>
           <w:szCs w:val="18"/>
         </w:rPr>
+        <w:t xml:space="preserve">§9.12  </w:t>
+      </w:r>
+      <w:r>
+        <w:rPr>
+          <w:rFonts w:ascii="Garamond" w:cs="Garamond" w:eastAsia="Garamond" w:hAnsi="Garamond"/>
+          <w:b/>
+          <w:bCs/>
+          <w:i w:val="false"/>
+          <w:iCs w:val="false"/>
+          <w:color w:val="1B2A4A"/>
+          <w:sz w:val="22"/>
+          <w:szCs w:val="22"/>
+        </w:rPr>
+        <w:t xml:space="preserve">Constitutional Pool Framework</w:t>
+      </w:r>
+    </w:p>
+    <w:p>
+      <w:pPr>
+        <w:spacing w:after="120" w:before="0"/>
+        <w:ind w:left="431"/>
+        <w:jc w:val="both"/>
+      </w:pPr>
+      <w:r>
+        <w:rPr>
+          <w:rFonts w:ascii="Garamond" w:cs="Garamond" w:eastAsia="Garamond" w:hAnsi="Garamond"/>
+          <w:b w:val="false"/>
+          <w:bCs w:val="false"/>
+          <w:i w:val="false"/>
+          <w:iCs w:val="false"/>
+          <w:color w:val="2a2520"/>
+          <w:sz w:val="22"/>
+          <w:szCs w:val="22"/>
+        </w:rPr>
+        <w:t xml:space="preserve">The Elections Panel maintains all constitutional candidate registries and pools as the administrative keeper of record. The Elections Panel receives applications, stores records, provides public access via the NRS, and enters certified applicants into the relevant registry or pool. The Elections Panel may not exclude any applicant who has been certified as eligible by the appropriate Inspectorate. The appropriate Inspectorate reviews each applicant against the qualification requirements for that registry or pool and publishes a certification to the NRS. Where an office involves significant financial authority, the EI reviews financial disclosure concurrently. Pool records and certifications are public NRS records at all times. The Joint Inspectorate Council conducts the draw in a public session, certifies the result jointly, and publishes it to the NRS. Where selection is by deliberate nomination, the named officer nominates from certified pool members. Where confirmation is required, the Senate must act within the period defined by the establishing provision; failure to confirm within that period is a constitutional compliance breach reported by the LI. The JI monitors all constitutional pools annually and publishes a status report; where a pool falls below its constitutional minimum, the relevant nominating bodies must respond within 30 days.</w:t>
+      </w:r>
+    </w:p>
+    <w:p>
+      <w:pPr>
+        <w:spacing w:after="120" w:before="0"/>
+      </w:pPr>
+      <w:r>
+        <w:t xml:space="preserve"/>
+      </w:r>
+    </w:p>
+    <w:p>
+      <w:pPr>
+        <w:spacing w:after="60" w:before="200"/>
+        <w:ind w:left="431"/>
+        <w:jc w:val="left"/>
+      </w:pPr>
+      <w:r>
+        <w:rPr>
+          <w:rFonts w:ascii="Courier New" w:cs="Courier New" w:eastAsia="Courier New" w:hAnsi="Courier New"/>
+          <w:b/>
+          <w:bCs/>
+          <w:color w:val="1B2A4A"/>
+          <w:sz w:val="18"/>
+          <w:szCs w:val="18"/>
+        </w:rPr>
         <w:t xml:space="preserve">§9.13  </w:t>
       </w:r>
       <w:r>
@@ -5537,41 +5596,31 @@
           <w:rFonts w:ascii="Garamond" w:cs="Garamond" w:eastAsia="Garamond" w:hAnsi="Garamond"/>
           <w:b/>
           <w:bCs/>
-          <w:i w:val="false"/>
-          <w:iCs w:val="false"/>
-          <w:color w:val="1B2A4A"/>
-          <w:sz w:val="22"/>
-          <w:szCs w:val="22"/>
-        </w:rPr>
-        <w:t xml:space="preserve">Constitutional Pool Framework</w:t>
-      </w:r>
-    </w:p>
-    <w:p>
-      <w:pPr>
-        <w:spacing w:after="120" w:before="0"/>
-        <w:ind w:left="431"/>
-        <w:jc w:val="both"/>
-      </w:pPr>
-      <w:r>
-        <w:rPr>
-          <w:rFonts w:ascii="Garamond" w:cs="Garamond" w:eastAsia="Garamond" w:hAnsi="Garamond"/>
-          <w:b w:val="false"/>
-          <w:bCs w:val="false"/>
-          <w:i w:val="false"/>
-          <w:iCs w:val="false"/>
-          <w:color w:val="2a2520"/>
-          <w:sz w:val="22"/>
-          <w:szCs w:val="22"/>
-        </w:rPr>
-        <w:t xml:space="preserve">The Elections Panel maintains all constitutional candidate registries and pools as the administrative keeper of record. The Elections Panel receives applications, stores records, provides public access via the NRS, and enters certified applicants into the relevant registry or pool. The Elections Panel may not exclude any applicant who has been certified as eligible by the appropriate Inspectorate. The appropriate Inspectorate reviews each applicant against the qualification requirements for that registry or pool and publishes a certification to the NRS. Where an office involves significant financial authority, the EI reviews financial disclosure concurrently. Pool records and certifications are public NRS records at all times. The Joint Inspectorate Council conducts the draw in a public session, certifies the result jointly, and publishes it to the NRS. Where selection is by deliberate nomination, the named officer nominates from certified pool members. Where confirmation is required, the Senate must act within the period defined by the establishing provision; failure to confirm within that period is a constitutional compliance breach reported by the LI. The JI monitors all constitutional pools annually and publishes a status report; where a pool falls below its constitutional minimum, the relevant nominating bodies must respond within 30 days.</w:t>
-      </w:r>
-    </w:p>
-    <w:p>
-      <w:pPr>
-        <w:spacing w:after="120" w:before="0"/>
-      </w:pPr>
-      <w:r>
-        <w:t xml:space="preserve"/>
+          <w:color w:val="1B2A4A"/>
+          <w:sz w:val="22"/>
+          <w:szCs w:val="22"/>
+        </w:rPr>
+        <w:t xml:space="preserve">Registry Integrity Standards</w:t>
+      </w:r>
+    </w:p>
+    <w:p>
+      <w:pPr>
+        <w:spacing w:after="120" w:before="0"/>
+        <w:ind w:left="431"/>
+        <w:jc w:val="both"/>
+      </w:pPr>
+      <w:r>
+        <w:rPr>
+          <w:rFonts w:ascii="Garamond" w:cs="Garamond" w:eastAsia="Garamond" w:hAnsi="Garamond"/>
+          <w:b w:val="false"/>
+          <w:bCs w:val="false"/>
+          <w:i w:val="false"/>
+          <w:iCs w:val="false"/>
+          <w:color w:val="2a2520"/>
+          <w:sz w:val="22"/>
+          <w:szCs w:val="22"/>
+        </w:rPr>
+        <w:t xml:space="preserve">These standards apply to all registries and candidate pools maintained under constitutional mandate. Eligibility criteria are strictly objective — years of practice or service, office status, and financial interests as defined by this Constitution or by statute. No registry administrator may apply criteria relating to legal philosophy, judicial temperament, ideological orientation, or political association; any exclusion on such grounds is constitutionally void. Where an applicant is excluded or removed, the administering body must publish the specific grounds to the NRS within 14 days. An excluded or removed applicant may petition the SC within 30 days of NRS publication; the SC reviews only whether the stated grounds correspond to an established eligibility criterion — it does not review the factual merits of the determination. The JIC annual audit must evaluate each registry for pool depth, distribution, and patterns in exclusion decisions.</w:t>
       </w:r>
     </w:p>
     <w:p>
@@ -5590,55 +5639,6 @@
           <w:szCs w:val="18"/>
         </w:rPr>
         <w:t xml:space="preserve">§9.14  </w:t>
-      </w:r>
-      <w:r>
-        <w:rPr>
-          <w:rFonts w:ascii="Garamond" w:cs="Garamond" w:eastAsia="Garamond" w:hAnsi="Garamond"/>
-          <w:b/>
-          <w:bCs/>
-          <w:color w:val="1B2A4A"/>
-          <w:sz w:val="22"/>
-          <w:szCs w:val="22"/>
-        </w:rPr>
-        <w:t xml:space="preserve">Registry Integrity Standards</w:t>
-      </w:r>
-    </w:p>
-    <w:p>
-      <w:pPr>
-        <w:spacing w:after="120" w:before="0"/>
-        <w:ind w:left="431"/>
-        <w:jc w:val="both"/>
-      </w:pPr>
-      <w:r>
-        <w:rPr>
-          <w:rFonts w:ascii="Garamond" w:cs="Garamond" w:eastAsia="Garamond" w:hAnsi="Garamond"/>
-          <w:b w:val="false"/>
-          <w:bCs w:val="false"/>
-          <w:i w:val="false"/>
-          <w:iCs w:val="false"/>
-          <w:color w:val="2a2520"/>
-          <w:sz w:val="22"/>
-          <w:szCs w:val="22"/>
-        </w:rPr>
-        <w:t xml:space="preserve">These standards apply to all registries and candidate pools maintained under constitutional mandate. Eligibility criteria are strictly objective — years of practice or service, office status, and financial interests as defined by this Constitution or by statute. No registry administrator may apply criteria relating to legal philosophy, judicial temperament, ideological orientation, or political association; any exclusion on such grounds is constitutionally void. Where an applicant is excluded or removed, the administering body must publish the specific grounds to the NRS within 14 days. An excluded or removed applicant may petition the SC within 30 days of NRS publication; the SC reviews only whether the stated grounds correspond to an established eligibility criterion — it does not review the factual merits of the determination. The JIC annual audit must evaluate each registry for pool depth, distribution, and patterns in exclusion decisions.</w:t>
-      </w:r>
-    </w:p>
-    <w:p>
-      <w:pPr>
-        <w:spacing w:after="60" w:before="200"/>
-        <w:ind w:left="431"/>
-        <w:jc w:val="left"/>
-      </w:pPr>
-      <w:r>
-        <w:rPr>
-          <w:rFonts w:ascii="Courier New" w:cs="Courier New" w:eastAsia="Courier New" w:hAnsi="Courier New"/>
-          <w:b/>
-          <w:bCs/>
-          <w:color w:val="1B2A4A"/>
-          <w:sz w:val="18"/>
-          <w:szCs w:val="18"/>
-        </w:rPr>
-        <w:t xml:space="preserve">§9.15  </w:t>
       </w:r>
       <w:r>
         <w:rPr>
@@ -6350,7 +6350,7 @@
           <w:sz w:val="22"/>
           <w:szCs w:val="22"/>
         </w:rPr>
-        <w:t xml:space="preserve">The National Endowment is a constitutionally established reserve fund that backstops the Republic's social state obligations under §12.1 during periods of Severe Revenue Contraction, as certified by the independent Monetary Authority established under §12.1. It operates independently of the annual budget process. The Endowment is governed by a board of five trustees selected by public lottery from the National Endowment Trustee Pool. Each executive nominates qualified persons to the pool annually; pool entry follows §9.13 and eligibility is certified jointly by the EI and LI; the JIC conducts the trustee lottery under §9.13. Disbursements are activated on Monetary Authority certification of Severe Revenue Contraction and continue until the Monetary Authority certifies the contraction has ended. Trustees serve staggered 6-year non-renewable terms and may be removed only for cause under the framework established in §9.15. The board's sole mandate is to preserve and grow the Endowment for social state backstop purposes; it may not be directed to any other goal. All board decisions and performance reports are published to the NRS; the EI audits the board annually.</w:t>
+        <w:t xml:space="preserve">The National Endowment is a constitutionally established reserve fund that backstops the Republic's social state obligations under §12.1 during periods of Severe Revenue Contraction, as certified by the independent Monetary Authority established under §12.1. It operates independently of the annual budget process. The Endowment is governed by a board of five trustees selected by public lottery from the National Endowment Trustee Pool. Each executive nominates qualified persons to the pool annually; pool entry follows §9.12 and eligibility is certified jointly by the EI and LI; the JIC conducts the trustee lottery under §9.12. Disbursements are activated on Monetary Authority certification of Severe Revenue Contraction and continue until the Monetary Authority certifies the contraction has ended. Trustees serve staggered 6-year non-renewable terms and may be removed only for cause under the framework established in §9.14. The board's sole mandate is to preserve and grow the Endowment for social state backstop purposes; it may not be directed to any other goal. All board decisions and performance reports are published to the NRS; the EI audits the board annually.</w:t>
       </w:r>
     </w:p>
     <w:p>
@@ -6630,7 +6630,7 @@
           <w:sz w:val="22"/>
           <w:szCs w:val="22"/>
         </w:rPr>
-        <w:t xml:space="preserve">60% of votes cast is the constitutional threshold for all direct electoral supermajority determinations. This threshold applies wherever this Constitution requires a supermajority outcome in a citizen vote rather than a legislative vote: the presidential first-round threshold at which the State plurality requirement is waived (§7.2); public confirmation of a Supreme Court justice under the Senate bypass mechanism (§4.4.a); and public election removal of a constitutional officer under the Judicial Track (§9.15). The Legislature may not set a higher or lower threshold for any direct electoral supermajority determination without a constitutional amendment. This provision does not govern the optional referendum or citizen initiative under §13.1–§13.2, which require only a simple majority of votes cast; it governs determinations that require constitutional supermajority democratic consent.</w:t>
+        <w:t xml:space="preserve">60% of votes cast is the constitutional threshold for all direct electoral supermajority determinations. This threshold applies wherever this Constitution requires a supermajority outcome in a citizen vote rather than a legislative vote: the presidential first-round threshold at which the State plurality requirement is waived (§7.2); public confirmation of a Supreme Court justice under the Senate bypass mechanism (§4.4.a); and public election removal of a constitutional officer under the Judicial Track (§9.14). The Legislature may not set a higher or lower threshold for any direct electoral supermajority determination without a constitutional amendment. This provision does not govern the optional referendum or citizen initiative under §13.1–§13.2, which require only a simple majority of votes cast; it governs determinations that require constitutional supermajority democratic consent.</w:t>
       </w:r>
     </w:p>
     <w:p>

</xml_diff>

<commit_message>
Fix remaining House → Assembly instances (15 in DOCX, 29 HTML files)
Previous terminology pass missed several patterns:
- Standalone 'House' without a prefix match
- 'House-passed' compound (→ Assembly-passed)
- 'House district maps' (→ Assembly district maps)
- 'House consent' (→ Assembly consent)
- 'House minority' (→ Assembly minority)
- 'House passage' (→ Assembly passage)
- 'renewable House approval' (→ Assembly approval)
- 'The House may remove/elect/impeach' (→ The Assembly)
- §3.2 heading 'The Assembly of Representatives' → 'The Assembly'

All 30 files with remaining House references updated.
</commit_message>
<xml_diff>
--- a/constitution-current.docx
+++ b/constitution-current.docx
@@ -1793,7 +1793,7 @@
           <w:sz w:val="22"/>
           <w:szCs w:val="22"/>
         </w:rPr>
-        <w:t xml:space="preserve">The Civic Consul holds residual executive authority over all functions not enumerated as Consular. To hold the office of Civic Consul, a person must have been a citizen for at least 7 years at the time of taking office and must hold no federal felony conviction. No other eligibility requirement applies. The Civic Consul answers to the Assembly through the confidence mechanism and does not require presidential confirmation for the exercise of the domestic domain. The Civic Consul's domestic authority includes: all domestic policy and regulatory frameworks; the annual budget, which must originate with the Civic Consul and pass the Assembly; certification of military expenditure; the civil service; and administration of the social state under Article X. The Civic Consul may declare a domestic emergency in response to natural disaster, public health crisis, or infrastructure failure, subject to the constraints of Article I and renewable House approval at intervals defined by statute. The Consul has no role in domestic emergencies. The Civic Consul has the right to be informed on national security matters that bear on domestic interests; no classification may be used to withhold such information from the Civic Consul where it affects the exercise of the domestic domain.</w:t>
+        <w:t xml:space="preserve">The Civic Consul holds residual executive authority over all functions not enumerated as Consular. To hold the office of Civic Consul, a person must have been a citizen for at least 7 years at the time of taking office and must hold no federal felony conviction. No other eligibility requirement applies. The Civic Consul answers to the Assembly through the confidence mechanism and does not require presidential confirmation for the exercise of the domestic domain. The Civic Consul's domestic authority includes: all domestic policy and regulatory frameworks; the annual budget, which must originate with the Civic Consul and pass the Assembly; certification of military expenditure; the civil service; and administration of the social state under Article X. The Civic Consul may declare a domestic emergency in response to natural disaster, public health crisis, or infrastructure failure, subject to the constraints of Article I and renewable Assembly approval at intervals defined by statute. The Consul has no role in domestic emergencies. The Civic Consul has the right to be informed on national security matters that bear on domestic interests; no classification may be used to withhold such information from the Civic Consul where it affects the exercise of the domestic domain.</w:t>
       </w:r>
     </w:p>
     <w:p>
@@ -1844,7 +1844,7 @@
           <w:sz w:val="22"/>
           <w:szCs w:val="22"/>
         </w:rPr>
-        <w:t xml:space="preserve">The Civic Consul is accountable to the Assembly. The House may remove the Civic Consul only through a constructive vote of no confidence: a single vote that simultaneously removes the sitting Civic Consul and installs a named replacement, by absolute majority of full seated Assembly membership. A confidence vote that does not name and elect a successor has no constitutional effect. No person may serve more than 8 consecutive years as Civic Consul, and no more than 12 years in total across all periods of service. Both limits operate simultaneously; the stricter governs at any given moment. The House elects the Civic Consul by absolute majority within the period defined by statute following any general election or vacancy. If the Assembly does not elect a Civic Consul within that period, the Civic Consul designates a Caretaker Civic Consul from the confirmed ministers; the designation is published to the NRS and confirmed by the LM. The Senate may, by 2/3 supermajority, designate a serving Assembly member as Civic Consul if the Assembly has failed to elect one within the statutory period; Assembly election of a Civic Consul by absolute majority terminates any Senate designation. Where no Civic Consul has been elected by absolute majority and the Senate has not designated a Civic Consul within 45 days of the Assembly failing to elect one within the statutory period, the Elections Panel administers a public dissolution referendum; the question is whether the people wish to dissolve the Assembly and hold a new election; the referendum is administered with a minimum 30-day campaign window; a simple majority decides. If the Assembly elects a Civic Consul by absolute majority at any point before the dissolution vote is certified, the referendum is moot and concludes without effect. Where the dissolution vote passes, dissolution takes effect from the moment of Elections Panel certification and is published to the NRS; a new Assembly general election follows under the ordinary electoral process; the Caretaker mechanism continues until the new Assembly elects a Civic Consul. Where the Civic Consul is temporarily unable to exercise authority, the PM’s designated Caretaker Civic Consul serves with authority limited to maintaining existing policy and emergency functions; Caretaker status ends when the Civic Consul resumes their duties or a new Civic Consul is confirmed by the Assembly.</w:t>
+        <w:t xml:space="preserve">The Civic Consul is accountable to the Assembly. The Assembly may remove the Civic Consul only through a constructive vote of no confidence: a single vote that simultaneously removes the sitting Civic Consul and installs a named replacement, by absolute majority of full seated Assembly membership. A confidence vote that does not name and elect a successor has no constitutional effect. No person may serve more than 8 consecutive years as Civic Consul, and no more than 12 years in total across all periods of service. Both limits operate simultaneously; the stricter governs at any given moment. The Assembly elects the Civic Consul by absolute majority within the period defined by statute following any general election or vacancy. If the Assembly does not elect a Civic Consul within that period, the Civic Consul designates a Caretaker Civic Consul from the confirmed ministers; the designation is published to the NRS and confirmed by the LM. The Senate may, by 2/3 supermajority, designate a serving Assembly member as Civic Consul if the Assembly has failed to elect one within the statutory period; Assembly election of a Civic Consul by absolute majority terminates any Senate designation. Where no Civic Consul has been elected by absolute majority and the Senate has not designated a Civic Consul within 45 days of the Assembly failing to elect one within the statutory period, the Elections Panel administers a public dissolution referendum; the question is whether the people wish to dissolve the Assembly and hold a new election; the referendum is administered with a minimum 30-day campaign window; a simple majority decides. If the Assembly elects a Civic Consul by absolute majority at any point before the dissolution vote is certified, the referendum is moot and concludes without effect. Where the dissolution vote passes, dissolution takes effect from the moment of Elections Panel certification and is published to the NRS; a new Assembly general election follows under the ordinary electoral process; the Caretaker mechanism continues until the new Assembly elects a Civic Consul. Where the Civic Consul is temporarily unable to exercise authority, the PM’s designated Caretaker Civic Consul serves with authority limited to maintaining existing policy and emergency functions; Caretaker status ends when the Civic Consul resumes their duties or a new Civic Consul is confirmed by the Assembly.</w:t>
       </w:r>
     </w:p>
     <w:p>
@@ -2430,7 +2430,7 @@
           <w:sz w:val="22"/>
           <w:szCs w:val="22"/>
         </w:rPr>
-        <w:t xml:space="preserve">The Legislature comprises two chambers: the Assembly of Representatives and the Senate. All legislation originates in the Assembly. The Senate reviews, may amend within the subject matter of the bill, and must act on every House-passed bill within the period defined by statute — inaction triggers automatic deemed approval. In the absence of a statutory period, the Senate must act within 90 days of receipt. Neither chamber may indefinitely delay business assigned to it by this constitution.</w:t>
+        <w:t xml:space="preserve">The Legislature comprises two chambers: the Assembly of Representatives and the Senate. All legislation originates in the Assembly. The Senate reviews, may amend within the subject matter of the bill, and must act on every Assembly-passed bill within the period defined by statute — inaction triggers automatic deemed approval. In the absence of a statutory period, the Senate must act within 90 days of receipt. Neither chamber may indefinitely delay business assigned to it by this constitution.</w:t>
       </w:r>
     </w:p>
     <w:p>
@@ -2461,27 +2461,27 @@
           <w:sz w:val="22"/>
           <w:szCs w:val="22"/>
         </w:rPr>
-        <w:t xml:space="preserve">The House of Representatives</w:t>
-      </w:r>
-    </w:p>
-    <w:p>
-      <w:pPr>
-        <w:spacing w:after="120" w:before="0"/>
-        <w:ind w:left="431"/>
-        <w:jc w:val="both"/>
-      </w:pPr>
-      <w:r>
-        <w:rPr>
-          <w:rFonts w:ascii="Garamond" w:cs="Garamond" w:eastAsia="Garamond" w:hAnsi="Garamond"/>
-          <w:b w:val="false"/>
-          <w:bCs w:val="false"/>
-          <w:i w:val="false"/>
-          <w:iCs w:val="false"/>
-          <w:color w:val="2a2520"/>
-          <w:sz w:val="22"/>
-          <w:szCs w:val="22"/>
-        </w:rPr>
-        <w:t xml:space="preserve">The House is the proportionally elected chamber. Both States and Territories send voting members. Seats are allocated by the Webster method based on population, with a minimum of one seat per State and Territory. The constituency divisor is established and may be adjusted by statute, subject to the minimum-seat guarantee. The census, conducted every ten years by a statutory independent agency, is the basis for reapportionment. The LM audits the census and allocation process. The Assembly Speaker is elected by the Assembly from its own members by absolute majority and does not hold a place in the presidential succession line. Quorum is a majority of full seated membership. The House establishes its own internal procedures. Members serve two-year terms. No member may serve more than six consecutive terms without sitting out one full electoral cycle; no cumulative lifetime restriction applies after the cooling-off period. Legislative compensation is set by independent formula, not by the Legislature itself; all member financial interests are disclosed to the EM and published to the NRS. Mid-term vacancies in Assembly seats are filled by special election administered by the Elections Panel; the Legislature establishes timing and procedures by statute, ensuring no seat remains vacant beyond a reasonable period. The House may expel a member by 2/3 vote of full seated membership; expulsion is published to the NRS and is effective immediately.</w:t>
+        <w:t xml:space="preserve">The Assembly</w:t>
+      </w:r>
+    </w:p>
+    <w:p>
+      <w:pPr>
+        <w:spacing w:after="120" w:before="0"/>
+        <w:ind w:left="431"/>
+        <w:jc w:val="both"/>
+      </w:pPr>
+      <w:r>
+        <w:rPr>
+          <w:rFonts w:ascii="Garamond" w:cs="Garamond" w:eastAsia="Garamond" w:hAnsi="Garamond"/>
+          <w:b w:val="false"/>
+          <w:bCs w:val="false"/>
+          <w:i w:val="false"/>
+          <w:iCs w:val="false"/>
+          <w:color w:val="2a2520"/>
+          <w:sz w:val="22"/>
+          <w:szCs w:val="22"/>
+        </w:rPr>
+        <w:t xml:space="preserve">The Assembly is the proportionally elected chamber. Both States and Territories send voting members. Seats are allocated by the Webster method based on population, with a minimum of one seat per State and Territory. The constituency divisor is established and may be adjusted by statute, subject to the minimum-seat guarantee. The census, conducted every ten years by a statutory independent agency, is the basis for reapportionment. The LM audits the census and allocation process. The Assembly Speaker is elected by the Assembly from its own members by absolute majority and does not hold a place in the presidential succession line. Quorum is a majority of full seated membership. The Assembly establishes its own internal procedures. Members serve two-year terms. No member may serve more than six consecutive terms without sitting out one full electoral cycle; no cumulative lifetime restriction applies after the cooling-off period. Legislative compensation is set by independent formula, not by the Legislature itself; all member financial interests are disclosed to the EM and published to the NRS. Mid-term vacancies in Assembly seats are filled by special election administered by the Elections Panel; the Legislature establishes timing and procedures by statute, ensuring no seat remains vacant beyond a reasonable period. The Assembly may expel a member by 2/3 vote of full seated membership; expulsion is published to the NRS and is effective immediately.</w:t>
       </w:r>
     </w:p>
     <w:p>
@@ -2532,7 +2532,7 @@
           <w:sz w:val="22"/>
           <w:szCs w:val="22"/>
         </w:rPr>
-        <w:t xml:space="preserve">States draw their own House district maps subject to five criteria: population equality within reasonable tolerance; geographic contiguity; compliance with §1.6 non-discrimination; no intentional dilution of minority voting power; and reasonable compactness. Maps may not be drawn using voter political affiliation data, voting history data, incumbent residence, or racial composition as a primary criterion. The LM reviews all maps for compliance and publishes findings to the NRS. Where a map fails, the Elections Panel draws an interim compliant map that takes effect at the next election and is retired when the State submits a compliant map. Territorial districts are drawn by the Elections Panel under the same criteria. Any citizen, State government, or parliamentary minority may challenge a map before the SC.</w:t>
+        <w:t xml:space="preserve">States draw their own Assembly district maps subject to five criteria: population equality within reasonable tolerance; geographic contiguity; compliance with §1.6 non-discrimination; no intentional dilution of minority voting power; and reasonable compactness. Maps may not be drawn using voter political affiliation data, voting history data, incumbent residence, or racial composition as a primary criterion. The LM reviews all maps for compliance and publishes findings to the NRS. Where a map fails, the Elections Panel draws an interim compliant map that takes effect at the next election and is retired when the State submits a compliant map. Territorial districts are drawn by the Elections Panel under the same criteria. Any citizen, State government, or parliamentary minority may challenge a map before the SC.</w:t>
       </w:r>
     </w:p>
     <w:p>
@@ -2889,7 +2889,7 @@
           <w:sz w:val="22"/>
           <w:szCs w:val="22"/>
         </w:rPr>
-        <w:t xml:space="preserve">The House may impeach officers serving in the presidential executive domain and inferior court judges. The Consul is removed exclusively under §2.13; the Civic Consul under §2.6; SC justices under §4.3.b; legislative members by their own chamber. A 1/3 House minority may open an inquiry; full impeachment requires absolute majority of full seated membership. Articles of Impeachment are published permanently to the NRS and transmitted immediately to the Senate. The subject official continues in office pending the Senate trial, relieved of executive functions from the date of House passage. The Senate trial is public and recorded on the NRS. Conviction and removal requires 2/3 of full seated Senate membership; the Senate may additionally bar the convicted from future federal office by simple majority. Acquittal is final on the same conduct. Criminal liability remains separately pursuable.</w:t>
+        <w:t xml:space="preserve">The Assembly may impeach officers serving in the presidential executive domain and inferior court judges. The Consul is removed exclusively under §2.13; the Civic Consul under §2.6; SC justices under §4.3.b; legislative members by their own chamber. A 1/3 Assembly minority may open an inquiry; full impeachment requires absolute majority of full seated membership. Articles of Impeachment are published permanently to the NRS and transmitted immediately to the Senate. The subject official continues in office pending the Senate trial, relieved of executive functions from the date of Assembly passage. The Senate trial is public and recorded on the NRS. Conviction and removal requires 2/3 of full seated Senate membership; the Senate may additionally bar the convicted from future federal office by simple majority. Acquittal is final on the same conduct. Criminal liability remains separately pursuable.</w:t>
       </w:r>
     </w:p>
     <w:p>
@@ -3441,7 +3441,7 @@
           <w:sz w:val="22"/>
           <w:szCs w:val="22"/>
         </w:rPr>
-        <w:t xml:space="preserve">Where the LM has assessed and reported a Senate breach under §4.4, the Civic Consul may — with 2/3 House consent — place the serving Temporary Associate Justice on the next federal electoral period ballot for public confirmation. Confirmation requires 60% of votes cast; the justice’s seniority-based designation is published to the NRS as ballot information. If confirmed, the justice serves the remainder of the original term and the Senate’s confirmation authority for that seat is extinguished. If not confirmed, the justice steps down, the next most senior Appellate Court judge auto-designates, and the process may repeat. Senate confirmation of a registry nominee before the public vote is certified ends the bypass immediately.</w:t>
+        <w:t xml:space="preserve">Where the LM has assessed and reported a Senate breach under §4.4, the Civic Consul may — with 2/3 Assembly consent — place the serving Temporary Associate Justice on the next federal electoral period ballot for public confirmation. Confirmation requires 60% of votes cast; the justice’s seniority-based designation is published to the NRS as ballot information. If confirmed, the justice serves the remainder of the original term and the Senate’s confirmation authority for that seat is extinguished. If not confirmed, the justice steps down, the next most senior Appellate Court judge auto-designates, and the process may repeat. Senate confirmation of a registry nominee before the public vote is certified ends the bypass immediately.</w:t>
       </w:r>
     </w:p>
     <w:p>
@@ -4749,7 +4749,7 @@
           <w:sz w:val="22"/>
           <w:szCs w:val="22"/>
         </w:rPr>
-        <w:t xml:space="preserve">The LM audits the Legislature for fiscal accuracy and constitutional compliance. Responsibilities include auditing the population census for constitutional compliance; reviewing House district maps against §3.3 criteria and publishing germaneness analyses; determining referendum eligibility; certifying legislative mandate compliance; and publishing an annual compliance report to the NRS.</w:t>
+        <w:t xml:space="preserve">The LM audits the Legislature for fiscal accuracy and constitutional compliance. Responsibilities include auditing the population census for constitutional compliance; reviewing Assembly district maps against §3.3 criteria and publishing germaneness analyses; determining referendum eligibility; certifying legislative mandate compliance; and publishing an annual compliance report to the NRS.</w:t>
       </w:r>
     </w:p>
     <w:p>
@@ -8909,7 +8909,7 @@
           <w:sz w:val="22"/>
           <w:szCs w:val="22"/>
         </w:rPr>
-        <w:t xml:space="preserve">Equal parties; neither constitutionally superior. Observing delegates attend House and Senate proceedings relevant to the compact — speaking rights, no vote, no quorum or threshold effect. The Republic may not impose its constitutional governance architecture on an Associated Community as a condition of the compact relationship. Minimum democratic legitimacy requirements applicable to States do not apply to Associated Communities.</w:t>
+        <w:t xml:space="preserve">Equal parties; neither constitutionally superior. Observing delegates attend Assembly and Senate proceedings relevant to the compact — speaking rights, no vote, no quorum or threshold effect. The Republic may not impose its constitutional governance architecture on an Associated Community as a condition of the compact relationship. Minimum democratic legitimacy requirements applicable to States do not apply to Associated Communities.</w:t>
       </w:r>
     </w:p>
     <w:p>

</xml_diff>

<commit_message>
Legat Consul: external executive renamed + Assembly of Representatives fixed
Terminology:
- 'Consul' (external executive) → 'Legat Consul' throughout
  (39 instances in DOCX, 33 HTML files updated)
- 'Civic Consul' preserved unchanged (73 instances)
- The Legat Consul holds military command, foreign affairs,
  intelligence, and treaty negotiation — the Republic's sovereign
  authority in the external domain
- Pairing: Legat Consul (outward) and Civic Consul (inward)

§3.1 and annotated.html:
- 'the Assembly of Representatives and the Senate' →
  'the Assembly and the Senate'
- Last remaining 'Representatives' reference removed
</commit_message>
<xml_diff>
--- a/constitution-current.docx
+++ b/constitution-current.docx
@@ -1569,27 +1569,27 @@
           <w:sz w:val="22"/>
           <w:szCs w:val="22"/>
         </w:rPr>
-        <w:t xml:space="preserve">The Consul — Domain and Term</w:t>
-      </w:r>
-    </w:p>
-    <w:p>
-      <w:pPr>
-        <w:spacing w:after="120" w:before="0"/>
-        <w:ind w:left="431"/>
-        <w:jc w:val="both"/>
-      </w:pPr>
-      <w:r>
-        <w:rPr>
-          <w:rFonts w:ascii="Garamond" w:cs="Garamond" w:eastAsia="Garamond" w:hAnsi="Garamond"/>
-          <w:b w:val="false"/>
-          <w:bCs w:val="false"/>
-          <w:i w:val="false"/>
-          <w:iCs w:val="false"/>
-          <w:color w:val="2a2520"/>
-          <w:sz w:val="22"/>
-          <w:szCs w:val="22"/>
-        </w:rPr>
-        <w:t xml:space="preserve">To hold the office of Consul, a person must have been a citizen for at least 7 years at the time of taking office and must hold no federal felony conviction. No other eligibility requirement applies. The Consul holds enumerated authority over: military command and force employment; foreign affairs and treaty negotiation; intelligence; trade agreements subject to §2.4; and appointments within the presidential domain. Consul's authority is enumerated; the Civic Consul's authority is residual. Where the domain of a proposed action is disputed, the Council of Ministers under §2.14 is the first forum; pending resolution, the Civic Consul's residual authority governs except for matters expressly enumerated in this provision. During active military operations, the Consul's domain governs operational decisions; either executive may petition the SC for an expedited domain determination. The Consul serves a single non-renewable term of four years. Upon expiration of the term, all authority transfers immediately to the incoming Consul. The outgoing Consul retains no access to classified information, government systems, or official functions beyond the day of transfer.</w:t>
+        <w:t xml:space="preserve">The Legat Consul — Domain and Term</w:t>
+      </w:r>
+    </w:p>
+    <w:p>
+      <w:pPr>
+        <w:spacing w:after="120" w:before="0"/>
+        <w:ind w:left="431"/>
+        <w:jc w:val="both"/>
+      </w:pPr>
+      <w:r>
+        <w:rPr>
+          <w:rFonts w:ascii="Garamond" w:cs="Garamond" w:eastAsia="Garamond" w:hAnsi="Garamond"/>
+          <w:b w:val="false"/>
+          <w:bCs w:val="false"/>
+          <w:i w:val="false"/>
+          <w:iCs w:val="false"/>
+          <w:color w:val="2a2520"/>
+          <w:sz w:val="22"/>
+          <w:szCs w:val="22"/>
+        </w:rPr>
+        <w:t xml:space="preserve">To hold the office of Legat Consul, a person must have been a citizen for at least 7 years at the time of taking office and must hold no federal felony conviction. No other eligibility requirement applies. The Legat Consul holds enumerated authority over: military command and force employment; foreign affairs and treaty negotiation; intelligence; trade agreements subject to §2.4; and appointments within the presidential domain. Legat Consul's authority is enumerated; the Civic Consul's authority is residual. Where the domain of a proposed action is disputed, the Council of Ministers under §2.14 is the first forum; pending resolution, the Civic Consul's residual authority governs except for matters expressly enumerated in this provision. During active military operations, the Legat Consul's domain governs operational decisions; either executive may petition the SC for an expedited domain determination. The Legat Consul serves a single non-renewable term of four years. Upon expiration of the term, all authority transfers immediately to the incoming Legat Consul. The outgoing Legat Consul retains no access to classified information, government systems, or official functions beyond the day of transfer.</w:t>
       </w:r>
     </w:p>
     <w:p>
@@ -1640,7 +1640,7 @@
           <w:sz w:val="22"/>
           <w:szCs w:val="22"/>
         </w:rPr>
-        <w:t xml:space="preserve">The Consul may use military force in immediate response to an active or imminent attack on Republic territory, citizens abroad, or treaty allies. Beyond immediate response, all use of military force requires legislative authorization. The Consul must notify both chambers and the Civic Consul promptly upon any use of force; the Legislature defines 'promptly' by statute. Legislative authorization expires unless affirmatively renewed at intervals the Legislature defines by statute; the constitutional default on expiry is cessation of all operations — the burden is always on authorization, never on termination. Military expenditure requires Civic Consul certification throughout; expenditure without Civic Consul certification is void. All military operations must state and be consistent with an authorized purpose under §14.1. All operations are published to the NRS.</w:t>
+        <w:t xml:space="preserve">The Legat Consul may use military force in immediate response to an active or imminent attack on Republic territory, citizens abroad, or treaty allies. Beyond immediate response, all use of military force requires legislative authorization. The Legat Consul must notify both chambers and the Civic Consul promptly upon any use of force; the Legislature defines 'promptly' by statute. Legislative authorization expires unless affirmatively renewed at intervals the Legislature defines by statute; the constitutional default on expiry is cessation of all operations — the burden is always on authorization, never on termination. Military expenditure requires Civic Consul certification throughout; expenditure without Civic Consul certification is void. All military operations must state and be consistent with an authorized purpose under §14.1. All operations are published to the NRS.</w:t>
       </w:r>
     </w:p>
     <w:p>
@@ -1691,7 +1691,7 @@
           <w:sz w:val="22"/>
           <w:szCs w:val="22"/>
         </w:rPr>
-        <w:t xml:space="preserve">The Consul directs foreign intelligence. No intelligence operation may be conducted against Republic citizens within Republic territory on the Consul's authority; such operations require independent judicial authorization. The EM reports any order authorizing domestic intelligence operations without judicial authorization to the NRS. The Consul may veto legislation that raises a genuine constitutional concern within the Consul's security domain — military operations, intelligence, treaty obligations, or border security. A general or speculative security connection is insufficient. Either Speaker may request an EM assessment of whether the veto falls within the Consul's defined domain; the EM publishes its finding to the NRS within 48 hours.</w:t>
+        <w:t xml:space="preserve">The Legat Consul directs foreign intelligence. No intelligence operation may be conducted against Republic citizens within Republic territory on the Legat Consul's authority; such operations require independent judicial authorization. The EM reports any order authorizing domestic intelligence operations without judicial authorization to the NRS. The Legat Consul may veto legislation that raises a genuine constitutional concern within the Legat Consul's security domain — military operations, intelligence, treaty obligations, or border security. A general or speculative security connection is insufficient. Either Speaker may request an EM assessment of whether the veto falls within the Legat Consul's defined domain; the EM publishes its finding to the NRS within 48 hours.</w:t>
       </w:r>
     </w:p>
     <w:p>
@@ -1742,7 +1742,7 @@
           <w:sz w:val="22"/>
           <w:szCs w:val="22"/>
         </w:rPr>
-        <w:t xml:space="preserve">The Consul negotiates and concludes trade agreements. Civic Consul written concurrence is required only for provisions imposing national treatment obligations within Republic territory, provisions requiring new domestic legislation, or provisions creating direct obligations on domestic persons. All other trade terms are within the Consul's sole authority. Where Civic Consul concurrence is withheld on a specific provision, that provision may be transmitted to the Assembly as ordinary legislation while the remaining agreement proceeds to Senate ratification independently. The Consul nominates senior domain officers — Director of Intelligence, Director of Foreign Affairs, Director of Defense — from a pool of qualified candidates maintained by the Elections Panel and certified by the JM under §9.12. The Legislature defines qualifications and confirmation procedures for each office by statute; Acting appointments may be made pending confirmation for the period and under the conditions the Legislature defines. Indefinite circumvention of Senate confirmation through Acting appointments is constitutionally prohibited. All nominations and appointments are published to the NRS.</w:t>
+        <w:t xml:space="preserve">The Legat Consul negotiates and concludes trade agreements. Civic Consul written concurrence is required only for provisions imposing national treatment obligations within Republic territory, provisions requiring new domestic legislation, or provisions creating direct obligations on domestic persons. All other trade terms are within the Legat Consul's sole authority. Where Civic Consul concurrence is withheld on a specific provision, that provision may be transmitted to the Assembly as ordinary legislation while the remaining agreement proceeds to Senate ratification independently. The Legat Consul nominates senior domain officers — Director of Intelligence, Director of Foreign Affairs, Director of Defense — from a pool of qualified candidates maintained by the Elections Panel and certified by the JM under §9.12. The Legislature defines qualifications and confirmation procedures for each office by statute; Acting appointments may be made pending confirmation for the period and under the conditions the Legislature defines. Indefinite circumvention of Senate confirmation through Acting appointments is constitutionally prohibited. All nominations and appointments are published to the NRS.</w:t>
       </w:r>
     </w:p>
     <w:p>
@@ -1793,7 +1793,7 @@
           <w:sz w:val="22"/>
           <w:szCs w:val="22"/>
         </w:rPr>
-        <w:t xml:space="preserve">The Civic Consul holds residual executive authority over all functions not enumerated as Consular. To hold the office of Civic Consul, a person must have been a citizen for at least 7 years at the time of taking office and must hold no federal felony conviction. No other eligibility requirement applies. The Civic Consul answers to the Assembly through the confidence mechanism and does not require presidential confirmation for the exercise of the domestic domain. The Civic Consul's domestic authority includes: all domestic policy and regulatory frameworks; the annual budget, which must originate with the Civic Consul and pass the Assembly; certification of military expenditure; the civil service; and administration of the social state under Article X. The Civic Consul may declare a domestic emergency in response to natural disaster, public health crisis, or infrastructure failure, subject to the constraints of Article I and renewable Assembly approval at intervals defined by statute. The Consul has no role in domestic emergencies. The Civic Consul has the right to be informed on national security matters that bear on domestic interests; no classification may be used to withhold such information from the Civic Consul where it affects the exercise of the domestic domain.</w:t>
+        <w:t xml:space="preserve">The Civic Consul holds residual executive authority over all functions not enumerated as Consular. To hold the office of Civic Consul, a person must have been a citizen for at least 7 years at the time of taking office and must hold no federal felony conviction. No other eligibility requirement applies. The Civic Consul answers to the Assembly through the confidence mechanism and does not require presidential confirmation for the exercise of the domestic domain. The Civic Consul's domestic authority includes: all domestic policy and regulatory frameworks; the annual budget, which must originate with the Civic Consul and pass the Assembly; certification of military expenditure; the civil service; and administration of the social state under Article X. The Civic Consul may declare a domestic emergency in response to natural disaster, public health crisis, or infrastructure failure, subject to the constraints of Article I and renewable Assembly approval at intervals defined by statute. The Legat Consul has no role in domestic emergencies. The Civic Consul has the right to be informed on national security matters that bear on domestic interests; no classification may be used to withhold such information from the Civic Consul where it affects the exercise of the domestic domain.</w:t>
       </w:r>
     </w:p>
     <w:p>
@@ -1997,7 +1997,7 @@
           <w:sz w:val="22"/>
           <w:szCs w:val="22"/>
         </w:rPr>
-        <w:t xml:space="preserve">Full succession activates on Consular death, resignation, removal, or certified permanent incapacity. The Senate Speaker holds the office of Consul from the moment the triggering event is published to the NRS — no active assumption is required or permitted; the transfer is instantaneous and self-executing by constitutional operation. Where the Senate Speaker is simultaneously unable to serve, the Senate Deputy Speaker holds the office from the same moment by the same operation. Where both are simultaneously unable to serve, the most senior Senator by continuous Senate service holds the office from that moment; where two or more Senators have equal continuous service, the oldest by age holds the office. The Legislature or Senate may by statute or standing order designate a further succession line beyond this constitutional floor. Upon NRS publication of any triggering event, the military chain of command recognizes the constitutional transfer immediately; any order issued in the name of the prior Consul after that moment is constitutionally void. A successor serves the remainder of the current presidential term; service by succession does not consume the successor's own eligibility to stand at the next election. Where the Consul is temporarily unable to exercise authority, the EM and LM jointly assess capacity and, on joint assessment published to the NRS, Acting Consular Authority transfers to the Senate Speaker without vacating the Speaker's Senate seat by constitutional operation from the moment of joint certification published to the NRS. Acting authority ends when the Consul publishes a restoration declaration to the NRS.</w:t>
+        <w:t xml:space="preserve">Full succession activates on Consular death, resignation, removal, or certified permanent incapacity. The Senate Speaker holds the office of Legat Consul from the moment the triggering event is published to the NRS — no active assumption is required or permitted; the transfer is instantaneous and self-executing by constitutional operation. Where the Senate Speaker is simultaneously unable to serve, the Senate Deputy Speaker holds the office from the same moment by the same operation. Where both are simultaneously unable to serve, the most senior Senator by continuous Senate service holds the office from that moment; where two or more Senators have equal continuous service, the oldest by age holds the office. The Legislature or Senate may by statute or standing order designate a further succession line beyond this constitutional floor. Upon NRS publication of any triggering event, the military chain of command recognizes the constitutional transfer immediately; any order issued in the name of the prior Legat Consul after that moment is constitutionally void. A successor serves the remainder of the current presidential term; service by succession does not consume the successor's own eligibility to stand at the next election. Where the Legat Consul is temporarily unable to exercise authority, the EM and LM jointly assess capacity and, on joint assessment published to the NRS, Acting Consular Authority transfers to the Senate Speaker without vacating the Speaker's Senate seat by constitutional operation from the moment of joint certification published to the NRS. Acting authority ends when the Legat Consul publishes a restoration declaration to the NRS.</w:t>
       </w:r>
     </w:p>
     <w:p>
@@ -2201,7 +2201,7 @@
           <w:sz w:val="22"/>
           <w:szCs w:val="22"/>
         </w:rPr>
-        <w:t xml:space="preserve">The Consul may be removed on two independent tracks. Under the legislative track, 2/3 of both chambers simultaneously on grounds of constitutional breach, demonstrated permanent incapacity, or conviction for a disqualifying offense. Either chamber may request a JMC assessment as part of the proceedings; any such assessment is published to the NRS. Under the popular track, a Senate majority may refer the question to a national recall referendum administered within the period defined by statute. The Consul is removed if the referendum achieves 60% of votes cast under §13.4 with a minimum 55% citizen participation. A failed referendum may not be re-initiated within the same presidential term. The Senate Speaker holds Acting Consular Authority from the moment of Senate referral published to the NRS — no active assumption is required or permitted. The military compliance obligations established in §2.9 apply to this transfer.</w:t>
+        <w:t xml:space="preserve">The Legat Consul may be removed on two independent tracks. Under the legislative track, 2/3 of both chambers simultaneously on grounds of constitutional breach, demonstrated permanent incapacity, or conviction for a disqualifying offense. Either chamber may request a JMC assessment as part of the proceedings; any such assessment is published to the NRS. Under the popular track, a Senate majority may refer the question to a national recall referendum administered within the period defined by statute. The Legat Consul is removed if the referendum achieves 60% of votes cast under §13.4 with a minimum 55% citizen participation. A failed referendum may not be re-initiated within the same presidential term. The Senate Speaker holds Acting Consular Authority from the moment of Senate referral published to the NRS — no active assumption is required or permitted. The military compliance obligations established in §2.9 apply to this transfer.</w:t>
       </w:r>
     </w:p>
     <w:p>
@@ -2252,7 +2252,7 @@
           <w:sz w:val="22"/>
           <w:szCs w:val="22"/>
         </w:rPr>
-        <w:t xml:space="preserve">The Council of Ministers comprises the Consul's domain officers and the Civic Consul's ministers ministers meeting jointly as a standing cross-executive coordination body. The Council is the primary forum for matters that cross executive domains. The Council makes recommendations and coordinates positions; it does not exercise executive authority. A summary record of each session is published to the NRS within the period defined by statute. The existence and general subject of each session may not be classified. Operational procedures are defined by statute. In a cross-domain emergency — a crisis whose effective management requires unified operational authority across executive domains — either executive may propose a temporary operational lead designation to the Council of Ministers; the other executive must respond in writing within twelve hours; failure to respond within twelve hours is treated as an objection for the purposes of this provision; concurrence makes the designation effective and it is published to the NRS immediately with both executives' attributed positions; objection or non-response refers the dispute to the SC under §2.15 for expedited review. A temporary lead designation does not extinguish the other executive's domain authorities or certification functions — it assigns operational coordination, not constitutional supremacy. Either executive may petition the SC directly for emergency resolution of a coordination failure; the SC must rule within the period defined by statute, not to exceed 48 hours. Judicial review of any lead designation is conducted after the emergency is stabilized, not during it; courts do not govern active crisis management.</w:t>
+        <w:t xml:space="preserve">The Council of Ministers comprises the Legat Consul's domain officers and the Civic Consul's ministers ministers meeting jointly as a standing cross-executive coordination body. The Council is the primary forum for matters that cross executive domains. The Council makes recommendations and coordinates positions; it does not exercise executive authority. A summary record of each session is published to the NRS within the period defined by statute. The existence and general subject of each session may not be classified. Operational procedures are defined by statute. In a cross-domain emergency — a crisis whose effective management requires unified operational authority across executive domains — either executive may propose a temporary operational lead designation to the Council of Ministers; the other executive must respond in writing within twelve hours; failure to respond within twelve hours is treated as an objection for the purposes of this provision; concurrence makes the designation effective and it is published to the NRS immediately with both executives' attributed positions; objection or non-response refers the dispute to the SC under §2.15 for expedited review. A temporary lead designation does not extinguish the other executive's domain authorities or certification functions — it assigns operational coordination, not constitutional supremacy. Either executive may petition the SC directly for emergency resolution of a coordination failure; the SC must rule within the period defined by statute, not to exceed 48 hours. Judicial review of any lead designation is conducted after the emergency is stabilized, not during it; courts do not govern active crisis management.</w:t>
       </w:r>
     </w:p>
     <w:p>
@@ -2430,7 +2430,7 @@
           <w:sz w:val="22"/>
           <w:szCs w:val="22"/>
         </w:rPr>
-        <w:t xml:space="preserve">The Legislature comprises two chambers: the Assembly of Representatives and the Senate. All legislation originates in the Assembly. The Senate reviews, may amend within the subject matter of the bill, and must act on every Assembly-passed bill within the period defined by statute — inaction triggers automatic deemed approval. In the absence of a statutory period, the Senate must act within 90 days of receipt. Neither chamber may indefinitely delay business assigned to it by this constitution.</w:t>
+        <w:t xml:space="preserve">The Legislature comprises two chambers: the Assembly and the Senate. All legislation originates in the Assembly. The Senate reviews, may amend within the subject matter of the bill, and must act on every Assembly-passed bill within the period defined by statute — inaction triggers automatic deemed approval. In the absence of a statutory period, the Senate must act within 90 days of receipt. Neither chamber may indefinitely delay business assigned to it by this constitution.</w:t>
       </w:r>
     </w:p>
     <w:p>
@@ -2685,7 +2685,7 @@
           <w:sz w:val="22"/>
           <w:szCs w:val="22"/>
         </w:rPr>
-        <w:t xml:space="preserve">Treaty ratification requires 2/3 of the full seated Senate. Where a treaty fails ratification, standalone domestic provisions may be transmitted to the Assembly as ordinary legislation unless the treaty is bilateral and its obligations are interdependent, in which case it must be renegotiated or abandoned in full. The Consul initiates treaty withdrawal by published NRS notice. For general treaties, the Senate may block withdrawal by simple majority within the notice period; if the Senate does not act, withdrawal takes effect. For mutual defense treaties, the Senate must affirmatively confirm withdrawal; if the Senate does not confirm, the treaty remains in force. Indigenous treaties under Article XVI may not be unilaterally withdrawn. All withdrawal actions are published to the NRS.</w:t>
+        <w:t xml:space="preserve">Treaty ratification requires 2/3 of the full seated Senate. Where a treaty fails ratification, standalone domestic provisions may be transmitted to the Assembly as ordinary legislation unless the treaty is bilateral and its obligations are interdependent, in which case it must be renegotiated or abandoned in full. The Legat Consul initiates treaty withdrawal by published NRS notice. For general treaties, the Senate may block withdrawal by simple majority within the notice period; if the Senate does not act, withdrawal takes effect. For mutual defense treaties, the Senate must affirmatively confirm withdrawal; if the Senate does not confirm, the treaty remains in force. Indigenous treaties under Article XVI may not be unilaterally withdrawn. All withdrawal actions are published to the NRS.</w:t>
       </w:r>
     </w:p>
     <w:p>
@@ -2889,7 +2889,7 @@
           <w:sz w:val="22"/>
           <w:szCs w:val="22"/>
         </w:rPr>
-        <w:t xml:space="preserve">The Assembly may impeach officers serving in the presidential executive domain and inferior court judges. The Consul is removed exclusively under §2.13; the Civic Consul under §2.6; SC justices under §4.3.b; legislative members by their own chamber. A 1/3 Assembly minority may open an inquiry; full impeachment requires absolute majority of full seated membership. Articles of Impeachment are published permanently to the NRS and transmitted immediately to the Senate. The subject official continues in office pending the Senate trial, relieved of executive functions from the date of Assembly passage. The Senate trial is public and recorded on the NRS. Conviction and removal requires 2/3 of full seated Senate membership; the Senate may additionally bar the convicted from future federal office by simple majority. Acquittal is final on the same conduct. Criminal liability remains separately pursuable.</w:t>
+        <w:t xml:space="preserve">The Assembly may impeach officers serving in the presidential executive domain and inferior court judges. The Legat Consul is removed exclusively under §2.13; the Civic Consul under §2.6; SC justices under §4.3.b; legislative members by their own chamber. A 1/3 Assembly minority may open an inquiry; full impeachment requires absolute majority of full seated membership. Articles of Impeachment are published permanently to the NRS and transmitted immediately to the Senate. The subject official continues in office pending the Senate trial, relieved of executive functions from the date of Assembly passage. The Senate trial is public and recorded on the NRS. Conviction and removal requires 2/3 of full seated Senate membership; the Senate may additionally bar the convicted from future federal office by simple majority. Acquittal is final on the same conduct. Criminal liability remains separately pursuable.</w:t>
       </w:r>
     </w:p>
     <w:p>
@@ -3954,7 +3954,7 @@
           <w:sz w:val="22"/>
           <w:szCs w:val="22"/>
         </w:rPr>
-        <w:t xml:space="preserve">Every immigration application must clear two sequential gates: Gate 1 (State sponsorship) and Gate 2 (federal certification). Legal residency requires passing both gates. States retain discretion over whom they sponsor but may not apply sponsorship criteria that violate §1.6. Federal certification covers four statutory categories only: identity verification, criminal history, national security assessment, and absence of documented welfare dependency on a foreign state — no ideological screening or nationality-based quotas. Any denial must specify the precise ground in writing. Once an applicant clears both gates, the Consul must ministerially issue residency credentials; Consul's interference with credential issuance is constitutionally prohibited. The Legislature may establish a Federal Sponsorship Category where federal agencies serve as Gate 1 sponsors for applicants serving a defined federal interest; this does not bypass Gate 2. The Legislature may set aggregate limits on total applications received and processed in any period, provided limits are applied without §1.6 discrimination. Asylum proceedings under §6.3 are exempt from Gate 1 — no State's refusal to sponsor can extinguish a §1.21 asylum claim.</w:t>
+        <w:t xml:space="preserve">Every immigration application must clear two sequential gates: Gate 1 (State sponsorship) and Gate 2 (federal certification). Legal residency requires passing both gates. States retain discretion over whom they sponsor but may not apply sponsorship criteria that violate §1.6. Federal certification covers four statutory categories only: identity verification, criminal history, national security assessment, and absence of documented welfare dependency on a foreign state — no ideological screening or nationality-based quotas. Any denial must specify the precise ground in writing. Once an applicant clears both gates, the Legat Consul must ministerially issue residency credentials; Legat Consul's interference with credential issuance is constitutionally prohibited. The Legislature may establish a Federal Sponsorship Category where federal agencies serve as Gate 1 sponsors for applicants serving a defined federal interest; this does not bypass Gate 2. The Legislature may set aggregate limits on total applications received and processed in any period, provided limits are applied without §1.6 discrimination. Asylum proceedings under §6.3 are exempt from Gate 1 — no State's refusal to sponsor can extinguish a §1.21 asylum claim.</w:t>
       </w:r>
     </w:p>
     <w:p>
@@ -4338,7 +4338,7 @@
           <w:sz w:val="22"/>
           <w:szCs w:val="22"/>
         </w:rPr>
-        <w:t xml:space="preserve">The Consul is elected through two concurrent requirements: a national RCV majority and a State plurality qualification. A candidate wins outright by satisfying both. Where a candidate's national RCV majority reaches or exceeds 60% of active ballots, the State plurality requirement is waived. Where no candidate wins outright, a runoff is conducted between the two candidates with the highest national first-preference totals, determined by national RCV only with no State plurality requirement; where two candidates are tied for the second position, the Elections Panel determines which advances by lot. The Elections Panel administers and certifies all presidential elections. Territory citizens vote in presidential elections and their votes count in the national RCV total; Territories are not included in the State plurality calculation.</w:t>
+        <w:t xml:space="preserve">The Legat Consul is elected through two concurrent requirements: a national RCV majority and a State plurality qualification. A candidate wins outright by satisfying both. Where a candidate's national RCV majority reaches or exceeds 60% of active ballots, the State plurality requirement is waived. Where no candidate wins outright, a runoff is conducted between the two candidates with the highest national first-preference totals, determined by national RCV only with no State plurality requirement; where two candidates are tied for the second position, the Elections Panel determines which advances by lot. The Elections Panel administers and certifies all presidential elections. Territory citizens vote in presidential elections and their votes count in the national RCV total; Territories are not included in the State plurality calculation.</w:t>
       </w:r>
     </w:p>
     <w:p>
@@ -4440,7 +4440,7 @@
           <w:sz w:val="22"/>
           <w:szCs w:val="22"/>
         </w:rPr>
-        <w:t xml:space="preserve">Federal elections are held at regular intervals: Assembly elections every two years; Senate elections on the staggered six-year cycle; presidential elections every four years. All federal elections use Ranked Choice Voting — majority required, not plurality; presidential elections use RCV within the framework of §7.2, which adds the State plurality requirement. The Legislature defines by statute the specific timing, duration, and structure of the federal electoral period within these constitutional floors. All federal elections, referenda, and confirmation votes are administered by the Elections Panel using the National Voting System, free from executive interference. The Consul may not declare, postpone, or influence the scheduling of elections — including declaring emergencies that have the effect of delaying them. No State may take any action that reduces NVS access, functionality, or availability within its territory. States may offer early voting, mail-in ballots, and alternative participation methods provided all methods connect to the NVS and meet its constitutional standards. Special elections for vacancies are administered by the Elections Panel under procedures established by statute.</w:t>
+        <w:t xml:space="preserve">Federal elections are held at regular intervals: Assembly elections every two years; Senate elections on the staggered six-year cycle; presidential elections every four years. All federal elections use Ranked Choice Voting — majority required, not plurality; presidential elections use RCV within the framework of §7.2, which adds the State plurality requirement. The Legislature defines by statute the specific timing, duration, and structure of the federal electoral period within these constitutional floors. All federal elections, referenda, and confirmation votes are administered by the Elections Panel using the National Voting System, free from executive interference. The Legat Consul may not declare, postpone, or influence the scheduling of elections — including declaring emergencies that have the effect of delaying them. No State may take any action that reduces NVS access, functionality, or availability within its territory. States may offer early voting, mail-in ballots, and alternative participation methods provided all methods connect to the NVS and meet its constitutional standards. Special elections for vacancies are administered by the Elections Panel under procedures established by statute.</w:t>
       </w:r>
     </w:p>
     <w:p>
@@ -6808,7 +6808,7 @@
           <w:sz w:val="22"/>
           <w:szCs w:val="22"/>
         </w:rPr>
-        <w:t xml:space="preserve">Military expenditure is authorized through Civic Consul certification concurrent with legislative authorization. No military operation may be funded without Civic Consul certification; the Civic Consul may certify, condition, or decline certification on any operation. Expenditure in categories not covered by the certification requires supplementary Civic Consul certification. When legislative authorization expires or is not renewed, all military expenditure ceases; ongoing contracts may continue to wind down for the period the Legislature defines by statute; no new commitments may be entered after authorization expires. The EM audits all military expenditure during active operations and publishes findings to the NRS. Within the period the Legislature defines by statute following the conclusion of any military operation, not to exceed 180 days, the EM publishes a comprehensive expenditure accountability report. Where the Civic Consul declines certification for ongoing military operations that have been legislatively authorized, previously certified operational expenditure continues at maintenance-only levels for the period the Legislature defines by statute — covering only operations explicitly within the prior authorization, with no escalations, expansions, or new commitments permitted; the Consul must publish notice of the certification refusal to the NRS within 24 hours with stated grounds; both chambers must be notified simultaneously; if the Legislature does not act within the maintenance period, all expenditure ceases. A Civic Consul who declines certification bears the same constitutional attribution for the consequences of that decision as a Consul who orders an operation.</w:t>
+        <w:t xml:space="preserve">Military expenditure is authorized through Civic Consul certification concurrent with legislative authorization. No military operation may be funded without Civic Consul certification; the Civic Consul may certify, condition, or decline certification on any operation. Expenditure in categories not covered by the certification requires supplementary Civic Consul certification. When legislative authorization expires or is not renewed, all military expenditure ceases; ongoing contracts may continue to wind down for the period the Legislature defines by statute; no new commitments may be entered after authorization expires. The EM audits all military expenditure during active operations and publishes findings to the NRS. Within the period the Legislature defines by statute following the conclusion of any military operation, not to exceed 180 days, the EM publishes a comprehensive expenditure accountability report. Where the Civic Consul declines certification for ongoing military operations that have been legislatively authorized, previously certified operational expenditure continues at maintenance-only levels for the period the Legislature defines by statute — covering only operations explicitly within the prior authorization, with no escalations, expansions, or new commitments permitted; the Legat Consul must publish notice of the certification refusal to the NRS within 24 hours with stated grounds; both chambers must be notified simultaneously; if the Legislature does not act within the maintenance period, all expenditure ceases. A Civic Consul who declines certification bears the same constitutional attribution for the consequences of that decision as a Legat Consul who orders an operation.</w:t>
       </w:r>
     </w:p>
     <w:p>
@@ -6961,7 +6961,7 @@
           <w:sz w:val="22"/>
           <w:szCs w:val="22"/>
         </w:rPr>
-        <w:t xml:space="preserve">Where an existing treaty requires emergency military action, the Consul may act immediately and must notify both chambers and the Civic Consul within 12 hours, citing the specific treaty obligation triggered. The Legislature must then authorize continuation within the period defined by statute; absent authorization, operations cease. Treaties cannot substitute for legislative authorization of sustained engagement — each continued operation requires authorization regardless of what the treaty requires. Civic Consul certification of expenditure applies from the moment of action under §14.2.</w:t>
+        <w:t xml:space="preserve">Where an existing treaty requires emergency military action, the Legat Consul may act immediately and must notify both chambers and the Civic Consul within 12 hours, citing the specific treaty obligation triggered. The Legislature must then authorize continuation within the period defined by statute; absent authorization, operations cease. Treaties cannot substitute for legislative authorization of sustained engagement — each continued operation requires authorization regardless of what the treaty requires. Civic Consul certification of expenditure applies from the moment of action under §14.2.</w:t>
       </w:r>
     </w:p>
     <w:p>
@@ -7576,7 +7576,7 @@
           <w:sz w:val="22"/>
           <w:szCs w:val="22"/>
         </w:rPr>
-        <w:t xml:space="preserve">Compacts are living agreements administered through joint mechanisms. Disputes are resolved through a Joint Compact Review Council with equal representation of the Nation and the Republic. The Republic is represented on the Council by the Civic Consul's designated Compact Officer for domestic and governance matters; the Consul's designated representative participates for any matter within the presidential domain under §2.1. Council decisions are binding on both parties within the scope of the compact; neither party may unilaterally declare a compact dispute resolved. Constitutional questions are appealed to the SC, which must rule within 90 days of petition; where the SC fails to rule within 90 days, the Nation’s position is upheld by constitutional operation pending any subsequent ruling. Compacts are reviewed on a schedule defined in the compact terms, minimum every 20 years; either party may request a review outside the schedule. The review may result in compact amendment by mutual agreement — neither party can impose amendments. A compact may be terminated by mutual agreement only; neither party may unilaterally terminate; only the Nation may initiate termination, and the Republic must negotiate exit terms within 2 years; if no agreement is reached the compact continues and the dispute is referred to the SC.</w:t>
+        <w:t xml:space="preserve">Compacts are living agreements administered through joint mechanisms. Disputes are resolved through a Joint Compact Review Council with equal representation of the Nation and the Republic. The Republic is represented on the Council by the Civic Consul's designated Compact Officer for domestic and governance matters; the Legat Consul's designated representative participates for any matter within the presidential domain under §2.1. Council decisions are binding on both parties within the scope of the compact; neither party may unilaterally declare a compact dispute resolved. Constitutional questions are appealed to the SC, which must rule within 90 days of petition; where the SC fails to rule within 90 days, the Nation’s position is upheld by constitutional operation pending any subsequent ruling. Compacts are reviewed on a schedule defined in the compact terms, minimum every 20 years; either party may request a review outside the schedule. The review may result in compact amendment by mutual agreement — neither party can impose amendments. A compact may be terminated by mutual agreement only; neither party may unilaterally terminate; only the Nation may initiate termination, and the Republic must negotiate exit terms within 2 years; if no agreement is reached the compact continues and the dispute is referred to the SC.</w:t>
       </w:r>
     </w:p>
     <w:p>
@@ -7729,7 +7729,7 @@
           <w:sz w:val="22"/>
           <w:szCs w:val="22"/>
         </w:rPr>
-        <w:t xml:space="preserve">An indigenous nation with an established compact under Article XVI holds the constitutional right to initiate a status transition through its own democratic or traditional governance process. Three status options are available: (a) Compact Status — continued Article XVI compact relationship (default; no election required to remain); (b) Territorial Integration — election to pursue territorial incorporation through §15.6, entering as a Territory with the standard §15.2 Statehood pathway available; (c) Full Sovereign Independence — the nation exists outside the Republic's constitutional framework as a fully independent sovereign nation, with the Republic obligated to negotiate a treaty within 24 months governing borders, trade, citizenship, and infrastructure — negotiations are conducted jointly by both executives through the Council of Ministers under §2.14, with the Consul holding primary authority on border and defense terms under §2.1 and the Civic Consul holding primary authority on domestic implementation terms under §2.5; as an independent sovereign the Nation may subsequently seek an Associated Community compact with the Republic under Article XX. The Republic may not prefer, discourage, or offer inducements toward any option. The Republic must provide factual information about each status upon request.</w:t>
+        <w:t xml:space="preserve">An indigenous nation with an established compact under Article XVI holds the constitutional right to initiate a status transition through its own democratic or traditional governance process. Three status options are available: (a) Compact Status — continued Article XVI compact relationship (default; no election required to remain); (b) Territorial Integration — election to pursue territorial incorporation through §15.6, entering as a Territory with the standard §15.2 Statehood pathway available; (c) Full Sovereign Independence — the nation exists outside the Republic's constitutional framework as a fully independent sovereign nation, with the Republic obligated to negotiate a treaty within 24 months governing borders, trade, citizenship, and infrastructure — negotiations are conducted jointly by both executives through the Council of Ministers under §2.14, with the Legat Consul holding primary authority on border and defense terms under §2.1 and the Civic Consul holding primary authority on domestic implementation terms under §2.5; as an independent sovereign the Nation may subsequently seek an Associated Community compact with the Republic under Article XX. The Republic may not prefer, discourage, or offer inducements toward any option. The Republic must provide factual information about each status upon request.</w:t>
       </w:r>
     </w:p>
     <w:p>
@@ -7910,7 +7910,7 @@
           <w:sz w:val="22"/>
           <w:szCs w:val="22"/>
         </w:rPr>
-        <w:t xml:space="preserve">Neither the Consul nor the Civic Consul has any role in the constitutional amendment process. No signature required. No veto available. An amendment takes effect immediately upon LM certification (State Ratification) or Elections Panel certification (Popular Ratification) and NRS publication — no implementation delay, no executive discretion over timing.</w:t>
+        <w:t xml:space="preserve">Neither the Legat Consul nor the Civic Consul has any role in the constitutional amendment process. No signature required. No veto available. An amendment takes effect immediately upon LM certification (State Ratification) or Elections Panel certification (Popular Ratification) and NRS publication — no implementation delay, no executive discretion over timing.</w:t>
       </w:r>
     </w:p>
     <w:p>
@@ -8576,7 +8576,7 @@
           <w:sz w:val="22"/>
           <w:szCs w:val="22"/>
         </w:rPr>
-        <w:t xml:space="preserve">The Republic assumes the public debt obligations of its predecessor government as a constitutional matter — it does not inherit a clean slate. Active military operations of the prior government continue under existing authorization until the §2.2 tier framework can apply; the Consul, once inaugurated, must certify each active operation under the appropriate tier within 14 days or begin orderly cessation; operations not certified within 60 days cease unless the Legislature grants a one-time extension. Social insurance programs — retirement pensions, disability benefits, health coverage — continue uninterrupted during the Transition Window. All benefit obligations to persons who served in military or national service under the prior government are inherited and honored; the Legislature must pass a Veterans and National Service Benefits Act within the first budget cycle following Phase 4. The Republic is the legal continuation of the prior government as a matter of international law; all international obligations, financial commitments, treaty relationships, and contractual obligations of the prior government are assumed as successor sovereign. The immediate nullification of laws conflicting with the Individual Sovereignty Floor creates constitutional disputes; the Legislature must establish an interim Constitutional Claims Court within Phase 2, with jurisdiction over all Article I claims arising from Day Zero nullification.</w:t>
+        <w:t xml:space="preserve">The Republic assumes the public debt obligations of its predecessor government as a constitutional matter — it does not inherit a clean slate. Active military operations of the prior government continue under existing authorization until the §2.2 tier framework can apply; the Legat Consul, once inaugurated, must certify each active operation under the appropriate tier within 14 days or begin orderly cessation; operations not certified within 60 days cease unless the Legislature grants a one-time extension. Social insurance programs — retirement pensions, disability benefits, health coverage — continue uninterrupted during the Transition Window. All benefit obligations to persons who served in military or national service under the prior government are inherited and honored; the Legislature must pass a Veterans and National Service Benefits Act within the first budget cycle following Phase 4. The Republic is the legal continuation of the prior government as a matter of international law; all international obligations, financial commitments, treaty relationships, and contractual obligations of the prior government are assumed as successor sovereign. The immediate nullification of laws conflicting with the Individual Sovereignty Floor creates constitutional disputes; the Legislature must establish an interim Constitutional Claims Court within Phase 2, with jurisdiction over all Article I claims arising from Day Zero nullification.</w:t>
       </w:r>
     </w:p>
     <w:p>

</xml_diff>

<commit_message>
Restore missing Article II — The Dual Executive heading
The Article II heading was accidentally removed during the earlier
provision relocation pass (§3.12/§3.13 move to Article III). When
the stray 'Article II — The Dual Executive' heading between §3.12
and §3.13 was correctly removed, it took with it the only Article II
heading in the document. Article II now has its heading restored
before §2.1. All 20 articles have headings.
</commit_message>
<xml_diff>
--- a/constitution-current.docx
+++ b/constitution-current.docx
@@ -1539,6 +1539,65 @@
           <w:szCs w:val="22"/>
         </w:rPr>
         <w:t xml:space="preserve">No person within the Republic's jurisdiction may be returned, expelled, or extradited to any territory where they face genuine risk of persecution, torture, or deprivation of life. This protection applies regardless of the person's status, conduct, or the nature of the receiving territory's government. This right is non-derogable under §1.19.b.</w:t>
+      </w:r>
+    </w:p>
+    <w:p>
+      <w:pPr>
+        <w:spacing w:after="120" w:before="0"/>
+        <w:ind w:left="431"/>
+        <w:jc w:val="both"/>
+      </w:pPr>
+      <w:r>
+        <w:rPr>
+          <w:rFonts w:ascii="Garamond" w:cs="Garamond" w:eastAsia="Garamond" w:hAnsi="Garamond"/>
+          <w:b w:val="false"/>
+          <w:bCs w:val="false"/>
+          <w:i w:val="false"/>
+          <w:iCs w:val="false"/>
+          <w:color w:val="2a2520"/>
+          <w:sz w:val="22"/>
+          <w:szCs w:val="22"/>
+        </w:rPr>
+        <w:t xml:space="preserve">Where a conflict between constitutional actors creates a risk of suspension of lawful governance or constitutionally mandated essential services, the applicable constitutional default is continuity of lawful governance at existing scope, pending formal resolution. No constitutional actor may use a refusal to certify, approve, or coordinate as a mechanism to achieve the functional suspension of a constitutionally mandated obligation. The burden of justifying a disruption to essential government functions falls on the actor whose conduct creates the risk of disruption — not on the actor seeking to maintain continuity. The SC holds expedited review jurisdiction over any constitutional dispute in which either executive, either chamber, or the JMC reports that continuity of lawful governance is at immediate risk; the Court must act within seven days of such certification; where the SC fails to rule within seven days, the position of the continuity-seeking party is upheld by constitutional operation pending any subsequent ruling. Continuity protections apply to: military operations with active legislative authorization; social state obligations; Monitor operations; NRS availability; and electoral administration.</w:t>
+      </w:r>
+    </w:p>
+    <w:p>
+      <w:pPr>
+        <w:spacing w:after="60" w:before="200"/>
+        <w:jc w:val="left"/>
+      </w:pPr>
+      <w:r>
+        <w:rPr>
+          <w:rFonts w:ascii="Garamond" w:cs="Garamond" w:eastAsia="Garamond" w:hAnsi="Garamond"/>
+          <w:b/>
+          <w:bCs/>
+          <w:i w:val="false"/>
+          <w:iCs w:val="false"/>
+          <w:color w:val="1B2A4A"/>
+          <w:sz w:val="34"/>
+          <w:szCs w:val="34"/>
+        </w:rPr>
+        <w:t xml:space="preserve">Article II — The Dual Executive</w:t>
+      </w:r>
+    </w:p>
+    <w:p>
+      <w:pPr>
+        <w:spacing w:after="120" w:before="0"/>
+        <w:ind w:left="431"/>
+        <w:jc w:val="both"/>
+      </w:pPr>
+      <w:r>
+        <w:rPr>
+          <w:rFonts w:ascii="Garamond" w:cs="Garamond" w:eastAsia="Garamond" w:hAnsi="Garamond"/>
+          <w:b w:val="false"/>
+          <w:bCs w:val="false"/>
+          <w:i w:val="false"/>
+          <w:iCs w:val="false"/>
+          <w:color w:val="2a2520"/>
+          <w:sz w:val="22"/>
+          <w:szCs w:val="22"/>
+        </w:rPr>
+        <w:t xml:space="preserve">Where a conflict between constitutional actors creates a risk of suspension of lawful governance or constitutionally mandated essential services, the applicable constitutional default is continuity of lawful governance at existing scope, pending formal resolution. No constitutional actor may use a refusal to certify, approve, or coordinate as a mechanism to achieve the functional suspension of a constitutionally mandated obligation. The burden of justifying a disruption to essential government functions falls on the actor whose conduct creates the risk of disruption — not on the actor seeking to maintain continuity. The SC holds expedited review jurisdiction over any constitutional dispute in which either executive, either chamber, or the JMC reports that continuity of lawful governance is at immediate risk; the Court must act within seven days of such certification; where the SC fails to rule within seven days, the position of the continuity-seeking party is upheld by constitutional operation pending any subsequent ruling. Continuity protections apply to: military operations with active legislative authorization; social state obligations; Monitor operations; NRS availability; and electoral administration.</w:t>
       </w:r>
     </w:p>
     <w:p>

</xml_diff>

<commit_message>
Remove duplicate §2.15 blocks; fix §10.1 LI→LM
Two issues found via external review (Gemini, reviewing 260530d):

§2.15 duplication: The full text of §2.15 (Constitutional
Continuity) appeared twice as loose unnumbered paragraphs —
once before the Article II heading and once after it, both
between §1.21 and §2.1. Both duplicates removed. §2.15 remains
correctly in its proper place at the end of Article II.

§10.1 LI ghost: 'public mechanism maintained by the LI'
→ 'maintained by the LM'. Final remaining legacy LI
abbreviation in the document.

Note: Gemini's other two findings (stray Article II heading
between §3.12/§3.13, and all other LI/IG instances) were
already resolved in earlier passes.
</commit_message>
<xml_diff>
--- a/constitution-current.docx
+++ b/constitution-current.docx
@@ -1543,26 +1543,6 @@
     </w:p>
     <w:p>
       <w:pPr>
-        <w:spacing w:after="120" w:before="0"/>
-        <w:ind w:left="431"/>
-        <w:jc w:val="both"/>
-      </w:pPr>
-      <w:r>
-        <w:rPr>
-          <w:rFonts w:ascii="Garamond" w:cs="Garamond" w:eastAsia="Garamond" w:hAnsi="Garamond"/>
-          <w:b w:val="false"/>
-          <w:bCs w:val="false"/>
-          <w:i w:val="false"/>
-          <w:iCs w:val="false"/>
-          <w:color w:val="2a2520"/>
-          <w:sz w:val="22"/>
-          <w:szCs w:val="22"/>
-        </w:rPr>
-        <w:t xml:space="preserve">Where a conflict between constitutional actors creates a risk of suspension of lawful governance or constitutionally mandated essential services, the applicable constitutional default is continuity of lawful governance at existing scope, pending formal resolution. No constitutional actor may use a refusal to certify, approve, or coordinate as a mechanism to achieve the functional suspension of a constitutionally mandated obligation. The burden of justifying a disruption to essential government functions falls on the actor whose conduct creates the risk of disruption — not on the actor seeking to maintain continuity. The SC holds expedited review jurisdiction over any constitutional dispute in which either executive, either chamber, or the JMC reports that continuity of lawful governance is at immediate risk; the Court must act within seven days of such certification; where the SC fails to rule within seven days, the position of the continuity-seeking party is upheld by constitutional operation pending any subsequent ruling. Continuity protections apply to: military operations with active legislative authorization; social state obligations; Monitor operations; NRS availability; and electoral administration.</w:t>
-      </w:r>
-    </w:p>
-    <w:p>
-      <w:pPr>
         <w:spacing w:after="60" w:before="200"/>
         <w:jc w:val="left"/>
       </w:pPr>
@@ -1582,26 +1562,6 @@
     </w:p>
     <w:p>
       <w:pPr>
-        <w:spacing w:after="120" w:before="0"/>
-        <w:ind w:left="431"/>
-        <w:jc w:val="both"/>
-      </w:pPr>
-      <w:r>
-        <w:rPr>
-          <w:rFonts w:ascii="Garamond" w:cs="Garamond" w:eastAsia="Garamond" w:hAnsi="Garamond"/>
-          <w:b w:val="false"/>
-          <w:bCs w:val="false"/>
-          <w:i w:val="false"/>
-          <w:iCs w:val="false"/>
-          <w:color w:val="2a2520"/>
-          <w:sz w:val="22"/>
-          <w:szCs w:val="22"/>
-        </w:rPr>
-        <w:t xml:space="preserve">Where a conflict between constitutional actors creates a risk of suspension of lawful governance or constitutionally mandated essential services, the applicable constitutional default is continuity of lawful governance at existing scope, pending formal resolution. No constitutional actor may use a refusal to certify, approve, or coordinate as a mechanism to achieve the functional suspension of a constitutionally mandated obligation. The burden of justifying a disruption to essential government functions falls on the actor whose conduct creates the risk of disruption — not on the actor seeking to maintain continuity. The SC holds expedited review jurisdiction over any constitutional dispute in which either executive, either chamber, or the JMC reports that continuity of lawful governance is at immediate risk; the Court must act within seven days of such certification; where the SC fails to rule within seven days, the position of the continuity-seeking party is upheld by constitutional operation pending any subsequent ruling. Continuity protections apply to: military operations with active legislative authorization; social state obligations; Monitor operations; NRS availability; and electoral administration.</w:t>
-      </w:r>
-    </w:p>
-    <w:p>
-      <w:pPr>
         <w:spacing w:after="60" w:before="200"/>
         <w:ind w:left="431"/>
         <w:jc w:val="left"/>
@@ -5820,7 +5780,7 @@
           <w:sz w:val="22"/>
           <w:szCs w:val="22"/>
         </w:rPr>
-        <w:t xml:space="preserve">The National Record System is the permanent, tamper-evident public record of the Republic — freely accessible to every Inhabitant at no cost. Every constitutional act, order, finding, certification, designation, declaration, and determination made under authority of this Constitution is published to the NRS as a permanent record. No provision of this Constitution need state this obligation individually; it applies universally by operation of this section. Where this Constitution specifies a publication timeline, that timeline governs; in all other cases, publication occurs at or before the effective moment of the act. Records may not be deleted, altered, or reclassified after publication; corrections are published as new entries alongside the original. The NRS must remain fully functional in the event of localized technical failure — no single point of failure is constitutionally acceptable. The Legislature defines technical standards by statute. The NRS includes a permanent historical archive of all prior legislative acts, executive orders, judicial decisions, and government documents dating to the Republic's founding. Records published to the NRS by any jurisdiction within the Republic are recognized as authentic by all other jurisdictions without re-certification. Monitor reports are permanently exempt from classification. Citizens may submit corrections or context to any NRS record through a public mechanism maintained by the LI; submissions are published alongside the original after accuracy review. The NRS is the record of government, not a condition of it. Government acts take legal effect from the moment of issuance regardless of NRS status; the publication obligation applies from the moment the NRS is restored. The JM maintains a continuously operating parallel authentication system, physically and logistically independent of the NRS, capable of authenticating and preserving all constitutional acts without NRS connectivity. This system operates in parallel at all times — not merely as a contingency — and records all authenticated acts with full constitutional effect from the moment of their issuance. Upon NRS restoration, all parallel system records migrate to the NRS as permanent records with their original issuance timestamps. Where the NRS has not been restored within 180 days, the parallel system becomes the constitutional record of the Republic; the Legislature must by statute establish permanent restoration obligations and timelines within 90 days of that threshold. The Legislature defines the technical specifications, security standards, and operational parameters of the parallel system by statute; the constitutional obligation to maintain it is absolute and its funding floor follows the NRS funding floor in this section. Funding for the NRS may not be reduced below the prior year’s level without a 2/3 vote of both chambers. Classification used to conceal a constitutional violation or illegal order is itself a constitutional offense.</w:t>
+        <w:t xml:space="preserve">The National Record System is the permanent, tamper-evident public record of the Republic — freely accessible to every Inhabitant at no cost. Every constitutional act, order, finding, certification, designation, declaration, and determination made under authority of this Constitution is published to the NRS as a permanent record. No provision of this Constitution need state this obligation individually; it applies universally by operation of this section. Where this Constitution specifies a publication timeline, that timeline governs; in all other cases, publication occurs at or before the effective moment of the act. Records may not be deleted, altered, or reclassified after publication; corrections are published as new entries alongside the original. The NRS must remain fully functional in the event of localized technical failure — no single point of failure is constitutionally acceptable. The Legislature defines technical standards by statute. The NRS includes a permanent historical archive of all prior legislative acts, executive orders, judicial decisions, and government documents dating to the Republic's founding. Records published to the NRS by any jurisdiction within the Republic are recognized as authentic by all other jurisdictions without re-certification. Monitor reports are permanently exempt from classification. Citizens may submit corrections or context to any NRS record through a public mechanism maintained by the LM; submissions are published alongside the original after accuracy review. The NRS is the record of government, not a condition of it. Government acts take legal effect from the moment of issuance regardless of NRS status; the publication obligation applies from the moment the NRS is restored. The JM maintains a continuously operating parallel authentication system, physically and logistically independent of the NRS, capable of authenticating and preserving all constitutional acts without NRS connectivity. This system operates in parallel at all times — not merely as a contingency — and records all authenticated acts with full constitutional effect from the moment of their issuance. Upon NRS restoration, all parallel system records migrate to the NRS as permanent records with their original issuance timestamps. Where the NRS has not been restored within 180 days, the parallel system becomes the constitutional record of the Republic; the Legislature must by statute establish permanent restoration obligations and timelines within 90 days of that threshold. The Legislature defines the technical specifications, security standards, and operational parameters of the parallel system by statute; the constitutional obligation to maintain it is absolute and its funding floor follows the NRS funding floor in this section. Funding for the NRS may not be reduced below the prior year’s level without a 2/3 vote of both chambers. Classification used to conceal a constitutional violation or illegal order is itself a constitutional offense.</w:t>
       </w:r>
     </w:p>
     <w:p>

</xml_diff>

<commit_message>
Session 6 testing: spelling fix — offence → offense (6 instances)
Automated structural audit results:
- All 20 article headings present ✓
- No provision numbering gaps or duplicates ✓
- All 166 cross-references point to existing provisions ✓
- All article cross-references valid ✓
- 90 by-statute delegations all constrained ✓
- Provision count consistent at 166 throughout ✓

Only genuine finding: 'offence' (British) vs 'offense' (American)
mixed throughout document. Article I criminal rights provisions
used British spelling; disqualifying offense provisions used
American. Document uses American English throughout. 6 instances
of 'offence' in §1.12, §1.13, §1.14, §1.15 corrected to 'offense'.
All 15 offense/offence instances now consistently 'offense'.
</commit_message>
<xml_diff>
--- a/constitution-current.docx
+++ b/constitution-current.docx
@@ -824,7 +824,7 @@
           <w:sz w:val="22"/>
           <w:szCs w:val="22"/>
         </w:rPr>
-        <w:t xml:space="preserve">Every person accused of a criminal offence holds: the right to be informed promptly of the charges; the right to counsel of their choosing, or to competent, adequately resourced counsel appointed at public expense where they cannot afford representation; the right to adequate time and means to prepare a defense; the right to examine witnesses; the right to silence without adverse inference; and the right to a speedy trial. No person may be penalised — by sentence enhancement or otherwise — solely for exercising the right to trial. Bail may not be used as punishment; its purpose is ensuring appearance and public safety, calibrated to individual circumstances. The Legislature establishes by statute the procedural framework for criminal proceedings, subject to the requirements of this provision. Where algorithmic systems are used as evidence, the accused has the right to examine the system's methodology.</w:t>
+        <w:t xml:space="preserve">Every person accused of a criminal offense holds: the right to be informed promptly of the charges; the right to counsel of their choosing, or to competent, adequately resourced counsel appointed at public expense where they cannot afford representation; the right to adequate time and means to prepare a defense; the right to examine witnesses; the right to silence without adverse inference; and the right to a speedy trial. No person may be penalised — by sentence enhancement or otherwise — solely for exercising the right to trial. Bail may not be used as punishment; its purpose is ensuring appearance and public safety, calibrated to individual circumstances. The Legislature establishes by statute the procedural framework for criminal proceedings, subject to the requirements of this provision. Where algorithmic systems are used as evidence, the accused has the right to examine the system's methodology.</w:t>
       </w:r>
     </w:p>
     <w:p>
@@ -875,7 +875,7 @@
           <w:sz w:val="22"/>
           <w:szCs w:val="22"/>
         </w:rPr>
-        <w:t xml:space="preserve">Every person accused of a criminal offence has the right to a public trial before an independent court. Proceedings may be held in camera only to the minimum extent necessary to protect a compelling interest identified in advance by the court; the existence of any proceeding may not be concealed. This right is non-derogable under §1.19.b.</w:t>
+        <w:t xml:space="preserve">Every person accused of a criminal offense has the right to a public trial before an independent court. Proceedings may be held in camera only to the minimum extent necessary to protect a compelling interest identified in advance by the court; the existence of any proceeding may not be concealed. This right is non-derogable under §1.19.b.</w:t>
       </w:r>
     </w:p>
     <w:p>
@@ -926,7 +926,7 @@
           <w:sz w:val="22"/>
           <w:szCs w:val="22"/>
         </w:rPr>
-        <w:t xml:space="preserve">No person may be convicted of an act that was not a criminal offence when committed, or subjected to a penalty greater than that applicable at the time of the offence. No criminal law may be applied retroactively to the disadvantage of the accused. This right is non-derogable under §1.19.b.</w:t>
+        <w:t xml:space="preserve">No person may be convicted of an act that was not a criminal offense when committed, or subjected to a penalty greater than that applicable at the time of the offense. No criminal law may be applied retroactively to the disadvantage of the accused. This right is non-derogable under §1.19.b.</w:t>
       </w:r>
     </w:p>
     <w:p>
@@ -977,7 +977,7 @@
           <w:sz w:val="22"/>
           <w:szCs w:val="22"/>
         </w:rPr>
-        <w:t xml:space="preserve">No person may be tried or punished twice for the same offence following a final acquittal or conviction. Same offence means the same conduct regardless of how it is labeled or charged; the protection applies to any charge that does not require proof of an element distinct from those required for the original charge. The Legislature defines by statute the scope of this protection above this constitutional floor, including its application across jurisdictions.</w:t>
+        <w:t xml:space="preserve">No person may be tried or punished twice for the same offense following a final acquittal or conviction. Same offense means the same conduct regardless of how it is labeled or charged; the protection applies to any charge that does not require proof of an element distinct from those required for the original charge. The Legislature defines by statute the scope of this protection above this constitutional floor, including its application across jurisdictions.</w:t>
       </w:r>
     </w:p>
     <w:p>

</xml_diff>

<commit_message>
Language: 'simultaneously' → 'in a concurrent vote' in 6 provisions
Applied to Category B uses — the legislative supermajority provisions
where 'simultaneously' was ambiguous about timing:

§2.7  Suspensive veto override
§2.13 Legat Consul legislative removal track
§4.3.b SC justice removal
§7.3  Election postponement
§9.10 Monitor/Panel funding floor protection
§9.14 Monitor General standard track removal

'In a concurrent vote' is standard parliamentary language and
specifies that both chambers act as part of the same coordinated
proceeding, removing the ambiguity of whether 'simultaneously'
means same day, same session, or same legislative period.

Category A uses (8 instances: 'simultaneously removes',
'simultaneously unable', 'properties simultaneously', etc.)
unchanged — those use 'simultaneously' in the clear sense of
two things happening at the same moment, no ambiguity.
</commit_message>
<xml_diff>
--- a/constitution-current.docx
+++ b/constitution-current.docx
@@ -1914,7 +1914,7 @@
           <w:sz w:val="22"/>
           <w:szCs w:val="22"/>
         </w:rPr>
-        <w:t xml:space="preserve">Where the Civic Consul withholds assent from a bill passed by both chambers, the Civic Consul exercises a suspensive veto by returning the bill to the Legislature within the period defined by statute with a written statement of objection specifying constitutional, fiscal, or operational grounds, published to the NRS. The bill is suspended from taking effect during the return and reconsideration period. The Legislature may override the suspensive veto by 2/3 of both chambers simultaneously; a successfully overridden bill takes effect without Civic Consul assent. Where the Legislature does not hold an override vote within the period defined by statute, the bill lapses for that session and may be reintroduced in the next. The suspensive veto may not be used on the annual budget, bills implementing a constitutional obligation, or emergency legislation. The Civic Consul may also object on specific solvency grounds — the bill would cause or materially worsen a structural deficit. Requires MA assessment; the Assembly may override by simple majority after receiving the assessment. If the Civic Consul neither signs nor objects within the legislative review period, the bill is enacted. Silence is not a veto. Both executives review legislation concurrently from the date of final passage; periods and procedures are defined by statute.</w:t>
+        <w:t xml:space="preserve">Where the Civic Consul withholds assent from a bill passed by both chambers, the Civic Consul exercises a suspensive veto by returning the bill to the Legislature within the period defined by statute with a written statement of objection specifying constitutional, fiscal, or operational grounds, published to the NRS. The bill is suspended from taking effect during the return and reconsideration period. The Legislature may override the suspensive veto by 2/3 of both chambers in a concurrent vote; a successfully overridden bill takes effect without Civic Consul assent. Where the Legislature does not hold an override vote within the period defined by statute, the bill lapses for that session and may be reintroduced in the next. The suspensive veto may not be used on the annual budget, bills implementing a constitutional obligation, or emergency legislation. The Civic Consul may also object on specific solvency grounds — the bill would cause or materially worsen a structural deficit. Requires MA assessment; the Assembly may override by simple majority after receiving the assessment. If the Civic Consul neither signs nor objects within the legislative review period, the bill is enacted. Silence is not a veto. Both executives review legislation concurrently from the date of final passage; periods and procedures are defined by statute.</w:t>
       </w:r>
     </w:p>
     <w:p>
@@ -2220,7 +2220,7 @@
           <w:sz w:val="22"/>
           <w:szCs w:val="22"/>
         </w:rPr>
-        <w:t xml:space="preserve">The Legat Consul may be removed on two independent tracks. Under the legislative track, 2/3 of both chambers simultaneously on grounds of constitutional breach, demonstrated permanent incapacity, or conviction for a disqualifying offense. Either chamber may request a JMC assessment as part of the proceedings; any such assessment is published to the NRS. Under the popular track, a Senate majority may refer the question to a national recall referendum administered within the period defined by statute. The Legat Consul is removed if the referendum achieves 60% of votes cast under §13.4 with a minimum 55% citizen participation. A failed referendum may not be re-initiated within the same Legat Consul's term. The Senate Speaker holds Acting Consular Authority from the moment of Senate referral published to the NRS — no active assumption is required or permitted. The military compliance obligations established in §2.9 apply to this transfer.</w:t>
+        <w:t xml:space="preserve">The Legat Consul may be removed on two independent tracks. Under the legislative track, 2/3 of both chambers in a concurrent vote on grounds of constitutional breach, demonstrated permanent incapacity, or conviction for a disqualifying offense. Either chamber may request a JMC assessment as part of the proceedings; any such assessment is published to the NRS. Under the popular track, a Senate majority may refer the question to a national recall referendum administered within the period defined by statute. The Legat Consul is removed if the referendum achieves 60% of votes cast under §13.4 with a minimum 55% citizen participation. A failed referendum may not be re-initiated within the same Legat Consul's term. The Senate Speaker holds Acting Consular Authority from the moment of Senate referral published to the NRS — no active assumption is required or permitted. The military compliance obligations established in §2.9 apply to this transfer.</w:t>
       </w:r>
     </w:p>
     <w:p>
@@ -3333,7 +3333,7 @@
           <w:sz w:val="22"/>
           <w:szCs w:val="22"/>
         </w:rPr>
-        <w:t xml:space="preserve">A Supreme Court justice may be removed only for cause. Three grounds constitute sufficient cause: a published EM finding of constitutional breach in the exercise of judicial authority; certified permanent incapacity jointly certified by the EM and LM; or conviction for a disqualifying offense. Removal requires a 2/3 vote of both chambers simultaneously following publication of the relevant ground. No removal vote may be held within 180 days of a major national election without prior SC review within 48 hours. Judicial disagreement — however profound — does not constitute grounds for removal; the independence of SC judicial judgment is absolute and may not itself be invoked as grounds for removal. Upon removal, the most senior Appellate Court judge auto-designates as Temporary Associate Justice under §4.4 until the vacancy is filled.</w:t>
+        <w:t xml:space="preserve">A Supreme Court justice may be removed only for cause. Three grounds constitute sufficient cause: a published EM finding of constitutional breach in the exercise of judicial authority; certified permanent incapacity jointly certified by the EM and LM; or conviction for a disqualifying offense. Removal requires a 2/3 vote of both chambers in a concurrent vote following publication of the relevant ground. No removal vote may be held within 180 days of a major national election without prior SC review within 48 hours. Judicial disagreement — however profound — does not constitute grounds for removal; the independence of SC judicial judgment is absolute and may not itself be invoked as grounds for removal. Upon removal, the most senior Appellate Court judge auto-designates as Temporary Associate Justice under §4.4 until the vacancy is filled.</w:t>
       </w:r>
     </w:p>
     <w:p>
@@ -4432,7 +4432,7 @@
           <w:sz w:val="22"/>
           <w:szCs w:val="22"/>
         </w:rPr>
-        <w:t xml:space="preserve">Federal elections are held at regular intervals: Assembly elections every two years; Senate elections on the staggered six-year cycle; consular elections every six years. All federal elections use Ranked Choice Voting — majority required, not plurality; consular elections use RCV within the framework of §7.2, which adds the State plurality requirement. The Legislature defines by statute the specific timing, duration, and structure of the federal electoral period within these constitutional floors. All federal elections, referenda, and confirmation votes are administered by the Elections Panel using the National Voting System, free from executive interference. The Legat Consul may not declare, postpone, or influence the scheduling of elections — including declaring emergencies that have the effect of delaying them. No State may take any action that reduces NVS access, functionality, or availability within its territory. States may offer early voting, mail-in ballots, and alternative participation methods provided all methods connect to the NVS and meet its constitutional standards. Special elections for vacancies are administered by the Elections Panel under procedures established by statute. Where the Elections Panel certifies that elections cannot be held across a substantial portion of the Republic due to a natural disaster or catastrophic infrastructure failure, the Legislature may by 2/3 of both chambers simultaneously postpone the affected election for a period not to exceed 90 days, publishing the determination to the NRS; the mandates of sitting members extend automatically for that period only. Only the Elections Panel may certify that conditions have normalized sufficiently for elections to proceed; the postponement lapses and elections must be held immediately upon that certification. No further postponement may be granted without a new Elections Panel certification of impossibility and a new 2/3 legislative determination.</w:t>
+        <w:t xml:space="preserve">Federal elections are held at regular intervals: Assembly elections every two years; Senate elections on the staggered six-year cycle; consular elections every six years. All federal elections use Ranked Choice Voting — majority required, not plurality; consular elections use RCV within the framework of §7.2, which adds the State plurality requirement. The Legislature defines by statute the specific timing, duration, and structure of the federal electoral period within these constitutional floors. All federal elections, referenda, and confirmation votes are administered by the Elections Panel using the National Voting System, free from executive interference. The Legat Consul may not declare, postpone, or influence the scheduling of elections — including declaring emergencies that have the effect of delaying them. No State may take any action that reduces NVS access, functionality, or availability within its territory. States may offer early voting, mail-in ballots, and alternative participation methods provided all methods connect to the NVS and meet its constitutional standards. Special elections for vacancies are administered by the Elections Panel under procedures established by statute. Where the Elections Panel certifies that elections cannot be held across a substantial portion of the Republic due to a natural disaster or catastrophic infrastructure failure, the Legislature may by 2/3 of both chambers in a concurrent vote postpone the affected election for a period not to exceed 90 days, publishing the determination to the NRS; the mandates of sitting members extend automatically for that period only. Only the Elections Panel may certify that conditions have normalized sufficiently for elections to proceed; the postponement lapses and elections must be held immediately upon that certification. No further postponement may be granted without a new Elections Panel certification of impossibility and a new 2/3 legislative determination.</w:t>
       </w:r>
     </w:p>
     <w:p>
@@ -5453,7 +5453,7 @@
           <w:sz w:val="22"/>
           <w:szCs w:val="22"/>
         </w:rPr>
-        <w:t xml:space="preserve">The annual appropriation for each Monitor, the Elections Panel, and the NRS Panel may not fall below the inflation-adjusted equivalent of the prior fiscal year's funding level without a 2/3 vote of both chambers simultaneously. The Monetary Authority certifies each body's prior-year funding level adjusted for inflation and publishes the certified floor to the NRS before the Legislature begins its annual budget process. Where a budget reduces any protected body below its certified inflation-adjusted floor without the required supermajority, the prior-year funding level takes effect automatically for that body by constitutional operation.</w:t>
+        <w:t xml:space="preserve">The annual appropriation for each Monitor, the Elections Panel, and the NRS Panel may not fall below the inflation-adjusted equivalent of the prior fiscal year's funding level without a 2/3 vote of both chambers in a concurrent vote. The Monetary Authority certifies each body's prior-year funding level adjusted for inflation and publishes the certified floor to the NRS before the Legislature begins its annual budget process. Where a budget reduces any protected body below its certified inflation-adjusted floor without the required supermajority, the prior-year funding level takes effect automatically for that body by constitutional operation.</w:t>
       </w:r>
     </w:p>
     <w:p>
@@ -5710,7 +5710,7 @@
           <w:sz w:val="22"/>
           <w:szCs w:val="22"/>
         </w:rPr>
-        <w:t xml:space="preserve">This section governs for-cause removal of all constitutionally confirmed independent officers except Supreme Court justices (§4.3.b) and elected executives. Two removal tracks are available. Under the Standard Track, the charging party files stated grounds with the SC under §9.9; the SC confirms grounds within 14 days; duty suspension activates immediately on confirmation; removal requires a 2/3 vote of both chambers simultaneously; no removal vote may be held within 180 days of a major national election without prior SC review within 48 hours. Under the Judicial Track, where two of the three Monitors jointly assess and report for-cause grounds and petition the SC, the SC determines within 30 days whether the certified grounds constitute sufficient cause for suspension; where the SC fails to rule within 30 days, cause is deemed found by constitutional operation; if cause is found or deemed found, the officer is suspended and the most senior deputy acts in the interim; the Senate has 60 days to hold a removal vote, with 3/5 required for permanent removal; a vote failing 3/5 reinstates the officer and closes the process; where the Senate fails to vote within 60 days, the matter is placed before the next federal electoral period ballot or a Legislature-set special election with a minimum 90-day notice period; removal by election requires 60% of votes cast. The Judicial Track is available where the Standard Track’s legislative threshold appears unreachable due to demonstrated political gridlock. Officers subject to this framework include the Monitor Generals and any other officers whose selection process is established by this Constitution rather than by statute. Officers of independent agencies established under §3.9 are not subject to this framework; their removal is governed by the statute establishing the relevant agency, which must preserve the for-cause removal principle. Provisions governing specific offices may cross-reference this section without restating its terms.</w:t>
+        <w:t xml:space="preserve">This section governs for-cause removal of all constitutionally confirmed independent officers except Supreme Court justices (§4.3.b) and elected executives. Two removal tracks are available. Under the Standard Track, the charging party files stated grounds with the SC under §9.9; the SC confirms grounds within 14 days; duty suspension activates immediately on confirmation; removal requires a 2/3 vote of both chambers in a concurrent vote; no removal vote may be held within 180 days of a major national election without prior SC review within 48 hours. Under the Judicial Track, where two of the three Monitors jointly assess and report for-cause grounds and petition the SC, the SC determines within 30 days whether the certified grounds constitute sufficient cause for suspension; where the SC fails to rule within 30 days, cause is deemed found by constitutional operation; if cause is found or deemed found, the officer is suspended and the most senior deputy acts in the interim; the Senate has 60 days to hold a removal vote, with 3/5 required for permanent removal; a vote failing 3/5 reinstates the officer and closes the process; where the Senate fails to vote within 60 days, the matter is placed before the next federal electoral period ballot or a Legislature-set special election with a minimum 90-day notice period; removal by election requires 60% of votes cast. The Judicial Track is available where the Standard Track’s legislative threshold appears unreachable due to demonstrated political gridlock. Officers subject to this framework include the Monitor Generals and any other officers whose selection process is established by this Constitution rather than by statute. Officers of independent agencies established under §3.9 are not subject to this framework; their removal is governed by the statute establishing the relevant agency, which must preserve the for-cause removal principle. Provisions governing specific offices may cross-reference this section without restating its terms.</w:t>
       </w:r>
     </w:p>
     <w:p>

</xml_diff>

<commit_message>
Timeline pass: 3 administrative timelines → statutory delegation
Comprehensive audit of all 47 time-specific provisions found:
- 8 already using correct ceiling language ('not to exceed X',
  'period defined by statute') — left unchanged
- 26 intentional constitutional protections — left unchanged
  (rights protections, military timelines, election proximity
  bars, amendment stability requirements, etc.)
- 5 transition/eligibility provisions — left unchanged
- 3 genuine administrative candidates — updated:

§9.12 Pool compliance: 'within 60 days' →
  'within the period defined by statute'

§15.3 State remediation plan: 'within 60 days' →
  'within the period defined by statute'

§16.7.a Status election NRS publication: 'within 30 days' →
  'within the period defined by statute following the
  governance decision'

search-index.js regenerated to reflect changes.
</commit_message>
<xml_diff>
--- a/constitution-current.docx
+++ b/constitution-current.docx
@@ -5604,7 +5604,7 @@
           <w:sz w:val="22"/>
           <w:szCs w:val="22"/>
         </w:rPr>
-        <w:t xml:space="preserve">The Elections Panel maintains all constitutional candidate registries and pools as the administrative keeper of record. The Elections Panel receives applications, stores records, provides public access via the NRS, and enters certified applicants into the relevant registry or pool. The Elections Panel may not exclude any applicant who has been certified as eligible by the appropriate Monitor. The appropriate Monitor reviews each applicant against the qualification requirements for that registry or pool and publishes a certification to the NRS. Where an office involves significant financial authority, the EM reviews financial disclosure concurrently. Pool records and certifications are public NRS records at all times. The Joint Monitor Council conducts the draw in a public session, certifies the result jointly, and publishes it to the NRS. Where selection is by deliberate nomination, the named officer nominates from certified pool members. Where confirmation is required, the Senate must act within the period defined by the establishing provision; failure to confirm within that period is a constitutional compliance breach reported by the LM. The JM monitors all constitutional pools annually and publishes a status report. The constitutional minimum for all pools is five eligible members; where a pool falls below five, the JM publishes a compliance breach and the relevant nominating bodies must act to restore the minimum within 60 days. Where a pool reaches zero before an acting designation is made, the most senior eligible federal judge by continuous service who is not currently serving in any constitutional office serves as Acting officer until the pool is restored and a designation is made under the ordinary acting mechanism; this fallback applies only to judicial and Monitor pools.</w:t>
+        <w:t xml:space="preserve">The Elections Panel maintains all constitutional candidate registries and pools as the administrative keeper of record. The Elections Panel receives applications, stores records, provides public access via the NRS, and enters certified applicants into the relevant registry or pool. The Elections Panel may not exclude any applicant who has been certified as eligible by the appropriate Monitor. The appropriate Monitor reviews each applicant against the qualification requirements for that registry or pool and publishes a certification to the NRS. Where an office involves significant financial authority, the EM reviews financial disclosure concurrently. Pool records and certifications are public NRS records at all times. The Joint Monitor Council conducts the draw in a public session, certifies the result jointly, and publishes it to the NRS. Where selection is by deliberate nomination, the named officer nominates from certified pool members. Where confirmation is required, the Senate must act within the period defined by the establishing provision; failure to confirm within that period is a constitutional compliance breach reported by the LM. The JM monitors all constitutional pools annually and publishes a status report. The constitutional minimum for all pools is five eligible members; where a pool falls below five, the JM publishes a compliance breach and the relevant nominating bodies must act to restore the minimum within the period defined by statute. Where a pool reaches zero before an acting designation is made, the most senior eligible federal judge by continuous service who is not currently serving in any constitutional office serves as Acting officer until the pool is restored and a designation is made under the ordinary acting mechanism; this fallback applies only to judicial and Monitor pools.</w:t>
       </w:r>
     </w:p>
     <w:p>
@@ -7133,7 +7133,7 @@
           <w:sz w:val="22"/>
           <w:szCs w:val="22"/>
         </w:rPr>
-        <w:t xml:space="preserve">A State enters Mandatory Devolution if it fails three consecutive annual Statehood Audits, certified by the LM and confirmed by both the EM and JM. After each failing audit, the LM publishes an Early Warning specifying compliance requirements; the State must publish a Remediation Plan within 60 days. After three consecutive failures, citizens vote on one of three paths: a two-year federal remediation commission; a State-managed remediation plan subject to LM quarterly assessment of progress against the published compliance requirements; or devolution to Territory status. The chosen path is published to the NRS. A State-managed plan that fails two consecutive quarterly assessments automatically triggers a new citizen vote between the remaining two options. A devolved State returns to Territory status. Sitting senators complete their current elected terms — Senate seats are not vacated — but no new Senate elections may be held until Statehood is restored; existing Assembly members complete their current terms; Article I rights and social state protections continue without interruption. Restoration to Statehood is automatic upon passing the Statehood Audit and completing the Provisional Membership Period. Within 30 days of devolution taking effect, the affected State may petition the SC on the sole ground that the audit findings are factually insufficient to establish three consecutive failures; the Court reviews only the factual basis and must rule within 14 days.</w:t>
+        <w:t xml:space="preserve">A State enters Mandatory Devolution if it fails three consecutive annual Statehood Audits, certified by the LM and confirmed by both the EM and JM. After each failing audit, the LM publishes an Early Warning specifying compliance requirements; the State must publish a Remediation Plan within the period defined by statute. After three consecutive failures, citizens vote on one of three paths: a two-year federal remediation commission; a State-managed remediation plan subject to LM quarterly assessment of progress against the published compliance requirements; or devolution to Territory status. The chosen path is published to the NRS. A State-managed plan that fails two consecutive quarterly assessments automatically triggers a new citizen vote between the remaining two options. A devolved State returns to Territory status. Sitting senators complete their current elected terms — Senate seats are not vacated — but no new Senate elections may be held until Statehood is restored; existing Assembly members complete their current terms; Article I rights and social state protections continue without interruption. Restoration to Statehood is automatic upon passing the Statehood Audit and completing the Provisional Membership Period. Within 30 days of devolution taking effect, the affected State may petition the SC on the sole ground that the audit findings are factually insufficient to establish three consecutive failures; the Court reviews only the factual basis and must rule within 14 days.</w:t>
       </w:r>
     </w:p>
     <w:p>
@@ -7772,7 +7772,7 @@
           <w:sz w:val="22"/>
           <w:szCs w:val="22"/>
         </w:rPr>
-        <w:t xml:space="preserve">A status election under §16.7 requires: (1) a decision by the nation's own governance process, meeting the standards the nation itself defines for major governance decisions; and (2) publication of the election to the NRS within 30 days of the governance decision. A status election is irrevocable — a Nation that elects Territorial Integration or Full Sovereign Independence may not subsequently return to Article XVI compact status. Once a Nation has transitioned to Territory or State status, any further changes follow the standard constitutional processes applicable to that status under Articles XIII and XIX — including mandatory devolution under §15.3 if three consecutive Statehood Audits are failed. A Territory or State that formerly held Article XVI compact status has no special pathway back to compact status; the irrevocability of the status election is unconditional. Once a Nation has elected Full Sovereign Independence, any subsequent relationship with the Republic — including Associated Community status under Article XX — is pursued as an independent sovereign; Associated Community status requires full independence first and cannot be elected directly from compact status. At ratification, the Republic must formally notify all recognized indigenous compact nations of their rights under §16.7.</w:t>
+        <w:t xml:space="preserve">A status election under §16.7 requires: (1) a decision by the nation's own governance process, meeting the standards the nation itself defines for major governance decisions; and (2) publication of the election to the NRS within the period defined by statute following the governance decision. A status election is irrevocable — a Nation that elects Territorial Integration or Full Sovereign Independence may not subsequently return to Article XVI compact status. Once a Nation has transitioned to Territory or State status, any further changes follow the standard constitutional processes applicable to that status under Articles XIII and XIX — including mandatory devolution under §15.3 if three consecutive Statehood Audits are failed. A Territory or State that formerly held Article XVI compact status has no special pathway back to compact status; the irrevocability of the status election is unconditional. Once a Nation has elected Full Sovereign Independence, any subsequent relationship with the Republic — including Associated Community status under Article XX — is pursued as an independent sovereign; Associated Community status requires full independence first and cannot be elected directly from compact status. At ratification, the Republic must formally notify all recognized indigenous compact nations of their rights under §16.7.</w:t>
       </w:r>
     </w:p>
     <w:p>

</xml_diff>

<commit_message>
§9.7 removed; dereliction definition folded into §9.1.b
§9.7 (Triggered Investigations) removed as a standalone provision.
Content folded into §9.1.b where the EM's specific audit mandate
already lives:

'The EM audits constitutional officers for dereliction — failure
to perform a constitutionally mandated function within the required
period where that failure was not caused by circumstances genuinely
beyond the officer's control; political disagreement with a
constitutional requirement is not a defense.'

The definition is preserved where it belongs — as part of the
EM's described mandate — rather than as a separate provision
describing the same role. Provision count: 166 → 165.
</commit_message>
<xml_diff>
--- a/constitution-current.docx
+++ b/constitution-current.docx
@@ -4792,7 +4792,7 @@
           <w:sz w:val="22"/>
           <w:szCs w:val="22"/>
         </w:rPr>
-        <w:t xml:space="preserve">The EM audits both executives and the Monetary Authority. Annual responsibilities include: military compliance assessment covering whether tier authorizations were followed, whether the §2.3 intelligence warrant requirement was maintained, and whether fund certifications were observed; publishing clemency background reports before any executive act; reviewing disclosure records for constitutional appointments; and auditing electoral finance within the period defined by statute following any election.</w:t>
+        <w:t xml:space="preserve">The EM audits both executives and the Monetary Authority. Annual responsibilities include: military compliance assessment covering whether tier authorizations were followed, whether the §2.3 intelligence warrant requirement was maintained, and whether fund certifications were observed; publishing clemency background reports before any executive act; reviewing disclosure records for constitutional appointments; and auditing electoral finance within the period defined by statute following any election. The EM audits constitutional officers for dereliction — failure to perform a constitutionally mandated function within the required period where that failure was not caused by circumstances genuinely beyond the officer’s control; political disagreement with a constitutional requirement is not a defense.</w:t>
       </w:r>
     </w:p>
     <w:p>
@@ -5250,57 +5250,6 @@
           <w:szCs w:val="22"/>
         </w:rPr>
         <w:t xml:space="preserve">Every finding, report, and discrepancy notice must be published to the NRS permanently and free of charge; no official may suppress, delay, classify, or alter an Monitor report before publication. Monitor reports are permanently exempt from classification. Where any Monitor publishes a Critical Failure finding, the Legislature must publish a remediation plan with actions and timelines within the period defined by statute; failure to publish a remediation plan is a constitutional compliance breach. Any staff member may publish a minority report directly to the NRS if they believe a finding has been improperly omitted or suppressed — staff cannot be disciplined for doing so. All three Monitors jointly publish an annual State of the Republic report on a fixed date regardless of whether any political actor requests it. Where a compliance question spans multiple Monitor mandates, the Monitors may conduct a joint investigation; neither Monitor General may veto the other's contribution. All three Monitors have unrestricted access to records, personnel, facilities, and systems within their audit mandate; obstruction is a constitutional breach.</w:t>
-      </w:r>
-    </w:p>
-    <w:p>
-      <w:pPr>
-        <w:spacing w:after="60" w:before="200"/>
-        <w:ind w:left="431"/>
-        <w:jc w:val="left"/>
-      </w:pPr>
-      <w:r>
-        <w:rPr>
-          <w:rFonts w:ascii="Courier New" w:cs="Courier New" w:eastAsia="Courier New" w:hAnsi="Courier New"/>
-          <w:b/>
-          <w:bCs/>
-          <w:color w:val="1B2A4A"/>
-          <w:sz w:val="18"/>
-          <w:szCs w:val="18"/>
-        </w:rPr>
-        <w:t xml:space="preserve">§9.7  </w:t>
-      </w:r>
-      <w:r>
-        <w:rPr>
-          <w:rFonts w:ascii="Garamond" w:cs="Garamond" w:eastAsia="Garamond" w:hAnsi="Garamond"/>
-          <w:b/>
-          <w:bCs/>
-          <w:i w:val="false"/>
-          <w:iCs w:val="false"/>
-          <w:color w:val="1B2A4A"/>
-          <w:sz w:val="22"/>
-          <w:szCs w:val="22"/>
-        </w:rPr>
-        <w:t xml:space="preserve">Triggered Investigations</w:t>
-      </w:r>
-    </w:p>
-    <w:p>
-      <w:pPr>
-        <w:spacing w:after="120" w:before="0"/>
-        <w:ind w:left="431"/>
-        <w:jc w:val="both"/>
-      </w:pPr>
-      <w:r>
-        <w:rPr>
-          <w:rFonts w:ascii="Garamond" w:cs="Garamond" w:eastAsia="Garamond" w:hAnsi="Garamond"/>
-          <w:b w:val="false"/>
-          <w:bCs w:val="false"/>
-          <w:i w:val="false"/>
-          <w:iCs w:val="false"/>
-          <w:color w:val="2a2520"/>
-          <w:sz w:val="22"/>
-          <w:szCs w:val="22"/>
-        </w:rPr>
-        <w:t xml:space="preserve">The EM may investigate a constitutional officer for dereliction — failure to perform a constitutionally mandated function within the required period where that failure was not caused by circumstances genuinely beyond the officer's control. Political disagreement with a constitutional requirement is not a defense.</w:t>
       </w:r>
     </w:p>
     <w:p>

</xml_diff>

<commit_message>
New provisions and fixes
</commit_message>
<xml_diff>
--- a/constitution-current.docx
+++ b/constitution-current.docx
@@ -3060,6 +3060,56 @@
     </w:p>
     <w:p>
       <w:pPr>
+        <w:spacing w:after="80" w:before="200"/>
+        <w:ind w:left="431"/>
+      </w:pPr>
+      <w:r>
+        <w:rPr>
+          <w:rFonts w:ascii="Courier New" w:cs="Courier New" w:eastAsia="Courier New" w:hAnsi="Courier New"/>
+          <w:b/>
+          <w:bCs/>
+          <w:color w:val="1B2A4A"/>
+          <w:sz w:val="18"/>
+          <w:szCs w:val="18"/>
+        </w:rPr>
+        <w:t xml:space="preserve">§3.14  </w:t>
+      </w:r>
+      <w:r>
+        <w:rPr>
+          <w:rFonts w:ascii="Garamond" w:cs="Garamond" w:eastAsia="Garamond" w:hAnsi="Garamond"/>
+          <w:b/>
+          <w:bCs/>
+          <w:i w:val="false"/>
+          <w:iCs w:val="false"/>
+          <w:color w:val="1B2A4A"/>
+          <w:sz w:val="22"/>
+          <w:szCs w:val="22"/>
+        </w:rPr>
+        <w:t xml:space="preserve">Federal Legislative Competence</w:t>
+      </w:r>
+    </w:p>
+    <w:p>
+      <w:pPr>
+        <w:spacing w:after="120" w:before="0"/>
+        <w:ind w:left="431"/>
+        <w:jc w:val="both"/>
+      </w:pPr>
+      <w:r>
+        <w:rPr>
+          <w:rFonts w:ascii="Garamond" w:cs="Garamond" w:eastAsia="Garamond" w:hAnsi="Garamond"/>
+          <w:b w:val="false"/>
+          <w:bCs w:val="false"/>
+          <w:i w:val="false"/>
+          <w:iCs w:val="false"/>
+          <w:color w:val="2a2520"/>
+          <w:sz w:val="22"/>
+          <w:szCs w:val="22"/>
+        </w:rPr>
+        <w:t xml:space="preserve">The Legislature holds general authority to legislate for the peace, order, and good governance of the Republic. It may not enact legislation that destroys the capacity of States to govern themselves as self-governing communities. Where federal law and State law conflict, federal law prevails to the extent of the conflict. The Legislature may set minimum standards that States must meet but may not direct State institutions as instruments of federal administration.</w:t>
+      </w:r>
+    </w:p>
+    <w:p>
+      <w:pPr>
         <w:spacing w:after="60" w:before="200"/>
         <w:jc w:val="left"/>
       </w:pPr>
@@ -6381,6 +6431,106 @@
           <w:szCs w:val="22"/>
         </w:rPr>
         <w:t xml:space="preserve">No government official may set their own compensation or the compensation of their direct supervisors. All official compensation is set by statute and is a public record on the NRS. Official benefits and accommodations beyond compensation reflect the functional requirements of the office, not the status of the officeholder. No benefit may exceed what the function genuinely requires. Departures from ordinary professional standards require a demonstrable operational need, documented and published to the NRS, and are limited to the minimum extent that need requires.</w:t>
+      </w:r>
+    </w:p>
+    <w:p>
+      <w:pPr>
+        <w:spacing w:after="80" w:before="200"/>
+        <w:ind w:left="431"/>
+      </w:pPr>
+      <w:r>
+        <w:rPr>
+          <w:rFonts w:ascii="Courier New" w:cs="Courier New" w:eastAsia="Courier New" w:hAnsi="Courier New"/>
+          <w:b/>
+          <w:bCs/>
+          <w:color w:val="1B2A4A"/>
+          <w:sz w:val="18"/>
+          <w:szCs w:val="18"/>
+        </w:rPr>
+        <w:t xml:space="preserve">§12.7  </w:t>
+      </w:r>
+      <w:r>
+        <w:rPr>
+          <w:rFonts w:ascii="Garamond" w:cs="Garamond" w:eastAsia="Garamond" w:hAnsi="Garamond"/>
+          <w:b/>
+          <w:bCs/>
+          <w:i w:val="false"/>
+          <w:iCs w:val="false"/>
+          <w:color w:val="1B2A4A"/>
+          <w:sz w:val="22"/>
+          <w:szCs w:val="22"/>
+        </w:rPr>
+        <w:t xml:space="preserve">Internal Commerce</w:t>
+      </w:r>
+    </w:p>
+    <w:p>
+      <w:pPr>
+        <w:spacing w:after="120" w:before="0"/>
+        <w:ind w:left="431"/>
+        <w:jc w:val="both"/>
+      </w:pPr>
+      <w:r>
+        <w:rPr>
+          <w:rFonts w:ascii="Garamond" w:cs="Garamond" w:eastAsia="Garamond" w:hAnsi="Garamond"/>
+          <w:b w:val="false"/>
+          <w:bCs w:val="false"/>
+          <w:i w:val="false"/>
+          <w:iCs w:val="false"/>
+          <w:color w:val="2a2520"/>
+          <w:sz w:val="22"/>
+          <w:szCs w:val="22"/>
+        </w:rPr>
+        <w:t xml:space="preserve">No State or Territory may impose requirements on goods, services, or economic activity originating in another State or Territory that are more burdensome than those applied to its own. The Legislature may establish uniform internal commerce standards by statute.</w:t>
+      </w:r>
+    </w:p>
+    <w:p>
+      <w:pPr>
+        <w:spacing w:after="80" w:before="200"/>
+        <w:ind w:left="431"/>
+      </w:pPr>
+      <w:r>
+        <w:rPr>
+          <w:rFonts w:ascii="Courier New" w:cs="Courier New" w:eastAsia="Courier New" w:hAnsi="Courier New"/>
+          <w:b/>
+          <w:bCs/>
+          <w:color w:val="1B2A4A"/>
+          <w:sz w:val="18"/>
+          <w:szCs w:val="18"/>
+        </w:rPr>
+        <w:t xml:space="preserve">§12.8  </w:t>
+      </w:r>
+      <w:r>
+        <w:rPr>
+          <w:rFonts w:ascii="Garamond" w:cs="Garamond" w:eastAsia="Garamond" w:hAnsi="Garamond"/>
+          <w:b/>
+          <w:bCs/>
+          <w:i w:val="false"/>
+          <w:iCs w:val="false"/>
+          <w:color w:val="1B2A4A"/>
+          <w:sz w:val="22"/>
+          <w:szCs w:val="22"/>
+        </w:rPr>
+        <w:t xml:space="preserve">Fiscal Equalization</w:t>
+      </w:r>
+    </w:p>
+    <w:p>
+      <w:pPr>
+        <w:spacing w:after="120" w:before="0"/>
+        <w:ind w:left="431"/>
+        <w:jc w:val="both"/>
+      </w:pPr>
+      <w:r>
+        <w:rPr>
+          <w:rFonts w:ascii="Garamond" w:cs="Garamond" w:eastAsia="Garamond" w:hAnsi="Garamond"/>
+          <w:b w:val="false"/>
+          <w:bCs w:val="false"/>
+          <w:i w:val="false"/>
+          <w:iCs w:val="false"/>
+          <w:color w:val="2a2520"/>
+          <w:sz w:val="22"/>
+          <w:szCs w:val="22"/>
+        </w:rPr>
+        <w:t xml:space="preserve">The Legislature shall by statute establish a mechanism ensuring that every State and Territory has fiscal capacity reasonably sufficient to fulfil the Social State obligations under §12.1 and the rights guaranteed under Article I. The mechanism is reviewed at intervals the Legislature defines by statute. The EM certifies whether the mechanism is operating as required and publishes its finding to the NRS annually. Where the EM finds the mechanism has failed, the Legislature must respond within 90 days.</w:t>
       </w:r>
     </w:p>
     <w:p>

</xml_diff>

<commit_message>
Constitution cursory review — 4 fixes, quickref reconciled
Broken cross-references fixed:
- §12.2: removed dangling §2.15 reference (was removed during trimming);
  replaced with self-contained phrase covering judicial operations,
  active defense authorizations under §14.2, and social state continuity under §12.1
- §17.1: corrected §9.2–§9.5 range to §9.2–§9.4 (§9.5 was removed during trimming)

Grammar fixed:
- §3.3: 'a primary criterion' → 'primary criteria' (plural list)
- §16.7: 'As an independent sovereign the Nation' → added missing comma

Quickref reconciled:
- §1.7.a, §1.19.f, §2.6.b — noted as folded into parent provisions
- §4.4.b — corrected: content enacted as §12.4.a, not §4.4.b
- §19.10 — noted as covered by §5.1 + §19.5 successor sovereignty
- All five phantom sub-provisions resolved; DOCX remains at 158 provisions
</commit_message>
<xml_diff>
--- a/constitution-current.docx
+++ b/constitution-current.docx
@@ -2391,7 +2391,7 @@
           <w:sz w:val="22"/>
           <w:szCs w:val="22"/>
         </w:rPr>
-        <w:t xml:space="preserve">States draw their own Assembly district maps subject to five criteria: population equality within reasonable tolerance; geographic contiguity; compliance with §1.6 non-discrimination; no intentional dilution of minority voting power; and reasonable compactness. Maps may not be drawn using voter political affiliation data, voting history data, incumbent residence, or racial composition as a primary criterion. The LM reviews all maps for compliance and publishes findings to the NRS. Where a map fails, the Elections Panel draws an interim compliant map that takes effect at the next election and is retired when the State submits a compliant map. Territorial districts are drawn by the Elections Panel under the same criteria. Any citizen, State government, or parliamentary minority may challenge a map before the SC.</w:t>
+        <w:t xml:space="preserve">States draw their own Assembly district maps subject to five criteria: population equality within reasonable tolerance; geographic contiguity; compliance with §1.6 non-discrimination; no intentional dilution of minority voting power; and reasonable compactness. Maps may not be drawn using voter political affiliation data, voting history data, incumbent residence, or racial composition as primary criteria. The LM reviews all maps for compliance and publishes findings to the NRS. Where a map fails, the Elections Panel draws an interim compliant map that takes effect at the next election and is retired when the State submits a compliant map. Territorial districts are drawn by the Elections Panel under the same criteria. Any citizen, State government, or parliamentary minority may challenge a map before the SC.</w:t>
       </w:r>
     </w:p>
     <w:p>
@@ -5556,7 +5556,7 @@
           <w:sz w:val="22"/>
           <w:szCs w:val="22"/>
         </w:rPr>
-        <w:t xml:space="preserve">The Legislature must pass a balanced budget or publish a structural deficit justification reviewed by the MA for fiscal accuracy. Structural deficits above the threshold defined by the MA require a published plan for return to balance. Where the Legislature fails to enact a budget by the constitutional deadline defined by statute, an interim automatic appropriation takes effect by constitutional operation covering: the functions protected under §2.15; civil service compensation; and debt service obligations. The interim appropriation continues at the prior fiscal year’s inflation-adjusted level until a budget is enacted; no new programs may be initiated or expanded under the interim appropriation. Where discretionary government spending is suspended due to budget failure, the pay of all members of both chambers is withheld from the same date on which government employee pay is withheld and released only upon budget enactment. The Legislature must fund the National Endowment by appropriation in years of fiscal surplus; failure to adequately fund the Endowment is a constitutional compliance breach.</w:t>
+        <w:t xml:space="preserve">The Legislature must pass a balanced budget or publish a structural deficit justification reviewed by the MA for fiscal accuracy. Structural deficits above the threshold defined by the MA require a published plan for return to balance. Where the Legislature fails to enact a budget by the constitutional deadline defined by statute, an interim automatic appropriation takes effect by constitutional operation covering: judicial operations, active defense authorizations under §14.2, and social state continuity under §12.1; civil service compensation; and debt service obligations. The interim appropriation continues at the prior fiscal year’s inflation-adjusted level until a budget is enacted; no new programs may be initiated or expanded under the interim appropriation. Where discretionary government spending is suspended due to budget failure, the pay of all members of both chambers is withheld from the same date on which government employee pay is withheld and released only upon budget enactment. The Legislature must fund the National Endowment by appropriation in years of fiscal surplus; failure to adequately fund the Endowment is a constitutional compliance breach.</w:t>
       </w:r>
     </w:p>
     <w:p>
@@ -7181,7 +7181,7 @@
           <w:sz w:val="22"/>
           <w:szCs w:val="22"/>
         </w:rPr>
-        <w:t xml:space="preserve">An indigenous nation recognized under this Article holds the constitutional right to initiate a status transition through its own democratic or traditional governance process. Three status options are available: (a) Continued Status — the Nation’s existing compact or treaty relationship under this Article continues (default; no election required to remain); (b) Territorial Integration — election to pursue territorial incorporation through §15.6, entering as a Territory with the standard §15.2 Statehood pathway available; (c) Full Sovereign Independence — the nation exists outside the Republic's constitutional framework as a fully independent sovereign nation, with the Republic obligated to negotiate a treaty within 24 months governing borders, trade, citizenship, and infrastructure — negotiations are conducted jointly by both executives through the Council of Ministers under §2.14, with the Legat Consul holding primary authority on border and defense terms under §2.1 and the Civic Consul holding primary authority on domestic implementation terms under §2.5; the Legislature ratifies the treaty by 2/3 of both chambers. As an independent sovereign the Nation may subsequently seek an Associated Community compact with the Republic under Article XX. The Republic may not prefer, discourage, or offer inducements toward any option. The Republic must provide factual information about each status upon request.</w:t>
+        <w:t xml:space="preserve">An indigenous nation recognized under this Article holds the constitutional right to initiate a status transition through its own democratic or traditional governance process. Three status options are available: (a) Continued Status — the Nation’s existing compact or treaty relationship under this Article continues (default; no election required to remain); (b) Territorial Integration — election to pursue territorial incorporation through §15.6, entering as a Territory with the standard §15.2 Statehood pathway available; (c) Full Sovereign Independence — the nation exists outside the Republic's constitutional framework as a fully independent sovereign nation, with the Republic obligated to negotiate a treaty within 24 months governing borders, trade, citizenship, and infrastructure — negotiations are conducted jointly by both executives through the Council of Ministers under §2.14, with the Legat Consul holding primary authority on border and defense terms under §2.1 and the Civic Consul holding primary authority on domestic implementation terms under §2.5; the Legislature ratifies the treaty by 2/3 of both chambers. As an independent sovereign, the Nation may subsequently seek an Associated Community compact with the Republic under Article XX. The Republic may not prefer, discourage, or offer inducements toward any option. The Republic must provide factual information about each status upon request.</w:t>
       </w:r>
     </w:p>
     <w:p>
@@ -7307,7 +7307,7 @@
           <w:szCs w:val="22"/>
         </w:rPr>
         <w:t xml:space="preserve">This Constitution may be amended through the parliamentary path or through citizen initiative. No executive signature is required; no executive veto applies. Every member’s vote on any amendment is published to the NRS.
-A parliamentary amendment requires a 2/3 supermajority of the full seated membership of both chambers. The proposing body simultaneously specifies the ratification mechanism — either State Ratification (ratification by 2/3 of States within the period defined by statute) or Popular Ratification (a national popular referendum achieving 2/3 affirmative support with at least 55% citizen participation within 180 days). Citizen Initiative Amendment: A proposed constitutional amendment proceeds through the same two-phase petition process as §13.2, with Phase Two requiring signatures from 15% of eligible voters nationally rather than §13.2’s 10%. Once the Phase Two threshold is met, the proposal proceeds directly to a national referendum, with no legislative or executive action required to place it on the ballot; the Elections Panel administers the referendum within 180 days of Phase Two threshold verification. Passage requires 70% of votes cast with a minimum 65% citizen participation; where the participation floor is not met the initiative fails and may not be resubmitted on the same or substantially similar grounds for five years. Citizen initiative amendments are subject to §17.3 consistency analysis by the JM, advisory only. Amendment of the following provisions requires Popular Ratification regardless of the amendment’s origin: the Monitor selection mechanisms and independence protections (§9.2–§9.5), the Monitor information-only mandate and non-dependency principle (§9.1), the Monitor funding guarantee (§9.10), the NRS architecture and permanence requirements (§10.1), and the Elections Panel and NRS Panel independence (§11.1). These provisions may not be amended by State Ratification alone; a Citizen Initiative Amendment satisfies this requirement through its own referendum under this section without separately clearing the Popular Ratification threshold.</w:t>
+A parliamentary amendment requires a 2/3 supermajority of the full seated membership of both chambers. The proposing body simultaneously specifies the ratification mechanism — either State Ratification (ratification by 2/3 of States within the period defined by statute) or Popular Ratification (a national popular referendum achieving 2/3 affirmative support with at least 55% citizen participation within 180 days). Citizen Initiative Amendment: A proposed constitutional amendment proceeds through the same two-phase petition process as §13.2, with Phase Two requiring signatures from 15% of eligible voters nationally rather than §13.2’s 10%. Once the Phase Two threshold is met, the proposal proceeds directly to a national referendum, with no legislative or executive action required to place it on the ballot; the Elections Panel administers the referendum within 180 days of Phase Two threshold verification. Passage requires 70% of votes cast with a minimum 65% citizen participation; where the participation floor is not met the initiative fails and may not be resubmitted on the same or substantially similar grounds for five years. Citizen initiative amendments are subject to §17.3 consistency analysis by the JM, advisory only. Amendment of the following provisions requires Popular Ratification regardless of the amendment’s origin: the Monitor selection mechanisms and independence protections (§9.2–§9.4), the Monitor information-only mandate and non-dependency principle (§9.1), the Monitor funding guarantee (§9.10), the NRS architecture and permanence requirements (§10.1), and the Elections Panel and NRS Panel independence (§11.1). These provisions may not be amended by State Ratification alone; a Citizen Initiative Amendment satisfies this requirement through its own referendum under this section without separately clearing the Popular Ratification threshold.</w:t>
       </w:r>
     </w:p>
     <w:p>

</xml_diff>

<commit_message>
§13.3 → §7.4: Electoral Supermajority Threshold relocated to Article 7
§13.3 was misplaced in Article 13 (Direct Democracy). The provision
explicitly said it does not govern §13.1 or §13.2 — its host article.
It governs §7.2 (LC election threshold), §4.4.a (SC confirmation),
and §9.14 (officer removal) — all elections-layer provisions.

Moved to Article 7 as §7.4, after §7.3.a.
Article 13 now contains only §13.1 and §13.2.
§2.13 cross-reference updated §13.3 → §7.4.

Also fixed:
- Stale §13.3 'Executive Recall' quickref entry removed (ghost from
  the 300→158 trimming; that provision was removed years ago but
  the quickref entry survived with the wrong content)
- §7.4 quickref entry added in correct Article 7 position
- Glossary: Electoral Supermajority Threshold ref updated to §7.4
- Annotated edition: provision ID s13-3 → s7-4, moved to Art 7 section
</commit_message>
<xml_diff>
--- a/constitution-current.docx
+++ b/constitution-current.docx
@@ -2062,7 +2062,7 @@
           <w:sz w:val="22"/>
           <w:szCs w:val="22"/>
         </w:rPr>
-        <w:t xml:space="preserve">The Legat Consul may be removed on two independent tracks. Under the legislative track, 2/3 of both chambers in a concurrent vote on grounds of constitutional breach, demonstrated permanent incapacity, or conviction for a disqualifying offense. Either chamber may request a JMC assessment as part of the proceedings; any such assessment is published to the NRS. Under the popular track, a Senate majority may refer the question to a national recall referendum administered within the period defined by statute. The Legat Consul is removed if the referendum achieves 60% of votes cast under §13.3 with a minimum 55% citizen participation. A failed referendum may not be re-initiated within the same Legat Consul's term. The Senate Speaker holds Acting Consular Authority from the moment of Senate referral published to the NRS — no active assumption is required or permitted. The military compliance obligations established in §2.9 apply to this transfer.</w:t>
+        <w:t xml:space="preserve">The Legat Consul may be removed on two independent tracks. Under the legislative track, 2/3 of both chambers in a concurrent vote on grounds of constitutional breach, demonstrated permanent incapacity, or conviction for a disqualifying offense. Either chamber may request a JMC assessment as part of the proceedings; any such assessment is published to the NRS. Under the popular track, a Senate majority may refer the question to a national recall referendum administered within the period defined by statute. The Legat Consul is removed if the referendum achieves 60% of votes cast under §7.4 with a minimum 55% citizen participation. A failed referendum may not be re-initiated within the same Legat Consul's term. The Senate Speaker holds Acting Consular Authority from the moment of Senate referral published to the NRS — no active assumption is required or permitted. The military compliance obligations established in §2.9 apply to this transfer.</w:t>
       </w:r>
     </w:p>
     <w:p>
@@ -6056,7 +6056,7 @@
           <w:sz w:val="18"/>
           <w:szCs w:val="18"/>
         </w:rPr>
-        <w:t xml:space="preserve">§13.3  </w:t>
+        <w:t xml:space="preserve">§7.4  </w:t>
       </w:r>
       <w:r>
         <w:rPr>

</xml_diff>

<commit_message>
§3.2, §3.5, §3.11: recall framework + criminal non-immunity
§3.2 — Explicit Assembly recall framework added:
  State may establish recall by law; must be punitive or political;
  must not violate this Constitution; final decision by State
  legislature or eligible voters; no executive/court/admin recall alone

§3.5 — Senate recall expanded with same three principles + early
  departure clause: any senator who resigns, is expelled, or is
  removed by state recall is deemed to have served that full term
  for cooling-off purposes

§3.11 — Two additions:
  1. Recall reference updated to include §3.2 (was §3.5 only)
  2. Criminal non-immunity clause: expulsion, recall, and removal
     under any provision are civil and political processes; they do
     not protect the removed officer from criminal prosecution or
     civil liability for underlying conduct
</commit_message>
<xml_diff>
--- a/constitution-current.docx
+++ b/constitution-current.docx
@@ -2340,7 +2340,7 @@
           <w:sz w:val="22"/>
           <w:szCs w:val="22"/>
         </w:rPr>
-        <w:t xml:space="preserve">The Assembly is the proportionally elected chamber. Both States and Territories send voting members. Seats are allocated by the Webster method based on population, with a minimum of one seat per State and Territory. The constituency divisor is established and may be adjusted by statute, subject to the minimum-seat guarantee. The census, conducted every ten years by a statutory independent agency, is the basis for reapportionment. The LM audits the census and allocation process. The Assembly Speaker is elected by the Assembly from its own members by absolute majority. Quorum is a majority of full seated membership. The Assembly establishes its own internal procedures. Members serve two-year terms. No member may serve more than six consecutive terms without sitting out one full electoral cycle; no cumulative lifetime restriction applies after the cooling-off period. Any Assembly member who resigns, is expelled, or is removed by state recall at any point during a term shall be deemed to have served that full term for purposes of the consecutive-term limit. All member financial interests are disclosed to the EM and published to the NRS. Mid-term vacancies in Assembly seats are filled by special election administered by the Elections Panel; the Legislature establishes timing and procedures by statute, ensuring no seat remains vacant within the period defined by statute, not to exceed 90 days. The Assembly may expel a member by 2/3 vote of full seated membership; expulsion is published to the NRS and is effective immediately.</w:t>
+        <w:t xml:space="preserve">The Assembly is the proportionally elected chamber. Both States and Territories send voting members. Seats are allocated by the Webster method based on population, with a minimum of one seat per State and Territory. The constituency divisor is established and may be adjusted by statute, subject to the minimum-seat guarantee. The census, conducted every ten years by a statutory independent agency, is the basis for reapportionment. The LM audits the census and allocation process. The Assembly Speaker is elected by the Assembly from its own members by absolute majority. Quorum is a majority of full seated membership. The Assembly establishes its own internal procedures. Members serve two-year terms. No member may serve more than six consecutive terms without sitting out one full electoral cycle; no cumulative lifetime restriction applies after the cooling-off period. Any Assembly member who resigns, is expelled, or is removed by state recall at any point during a term shall be deemed to have served that full term for purposes of the consecutive-term limit. All member financial interests are disclosed to the EM and published to the NRS. Mid-term vacancies in Assembly seats are filled by special election administered by the Elections Panel; the Legislature establishes timing and procedures by statute, ensuring no seat remains vacant within the period defined by statute, not to exceed 90 days. The Assembly may expel a member by 2/3 vote of full seated membership; expulsion is published to the NRS and is effective immediately. A State may establish by law a recall mechanism for its Assembly members; any such mechanism must operate as a punitive or political process, must not violate this Constitution, and must place the final recall decision with the State legislature or the State’s eligible voters; no recall may proceed on the decision of an executive officer, administrative body, or court alone; where an Assembly member is recalled the seat is treated as vacant under this Constitution.</w:t>
       </w:r>
     </w:p>
     <w:p>
@@ -2493,7 +2493,7 @@
           <w:sz w:val="22"/>
           <w:szCs w:val="22"/>
         </w:rPr>
-        <w:t xml:space="preserve">The Senate comprises two senators per State regardless of population, elected for six-year staggered terms. At the first Senate seating, senators are assigned to three approximately equal cohorts by public lot: the first cohort serves an initial term of two years, the second four years, the third six years; thereafter all Senate terms are six years. The lot is conducted by the Elections Panel and published to the NRS before the first senators take the constitutional oath. No senator may serve more than two consecutive terms without sitting out one full term; no cumulative lifetime restriction applies after the cooling-off period. The Senate Speaker is elected by senators and may not serve more than two consecutive full Senate terms as Speaker without sitting out one full Senate term. The Senate defines its own internal procedures. The Senate may expel a member by 2/3 vote of full seated membership; expulsion is published to the NRS and is effective immediately. A State may establish by its own law a recall mechanism for its senators; where a senator is recalled under State law the seat is treated as vacant under this Constitution. The Senate holds exclusive authority over: judicial confirmation; treaty ratification by 2/3 of full seated membership; and, in the absence of a functioning Elections Panel, administration of the consular election. The Senate may not initiate legislation; all bills originate in the Assembly.</w:t>
+        <w:t xml:space="preserve">The Senate comprises two senators per State regardless of population, elected for six-year staggered terms. At the first Senate seating, senators are assigned to three approximately equal cohorts by public lot: the first cohort serves an initial term of two years, the second four years, the third six years; thereafter all Senate terms are six years. The lot is conducted by the Elections Panel and published to the NRS before the first senators take the constitutional oath. No senator may serve more than two consecutive terms without sitting out one full term; no cumulative lifetime restriction applies after the cooling-off period. Any senator who resigns, is expelled, or is removed by state recall at any point during a term shall be deemed to have served that full term for purposes of the consecutive-term limit. The Senate Speaker is elected by senators and may not serve more than two consecutive full Senate terms as Speaker without sitting out one full Senate term. The Senate defines its own internal procedures. The Senate may expel a member by 2/3 vote of full seated membership; expulsion is published to the NRS and is effective immediately. A State may establish by law a recall mechanism for its senators; any such mechanism must operate as a punitive or political process, must not violate this Constitution, and must place the final recall decision with the State legislature or the State’s eligible voters; no recall may proceed on the decision of an executive officer, administrative body, or court alone; where a senator is recalled the seat is treated as vacant under this Constitution. The Senate holds exclusive authority over: judicial confirmation; treaty ratification by 2/3 of full seated membership; and, in the absence of a functioning Elections Panel, administration of the consular election. The Senate may not initiate legislation; all bills originate in the Assembly.</w:t>
       </w:r>
     </w:p>
     <w:p>
@@ -2850,7 +2850,7 @@
           <w:sz w:val="22"/>
           <w:szCs w:val="22"/>
         </w:rPr>
-        <w:t xml:space="preserve">Elected constitutional officers serve their constitutionally defined terms. No act of the Legislature, either executive, any court, any Monitor, or any administrative body may shorten, suspend, or terminate an elected mandate. The only permitted exceptions are: expulsion by the relevant chamber under §3.2 or §3.5; recall under a mechanism established by State law as recognized in §3.5; and impeachment and removal under §3.10. Any mechanism enabling the people themselves to shorten an elected mandate not already provided in this Constitution requires a constitutional amendment under Article XVII and may not be established by ordinary statute.</w:t>
+        <w:t xml:space="preserve">Elected constitutional officers serve their constitutionally defined terms. No act of the Legislature, either executive, any court, any Monitor, or any administrative body may shorten, suspend, or terminate an elected mandate. The only permitted exceptions are: expulsion by the relevant chamber under §3.2 or §3.5; recall under a mechanism established by State law as recognized in §3.2 or §3.5; and impeachment and removal under §3.10. Any mechanism enabling the people themselves to shorten an elected mandate not already provided in this Constitution requires a constitutional amendment under Article XVII and may not be established by ordinary statute. Expulsion, recall, and removal under any provision of this Constitution are civil and political processes; they do not constitute criminal or civil legal proceedings and do not protect the removed officer from criminal prosecution or civil liability for underlying conduct.</w:t>
       </w:r>
     </w:p>
     <w:p>

</xml_diff>

<commit_message>
small fixes after edits
</commit_message>
<xml_diff>
--- a/constitution-current.docx
+++ b/constitution-current.docx
@@ -790,7 +790,7 @@
           <w:sz w:val="22"/>
           <w:szCs w:val="22"/>
         </w:rPr>
-        <w:t>Every Inhabitant is entitled to access the Republic's social state systems under Article XII. No government may exclude any person from social assistance on the basis of the characteristics listed in §1.6. The Legislature establishes by statute the content and administration of social assistance, subject to the adequacy standards certified under §12.1. The Legislature must take reasonable measures within available resources toward the progressive fulfilment of this right; no reduction in the adequacy standard below the established level is constitutionally valid absent a certified Severe Revenue Contraction under §12.5; any such reduction lapses as §12.5 provides.</w:t>
+        <w:t>Every Inhabitant is entitled to access the Republic's social state systems under Article XII. No government may exclude any person from social assistance on the basis of the characteristics listed in §1.6. The Legislature establishes by statute the content and administration of social assistance, subject to the adequacy standards certified under §12.1. The Legislature must take reasonable measures within available resources toward the progressive fulfillment of this right; no reduction in the adequacy standard below the established level is constitutionally valid absent a certified Severe Revenue Contraction under §12.5; any such reduction lapses as §12.5 provides.</w:t>
       </w:r>
     </w:p>
     <w:p>
@@ -834,7 +834,7 @@
           <w:sz w:val="22"/>
           <w:szCs w:val="22"/>
         </w:rPr>
-        <w:t>Every child has the right to education adequate to enable full civic participation. The state must ensure this education is available and accessible. Parents hold the right to direct the education of their children within the framework of public educational standards. The Legislature establishes by statute the content and funding of public education, subject to the adequacy standard established by statute. The Legislature must take reasonable measures within available resources toward the progressive fulfilment of this right; no reduction in the adequacy standard below the established level is constitutionally valid absent a certified Severe Revenue Contraction under §12.5; any such reduction lapses as §12.5 provides.</w:t>
+        <w:t>Every child has the right to education adequate to enable full civic participation. The state must ensure this education is available and accessible. Parents hold the right to direct the education of their children within the framework of public educational standards. The Legislature establishes by statute the content and funding of public education, subject to the adequacy standard established by statute. The Legislature must take reasonable measures within available resources toward the progressive fulfillment of this right; no reduction in the adequacy standard below the established level is constitutionally valid absent a certified Severe Revenue Contraction under §12.5; any such reduction lapses as §12.5 provides.</w:t>
       </w:r>
     </w:p>
     <w:p>
@@ -1223,7 +1223,7 @@
           <w:sz w:val="22"/>
           <w:szCs w:val="22"/>
         </w:rPr>
-        <w:t xml:space="preserve">No person may exercise the voting or decisional authority of more than one branch of government at the same time. A person holding or acting in an office of one branch may not cast a vote or exercise a decisional power reserved to another branch for so long as they hold or act in that office. This section does not bar a person from holding a seat that carries no exercisable vote during such service, nor from resuming an office or vote upon leaving the position that created the conflict.</w:t>
+        <w:t xml:space="preserve">No person may exercise the voting or decisional authority of more than one branch of government at the same time; a person holding or acting in an office of one branch may not cast a vote or exercise a decisional power reserved to another branch for so long as they hold or act in that office. This section does not bar a person from holding a seat that carries no exercisable vote during such service, nor from resuming an office or vote upon leaving the position that created the conflict.</w:t>
       </w:r>
     </w:p>
     <w:p>
@@ -1299,7 +1299,7 @@
           <w:sz w:val="22"/>
           <w:szCs w:val="22"/>
         </w:rPr>
-        <w:t>To hold the office of Legat Consul, a person must have been a citizen for at least 7 years at the time of taking office and must hold no federal felony conviction. No other eligibility requirement applies. The Legat Consul holds enumerated authority over: military command and force employment; foreign affairs, treaty negotiation, recognition of foreign governments, and the receipt of foreign delegations; intelligence; trade agreements subject to §2.4; and relations with recognized indigenous nations under Article XVI, including recognition determinations under §16.4; and appointments within the Legat Consul’s domain. Where the domain of a proposed action is disputed, the Council of Ministers under §2.14 is the first forum; pending resolution, each executive continues only those functions clearly within their established domain; the specific action giving rise to the dispute is suspended. Either executive may petition the SC under its original jurisdiction in §4.5 for domain determination. During active military operations, the Legat Consul’s domain governs operational decisions. The Legat Consul serves a single non-renewable term of six years. Upon expiration of the term, all authority transfers immediately to the incoming Legat Consul. The outgoing Legat Consul retains no access to classified information, government systems, or official functions beyond the time of transfer.</w:t>
+        <w:t>To hold the office of Legat Consul, a person must have been a citizen for at least 7 years at the time of taking office. Eligibility and disclosure requirements applicable to all federal offices are established in §7.4. No other eligibility requirement applies. The Legat Consul holds enumerated authority over: military command and force employment; foreign affairs, treaty negotiation, recognition of foreign governments, and the receipt of foreign delegations; intelligence; trade agreements subject to §2.4; and relations with recognized indigenous nations under Article XVI, including recognition determinations under §16.4; and appointments within the Legat Consul’s domain. Where the domain of a proposed action is disputed, the Council of Ministers under §2.14 is the first forum; pending resolution, each executive continues only those functions clearly within their established domain; the specific action giving rise to the dispute is suspended. Either executive may petition the SC under its original jurisdiction in §4.5 for domain determination. During active military operations, the Legat Consul’s domain governs operational decisions. The Legat Consul serves a single non-renewable term of six years. Upon expiration of the term, all authority transfers immediately to the incoming Legat Consul. The outgoing Legat Consul retains no access to classified information, government systems, or official functions beyond the time of transfer.</w:t>
       </w:r>
     </w:p>
     <w:p>
@@ -1431,7 +1431,7 @@
           <w:sz w:val="22"/>
           <w:szCs w:val="22"/>
         </w:rPr>
-        <w:t>The Legat Consul may veto legislation that raises a genuine constitutional concern within the Legat Consul’s security domain — military operations, intelligence, treaty obligations, or border security — by returning the bill within 10 business days of final passage with a written statement of grounds, published to the NRS. A general or speculative security connection is insufficient. If the Legat Consul neither acts nor objects within 10 business days of final passage, the bill is enacted by operation of law. The Legat Consul’s veto may be used only once on any bill; a bill reintroduced and passed by both chambers in a subsequent session proceeds without Legat Consul interference. Under §9.1, either Speaker may request an EM assessment of the domain question. The Senate may override by 2/3 supermajority at any time during that session; where no override occurs, the bill lapses for that session.</w:t>
+        <w:t>The Legat Consul may veto legislation that raises a genuine constitutional concern within the Legat Consul’s security domain — military operations, intelligence, treaty obligations, or border security — by returning the bill within 10 business days of final passage with a written statement of grounds, published to the NRS. A general or speculative security connection is insufficient. If the Legat Consul neither acts nor objects within 10 business days of final passage, the bill is enacted by operation of law. The Legat Consul’s veto may be used only once on any bill; a bill reintroduced and passed by both chambers in a subsequent session proceeds without Legat Consul interference. Under §9.1, either Speaker may request an EM assessment of the domain question. The Senate may override by 2/3 at any time during that session; where no override occurs, the bill lapses for that session.</w:t>
       </w:r>
     </w:p>
     <w:p>
@@ -1521,7 +1521,7 @@
           <w:sz w:val="22"/>
           <w:szCs w:val="22"/>
         </w:rPr>
-        <w:t>The Civic Consul holds residual executive authority over all functions not enumerated to the Legat Consul. To hold the office of Civic Consul, a person must have been a citizen for at least 7 years at the time of taking office and must hold no federal felony conviction, and must be a serving member of the Assembly at the time of election as required by §2.6. No other eligibility requirement applies. The Civic Consul serves at the confidence of the Assembly, subject to removal under §2.6. No person may serve more than 6 years consecutively as Civic Consul, nor more than 8 years cumulatively across all periods of service; the cumulative limit is a lifetime maximum. A person who has served as Civic Consul for 4 years or more, whether continuously or as the total of their service, and who then leaves the office for any reason, may not serve again as Civic Consul until one full Assembly electoral cycle has passed since they left the office; during that interval they may hold an Assembly seat but may not be elected or designated Civic Consul. A person who has served fewer than 4 years is subject to no cooling-off period on that account, but remains bound by both the consecutive and cumulative limits. The Civic Consul's domestic authority includes: all domestic policy and regulatory frameworks; preparation of a proposed budget for the civic domain, submitted to the Assembly under §12.2; the civil service; and administration of the social state under Article XII. The Civic Consul may declare a domestic emergency in response to natural disaster, public health crisis, or infrastructure failure, subject to the constraints of Article I and renewable Assembly approval at intervals defined by statute; in the absence of a statutory interval, the constitutional default is 30 days. The Legat Consul has no role in domestic emergencies. The Civic Consul has the right to be informed on matters within the Legat Consul’s domain that bear on domestic interests or create domestic fiscal obligations. No classification or domain assertion may be used to withhold such information from the Civic Consul. The Legat Consul shall consult the Civic Consul on treaty and compact negotiations with recognized indigenous nations where their terms bear on domestic interests; the Civic Consul’s response is advisory. Where the Civic Consul is temporarily unable to exercise authority, the Assembly Speaker serves as Acting Civic Consul by constitutional operation from the moment the incapacity is published to the NRS, with authority limited to maintaining existing policy and emergency functions. While serving in an acting executive capacity, the Speaker may not exercise any legislative function; the Speaker retains their Assembly seat and the Speakership, and the Assembly provides for the exercise of the Speaker’s functions during that period under its internal procedures. Acting service neither extends nor suspends the Speaker’s electoral mandate; where the Speaker ceases to be a member of the Assembly, acting authority passes by constitutional operation to the Assembly Speaker then in office. Acting status ends when the Civic Consul resumes their duties or a new Civic Consul is elected under §2.6; the Speaker’s legislative functions resume at that moment. The Civic Consul appoints ministers to lead the departments of the civic domain; ministerial portfolios are defined by statute. Ministers serve at the pleasure of the Civic Consul and require no confirmation; appointments and dismissals are published to the NRS. A minister’s service ends when the Civic Consul leaves office; ministers continue in a caretaker capacity, limited to maintaining existing policy, until the incoming Civic Consul’s ministers are appointed.</w:t>
+        <w:t>The Civic Consul holds residual executive authority over all functions not enumerated to the Legat Consul. To hold the office of Civic Consul, a person must be a serving member of the Assembly at the time of election as required by §2.6. Eligibility and disclosure requirements applicable to all federal offices are established in §7.4. No other eligibility requirement applies. The Civic Consul serves at the confidence of the Assembly, subject to removal under §2.6. No person may serve more than 6 years consecutively as Civic Consul, nor more than 8 years cumulatively across all periods of service; the cumulative limit is a lifetime maximum. A person who has served as Civic Consul for 4 years or more, whether continuously or as the total of their service, and who then leaves the office for any reason, may not serve again as Civic Consul until one full Assembly electoral cycle has passed since they left the office; during that interval they may hold an Assembly seat but may not be elected or designated Civic Consul. A person who has served fewer than 4 years is subject to no cooling-off period on that account, but remains bound by both the consecutive and cumulative limits. The Civic Consul's domestic authority includes: all domestic policy and regulatory frameworks; preparation of a proposed budget for the civic domain, submitted to the Assembly under §12.2; the civil service; and administration of the social state under Article XII. The Civic Consul may declare a domestic emergency in response to natural disaster, public health crisis, or infrastructure failure, subject to the constraints of Article I and renewable by Assembly approval at intervals defined by statute; in the absence of a statutory interval, the constitutional default is 30 days. The Legat Consul has no role in domestic emergencies. The Civic Consul has the right to be informed on matters within the Legat Consul’s domain that bear on domestic interests or create domestic fiscal obligations. No classification or domain assertion may be used to withhold such information from the Civic Consul. The Legat Consul shall consult the Civic Consul on treaty and compact negotiations with recognized indigenous nations where their terms bear on domestic interests; the Civic Consul’s response is advisory. Where the Civic Consul is temporarily unable to exercise authority, the Assembly Speaker serves as Acting Civic Consul by constitutional operation from the moment the incapacity is published to the NRS, with authority limited to maintaining existing policy and emergency functions. While serving in an acting executive capacity, the Speaker may not exercise any legislative function; the Speaker retains their Assembly seat and the Speakership, and the Assembly provides for the exercise of the Speaker’s functions during that period under its internal procedures. Acting service neither extends nor suspends the Speaker’s electoral mandate; where the Speaker ceases to be a member of the Assembly, acting authority passes by constitutional operation to the Assembly Speaker then in office. Acting status ends when the Civic Consul resumes their duties or a new Civic Consul is elected under §2.6; the Speaker’s legislative functions resume at that moment. The Civic Consul appoints ministers to lead the departments of the civic domain; ministerial portfolios are defined by statute. Ministers serve at the pleasure of the Civic Consul and require no confirmation; appointments and dismissals are published to the NRS. A minister’s service ends when the Civic Consul leaves office; ministers continue in a caretaker capacity, limited to maintaining existing policy, until the incoming Civic Consul’s ministers are appointed.</w:t>
       </w:r>
     </w:p>
     <w:p>
@@ -1609,9 +1609,9 @@
           <w:sz w:val="22"/>
           <w:szCs w:val="22"/>
         </w:rPr>
-        <w:t xml:space="preserve">The Assembly elects the Civic Consul by absolute majority within the period defined by statute following any general election or vacancy; where no statutory period has been established, the constitutional default is 21 days. If the Assembly does not elect a Civic Consul within that period, the acting role attaches automatically to the sitting Assembly Speaker, who serves as Acting Civic Consul by constitutional operation with authority limited to maintaining existing policy, until a Civic Consul is elected or designated under this section; the acting service is published to the NRS. Acting authority passes only to the standing Speaker and never by designation of the Civic Consul. No election is held to fill the acting role. The Senate may, by 2/3 supermajority, designate a serving Assembly member as Civic Consul if the Assembly has failed to elect one within the statutory period; Assembly election of a Civic Consul by absolute majority terminates any Senate designation. Where no Civic Consul has been elected and the Senate has not designated one within 45 days of the Assembly failing to elect, the Legat Consul nominates a serving Assembly member as Civic Consul within 21 days, published to the NRS; the Senate confirms by simple majority within 21 days of nomination; the confirmed appointee holds full Civic Consul authority as a Civic Consul, vacates their Assembly seat under §2.6, and is subject to removal under §2.6. Where the Legat Consul does not nominate within 21 days or the Senate does not confirm within 21 days of nomination, the most senior Assembly member by continuous service who otherwise meets the requirements for Civic Consul assumes the role by constitutional operation, </w:t>
+        <w:t xml:space="preserve">The Assembly elects the Civic Consul by absolute majority within the period defined by statute following any general election or vacancy; where no statutory period has been established, the constitutional default is 21 days. If the Assembly does not elect a Civic Consul within that period, the acting role attaches automatically to the sitting Assembly Speaker, who serves as Acting Civic Consul by constitutional operation with authority limited to maintaining existing policy, until a Civic Consul is elected or designated under this section; the acting service is published to the NRS. Acting authority passes only to the standing Speaker and never by designation of the Civic Consul. No election is held to fill the acting role. The Senate may, by 2/3, designate a serving Assembly member as Civic Consul if the Assembly has failed to elect one within the statutory period; Assembly election of a Civic Consul by absolute majority terminates any Senate designation. Where no Civic Consul has been elected and the Senate has not designated one within 45 days of the Assembly failing to elect, the Legat Consul nominates a serving Assembly member as Civic Consul within 21 days, published to the NRS; the Senate confirms by simple majority within 21 days of nomination; the confirmed appointee holds full Civic Consul authority, vacates their Assembly seat under §2.6, and is subject to removal under §2.6. Where the Legat Consul does not nominate within 21 days or the Senate does not confirm within 21 days of nomination, the most senior Assembly member by continuous service who otherwise meets the requirements for Civic Consul assumes the role by constitutional operation, </w:t>
         <w:lastRenderedPageBreak/>
-        <w:t>published to the NRS; this appointee holds full Civic Consul authority as a Civic Consul, vacates their Assembly seat under §2.6, and is subject to removal under §2.6. Where two or more Assembly members have equal continuous service, the tiebreaker is determined by statute.</w:t>
+        <w:t>published to the NRS; this appointee holds full Civic Consul authority, vacates their Assembly seat under §2.6, and is subject to removal under §2.6. Where two or more Assembly members have equal continuous service, the tiebreaker is determined by statute.</w:t>
       </w:r>
     </w:p>
     <w:p>
@@ -1655,7 +1655,7 @@
           <w:sz w:val="22"/>
           <w:szCs w:val="22"/>
         </w:rPr>
-        <w:t>The Civic Consul may withhold assent by returning a bill within 10 business days of final passage with written grounds published to the NRS; the bill is tabled for one month regardless of any change in CC office. The Senate may override by 2/3 supermajority during that month; failing override, the bill returns to the Legislature and must pass both chambers again before returning to the Civic Consul, who may not exercise the suspensive veto on that bill again, including where that bill lapses and is reintroduced in a subsequent session. The Civic Consul may also issue a fiscal notice — a written NRS statement that a bill would cause or materially worsen a structural deficit — at any point within the 10-business-day review window; a fiscal notice does not block enactment but entitles the Assembly Speaker to recall the bill for reconsideration within the remaining window; both instruments may be used on the same bill. Where the Civic Consul neither returns the bill nor issues a fiscal notice within 10 business days of final passage, the bill is enacted by operation of law. The suspensive veto may not be used on the annual budget, bills implementing a constitutional obligation, or emergency legislation. Both executives review concurrently from final passage.</w:t>
+        <w:t>The Civic Consul may withhold assent by returning a bill within 10 business days of final passage with written grounds published to the NRS; the bill is tabled for one month regardless of any change in CC office. The Senate may override by 2/3 during that month; failing override, the bill returns to the Legislature and must pass both chambers again before returning to the Civic Consul, who may not exercise the suspensive veto on that bill again, including where that bill lapses and is reintroduced in a subsequent session. The Civic Consul may also issue a fiscal notice — a written NRS statement that a bill would cause or materially worsen a structural deficit — at any point within the 10-business-day review window; a fiscal notice does not block enactment but entitles the Assembly Speaker to recall the bill for reconsideration within the remaining window; both instruments may be used on the same bill. Where the Civic Consul neither returns the bill nor issues a fiscal notice within 10 business days of final passage, the bill is enacted by operation of law. The suspensive veto may not be used on the annual budget, bills implementing a constitutional obligation, or emergency legislation. Both executives review concurrently from final passage.</w:t>
       </w:r>
     </w:p>
     <w:p>
@@ -1921,7 +1921,7 @@
           <w:sz w:val="22"/>
           <w:szCs w:val="22"/>
         </w:rPr>
-        <w:t>The Legat Consul may be removed on two independent tracks. Under the legislative track, 2/3 of both chambers in a concurrent vote on grounds of constitutional breach, demonstrated permanent incapacity, or conviction for a disqualifying offense. Either chamber may request a JMC assessment as part of the proceedings; any such assessment is published to the NRS. Under the popular track, a Senate majority may refer the question to a national recall referendum administered within the period defined by statute. The Legat Consul is removed if the referendum achieves 60% of votes cast under §7.3 with a minimum 55% citizen participation. A failed referendum may not be re-initiated within the same Legat Consul's term. The Senate Speaker holds Acting Consular Authority from the moment of Senate referral published to the NRS — no active assumption is required or permitted. The military compliance obligations established in §2.9 apply to this transfer.</w:t>
+        <w:t>The Legat Consul may be removed on two independent tracks. Under the legislative track, removal requires 2/3 of both chambers in a concurrent vote on grounds of constitutional breach, demonstrated permanent incapacity, or conviction for a disqualifying offense. Either chamber may request a JMC assessment as part of the proceedings; any such assessment is published to the NRS. Under the popular track, a Senate majority may refer the question to a national recall referendum administered within the period defined by statute. The Legat Consul is removed if the referendum achieves 60% of votes cast under §7.3 with a minimum 55% citizen participation. A failed referendum may not be re-initiated within the same Legat Consul's term. The Senate Speaker holds Acting Consular Authority from the moment of Senate referral published to the NRS — no active assumption is required or permitted. The military compliance obligations established in §2.9 apply to this transfer.</w:t>
       </w:r>
     </w:p>
     <w:p>
@@ -2471,7 +2471,7 @@
           <w:sz w:val="22"/>
           <w:szCs w:val="22"/>
         </w:rPr>
-        <w:t>Bills pass by absolute majority of the full seated membership of both chambers. Higher thresholds apply to constitutional amendments, veto overrides, removal proceedings, and other matters specified in this constitution; where a higher threshold is specified for a vote of a single chamber, it applies to the full seated membership of that chamber. The Speaker of each chamber must publish the final text of every enacted law to the NRS within the period defined by statute. All prior versions, committee reports, Monitor findings, and veto records are indexed alongside the enacted text. Where the constitution requires the Legislature to enact specific legislation and the Legislature fails to do so, the LM publishes a non-compliance finding; the mandate becomes justiciable in the SC; and, for mandates whose non-fulfilment directly impairs the exercise of a right guaranteed in Article I, affected parties may bring direct constitutional claims.</w:t>
+        <w:t>Bills pass by absolute majority of the full seated membership of both chambers. Higher thresholds apply to constitutional amendments, veto overrides, removal proceedings, and other matters specified in this constitution; where a higher threshold is specified for a vote of a single chamber, it applies to the full seated membership of that chamber. The Speaker of each chamber must publish the final text of every enacted law to the NRS within the period defined by statute. All prior versions, committee reports, Monitor findings, and veto records are indexed alongside the enacted text. Where the constitution requires the Legislature to enact specific legislation and the Legislature fails to do so, the LM publishes a non-compliance finding; the mandate becomes justiciable in the SC; and, for mandates whose non-fulfillment directly impairs the exercise of a right guaranteed in Article I, affected parties may bring direct constitutional claims.</w:t>
       </w:r>
     </w:p>
     <w:p>
@@ -2940,7 +2940,7 @@
           <w:sz w:val="22"/>
           <w:szCs w:val="22"/>
         </w:rPr>
-        <w:t>Any citizen meeting the eligibility criteria established in §9.4.a may apply to the Elections Panel to enter the Judicial Pool; the JM’s ongoing audit encompasses the Judicial Pool. Exceptions to pool eligibility — including persons currently holding government positions, those with disqualifying financial interests, and those removed from a court within a recent period — are defined by statute. The Civic Consul nominates inferior court judges from the Judicial Pool maintained by the Elections Panel under §9.8. The Civic Consul must nominate within the period defined by statute following a vacancy, not to exceed 90 days where no statutory period has been defined. The Senate confirms by a 2/3 supermajority. Inferior court judges serve a single non-renewable term of 12 years and may be removed only for cause. Cause for judicial removal must relate to conduct, competence, or a disqualifying offense under §3.12; policy disagreement with judicial decisions does not constitute cause, consistent with the principle established in §3.9. The Legislature may establish a mandatory retirement age by statute, not below 70. Judicial removal occurs through three tracks: legislative removal by 2/3 of both chambers on grounds of constitutional breach or demonstrated incapacity; under §9.1, either chamber may request an EM assessment to inform the proceeding; judicial discipline through a process established by statute under SC oversight; or criminal conviction for a disqualifying offense. No public official may direct, threaten, or seek to influence a judge's decision in any pending matter. Judicial compensation may not be reduced during a judge's term.</w:t>
+        <w:t>Any citizen meeting the eligibility criteria established in §9.4.a may apply to the Elections Panel to enter the Judicial Pool; the JM’s ongoing audit encompasses the Judicial Pool. Exceptions to pool eligibility — including persons currently holding government positions, those with disqualifying financial interests, and those removed from a court within a recent period — are defined by statute. The Civic Consul nominates inferior court judges from the Judicial Pool maintained by the Elections Panel under §9.8. The Civic Consul must nominate within the period defined by statute following a vacancy, not to exceed 90 days where no statutory period has been defined. The Senate confirms by 2/3. Inferior court judges serve a single non-renewable term of 12 years and may be removed only for cause. Cause for judicial removal must relate to conduct, competence, or a disqualifying offense under §3.12; policy disagreement with judicial decisions does not constitute cause, consistent with the principle established in §3.9. The Legislature may establish a mandatory retirement age by statute, not below 70. Judicial removal occurs through three tracks: legislative removal by 2/3 of both chambers on grounds of constitutional breach or demonstrated incapacity; under §9.1, either chamber may request an EM assessment to inform the proceeding; judicial discipline through a process established by statute under SC oversight; or criminal conviction for a disqualifying offense. No public official may direct, threaten, or seek to influence a judge's decision in any pending matter. Judicial compensation may not be reduced during a judge's term.</w:t>
       </w:r>
     </w:p>
     <w:p>
@@ -5581,7 +5581,7 @@
           <w:sz w:val="22"/>
           <w:szCs w:val="22"/>
         </w:rPr>
-        <w:t>The Legislature shall by statute establish a mechanism ensuring that every State and Territory has fiscal capacity reasonably sufficient to fulfil the Social State obligations under §12.1 and the rights guaranteed under Article I. The mechanism is reviewed at intervals the Legislature defines by statute. The EM certifies whether the mechanism is operating as required and publishes its finding to the NRS annually. Where the EM finds the mechanism has failed, the Legislature publishes its response to the NRS within 90 days.</w:t>
+        <w:t>The Legislature shall by statute establish a mechanism ensuring that every State and Territory has fiscal capacity reasonably sufficient to fulfill the Social State obligations under §12.1 and the rights guaranteed under Article I. The mechanism is reviewed at intervals the Legislature defines by statute. The EM certifies whether the mechanism is operating as required and publishes its finding to the NRS annually. Where the EM finds the mechanism has failed, the Legislature publishes its response to the NRS within 90 days.</w:t>
       </w:r>
     </w:p>
     <w:p>
@@ -5737,6 +5737,50 @@
     </w:p>
     <w:p>
       <w:pPr>
+        <w:spacing w:before="200" w:after="60"/>
+        <w:ind w:left="431"/>
+      </w:pPr>
+      <w:r>
+        <w:rPr>
+          <w:rFonts w:ascii="Courier New" w:eastAsia="Courier New" w:hAnsi="Courier New" w:cs="Courier New"/>
+          <w:b/>
+          <w:bCs/>
+          <w:color w:val="2A2A2A"/>
+          <w:sz w:val="18"/>
+          <w:szCs w:val="18"/>
+        </w:rPr>
+        <w:t xml:space="preserve">§7.4  </w:t>
+      </w:r>
+      <w:r>
+        <w:rPr>
+          <w:rFonts w:ascii="Garamond" w:eastAsia="Garamond" w:hAnsi="Garamond" w:cs="Garamond"/>
+          <w:i/>
+          <w:iCs/>
+          <w:color w:val="1B2A4A"/>
+          <w:sz w:val="22"/>
+          <w:szCs w:val="22"/>
+        </w:rPr>
+        <w:t>Eligibility and Disclosure for Federal Office</w:t>
+      </w:r>
+    </w:p>
+    <w:p>
+      <w:pPr>
+        <w:spacing w:after="120"/>
+        <w:ind w:left="431"/>
+        <w:jc w:val="both"/>
+      </w:pPr>
+      <w:r>
+        <w:rPr>
+          <w:rFonts w:ascii="Garamond" w:eastAsia="Garamond" w:hAnsi="Garamond" w:cs="Garamond"/>
+          <w:color w:val="2A2A2A"/>
+          <w:sz w:val="22"/>
+          <w:szCs w:val="22"/>
+        </w:rPr>
+        <w:t xml:space="preserve">Every candidate for federal office, and every person selected or elevated to a federal office without standing for election, shall disclose their criminal history on the official candidacy or acceptance filing, under penalty of perjury; the disclosure is published to the NRS and is available to voters and to any body that selects the officeholder. A person who has made a current disclosure for one federal office satisfies this requirement for elevation to another so long as the disclosure remains accurate. A false or incomplete disclosure is itself a federal offense. No criminal conviction bars a person from federal office except as provided in this section; the weight of a disclosed history is for the voters, or for the selecting body, to judge. A person convicted of insurrection against the Republic, rebellion against the Republic, treason against the Republic, or subversion of a federal election is barred from holding any federal office. These grounds are exhaustive; no other conviction bars a person from federal office, and any change to these grounds requires constitutional amendment. This bar requires a conviction, not an accusation or a pending charge. A person removed from a federal office by an affirmative removal process -- including impeachment, a for-cause removal, a constructive vote of no confidence, or recall -- may not hold or seek that office until the remainder of the electoral cycle in which the removal occurred and one full electoral cycle thereafter have passed. The ordinary expiration of a term, and loss of office through an election, are not removals for purposes of this section.</w:t>
+      </w:r>
+    </w:p>
+    <w:p>
+      <w:pPr>
         <w:pageBreakBefore/>
         <w:pBdr>
           <w:bottom w:val="single" w:sz="4" w:space="6" w:color="C9A84C"/>
@@ -6692,7 +6736,7 @@
           <w:sz w:val="22"/>
           <w:szCs w:val="22"/>
         </w:rPr>
-        <w:t>This Constitution may be amended through the parliamentary path or through citizen initiative. No executive signature is required; no executive veto applies. Every member’s vote on any amendment is published to the NRS.  A parliamentary amendment requires a 2/3 supermajority of the full seated membership of both chambers. The proposing body simultaneously specifies the ratification mechanism — either State Ratification (ratification by 2/3 of States within the period defined by statute) or Popular Ratification (a national popular referendum achieving 2/3 affirmative support with at least 55% citizen participation within 180 days). Citizen Initiative Amendment: A proposed constitutional amendment proceeds through the same two-phase petition process as §13.2, with Phase Two requiring signatures from 15% of eligible voters nationally rather than §13.2’s 10%. Once the Phase Two threshold is met, the proposal proceeds directly to a national referendum, with no legislative or executive action required to place it on the ballot; the Elections Panel administers the referendum within 180 days of Phase Two threshold verification. Passage requires 70% of votes cast with a minimum 65% citizen participation; where the participation floor is not met the initiative fails and may not be resubmitted on the same or substantially similar grounds for five years. Citizen initiative amendments are subject to §17.3 consistency analysis by the JM, advisory only. Amendment of the following provisions requires Popular Ratification regardless of the amendment’s origin: the Monitor selection mechanisms and independence protections (§9.2–§9.4), the Monitor information-only mandate and non-dependency principle (§9.1), the Monitor funding guarantee (§9.6), the NRS architecture and permanence requirements (§10.1), and the Elections Panel and NRS Panel independence (§11.1). These provisions may not be amended by State Ratification alone; a Citizen Initiative Amendment satisfies this requirement through its own referendum under this section without separately clearing the Popular Ratification threshold.</w:t>
+        <w:t>This Constitution may be amended through the parliamentary path or through citizen initiative. No executive signature is required; no executive veto applies. Every member’s vote on any amendment is published to the NRS.  A parliamentary amendment requires 2/3 of the full seated membership of both chambers. The proposing body simultaneously specifies the ratification mechanism — either State Ratification (ratification by 2/3 of States within the period defined by statute) or Popular Ratification (a national popular referendum achieving 2/3 affirmative support with at least 55% citizen participation within 180 days). Citizen Initiative Amendment: A proposed constitutional amendment proceeds through the same two-phase petition process as §13.2, with Phase Two requiring signatures from 15% of eligible voters nationally rather than §13.2’s 10%. Once the Phase Two threshold is met, the proposal proceeds directly to a national referendum, with no legislative or executive action required to place it on the ballot; the Elections Panel administers the referendum within 180 days of Phase Two threshold verification. Passage requires 70% of votes cast with a minimum 65% citizen participation; where the participation floor is not met the initiative fails and may not be resubmitted on the same or substantially similar grounds for five years. Citizen initiative amendments are subject to §17.3 consistency analysis by the JM, advisory only. Amendment of the following provisions requires Popular Ratification regardless of the amendment’s origin: the Monitor selection mechanisms and independence protections (§9.2–§9.4), the Monitor information-only mandate and non-dependency principle (§9.1), the Monitor funding guarantee (§9.6), the NRS architecture and permanence requirements (§10.1), and the Elections Panel and NRS Panel independence (§11.1). These provisions may not be amended by State Ratification alone; a Citizen Initiative Amendment satisfies this requirement through its own referendum under this section without separately clearing the Popular Ratification threshold.</w:t>
       </w:r>
     </w:p>
     <w:p>

</xml_diff>